<commit_message>
adam's article complete draft
</commit_message>
<xml_diff>
--- a/Essays/DF_Review_Article.docx
+++ b/Essays/DF_Review_Article.docx
@@ -271,1445 +271,983 @@
       </w:pPr>
       <w:r>
         <w:lastRenderedPageBreak/>
-        <w:t xml:space="preserve">Draft </w:t>
-      </w:r>
-      <w:r>
-        <w:t>Main Body</w:t>
-      </w:r>
-      <w:r>
-        <w:t xml:space="preserve"> Ideas</w:t>
-      </w:r>
-      <w:r>
-        <w:t xml:space="preserve"> – Adam</w:t>
-      </w:r>
-    </w:p>
-    <w:p>
-      <w:r>
-        <w:t>Mechanism (abstract para 1):</w:t>
-      </w:r>
-    </w:p>
-    <w:p>
-      <w:pPr>
-        <w:pStyle w:val="ListParagraph"/>
-        <w:numPr>
-          <w:ilvl w:val="0"/>
-          <w:numId w:val="3"/>
-        </w:numPr>
-      </w:pPr>
-      <w:r>
-        <w:t>Why is exposure now the organising variable</w:t>
-      </w:r>
-      <w:r>
+        <w:t xml:space="preserve">ADAM </w:t>
+      </w:r>
+      <w:r>
+        <w:t>1</w:t>
+      </w:r>
+      <w:r>
+        <w:t>576</w:t>
+      </w:r>
+      <w:r>
+        <w:t xml:space="preserve"> WORDS</w:t>
+      </w:r>
+    </w:p>
+    <w:p>
+      <w:pPr>
+        <w:pStyle w:val="Heading2"/>
+        <w:rPr>
+          <w:rFonts w:asciiTheme="minorHAnsi" w:eastAsiaTheme="minorHAnsi" w:hAnsiTheme="minorHAnsi" w:cstheme="minorBidi"/>
+          <w:color w:val="auto"/>
+          <w:sz w:val="24"/>
+          <w:szCs w:val="24"/>
+        </w:rPr>
+      </w:pPr>
+      <w:r>
+        <w:rPr>
+          <w:rFonts w:asciiTheme="minorHAnsi" w:eastAsiaTheme="minorHAnsi" w:hAnsiTheme="minorHAnsi" w:cstheme="minorBidi"/>
+          <w:color w:val="auto"/>
+          <w:sz w:val="24"/>
+          <w:szCs w:val="24"/>
+        </w:rPr>
+        <w:t>Land warfare now turns on a single question: who is observed, when</w:t>
+      </w:r>
+      <w:r>
+        <w:rPr>
+          <w:rFonts w:asciiTheme="minorHAnsi" w:eastAsiaTheme="minorHAnsi" w:hAnsiTheme="minorHAnsi" w:cstheme="minorBidi"/>
+          <w:color w:val="auto"/>
+          <w:sz w:val="24"/>
+          <w:szCs w:val="24"/>
+        </w:rPr>
+        <w:t xml:space="preserve"> and</w:t>
+      </w:r>
+      <w:r>
+        <w:rPr>
+          <w:rFonts w:asciiTheme="minorHAnsi" w:eastAsiaTheme="minorHAnsi" w:hAnsiTheme="minorHAnsi" w:cstheme="minorBidi"/>
+          <w:color w:val="auto"/>
+          <w:sz w:val="24"/>
+          <w:szCs w:val="24"/>
+        </w:rPr>
+        <w:t xml:space="preserve"> how fast that observation becomes fire. Cheap sensors and democratised precision strike have compressed the interval between being seen and being hit to seconds</w:t>
+      </w:r>
+      <w:r>
+        <w:rPr>
+          <w:rFonts w:asciiTheme="minorHAnsi" w:eastAsiaTheme="minorHAnsi" w:hAnsiTheme="minorHAnsi" w:cstheme="minorBidi"/>
+          <w:color w:val="auto"/>
+          <w:sz w:val="24"/>
+          <w:szCs w:val="24"/>
+        </w:rPr>
+        <w:t xml:space="preserve"> and</w:t>
+      </w:r>
+      <w:r>
+        <w:rPr>
+          <w:rFonts w:asciiTheme="minorHAnsi" w:eastAsiaTheme="minorHAnsi" w:hAnsiTheme="minorHAnsi" w:cstheme="minorBidi"/>
+          <w:color w:val="auto"/>
+          <w:sz w:val="24"/>
+          <w:szCs w:val="24"/>
+        </w:rPr>
+        <w:t xml:space="preserve"> that compression has changed what movement costs. To move is to generate signature</w:t>
+      </w:r>
+      <w:r>
+        <w:rPr>
+          <w:rFonts w:asciiTheme="minorHAnsi" w:eastAsiaTheme="minorHAnsi" w:hAnsiTheme="minorHAnsi" w:cstheme="minorBidi"/>
+          <w:color w:val="auto"/>
+          <w:sz w:val="24"/>
+          <w:szCs w:val="24"/>
+        </w:rPr>
+        <w:t xml:space="preserve"> — </w:t>
+      </w:r>
+      <w:r>
+        <w:rPr>
+          <w:rFonts w:asciiTheme="minorHAnsi" w:eastAsiaTheme="minorHAnsi" w:hAnsiTheme="minorHAnsi" w:cstheme="minorBidi"/>
+          <w:color w:val="auto"/>
+          <w:sz w:val="24"/>
+          <w:szCs w:val="24"/>
+        </w:rPr>
+        <w:t>across space, where a force can be seen; across time, since the longer it is exposed the more targetable it grows; and across the electromagnetic spectrum, where every emission betrays position. Manoeuvre has not been abolished, but its price has risen sharply. It survives only where sensing, concealment, electronic warfare and fires are sequenced to buy a temporary window. Exposure has therefore displaced terrain as the variable around which tactical action organises: the first question is no longer where to move, but whether movement can be afforded at all.</w:t>
+      </w:r>
+    </w:p>
+    <w:p>
+      <w:pPr>
+        <w:pStyle w:val="Heading2"/>
+        <w:rPr>
+          <w:rFonts w:asciiTheme="minorHAnsi" w:eastAsiaTheme="minorHAnsi" w:hAnsiTheme="minorHAnsi" w:cstheme="minorBidi"/>
+          <w:color w:val="auto"/>
+          <w:sz w:val="24"/>
+          <w:szCs w:val="24"/>
+        </w:rPr>
+      </w:pPr>
+      <w:r>
+        <w:rPr>
+          <w:rFonts w:asciiTheme="minorHAnsi" w:eastAsiaTheme="minorHAnsi" w:hAnsiTheme="minorHAnsi" w:cstheme="minorBidi"/>
+          <w:color w:val="auto"/>
+          <w:sz w:val="24"/>
+          <w:szCs w:val="24"/>
+        </w:rPr>
+        <w:t>Ireland has no national security strategy and no settled defence policy; the Defence Policy Review</w:t>
+      </w:r>
+      <w:r>
+        <w:rPr>
+          <w:rStyle w:val="FootnoteReference"/>
+          <w:rFonts w:asciiTheme="minorHAnsi" w:eastAsiaTheme="minorHAnsi" w:hAnsiTheme="minorHAnsi" w:cstheme="minorBidi"/>
+          <w:color w:val="auto"/>
+          <w:sz w:val="24"/>
+          <w:szCs w:val="24"/>
+        </w:rPr>
+        <w:footnoteReference w:id="1"/>
+      </w:r>
+      <w:r>
+        <w:rPr>
+          <w:rFonts w:asciiTheme="minorHAnsi" w:eastAsiaTheme="minorHAnsi" w:hAnsiTheme="minorHAnsi" w:cstheme="minorBidi"/>
+          <w:color w:val="auto"/>
+          <w:sz w:val="24"/>
+          <w:szCs w:val="24"/>
+        </w:rPr>
+        <w:t xml:space="preserve"> </w:t>
+      </w:r>
+      <w:r>
+        <w:rPr>
+          <w:rFonts w:asciiTheme="minorHAnsi" w:eastAsiaTheme="minorHAnsi" w:hAnsiTheme="minorHAnsi" w:cstheme="minorBidi"/>
+          <w:color w:val="auto"/>
+          <w:sz w:val="24"/>
+          <w:szCs w:val="24"/>
+        </w:rPr>
+        <w:t>updates the White Paper</w:t>
+      </w:r>
+      <w:r>
+        <w:rPr>
+          <w:rStyle w:val="FootnoteReference"/>
+          <w:rFonts w:asciiTheme="minorHAnsi" w:eastAsiaTheme="minorHAnsi" w:hAnsiTheme="minorHAnsi" w:cstheme="minorBidi"/>
+          <w:color w:val="auto"/>
+          <w:sz w:val="24"/>
+          <w:szCs w:val="24"/>
+        </w:rPr>
+        <w:footnoteReference w:id="2"/>
+      </w:r>
+      <w:r>
+        <w:rPr>
+          <w:rFonts w:asciiTheme="minorHAnsi" w:eastAsiaTheme="minorHAnsi" w:hAnsiTheme="minorHAnsi" w:cstheme="minorBidi"/>
+          <w:color w:val="auto"/>
+          <w:sz w:val="24"/>
+          <w:szCs w:val="24"/>
+        </w:rPr>
+        <w:t>, constituting</w:t>
+      </w:r>
+      <w:r>
+        <w:rPr>
+          <w:rFonts w:asciiTheme="minorHAnsi" w:eastAsiaTheme="minorHAnsi" w:hAnsiTheme="minorHAnsi" w:cstheme="minorBidi"/>
+          <w:color w:val="auto"/>
+          <w:sz w:val="24"/>
+          <w:szCs w:val="24"/>
+        </w:rPr>
+        <w:t xml:space="preserve"> a de facto substitute</w:t>
+      </w:r>
+      <w:r>
+        <w:rPr>
+          <w:rFonts w:asciiTheme="minorHAnsi" w:eastAsiaTheme="minorHAnsi" w:hAnsiTheme="minorHAnsi" w:cstheme="minorBidi"/>
+          <w:color w:val="auto"/>
+          <w:sz w:val="24"/>
+          <w:szCs w:val="24"/>
+        </w:rPr>
+        <w:t>. The military is tasked “</w:t>
+      </w:r>
+      <w:r>
+        <w:rPr>
+          <w:rFonts w:asciiTheme="minorHAnsi" w:eastAsiaTheme="minorHAnsi" w:hAnsiTheme="minorHAnsi" w:cstheme="minorBidi"/>
+          <w:color w:val="auto"/>
+          <w:sz w:val="24"/>
+          <w:szCs w:val="24"/>
+        </w:rPr>
+        <w:t>To provide for the military Defence of the</w:t>
+      </w:r>
+      <w:r>
+        <w:rPr>
+          <w:rFonts w:asciiTheme="minorHAnsi" w:eastAsiaTheme="minorHAnsi" w:hAnsiTheme="minorHAnsi" w:cstheme="minorBidi"/>
+          <w:color w:val="auto"/>
+          <w:sz w:val="24"/>
+          <w:szCs w:val="24"/>
+        </w:rPr>
+        <w:t xml:space="preserve"> </w:t>
+      </w:r>
+      <w:r>
+        <w:rPr>
+          <w:rFonts w:asciiTheme="minorHAnsi" w:eastAsiaTheme="minorHAnsi" w:hAnsiTheme="minorHAnsi" w:cstheme="minorBidi"/>
+          <w:color w:val="auto"/>
+          <w:sz w:val="24"/>
+          <w:szCs w:val="24"/>
+        </w:rPr>
+        <w:t>State from armed aggression</w:t>
+      </w:r>
+      <w:r>
+        <w:rPr>
+          <w:rFonts w:asciiTheme="minorHAnsi" w:eastAsiaTheme="minorHAnsi" w:hAnsiTheme="minorHAnsi" w:cstheme="minorBidi"/>
+          <w:color w:val="auto"/>
+          <w:sz w:val="24"/>
+          <w:szCs w:val="24"/>
+        </w:rPr>
+        <w:t>”.</w:t>
+      </w:r>
+      <w:r>
+        <w:rPr>
+          <w:rFonts w:asciiTheme="minorHAnsi" w:eastAsiaTheme="minorHAnsi" w:hAnsiTheme="minorHAnsi" w:cstheme="minorBidi"/>
+          <w:color w:val="auto"/>
+          <w:sz w:val="24"/>
+          <w:szCs w:val="24"/>
+        </w:rPr>
+        <w:t xml:space="preserve"> </w:t>
+      </w:r>
+      <w:r>
+        <w:rPr>
+          <w:rFonts w:asciiTheme="minorHAnsi" w:eastAsiaTheme="minorHAnsi" w:hAnsiTheme="minorHAnsi" w:cstheme="minorBidi"/>
+          <w:color w:val="auto"/>
+          <w:sz w:val="24"/>
+          <w:szCs w:val="24"/>
+        </w:rPr>
+        <w:t>While m</w:t>
+      </w:r>
+      <w:r>
+        <w:rPr>
+          <w:rFonts w:asciiTheme="minorHAnsi" w:eastAsiaTheme="minorHAnsi" w:hAnsiTheme="minorHAnsi" w:cstheme="minorBidi"/>
+          <w:color w:val="auto"/>
+          <w:sz w:val="24"/>
+          <w:szCs w:val="24"/>
+        </w:rPr>
+        <w:t xml:space="preserve">ilitary </w:t>
+      </w:r>
+      <w:r>
+        <w:rPr>
+          <w:rFonts w:asciiTheme="minorHAnsi" w:eastAsiaTheme="minorHAnsi" w:hAnsiTheme="minorHAnsi" w:cstheme="minorBidi"/>
+          <w:color w:val="auto"/>
+          <w:sz w:val="24"/>
+          <w:szCs w:val="24"/>
+        </w:rPr>
+        <w:t>strategy and operations</w:t>
+      </w:r>
+      <w:r>
+        <w:rPr>
+          <w:rFonts w:asciiTheme="minorHAnsi" w:eastAsiaTheme="minorHAnsi" w:hAnsiTheme="minorHAnsi" w:cstheme="minorBidi"/>
+          <w:color w:val="auto"/>
+          <w:sz w:val="24"/>
+          <w:szCs w:val="24"/>
+        </w:rPr>
+        <w:t xml:space="preserve"> can organise effort</w:t>
+      </w:r>
+      <w:r>
+        <w:rPr>
+          <w:rFonts w:asciiTheme="minorHAnsi" w:eastAsiaTheme="minorHAnsi" w:hAnsiTheme="minorHAnsi" w:cstheme="minorBidi"/>
+          <w:color w:val="auto"/>
+          <w:sz w:val="24"/>
+          <w:szCs w:val="24"/>
+        </w:rPr>
+        <w:t>, policy directs</w:t>
+      </w:r>
+      <w:r>
+        <w:rPr>
+          <w:rFonts w:asciiTheme="minorHAnsi" w:eastAsiaTheme="minorHAnsi" w:hAnsiTheme="minorHAnsi" w:cstheme="minorBidi"/>
+          <w:color w:val="auto"/>
+          <w:sz w:val="24"/>
+          <w:szCs w:val="24"/>
+        </w:rPr>
+        <w:t xml:space="preserve">. In that vacuum, force design drifts toward continuity. </w:t>
+      </w:r>
+      <w:r>
+        <w:rPr>
+          <w:rFonts w:asciiTheme="minorHAnsi" w:eastAsiaTheme="minorHAnsi" w:hAnsiTheme="minorHAnsi" w:cstheme="minorBidi"/>
+          <w:color w:val="auto"/>
+          <w:sz w:val="24"/>
+          <w:szCs w:val="24"/>
+        </w:rPr>
+        <w:t>T</w:t>
+      </w:r>
+      <w:r>
+        <w:rPr>
+          <w:rFonts w:asciiTheme="minorHAnsi" w:eastAsiaTheme="minorHAnsi" w:hAnsiTheme="minorHAnsi" w:cstheme="minorBidi"/>
+          <w:color w:val="auto"/>
+          <w:sz w:val="24"/>
+          <w:szCs w:val="24"/>
+        </w:rPr>
+        <w:t xml:space="preserve">erritorial defence is no longer implausible </w:t>
+      </w:r>
+      <w:r>
+        <w:rPr>
+          <w:rFonts w:asciiTheme="minorHAnsi" w:eastAsiaTheme="minorHAnsi" w:hAnsiTheme="minorHAnsi" w:cstheme="minorBidi"/>
+          <w:color w:val="auto"/>
+          <w:sz w:val="24"/>
+          <w:szCs w:val="24"/>
+        </w:rPr>
+        <w:t>—</w:t>
+      </w:r>
+      <w:r>
+        <w:rPr>
+          <w:rFonts w:asciiTheme="minorHAnsi" w:eastAsiaTheme="minorHAnsi" w:hAnsiTheme="minorHAnsi" w:cstheme="minorBidi"/>
+          <w:color w:val="auto"/>
+          <w:sz w:val="24"/>
+          <w:szCs w:val="24"/>
+        </w:rPr>
+        <w:t xml:space="preserve"> it is politically constrained, under-resourced and increasingly likely.</w:t>
+      </w:r>
+      <w:r>
+        <w:rPr>
+          <w:rFonts w:asciiTheme="minorHAnsi" w:eastAsiaTheme="minorHAnsi" w:hAnsiTheme="minorHAnsi" w:cstheme="minorBidi"/>
+          <w:color w:val="auto"/>
+          <w:sz w:val="24"/>
+          <w:szCs w:val="24"/>
+        </w:rPr>
+        <w:t xml:space="preserve"> Recent</w:t>
+      </w:r>
+      <w:r>
+        <w:rPr>
+          <w:rFonts w:asciiTheme="minorHAnsi" w:eastAsiaTheme="minorHAnsi" w:hAnsiTheme="minorHAnsi" w:cstheme="minorBidi"/>
+          <w:color w:val="auto"/>
+          <w:sz w:val="24"/>
+          <w:szCs w:val="24"/>
+        </w:rPr>
+        <w:t xml:space="preserve"> developments</w:t>
+      </w:r>
+      <w:r>
+        <w:rPr>
+          <w:rFonts w:asciiTheme="minorHAnsi" w:eastAsiaTheme="minorHAnsi" w:hAnsiTheme="minorHAnsi" w:cstheme="minorBidi"/>
+          <w:color w:val="auto"/>
+          <w:sz w:val="24"/>
+          <w:szCs w:val="24"/>
+        </w:rPr>
+        <w:t xml:space="preserve"> </w:t>
+      </w:r>
+      <w:r>
+        <w:rPr>
+          <w:rFonts w:asciiTheme="minorHAnsi" w:eastAsiaTheme="minorHAnsi" w:hAnsiTheme="minorHAnsi" w:cstheme="minorBidi"/>
+          <w:color w:val="auto"/>
+          <w:sz w:val="24"/>
+          <w:szCs w:val="24"/>
+        </w:rPr>
+        <w:t xml:space="preserve">among Western states </w:t>
+      </w:r>
+      <w:r>
+        <w:rPr>
+          <w:rFonts w:asciiTheme="minorHAnsi" w:eastAsiaTheme="minorHAnsi" w:hAnsiTheme="minorHAnsi" w:cstheme="minorBidi"/>
+          <w:color w:val="auto"/>
+          <w:sz w:val="24"/>
+          <w:szCs w:val="24"/>
+        </w:rPr>
+        <w:t>—</w:t>
+      </w:r>
+      <w:r>
+        <w:rPr>
+          <w:rFonts w:asciiTheme="minorHAnsi" w:eastAsiaTheme="minorHAnsi" w:hAnsiTheme="minorHAnsi" w:cstheme="minorBidi"/>
+          <w:color w:val="auto"/>
+          <w:sz w:val="24"/>
+          <w:szCs w:val="24"/>
+        </w:rPr>
+        <w:t xml:space="preserve"> most notably the United States’ assertions regarding</w:t>
+      </w:r>
+      <w:r>
+        <w:rPr>
+          <w:rFonts w:asciiTheme="minorHAnsi" w:eastAsiaTheme="minorHAnsi" w:hAnsiTheme="minorHAnsi" w:cstheme="minorBidi"/>
+          <w:color w:val="auto"/>
+          <w:sz w:val="24"/>
+          <w:szCs w:val="24"/>
+        </w:rPr>
+        <w:t xml:space="preserve"> </w:t>
+      </w:r>
+      <w:r>
+        <w:rPr>
+          <w:rFonts w:asciiTheme="minorHAnsi" w:eastAsiaTheme="minorHAnsi" w:hAnsiTheme="minorHAnsi" w:cstheme="minorBidi"/>
+          <w:color w:val="auto"/>
+          <w:sz w:val="24"/>
+          <w:szCs w:val="24"/>
+        </w:rPr>
+        <w:t>Greenland</w:t>
+      </w:r>
+      <w:r>
+        <w:rPr>
+          <w:rStyle w:val="FootnoteReference"/>
+          <w:rFonts w:asciiTheme="minorHAnsi" w:eastAsiaTheme="minorHAnsi" w:hAnsiTheme="minorHAnsi" w:cstheme="minorBidi"/>
+          <w:color w:val="auto"/>
+          <w:sz w:val="24"/>
+          <w:szCs w:val="24"/>
+        </w:rPr>
+        <w:footnoteReference w:id="3"/>
+      </w:r>
+      <w:r>
+        <w:rPr>
+          <w:rFonts w:asciiTheme="minorHAnsi" w:eastAsiaTheme="minorHAnsi" w:hAnsiTheme="minorHAnsi" w:cstheme="minorBidi"/>
+          <w:color w:val="auto"/>
+          <w:sz w:val="24"/>
+          <w:szCs w:val="24"/>
+        </w:rPr>
+        <w:t xml:space="preserve"> and Denmark’s response</w:t>
+      </w:r>
+      <w:r>
+        <w:rPr>
+          <w:rStyle w:val="FootnoteReference"/>
+          <w:rFonts w:asciiTheme="minorHAnsi" w:eastAsiaTheme="minorHAnsi" w:hAnsiTheme="minorHAnsi" w:cstheme="minorBidi"/>
+          <w:color w:val="auto"/>
+          <w:sz w:val="24"/>
+          <w:szCs w:val="24"/>
+        </w:rPr>
+        <w:footnoteReference w:id="4"/>
+      </w:r>
+      <w:r>
+        <w:rPr>
+          <w:rFonts w:asciiTheme="minorHAnsi" w:eastAsiaTheme="minorHAnsi" w:hAnsiTheme="minorHAnsi" w:cstheme="minorBidi"/>
+          <w:color w:val="auto"/>
+          <w:sz w:val="24"/>
+          <w:szCs w:val="24"/>
+        </w:rPr>
+        <w:t xml:space="preserve">  </w:t>
+      </w:r>
+      <w:r>
+        <w:rPr>
+          <w:rFonts w:asciiTheme="minorHAnsi" w:eastAsiaTheme="minorHAnsi" w:hAnsiTheme="minorHAnsi" w:cstheme="minorBidi"/>
+          <w:color w:val="auto"/>
+          <w:sz w:val="24"/>
+          <w:szCs w:val="24"/>
+        </w:rPr>
+        <w:t>—</w:t>
+      </w:r>
+      <w:r>
+        <w:rPr>
+          <w:rFonts w:asciiTheme="minorHAnsi" w:eastAsiaTheme="minorHAnsi" w:hAnsiTheme="minorHAnsi" w:cstheme="minorBidi"/>
+          <w:color w:val="auto"/>
+          <w:sz w:val="24"/>
+          <w:szCs w:val="24"/>
+        </w:rPr>
+        <w:t xml:space="preserve"> demonstrate that scenarios once considered unlikely can rapidly</w:t>
+      </w:r>
+      <w:r>
+        <w:rPr>
+          <w:rFonts w:asciiTheme="minorHAnsi" w:eastAsiaTheme="minorHAnsi" w:hAnsiTheme="minorHAnsi" w:cstheme="minorBidi"/>
+          <w:color w:val="auto"/>
+          <w:sz w:val="24"/>
+          <w:szCs w:val="24"/>
+        </w:rPr>
+        <w:t xml:space="preserve"> </w:t>
+      </w:r>
+      <w:r>
+        <w:rPr>
+          <w:rFonts w:asciiTheme="minorHAnsi" w:eastAsiaTheme="minorHAnsi" w:hAnsiTheme="minorHAnsi" w:cstheme="minorBidi"/>
+          <w:color w:val="auto"/>
+          <w:sz w:val="24"/>
+          <w:szCs w:val="24"/>
+        </w:rPr>
+        <w:t xml:space="preserve">acquire </w:t>
+      </w:r>
+      <w:r>
+        <w:rPr>
+          <w:rFonts w:asciiTheme="minorHAnsi" w:eastAsiaTheme="minorHAnsi" w:hAnsiTheme="minorHAnsi" w:cstheme="minorBidi"/>
+          <w:color w:val="auto"/>
+          <w:sz w:val="24"/>
+          <w:szCs w:val="24"/>
+        </w:rPr>
+        <w:t>s</w:t>
+      </w:r>
+      <w:r>
+        <w:rPr>
+          <w:rFonts w:asciiTheme="minorHAnsi" w:eastAsiaTheme="minorHAnsi" w:hAnsiTheme="minorHAnsi" w:cstheme="minorBidi"/>
+          <w:color w:val="auto"/>
+          <w:sz w:val="24"/>
+          <w:szCs w:val="24"/>
+        </w:rPr>
+        <w:t>trategic salience. The perception of threat is an unreliable indicator for future</w:t>
+      </w:r>
+      <w:r>
+        <w:rPr>
+          <w:rFonts w:asciiTheme="minorHAnsi" w:eastAsiaTheme="minorHAnsi" w:hAnsiTheme="minorHAnsi" w:cstheme="minorBidi"/>
+          <w:color w:val="auto"/>
+          <w:sz w:val="24"/>
+          <w:szCs w:val="24"/>
+        </w:rPr>
+        <w:t xml:space="preserve"> </w:t>
+      </w:r>
+      <w:r>
+        <w:rPr>
+          <w:rFonts w:asciiTheme="minorHAnsi" w:eastAsiaTheme="minorHAnsi" w:hAnsiTheme="minorHAnsi" w:cstheme="minorBidi"/>
+          <w:color w:val="auto"/>
+          <w:sz w:val="24"/>
+          <w:szCs w:val="24"/>
+        </w:rPr>
+        <w:t xml:space="preserve">conflict. Failure to internalise the implications of </w:t>
+      </w:r>
+      <w:proofErr w:type="spellStart"/>
+      <w:r>
+        <w:rPr>
+          <w:rFonts w:asciiTheme="minorHAnsi" w:eastAsiaTheme="minorHAnsi" w:hAnsiTheme="minorHAnsi" w:cstheme="minorBidi"/>
+          <w:color w:val="auto"/>
+          <w:sz w:val="24"/>
+          <w:szCs w:val="24"/>
+        </w:rPr>
+        <w:t>UxS</w:t>
+      </w:r>
+      <w:proofErr w:type="spellEnd"/>
+      <w:r>
+        <w:rPr>
+          <w:rFonts w:asciiTheme="minorHAnsi" w:eastAsiaTheme="minorHAnsi" w:hAnsiTheme="minorHAnsi" w:cstheme="minorBidi"/>
+          <w:color w:val="auto"/>
+          <w:sz w:val="24"/>
+          <w:szCs w:val="24"/>
+        </w:rPr>
+        <w:t xml:space="preserve"> risks entrenching a force posture</w:t>
+      </w:r>
+      <w:r>
+        <w:rPr>
+          <w:rFonts w:asciiTheme="minorHAnsi" w:eastAsiaTheme="minorHAnsi" w:hAnsiTheme="minorHAnsi" w:cstheme="minorBidi"/>
+          <w:color w:val="auto"/>
+          <w:sz w:val="24"/>
+          <w:szCs w:val="24"/>
+        </w:rPr>
+        <w:t xml:space="preserve"> </w:t>
+      </w:r>
+      <w:r>
+        <w:rPr>
+          <w:rFonts w:asciiTheme="minorHAnsi" w:eastAsiaTheme="minorHAnsi" w:hAnsiTheme="minorHAnsi" w:cstheme="minorBidi"/>
+          <w:color w:val="auto"/>
+          <w:sz w:val="24"/>
+          <w:szCs w:val="24"/>
+        </w:rPr>
+        <w:t>optimised for conditions which no longer exist</w:t>
+      </w:r>
+      <w:r>
+        <w:rPr>
+          <w:rFonts w:asciiTheme="minorHAnsi" w:eastAsiaTheme="minorHAnsi" w:hAnsiTheme="minorHAnsi" w:cstheme="minorBidi"/>
+          <w:color w:val="auto"/>
+          <w:sz w:val="24"/>
+          <w:szCs w:val="24"/>
+        </w:rPr>
+        <w:t>,</w:t>
+      </w:r>
+      <w:r>
+        <w:rPr>
+          <w:rFonts w:asciiTheme="minorHAnsi" w:eastAsiaTheme="minorHAnsi" w:hAnsiTheme="minorHAnsi" w:cstheme="minorBidi"/>
+          <w:color w:val="auto"/>
+          <w:sz w:val="24"/>
+          <w:szCs w:val="24"/>
+        </w:rPr>
+        <w:t xml:space="preserve"> allowing force design decisions to prioritise</w:t>
+      </w:r>
+      <w:r>
+        <w:rPr>
+          <w:rFonts w:asciiTheme="minorHAnsi" w:eastAsiaTheme="minorHAnsi" w:hAnsiTheme="minorHAnsi" w:cstheme="minorBidi"/>
+          <w:color w:val="auto"/>
+          <w:sz w:val="24"/>
+          <w:szCs w:val="24"/>
+        </w:rPr>
+        <w:t xml:space="preserve"> </w:t>
+      </w:r>
+      <w:r>
+        <w:rPr>
+          <w:rFonts w:asciiTheme="minorHAnsi" w:eastAsiaTheme="minorHAnsi" w:hAnsiTheme="minorHAnsi" w:cstheme="minorBidi"/>
+          <w:color w:val="auto"/>
+          <w:sz w:val="24"/>
+          <w:szCs w:val="24"/>
+        </w:rPr>
+        <w:t>continuity over adaptation and without articulating a theory of victory.</w:t>
+      </w:r>
+      <w:r>
+        <w:rPr>
+          <w:rFonts w:asciiTheme="minorHAnsi" w:eastAsiaTheme="minorHAnsi" w:hAnsiTheme="minorHAnsi" w:cstheme="minorBidi"/>
+          <w:color w:val="auto"/>
+          <w:sz w:val="24"/>
+          <w:szCs w:val="24"/>
+        </w:rPr>
+        <w:t xml:space="preserve"> [</w:t>
+      </w:r>
+      <w:r>
+        <w:rPr>
+          <w:rFonts w:asciiTheme="minorHAnsi" w:eastAsiaTheme="minorHAnsi" w:hAnsiTheme="minorHAnsi" w:cstheme="minorBidi"/>
+          <w:color w:val="auto"/>
+          <w:sz w:val="24"/>
+          <w:szCs w:val="24"/>
+          <w:highlight w:val="yellow"/>
+        </w:rPr>
+        <w:t>OB: please proof the ideas here, they’re still in draft though</w:t>
+      </w:r>
+      <w:r>
+        <w:rPr>
+          <w:rFonts w:asciiTheme="minorHAnsi" w:eastAsiaTheme="minorHAnsi" w:hAnsiTheme="minorHAnsi" w:cstheme="minorBidi"/>
+          <w:color w:val="auto"/>
+          <w:sz w:val="24"/>
+          <w:szCs w:val="24"/>
+        </w:rPr>
+        <w:t>]</w:t>
+      </w:r>
+    </w:p>
+    <w:p>
+      <w:r>
+        <w:br w:type="page"/>
+      </w:r>
+    </w:p>
+    <w:p>
+      <w:r>
+        <w:lastRenderedPageBreak/>
+        <w:t>Ireland's light infantry section is not a capability gap to be filled with equipment; it is a structure overtaken by the threat</w:t>
+      </w:r>
+      <w:r>
+        <w:t xml:space="preserve">. </w:t>
+      </w:r>
+      <w:r>
+        <w:t>Capability is sometimes reduced to equipment, but it is better understood as the synthesis described by DOTMLPF-I</w:t>
+      </w:r>
+      <w:r>
+        <w:t>.</w:t>
+      </w:r>
+      <w:r>
+        <w:rPr>
+          <w:rStyle w:val="FootnoteReference"/>
+        </w:rPr>
+        <w:footnoteReference w:id="5"/>
+      </w:r>
+      <w:r>
+        <w:t xml:space="preserve"> </w:t>
+      </w:r>
+      <w:r>
+        <w:rPr>
+          <w:rStyle w:val="FootnoteReference"/>
+        </w:rPr>
+        <w:footnoteReference w:id="6"/>
+      </w:r>
+      <w:r>
+        <w:t xml:space="preserve"> O</w:t>
+      </w:r>
+      <w:r>
+        <w:t>n that basis the section fails against nearly every line. Its doctrine</w:t>
+      </w:r>
+      <w:r>
+        <w:rPr>
+          <w:rStyle w:val="FootnoteReference"/>
+        </w:rPr>
+        <w:footnoteReference w:id="7"/>
+      </w:r>
+      <w:r>
+        <w:t xml:space="preserve"> remains that of a foot-mobile light infantry section, </w:t>
+      </w:r>
+      <w:r>
+        <w:rPr>
+          <w:highlight w:val="yellow"/>
+        </w:rPr>
+        <w:t>never reconciled with the vehicles now built to carry it</w:t>
+      </w:r>
+      <w:r>
+        <w:t>. Its organisation may now be rebuilt around vehicle capacity,</w:t>
+      </w:r>
+      <w:r>
+        <w:rPr>
+          <w:rStyle w:val="FootnoteReference"/>
+        </w:rPr>
+        <w:t xml:space="preserve"> </w:t>
+      </w:r>
+      <w:r>
+        <w:rPr>
+          <w:rStyle w:val="FootnoteReference"/>
+        </w:rPr>
+        <w:footnoteReference w:id="8"/>
+      </w:r>
+      <w:r>
+        <w:t xml:space="preserve"> on the assumption that one section must fit one carrier — a constraint</w:t>
+      </w:r>
+      <w:r>
+        <w:t xml:space="preserve"> more appropriate for</w:t>
+      </w:r>
+      <w:r>
+        <w:t xml:space="preserve"> mechanised and armoured formations</w:t>
+      </w:r>
+      <w:r>
+        <w:t xml:space="preserve">. </w:t>
+      </w:r>
+      <w:r>
+        <w:t>It</w:t>
+      </w:r>
+      <w:r>
+        <w:t xml:space="preserve"> should</w:t>
+      </w:r>
+      <w:r>
+        <w:t xml:space="preserve"> not bind light infantry, which moves on foot or in soft-skin vehicles, increasingly all-terrain </w:t>
+      </w:r>
+      <w:r>
+        <w:t>vehicles</w:t>
+      </w:r>
+      <w:r>
+        <w:t xml:space="preserve"> such as the ULTV.</w:t>
+      </w:r>
+      <w:r>
+        <w:rPr>
+          <w:rStyle w:val="FootnoteReference"/>
+        </w:rPr>
+        <w:t xml:space="preserve"> </w:t>
+      </w:r>
+      <w:r>
+        <w:rPr>
+          <w:rStyle w:val="FootnoteReference"/>
+        </w:rPr>
+        <w:footnoteReference w:id="9"/>
+      </w:r>
+      <w:r>
+        <w:rPr>
+          <w:rStyle w:val="FootnoteReference"/>
+        </w:rPr>
+        <w:t xml:space="preserve"> </w:t>
+      </w:r>
+      <w:r>
+        <w:rPr>
+          <w:rStyle w:val="FootnoteReference"/>
+        </w:rPr>
+        <w:t xml:space="preserve"> </w:t>
+      </w:r>
+      <w:r>
+        <w:t>I</w:t>
+      </w:r>
+      <w:r>
+        <w:t xml:space="preserve">ts training still rehearses the conventional drills of the last century and the peace-support tasks of the decades since. It neglects the cognitive burden, dispersion and exposure of a section that can be found and struck on a checkpoint or logistics convoy as readily as in battle, without higher-echelon cover. Its materiel reflects a Cold War mentality. Its leadership is not configured for contemporary mission command. And it fields too few soldiers to carry the cognitive load, operate the new systems and remain cohesive once dispersed. Adding </w:t>
+      </w:r>
+      <w:proofErr w:type="gramStart"/>
+      <w:r>
+        <w:t>drones</w:t>
+      </w:r>
+      <w:proofErr w:type="gramEnd"/>
+      <w:r>
+        <w:t xml:space="preserve"> changes none of that.</w:t>
+      </w:r>
+    </w:p>
+    <w:p>
+      <w:r>
+        <w:rPr>
+          <w:highlight w:val="yellow"/>
+        </w:rPr>
+        <w:t>OB: I will reference TM 201 as proof that doctrine hasn’t changed. However, I think I want to cite paragraph 0202 “The fundamental role of the infantry man/woman has changed little over recent centuries: their tasks are still to close with and destroy the enemy or force them to surrender, to seize and hold terrain, to dominate and control close country and finally, to carry out close surveillance”. Then we can say that the first task – their most important – cannot be achieved without substantial review of the doctrine, organisation, training, leadership, materiel,</w:t>
+      </w:r>
+      <w:r>
+        <w:t xml:space="preserve"> </w:t>
+      </w:r>
+    </w:p>
+    <w:p/>
+    <w:p>
+      <w:pPr>
+        <w:pStyle w:val="Heading2"/>
+        <w:rPr>
+          <w:rFonts w:asciiTheme="minorHAnsi" w:eastAsiaTheme="minorHAnsi" w:hAnsiTheme="minorHAnsi" w:cstheme="minorBidi"/>
+          <w:color w:val="auto"/>
+          <w:sz w:val="24"/>
+          <w:szCs w:val="24"/>
+        </w:rPr>
+      </w:pPr>
+      <w:r>
+        <w:rPr>
+          <w:rFonts w:asciiTheme="minorHAnsi" w:eastAsiaTheme="minorHAnsi" w:hAnsiTheme="minorHAnsi" w:cstheme="minorBidi"/>
+          <w:color w:val="auto"/>
+          <w:sz w:val="24"/>
+          <w:szCs w:val="24"/>
+        </w:rPr>
+        <w:lastRenderedPageBreak/>
+        <w:t xml:space="preserve">Relative combat power </w:t>
+      </w:r>
+      <w:r>
+        <w:rPr>
+          <w:rFonts w:asciiTheme="minorHAnsi" w:eastAsiaTheme="minorHAnsi" w:hAnsiTheme="minorHAnsi" w:cstheme="minorBidi"/>
+          <w:color w:val="auto"/>
+          <w:sz w:val="24"/>
+          <w:szCs w:val="24"/>
+        </w:rPr>
+        <w:t>rewards</w:t>
+      </w:r>
+      <w:r>
+        <w:rPr>
+          <w:rFonts w:asciiTheme="minorHAnsi" w:eastAsiaTheme="minorHAnsi" w:hAnsiTheme="minorHAnsi" w:cstheme="minorBidi"/>
+          <w:color w:val="auto"/>
+          <w:sz w:val="24"/>
+          <w:szCs w:val="24"/>
+        </w:rPr>
+        <w:t xml:space="preserve"> the side </w:t>
+      </w:r>
+      <w:r>
+        <w:rPr>
+          <w:rFonts w:asciiTheme="minorHAnsi" w:eastAsiaTheme="minorHAnsi" w:hAnsiTheme="minorHAnsi" w:cstheme="minorBidi"/>
+          <w:color w:val="auto"/>
+          <w:sz w:val="24"/>
+          <w:szCs w:val="24"/>
+        </w:rPr>
+        <w:t>which</w:t>
+      </w:r>
+      <w:r>
+        <w:rPr>
+          <w:rFonts w:asciiTheme="minorHAnsi" w:eastAsiaTheme="minorHAnsi" w:hAnsiTheme="minorHAnsi" w:cstheme="minorBidi"/>
+          <w:color w:val="auto"/>
+          <w:sz w:val="24"/>
+          <w:szCs w:val="24"/>
+        </w:rPr>
+        <w:t xml:space="preserve"> can mass force and absorb loss</w:t>
+      </w:r>
+      <w:r>
+        <w:rPr>
+          <w:rFonts w:asciiTheme="minorHAnsi" w:eastAsiaTheme="minorHAnsi" w:hAnsiTheme="minorHAnsi" w:cstheme="minorBidi"/>
+          <w:color w:val="auto"/>
+          <w:sz w:val="24"/>
+          <w:szCs w:val="24"/>
+        </w:rPr>
         <w:t xml:space="preserve"> – </w:t>
       </w:r>
       <w:r>
-        <w:t xml:space="preserve">what makes movement the costed act? </w:t>
-      </w:r>
-      <w:r>
-        <w:rPr>
-          <w:i/>
-          <w:iCs/>
-        </w:rPr>
-        <w:t>(P1)</w:t>
-      </w:r>
-    </w:p>
-    <w:p>
-      <w:pPr>
-        <w:pStyle w:val="ListParagraph"/>
-        <w:numPr>
-          <w:ilvl w:val="0"/>
-          <w:numId w:val="3"/>
-        </w:numPr>
-      </w:pPr>
-      <w:r>
-        <w:t xml:space="preserve">How do low-cost </w:t>
-      </w:r>
-      <w:proofErr w:type="spellStart"/>
-      <w:r>
-        <w:t>UxS</w:t>
-      </w:r>
-      <w:proofErr w:type="spellEnd"/>
-      <w:r>
-        <w:t xml:space="preserve"> shift RCP toward the resource-constrained defender? </w:t>
-      </w:r>
-      <w:r>
-        <w:rPr>
-          <w:i/>
-          <w:iCs/>
-        </w:rPr>
-        <w:t>(P1)</w:t>
-      </w:r>
-    </w:p>
-    <w:p>
-      <w:pPr>
-        <w:pStyle w:val="ListParagraph"/>
-        <w:numPr>
-          <w:ilvl w:val="0"/>
-          <w:numId w:val="3"/>
-        </w:numPr>
-      </w:pPr>
-      <w:r>
-        <w:t>What is the cost proof</w:t>
-      </w:r>
-      <w:r>
-        <w:t xml:space="preserve"> – </w:t>
-      </w:r>
-      <w:r>
-        <w:t xml:space="preserve">and does the </w:t>
-      </w:r>
-      <w:proofErr w:type="spellStart"/>
-      <w:r>
-        <w:t>Javelin:FPV</w:t>
-      </w:r>
-      <w:proofErr w:type="spellEnd"/>
-      <w:r>
-        <w:t xml:space="preserve"> ratio </w:t>
-      </w:r>
-      <w:proofErr w:type="gramStart"/>
-      <w:r>
-        <w:t>actually hold</w:t>
-      </w:r>
-      <w:proofErr w:type="gramEnd"/>
-      <w:r>
-        <w:t xml:space="preserve"> at 1:54–1:144? </w:t>
-      </w:r>
-      <w:r>
-        <w:rPr>
-          <w:i/>
-          <w:iCs/>
-        </w:rPr>
-        <w:t>(P2</w:t>
-      </w:r>
-      <w:r>
-        <w:rPr>
-          <w:i/>
-          <w:iCs/>
-        </w:rPr>
-        <w:t xml:space="preserve"> – </w:t>
-      </w:r>
-      <w:r>
-        <w:rPr>
-          <w:i/>
-          <w:iCs/>
-        </w:rPr>
-        <w:t>and this is the sentence with the VAT-basis seam; the question you must answer cleanly is "do the two numbers chain," and right now they don't)</w:t>
-      </w:r>
-    </w:p>
-    <w:p>
-      <w:pPr>
-        <w:pStyle w:val="ListParagraph"/>
-        <w:numPr>
-          <w:ilvl w:val="0"/>
-          <w:numId w:val="3"/>
-        </w:numPr>
-      </w:pPr>
-      <w:r>
-        <w:t xml:space="preserve">Why does this reframe "credible territorial defence is financially unreachable" for Ireland specifically? </w:t>
-      </w:r>
-      <w:r>
-        <w:rPr>
-          <w:i/>
-          <w:iCs/>
-        </w:rPr>
-        <w:t>(P1–P2)</w:t>
-      </w:r>
-    </w:p>
-    <w:p>
-      <w:pPr>
-        <w:pStyle w:val="ListParagraph"/>
-        <w:numPr>
-          <w:ilvl w:val="0"/>
-          <w:numId w:val="3"/>
-        </w:numPr>
-      </w:pPr>
-      <w:r>
-        <w:t>What is deterrence-by-denial here</w:t>
-      </w:r>
-      <w:r>
-        <w:t xml:space="preserve"> and</w:t>
-      </w:r>
-      <w:r>
-        <w:t xml:space="preserve"> what is it </w:t>
-      </w:r>
-      <w:r>
-        <w:rPr>
-          <w:i/>
-          <w:iCs/>
-        </w:rPr>
-        <w:t>not</w:t>
-      </w:r>
-      <w:r>
-        <w:t xml:space="preserve">? </w:t>
-      </w:r>
-      <w:r>
-        <w:rPr>
-          <w:i/>
-          <w:iCs/>
-        </w:rPr>
-        <w:t>(P2</w:t>
-      </w:r>
-      <w:r>
-        <w:rPr>
-          <w:i/>
-          <w:iCs/>
-        </w:rPr>
-        <w:t xml:space="preserve"> – </w:t>
-      </w:r>
-      <w:r>
-        <w:rPr>
-          <w:i/>
-          <w:iCs/>
-        </w:rPr>
-        <w:t>the bound: effect of cost imposition, not a theory of deterrence)</w:t>
-      </w:r>
-    </w:p>
-    <w:p>
-      <w:pPr>
-        <w:pStyle w:val="ListParagraph"/>
-        <w:numPr>
-          <w:ilvl w:val="0"/>
-          <w:numId w:val="3"/>
-        </w:numPr>
-      </w:pPr>
-      <w:r>
-        <w:t>Why is capability not yet deterrence</w:t>
-      </w:r>
-      <w:r>
-        <w:t xml:space="preserve"> – </w:t>
-      </w:r>
-      <w:r>
-        <w:t xml:space="preserve">what are the four conditions? </w:t>
-      </w:r>
-      <w:r>
-        <w:rPr>
-          <w:i/>
-          <w:iCs/>
-        </w:rPr>
-        <w:t>(P3)</w:t>
-      </w:r>
-    </w:p>
-    <w:p>
-      <w:r>
-        <w:t xml:space="preserve">The spine and </w:t>
-      </w:r>
-      <w:r>
-        <w:t xml:space="preserve">Adam’s two </w:t>
-      </w:r>
-      <w:r>
-        <w:t>conditions (abstract para 2):</w:t>
-      </w:r>
-    </w:p>
-    <w:p>
-      <w:pPr>
-        <w:pStyle w:val="ListParagraph"/>
-        <w:numPr>
-          <w:ilvl w:val="0"/>
-          <w:numId w:val="3"/>
-        </w:numPr>
-      </w:pPr>
-      <w:r>
-        <w:rPr>
-          <w:i/>
-          <w:iCs/>
-        </w:rPr>
-        <w:t>Politically owned</w:t>
-      </w:r>
-      <w:r>
-        <w:t xml:space="preserve"> – </w:t>
-      </w:r>
-      <w:r>
-        <w:t>why is there no owner</w:t>
-      </w:r>
-      <w:r>
-        <w:t xml:space="preserve"> and</w:t>
-      </w:r>
-      <w:r>
-        <w:t xml:space="preserve"> what would ownership </w:t>
-      </w:r>
-      <w:proofErr w:type="gramStart"/>
-      <w:r>
-        <w:t>actually be</w:t>
-      </w:r>
-      <w:proofErr w:type="gramEnd"/>
-      <w:r>
-        <w:t xml:space="preserve">? </w:t>
-      </w:r>
-      <w:r>
-        <w:rPr>
-          <w:i/>
-          <w:iCs/>
-        </w:rPr>
-        <w:t>(P4–P6: the policy void, ownership-as-reallocation, the threat-perception rebuttal)</w:t>
-      </w:r>
-    </w:p>
-    <w:p>
-      <w:pPr>
-        <w:pStyle w:val="ListParagraph"/>
-        <w:numPr>
-          <w:ilvl w:val="0"/>
-          <w:numId w:val="3"/>
-        </w:numPr>
-      </w:pPr>
-      <w:r>
-        <w:rPr>
-          <w:i/>
-          <w:iCs/>
-        </w:rPr>
-        <w:t>Credibly fielded</w:t>
-      </w:r>
-      <w:r>
-        <w:t xml:space="preserve"> – </w:t>
-      </w:r>
-      <w:r>
-        <w:t>why is the nine-soldier section obsolete</w:t>
-      </w:r>
-      <w:r>
-        <w:t xml:space="preserve"> and</w:t>
-      </w:r>
-      <w:r>
-        <w:t xml:space="preserve"> what replaces it? </w:t>
-      </w:r>
-      <w:r>
-        <w:rPr>
-          <w:i/>
-          <w:iCs/>
-        </w:rPr>
-        <w:t>(P7–P9: the 14/15-soldier section, organic ISR/CUAS/IEDD, rank, training, experimentation, the external-staff test)</w:t>
-      </w:r>
-    </w:p>
-    <w:p>
-      <w:pPr>
-        <w:pStyle w:val="ListParagraph"/>
-        <w:numPr>
-          <w:ilvl w:val="0"/>
-          <w:numId w:val="3"/>
-        </w:numPr>
-      </w:pPr>
-      <w:r>
-        <w:t xml:space="preserve">What </w:t>
-      </w:r>
-      <w:proofErr w:type="gramStart"/>
-      <w:r>
-        <w:t>are</w:t>
-      </w:r>
-      <w:proofErr w:type="gramEnd"/>
-      <w:r>
-        <w:t xml:space="preserve"> the force-design recommendations</w:t>
-      </w:r>
-      <w:r>
-        <w:t xml:space="preserve"> – </w:t>
-      </w:r>
-      <w:r>
-        <w:t xml:space="preserve">concrete and usable? </w:t>
-      </w:r>
-      <w:r>
-        <w:rPr>
-          <w:i/>
-          <w:iCs/>
-        </w:rPr>
-        <w:t>(P9: lance-corporal rank, structured experimentation, SOP embedding)</w:t>
-      </w:r>
-    </w:p>
-    <w:p>
-      <w:pPr>
-        <w:pStyle w:val="Heading2"/>
-      </w:pPr>
-      <w:r>
+        <w:rPr>
+          <w:rFonts w:asciiTheme="minorHAnsi" w:eastAsiaTheme="minorHAnsi" w:hAnsiTheme="minorHAnsi" w:cstheme="minorBidi"/>
+          <w:color w:val="auto"/>
+          <w:sz w:val="24"/>
+          <w:szCs w:val="24"/>
+        </w:rPr>
+        <w:t xml:space="preserve">historically the better-funded one. </w:t>
+      </w:r>
+      <w:r>
+        <w:rPr>
+          <w:rFonts w:asciiTheme="minorHAnsi" w:eastAsiaTheme="minorHAnsi" w:hAnsiTheme="minorHAnsi" w:cstheme="minorBidi"/>
+          <w:color w:val="auto"/>
+          <w:sz w:val="24"/>
+          <w:szCs w:val="24"/>
+        </w:rPr>
+        <w:t>Low-cost uncrewed systems disturb that arithmetic, a shift which</w:t>
+      </w:r>
+      <w:r>
+        <w:rPr>
+          <w:rFonts w:asciiTheme="minorHAnsi" w:eastAsiaTheme="minorHAnsi" w:hAnsiTheme="minorHAnsi" w:cstheme="minorBidi"/>
+          <w:color w:val="auto"/>
+          <w:sz w:val="24"/>
+          <w:szCs w:val="24"/>
+        </w:rPr>
+        <w:t xml:space="preserve"> Lanchester Force Equations</w:t>
+      </w:r>
+      <w:r>
+        <w:rPr>
+          <w:rStyle w:val="FootnoteReference"/>
+          <w:rFonts w:asciiTheme="minorHAnsi" w:eastAsiaTheme="minorHAnsi" w:hAnsiTheme="minorHAnsi" w:cstheme="minorBidi"/>
+          <w:color w:val="auto"/>
+          <w:sz w:val="24"/>
+          <w:szCs w:val="24"/>
+        </w:rPr>
+        <w:footnoteReference w:id="10"/>
+      </w:r>
+      <w:r>
+        <w:rPr>
+          <w:rFonts w:asciiTheme="minorHAnsi" w:eastAsiaTheme="minorHAnsi" w:hAnsiTheme="minorHAnsi" w:cstheme="minorBidi"/>
+          <w:color w:val="auto"/>
+          <w:sz w:val="24"/>
+          <w:szCs w:val="24"/>
+        </w:rPr>
+        <w:t xml:space="preserve"> and the 3:1 heuristic</w:t>
+      </w:r>
+      <w:r>
+        <w:rPr>
+          <w:rStyle w:val="FootnoteReference"/>
+          <w:rFonts w:asciiTheme="minorHAnsi" w:eastAsiaTheme="minorHAnsi" w:hAnsiTheme="minorHAnsi" w:cstheme="minorBidi"/>
+          <w:color w:val="auto"/>
+          <w:sz w:val="24"/>
+          <w:szCs w:val="24"/>
+        </w:rPr>
+        <w:footnoteReference w:id="11"/>
+      </w:r>
+      <w:r>
+        <w:rPr>
+          <w:rFonts w:asciiTheme="minorHAnsi" w:eastAsiaTheme="minorHAnsi" w:hAnsiTheme="minorHAnsi" w:cstheme="minorBidi"/>
+          <w:color w:val="auto"/>
+          <w:sz w:val="24"/>
+          <w:szCs w:val="24"/>
+        </w:rPr>
+        <w:t xml:space="preserve"> </w:t>
+      </w:r>
+      <w:r>
+        <w:rPr>
+          <w:rFonts w:asciiTheme="minorHAnsi" w:eastAsiaTheme="minorHAnsi" w:hAnsiTheme="minorHAnsi" w:cstheme="minorBidi"/>
+          <w:color w:val="auto"/>
+          <w:sz w:val="24"/>
+          <w:szCs w:val="24"/>
+        </w:rPr>
+        <w:t>help frame but cannot fully capture.</w:t>
+      </w:r>
+      <w:r>
+        <w:rPr>
+          <w:rFonts w:asciiTheme="minorHAnsi" w:eastAsiaTheme="minorHAnsi" w:hAnsiTheme="minorHAnsi" w:cstheme="minorBidi"/>
+          <w:color w:val="auto"/>
+          <w:sz w:val="24"/>
+          <w:szCs w:val="24"/>
+        </w:rPr>
+        <w:t xml:space="preserve"> </w:t>
+      </w:r>
+      <w:r>
+        <w:rPr>
+          <w:rFonts w:asciiTheme="minorHAnsi" w:eastAsiaTheme="minorHAnsi" w:hAnsiTheme="minorHAnsi" w:cstheme="minorBidi"/>
+          <w:color w:val="auto"/>
+          <w:sz w:val="24"/>
+          <w:szCs w:val="24"/>
+        </w:rPr>
+        <w:t xml:space="preserve">They drive down the price of three functions that once demanded expensive platforms: finding the enemy, striking them precisely and sustaining the force. A defender who can see, strike at range and attrit an attacker with systems costing hundreds rather than millions need not match him platform-for-platform. The asymmetry is structural: the attacker must still mass to break through, yet massing is exactly what persistent observation punishes most. For a state </w:t>
+      </w:r>
+      <w:r>
+        <w:rPr>
+          <w:rFonts w:asciiTheme="minorHAnsi" w:eastAsiaTheme="minorHAnsi" w:hAnsiTheme="minorHAnsi" w:cstheme="minorBidi"/>
+          <w:color w:val="auto"/>
+          <w:sz w:val="24"/>
+          <w:szCs w:val="24"/>
+        </w:rPr>
+        <w:t>which</w:t>
+      </w:r>
+      <w:r>
+        <w:rPr>
+          <w:rFonts w:asciiTheme="minorHAnsi" w:eastAsiaTheme="minorHAnsi" w:hAnsiTheme="minorHAnsi" w:cstheme="minorBidi"/>
+          <w:color w:val="auto"/>
+          <w:sz w:val="24"/>
+          <w:szCs w:val="24"/>
+        </w:rPr>
+        <w:t xml:space="preserve"> cannot buy conventional scale, this is how scarcity stops being decisive – denial without parity.</w:t>
+      </w:r>
+    </w:p>
+    <w:p/>
+    <w:p>
+      <w:r>
+        <w:fldChar w:fldCharType="begin"/>
+      </w:r>
+      <w:r>
+        <w:instrText xml:space="preserve"> REF _Ref233053446 \h </w:instrText>
+      </w:r>
+      <w:r>
+        <w:fldChar w:fldCharType="separate"/>
+      </w:r>
+      <w:r>
+        <w:t xml:space="preserve">Table </w:t>
+      </w:r>
+      <w:r>
+        <w:rPr>
+          <w:noProof/>
+        </w:rPr>
+        <w:t>1</w:t>
+      </w:r>
+      <w:r>
+        <w:fldChar w:fldCharType="end"/>
+      </w:r>
+      <w:r>
+        <w:t xml:space="preserve"> </w:t>
+      </w:r>
+      <w:r>
+        <w:t xml:space="preserve">shows that FPV-OWADs cannot be dismissed as cheap substitutes for Javelin. The operational comparison is the telling one: defeating an armoured company costs roughly €1.13 million in Javelins, compared with under €85,000 in FPV-OWADs – more than an order of magnitude less for the same task, on assumptions generous to Javelin. Ireland's recent Javelin-only procurement buys 44 missiles; the same budget fields thousands of FPV-OWADs. Javelin remains the higher-confidence kill mechanism, and FPV-OWADs may require several strikes to destroy armour, </w:t>
+      </w:r>
+      <w:r>
+        <w:t>but they can immobilise it for follow-on fires and reach more than an order of magnitude further.</w:t>
+      </w:r>
+      <w:r>
+        <w:t xml:space="preserve"> The direction is unambiguous: FPV-OWADs do not replace ATGMs, but they change the defensive arithmetic and can no longer be ignored</w:t>
+      </w:r>
+      <w:r>
+        <w:t>.</w:t>
+      </w:r>
+      <w:r>
+        <w:rPr>
+          <w:rStyle w:val="FootnoteReference"/>
+        </w:rPr>
+        <w:footnoteReference w:id="12"/>
+      </w:r>
+      <w:r>
+        <w:t xml:space="preserve"> </w:t>
+      </w:r>
+      <w:r>
+        <w:rPr>
+          <w:rStyle w:val="FootnoteReference"/>
+        </w:rPr>
+        <w:footnoteReference w:id="13"/>
+      </w:r>
+    </w:p>
+    <w:p>
+      <w:pPr>
+        <w:keepNext/>
+      </w:pPr>
+      <w:r>
+        <w:rPr>
+          <w:noProof/>
+        </w:rPr>
         <w:lastRenderedPageBreak/>
-        <w:t xml:space="preserve"> </w:t>
-      </w:r>
-    </w:p>
-    <w:p>
-      <w:pPr>
-        <w:pStyle w:val="Heading2"/>
-        <w:rPr>
-          <w:rFonts w:asciiTheme="minorHAnsi" w:eastAsiaTheme="minorHAnsi" w:hAnsiTheme="minorHAnsi" w:cstheme="minorBidi"/>
-          <w:color w:val="auto"/>
-          <w:sz w:val="24"/>
-          <w:szCs w:val="24"/>
-        </w:rPr>
-      </w:pPr>
-      <w:r>
-        <w:rPr>
-          <w:rFonts w:asciiTheme="minorHAnsi" w:eastAsiaTheme="minorHAnsi" w:hAnsiTheme="minorHAnsi" w:cstheme="minorBidi"/>
-          <w:color w:val="auto"/>
-          <w:sz w:val="24"/>
-          <w:szCs w:val="24"/>
-        </w:rPr>
-        <w:t>Land warfare now turns on a single question: who is observed, when</w:t>
-      </w:r>
-      <w:r>
-        <w:rPr>
-          <w:rFonts w:asciiTheme="minorHAnsi" w:eastAsiaTheme="minorHAnsi" w:hAnsiTheme="minorHAnsi" w:cstheme="minorBidi"/>
-          <w:color w:val="auto"/>
-          <w:sz w:val="24"/>
-          <w:szCs w:val="24"/>
-        </w:rPr>
-        <w:t xml:space="preserve"> and</w:t>
-      </w:r>
-      <w:r>
-        <w:rPr>
-          <w:rFonts w:asciiTheme="minorHAnsi" w:eastAsiaTheme="minorHAnsi" w:hAnsiTheme="minorHAnsi" w:cstheme="minorBidi"/>
-          <w:color w:val="auto"/>
-          <w:sz w:val="24"/>
-          <w:szCs w:val="24"/>
-        </w:rPr>
-        <w:t xml:space="preserve"> how fast that observation becomes fire. Cheap sensors and democratised precision strike have compressed the interval between being seen and being hit to seconds</w:t>
-      </w:r>
-      <w:r>
-        <w:rPr>
-          <w:rFonts w:asciiTheme="minorHAnsi" w:eastAsiaTheme="minorHAnsi" w:hAnsiTheme="minorHAnsi" w:cstheme="minorBidi"/>
-          <w:color w:val="auto"/>
-          <w:sz w:val="24"/>
-          <w:szCs w:val="24"/>
-        </w:rPr>
-        <w:t xml:space="preserve"> and</w:t>
-      </w:r>
-      <w:r>
-        <w:rPr>
-          <w:rFonts w:asciiTheme="minorHAnsi" w:eastAsiaTheme="minorHAnsi" w:hAnsiTheme="minorHAnsi" w:cstheme="minorBidi"/>
-          <w:color w:val="auto"/>
-          <w:sz w:val="24"/>
-          <w:szCs w:val="24"/>
-        </w:rPr>
-        <w:t xml:space="preserve"> that compression has changed what movement costs. To move is to generate signature</w:t>
-      </w:r>
-      <w:r>
-        <w:rPr>
-          <w:rFonts w:asciiTheme="minorHAnsi" w:eastAsiaTheme="minorHAnsi" w:hAnsiTheme="minorHAnsi" w:cstheme="minorBidi"/>
-          <w:color w:val="auto"/>
-          <w:sz w:val="24"/>
-          <w:szCs w:val="24"/>
-        </w:rPr>
-        <w:t xml:space="preserve"> – </w:t>
-      </w:r>
-      <w:r>
-        <w:rPr>
-          <w:rFonts w:asciiTheme="minorHAnsi" w:eastAsiaTheme="minorHAnsi" w:hAnsiTheme="minorHAnsi" w:cstheme="minorBidi"/>
-          <w:color w:val="auto"/>
-          <w:sz w:val="24"/>
-          <w:szCs w:val="24"/>
-        </w:rPr>
-        <w:t>across space, where a force can be seen; across time, since the longer it is exposed the more targetable it grows; and across the electromagnetic spectrum, where every emission betrays position. Manoeuvre has not been abolished, but its price has risen sharply. It survives only where sensing, concealment, electronic warfare and fires are sequenced to buy a temporary window. Exposure has therefore displaced terrain as the variable around which tactical action organises: the first question is no longer where to move, but whether movement can be afforded at all.</w:t>
-      </w:r>
-    </w:p>
-    <w:p>
-      <w:pPr>
-        <w:pStyle w:val="Heading2"/>
-        <w:rPr>
-          <w:rFonts w:asciiTheme="minorHAnsi" w:eastAsiaTheme="minorHAnsi" w:hAnsiTheme="minorHAnsi" w:cstheme="minorBidi"/>
-          <w:color w:val="auto"/>
-          <w:sz w:val="24"/>
-          <w:szCs w:val="24"/>
-        </w:rPr>
-      </w:pPr>
-      <w:r>
-        <w:rPr>
-          <w:rFonts w:asciiTheme="minorHAnsi" w:eastAsiaTheme="minorHAnsi" w:hAnsiTheme="minorHAnsi" w:cstheme="minorBidi"/>
-          <w:color w:val="auto"/>
-          <w:sz w:val="24"/>
-          <w:szCs w:val="24"/>
-        </w:rPr>
-        <w:t>Ireland has no national security strategy and no settled defence policy; the Defence Policy Review</w:t>
-      </w:r>
-      <w:r>
-        <w:rPr>
-          <w:rStyle w:val="FootnoteReference"/>
-          <w:rFonts w:asciiTheme="minorHAnsi" w:eastAsiaTheme="minorHAnsi" w:hAnsiTheme="minorHAnsi" w:cstheme="minorBidi"/>
-          <w:color w:val="auto"/>
-          <w:sz w:val="24"/>
-          <w:szCs w:val="24"/>
-        </w:rPr>
-        <w:footnoteReference w:id="1"/>
-      </w:r>
-      <w:r>
-        <w:rPr>
-          <w:rFonts w:asciiTheme="minorHAnsi" w:eastAsiaTheme="minorHAnsi" w:hAnsiTheme="minorHAnsi" w:cstheme="minorBidi"/>
-          <w:color w:val="auto"/>
-          <w:sz w:val="24"/>
-          <w:szCs w:val="24"/>
-        </w:rPr>
-        <w:t xml:space="preserve"> </w:t>
-      </w:r>
-      <w:r>
-        <w:rPr>
-          <w:rFonts w:asciiTheme="minorHAnsi" w:eastAsiaTheme="minorHAnsi" w:hAnsiTheme="minorHAnsi" w:cstheme="minorBidi"/>
-          <w:color w:val="auto"/>
-          <w:sz w:val="24"/>
-          <w:szCs w:val="24"/>
-        </w:rPr>
-        <w:t xml:space="preserve">updates the White </w:t>
-      </w:r>
-      <w:r>
-        <w:rPr>
-          <w:rFonts w:asciiTheme="minorHAnsi" w:eastAsiaTheme="minorHAnsi" w:hAnsiTheme="minorHAnsi" w:cstheme="minorBidi"/>
-          <w:color w:val="auto"/>
-          <w:sz w:val="24"/>
-          <w:szCs w:val="24"/>
-        </w:rPr>
-        <w:t>Paper</w:t>
-      </w:r>
-      <w:r>
-        <w:rPr>
-          <w:rStyle w:val="FootnoteReference"/>
-          <w:rFonts w:asciiTheme="minorHAnsi" w:eastAsiaTheme="minorHAnsi" w:hAnsiTheme="minorHAnsi" w:cstheme="minorBidi"/>
-          <w:color w:val="auto"/>
-          <w:sz w:val="24"/>
-          <w:szCs w:val="24"/>
-        </w:rPr>
-        <w:footnoteReference w:id="2"/>
-      </w:r>
-      <w:r>
-        <w:rPr>
-          <w:rFonts w:asciiTheme="minorHAnsi" w:eastAsiaTheme="minorHAnsi" w:hAnsiTheme="minorHAnsi" w:cstheme="minorBidi"/>
-          <w:color w:val="auto"/>
-          <w:sz w:val="24"/>
-          <w:szCs w:val="24"/>
-        </w:rPr>
-        <w:t>, constituting</w:t>
-      </w:r>
-      <w:r>
-        <w:rPr>
-          <w:rFonts w:asciiTheme="minorHAnsi" w:eastAsiaTheme="minorHAnsi" w:hAnsiTheme="minorHAnsi" w:cstheme="minorBidi"/>
-          <w:color w:val="auto"/>
-          <w:sz w:val="24"/>
-          <w:szCs w:val="24"/>
-        </w:rPr>
-        <w:t xml:space="preserve"> a de facto substitute</w:t>
-      </w:r>
-      <w:r>
-        <w:rPr>
-          <w:rFonts w:asciiTheme="minorHAnsi" w:eastAsiaTheme="minorHAnsi" w:hAnsiTheme="minorHAnsi" w:cstheme="minorBidi"/>
-          <w:color w:val="auto"/>
-          <w:sz w:val="24"/>
-          <w:szCs w:val="24"/>
-        </w:rPr>
-        <w:t xml:space="preserve">. </w:t>
-      </w:r>
-      <w:r>
-        <w:rPr>
-          <w:rFonts w:asciiTheme="minorHAnsi" w:eastAsiaTheme="minorHAnsi" w:hAnsiTheme="minorHAnsi" w:cstheme="minorBidi"/>
-          <w:color w:val="auto"/>
-          <w:sz w:val="24"/>
-          <w:szCs w:val="24"/>
-        </w:rPr>
-        <w:t>The military is tasked</w:t>
-      </w:r>
-      <w:r>
-        <w:rPr>
-          <w:rFonts w:asciiTheme="minorHAnsi" w:eastAsiaTheme="minorHAnsi" w:hAnsiTheme="minorHAnsi" w:cstheme="minorBidi"/>
-          <w:color w:val="auto"/>
-          <w:sz w:val="24"/>
-          <w:szCs w:val="24"/>
-        </w:rPr>
-        <w:t xml:space="preserve"> “</w:t>
-      </w:r>
-      <w:r>
-        <w:rPr>
-          <w:rFonts w:asciiTheme="minorHAnsi" w:eastAsiaTheme="minorHAnsi" w:hAnsiTheme="minorHAnsi" w:cstheme="minorBidi"/>
-          <w:color w:val="auto"/>
-          <w:sz w:val="24"/>
-          <w:szCs w:val="24"/>
-        </w:rPr>
-        <w:t>To provide for the military Defence of the</w:t>
-      </w:r>
-      <w:r>
-        <w:rPr>
-          <w:rFonts w:asciiTheme="minorHAnsi" w:eastAsiaTheme="minorHAnsi" w:hAnsiTheme="minorHAnsi" w:cstheme="minorBidi"/>
-          <w:color w:val="auto"/>
-          <w:sz w:val="24"/>
-          <w:szCs w:val="24"/>
-        </w:rPr>
-        <w:t xml:space="preserve"> </w:t>
-      </w:r>
-      <w:r>
-        <w:rPr>
-          <w:rFonts w:asciiTheme="minorHAnsi" w:eastAsiaTheme="minorHAnsi" w:hAnsiTheme="minorHAnsi" w:cstheme="minorBidi"/>
-          <w:color w:val="auto"/>
-          <w:sz w:val="24"/>
-          <w:szCs w:val="24"/>
-        </w:rPr>
-        <w:t>State from armed aggression</w:t>
-      </w:r>
-      <w:r>
-        <w:rPr>
-          <w:rFonts w:asciiTheme="minorHAnsi" w:eastAsiaTheme="minorHAnsi" w:hAnsiTheme="minorHAnsi" w:cstheme="minorBidi"/>
-          <w:color w:val="auto"/>
-          <w:sz w:val="24"/>
-          <w:szCs w:val="24"/>
-        </w:rPr>
-        <w:t>”.</w:t>
-      </w:r>
-      <w:r>
-        <w:rPr>
-          <w:rFonts w:asciiTheme="minorHAnsi" w:eastAsiaTheme="minorHAnsi" w:hAnsiTheme="minorHAnsi" w:cstheme="minorBidi"/>
-          <w:color w:val="auto"/>
-          <w:sz w:val="24"/>
-          <w:szCs w:val="24"/>
-        </w:rPr>
-        <w:t xml:space="preserve"> </w:t>
-      </w:r>
-      <w:r>
-        <w:rPr>
-          <w:rFonts w:asciiTheme="minorHAnsi" w:eastAsiaTheme="minorHAnsi" w:hAnsiTheme="minorHAnsi" w:cstheme="minorBidi"/>
-          <w:color w:val="auto"/>
-          <w:sz w:val="24"/>
-          <w:szCs w:val="24"/>
-        </w:rPr>
-        <w:t>While m</w:t>
-      </w:r>
-      <w:r>
-        <w:rPr>
-          <w:rFonts w:asciiTheme="minorHAnsi" w:eastAsiaTheme="minorHAnsi" w:hAnsiTheme="minorHAnsi" w:cstheme="minorBidi"/>
-          <w:color w:val="auto"/>
-          <w:sz w:val="24"/>
-          <w:szCs w:val="24"/>
-        </w:rPr>
-        <w:t xml:space="preserve">ilitary </w:t>
-      </w:r>
-      <w:r>
-        <w:rPr>
-          <w:rFonts w:asciiTheme="minorHAnsi" w:eastAsiaTheme="minorHAnsi" w:hAnsiTheme="minorHAnsi" w:cstheme="minorBidi"/>
-          <w:color w:val="auto"/>
-          <w:sz w:val="24"/>
-          <w:szCs w:val="24"/>
-        </w:rPr>
-        <w:t>strategy and operations</w:t>
-      </w:r>
-      <w:r>
-        <w:rPr>
-          <w:rFonts w:asciiTheme="minorHAnsi" w:eastAsiaTheme="minorHAnsi" w:hAnsiTheme="minorHAnsi" w:cstheme="minorBidi"/>
-          <w:color w:val="auto"/>
-          <w:sz w:val="24"/>
-          <w:szCs w:val="24"/>
-        </w:rPr>
-        <w:t xml:space="preserve"> can organise effort</w:t>
-      </w:r>
-      <w:r>
-        <w:rPr>
-          <w:rFonts w:asciiTheme="minorHAnsi" w:eastAsiaTheme="minorHAnsi" w:hAnsiTheme="minorHAnsi" w:cstheme="minorBidi"/>
-          <w:color w:val="auto"/>
-          <w:sz w:val="24"/>
-          <w:szCs w:val="24"/>
-        </w:rPr>
-        <w:t>, they</w:t>
-      </w:r>
-      <w:r>
-        <w:rPr>
-          <w:rFonts w:asciiTheme="minorHAnsi" w:eastAsiaTheme="minorHAnsi" w:hAnsiTheme="minorHAnsi" w:cstheme="minorBidi"/>
-          <w:color w:val="auto"/>
-          <w:sz w:val="24"/>
-          <w:szCs w:val="24"/>
-        </w:rPr>
-        <w:t xml:space="preserve"> </w:t>
-      </w:r>
-      <w:r>
-        <w:rPr>
-          <w:rFonts w:asciiTheme="minorHAnsi" w:eastAsiaTheme="minorHAnsi" w:hAnsiTheme="minorHAnsi" w:cstheme="minorBidi"/>
-          <w:color w:val="auto"/>
-          <w:sz w:val="24"/>
-          <w:szCs w:val="24"/>
-        </w:rPr>
-        <w:t>require</w:t>
-      </w:r>
-      <w:r>
-        <w:rPr>
-          <w:rFonts w:asciiTheme="minorHAnsi" w:eastAsiaTheme="minorHAnsi" w:hAnsiTheme="minorHAnsi" w:cstheme="minorBidi"/>
-          <w:color w:val="auto"/>
-          <w:sz w:val="24"/>
-          <w:szCs w:val="24"/>
-        </w:rPr>
-        <w:t xml:space="preserve"> </w:t>
-      </w:r>
-      <w:r>
-        <w:rPr>
-          <w:rFonts w:asciiTheme="minorHAnsi" w:eastAsiaTheme="minorHAnsi" w:hAnsiTheme="minorHAnsi" w:cstheme="minorBidi"/>
-          <w:color w:val="auto"/>
-          <w:sz w:val="24"/>
-          <w:szCs w:val="24"/>
-        </w:rPr>
-        <w:t>policy</w:t>
-      </w:r>
-      <w:r>
-        <w:rPr>
-          <w:rFonts w:asciiTheme="minorHAnsi" w:eastAsiaTheme="minorHAnsi" w:hAnsiTheme="minorHAnsi" w:cstheme="minorBidi"/>
-          <w:color w:val="auto"/>
-          <w:sz w:val="24"/>
-          <w:szCs w:val="24"/>
-        </w:rPr>
-        <w:t xml:space="preserve">. In that vacuum, force design drifts toward continuity. </w:t>
-      </w:r>
-      <w:r>
-        <w:rPr>
-          <w:rFonts w:asciiTheme="minorHAnsi" w:eastAsiaTheme="minorHAnsi" w:hAnsiTheme="minorHAnsi" w:cstheme="minorBidi"/>
-          <w:color w:val="auto"/>
-          <w:sz w:val="24"/>
-          <w:szCs w:val="24"/>
-        </w:rPr>
-        <w:t>T</w:t>
-      </w:r>
-      <w:r>
-        <w:rPr>
-          <w:rFonts w:asciiTheme="minorHAnsi" w:eastAsiaTheme="minorHAnsi" w:hAnsiTheme="minorHAnsi" w:cstheme="minorBidi"/>
-          <w:color w:val="auto"/>
-          <w:sz w:val="24"/>
-          <w:szCs w:val="24"/>
-        </w:rPr>
-        <w:t>erritorial defence is no longer implausible – it is politically constrained, under-resourced and increasingly likely.</w:t>
-      </w:r>
-      <w:r>
-        <w:rPr>
-          <w:rFonts w:asciiTheme="minorHAnsi" w:eastAsiaTheme="minorHAnsi" w:hAnsiTheme="minorHAnsi" w:cstheme="minorBidi"/>
-          <w:color w:val="auto"/>
-          <w:sz w:val="24"/>
-          <w:szCs w:val="24"/>
-        </w:rPr>
-        <w:t xml:space="preserve"> Recent</w:t>
-      </w:r>
-      <w:r>
-        <w:rPr>
-          <w:rFonts w:asciiTheme="minorHAnsi" w:eastAsiaTheme="minorHAnsi" w:hAnsiTheme="minorHAnsi" w:cstheme="minorBidi"/>
-          <w:color w:val="auto"/>
-          <w:sz w:val="24"/>
-          <w:szCs w:val="24"/>
-        </w:rPr>
-        <w:t xml:space="preserve"> developments</w:t>
-      </w:r>
-      <w:r>
-        <w:rPr>
-          <w:rFonts w:asciiTheme="minorHAnsi" w:eastAsiaTheme="minorHAnsi" w:hAnsiTheme="minorHAnsi" w:cstheme="minorBidi"/>
-          <w:color w:val="auto"/>
-          <w:sz w:val="24"/>
-          <w:szCs w:val="24"/>
-        </w:rPr>
-        <w:t xml:space="preserve"> </w:t>
-      </w:r>
-      <w:r>
-        <w:rPr>
-          <w:rFonts w:asciiTheme="minorHAnsi" w:eastAsiaTheme="minorHAnsi" w:hAnsiTheme="minorHAnsi" w:cstheme="minorBidi"/>
-          <w:color w:val="auto"/>
-          <w:sz w:val="24"/>
-          <w:szCs w:val="24"/>
-        </w:rPr>
-        <w:t xml:space="preserve">among Western states </w:t>
-      </w:r>
-      <w:r>
-        <w:rPr>
-          <w:rFonts w:asciiTheme="minorHAnsi" w:eastAsiaTheme="minorHAnsi" w:hAnsiTheme="minorHAnsi" w:cstheme="minorBidi"/>
-          <w:color w:val="auto"/>
-          <w:sz w:val="24"/>
-          <w:szCs w:val="24"/>
-        </w:rPr>
-        <w:t>–</w:t>
-      </w:r>
-      <w:r>
-        <w:rPr>
-          <w:rFonts w:asciiTheme="minorHAnsi" w:eastAsiaTheme="minorHAnsi" w:hAnsiTheme="minorHAnsi" w:cstheme="minorBidi"/>
-          <w:color w:val="auto"/>
-          <w:sz w:val="24"/>
-          <w:szCs w:val="24"/>
-        </w:rPr>
-        <w:t xml:space="preserve"> most notably the United States’ assertions regarding</w:t>
-      </w:r>
-      <w:r>
-        <w:rPr>
-          <w:rFonts w:asciiTheme="minorHAnsi" w:eastAsiaTheme="minorHAnsi" w:hAnsiTheme="minorHAnsi" w:cstheme="minorBidi"/>
-          <w:color w:val="auto"/>
-          <w:sz w:val="24"/>
-          <w:szCs w:val="24"/>
-        </w:rPr>
-        <w:t xml:space="preserve"> </w:t>
-      </w:r>
-      <w:r>
-        <w:rPr>
-          <w:rFonts w:asciiTheme="minorHAnsi" w:eastAsiaTheme="minorHAnsi" w:hAnsiTheme="minorHAnsi" w:cstheme="minorBidi"/>
-          <w:color w:val="auto"/>
-          <w:sz w:val="24"/>
-          <w:szCs w:val="24"/>
-        </w:rPr>
-        <w:t>Greenland</w:t>
-      </w:r>
-      <w:r>
-        <w:rPr>
-          <w:rStyle w:val="FootnoteReference"/>
-          <w:rFonts w:asciiTheme="minorHAnsi" w:eastAsiaTheme="minorHAnsi" w:hAnsiTheme="minorHAnsi" w:cstheme="minorBidi"/>
-          <w:color w:val="auto"/>
-          <w:sz w:val="24"/>
-          <w:szCs w:val="24"/>
-        </w:rPr>
-        <w:footnoteReference w:id="3"/>
-      </w:r>
-      <w:r>
-        <w:rPr>
-          <w:rFonts w:asciiTheme="minorHAnsi" w:eastAsiaTheme="minorHAnsi" w:hAnsiTheme="minorHAnsi" w:cstheme="minorBidi"/>
-          <w:color w:val="auto"/>
-          <w:sz w:val="24"/>
-          <w:szCs w:val="24"/>
-        </w:rPr>
-        <w:t xml:space="preserve"> and Denmark’s response</w:t>
-      </w:r>
-      <w:r>
-        <w:rPr>
-          <w:rStyle w:val="FootnoteReference"/>
-          <w:rFonts w:asciiTheme="minorHAnsi" w:eastAsiaTheme="minorHAnsi" w:hAnsiTheme="minorHAnsi" w:cstheme="minorBidi"/>
-          <w:color w:val="auto"/>
-          <w:sz w:val="24"/>
-          <w:szCs w:val="24"/>
-        </w:rPr>
-        <w:footnoteReference w:id="4"/>
-      </w:r>
-      <w:r>
-        <w:rPr>
-          <w:rFonts w:asciiTheme="minorHAnsi" w:eastAsiaTheme="minorHAnsi" w:hAnsiTheme="minorHAnsi" w:cstheme="minorBidi"/>
-          <w:color w:val="auto"/>
-          <w:sz w:val="24"/>
-          <w:szCs w:val="24"/>
-        </w:rPr>
-        <w:t xml:space="preserve"> </w:t>
-      </w:r>
-      <w:r>
-        <w:rPr>
-          <w:rFonts w:asciiTheme="minorHAnsi" w:eastAsiaTheme="minorHAnsi" w:hAnsiTheme="minorHAnsi" w:cstheme="minorBidi"/>
-          <w:color w:val="auto"/>
-          <w:sz w:val="24"/>
-          <w:szCs w:val="24"/>
-        </w:rPr>
-        <w:t xml:space="preserve"> </w:t>
-      </w:r>
-      <w:r>
-        <w:rPr>
-          <w:rFonts w:asciiTheme="minorHAnsi" w:eastAsiaTheme="minorHAnsi" w:hAnsiTheme="minorHAnsi" w:cstheme="minorBidi"/>
-          <w:color w:val="auto"/>
-          <w:sz w:val="24"/>
-          <w:szCs w:val="24"/>
-        </w:rPr>
-        <w:t>–</w:t>
-      </w:r>
-      <w:r>
-        <w:rPr>
-          <w:rFonts w:asciiTheme="minorHAnsi" w:eastAsiaTheme="minorHAnsi" w:hAnsiTheme="minorHAnsi" w:cstheme="minorBidi"/>
-          <w:color w:val="auto"/>
-          <w:sz w:val="24"/>
-          <w:szCs w:val="24"/>
-        </w:rPr>
-        <w:t xml:space="preserve"> </w:t>
-      </w:r>
-      <w:r>
-        <w:rPr>
-          <w:rFonts w:asciiTheme="minorHAnsi" w:eastAsiaTheme="minorHAnsi" w:hAnsiTheme="minorHAnsi" w:cstheme="minorBidi"/>
-          <w:color w:val="auto"/>
-          <w:sz w:val="24"/>
-          <w:szCs w:val="24"/>
-        </w:rPr>
-        <w:t xml:space="preserve">demonstrate that scenarios once considered </w:t>
-      </w:r>
-      <w:r>
-        <w:rPr>
-          <w:rFonts w:asciiTheme="minorHAnsi" w:eastAsiaTheme="minorHAnsi" w:hAnsiTheme="minorHAnsi" w:cstheme="minorBidi"/>
-          <w:color w:val="auto"/>
-          <w:sz w:val="24"/>
-          <w:szCs w:val="24"/>
-        </w:rPr>
-        <w:t>unlikely</w:t>
-      </w:r>
-      <w:r>
-        <w:rPr>
-          <w:rFonts w:asciiTheme="minorHAnsi" w:eastAsiaTheme="minorHAnsi" w:hAnsiTheme="minorHAnsi" w:cstheme="minorBidi"/>
-          <w:color w:val="auto"/>
-          <w:sz w:val="24"/>
-          <w:szCs w:val="24"/>
-        </w:rPr>
-        <w:t xml:space="preserve"> can rapidly</w:t>
-      </w:r>
-      <w:r>
-        <w:rPr>
-          <w:rFonts w:asciiTheme="minorHAnsi" w:eastAsiaTheme="minorHAnsi" w:hAnsiTheme="minorHAnsi" w:cstheme="minorBidi"/>
-          <w:color w:val="auto"/>
-          <w:sz w:val="24"/>
-          <w:szCs w:val="24"/>
-        </w:rPr>
-        <w:t xml:space="preserve"> </w:t>
-      </w:r>
-      <w:r>
-        <w:rPr>
-          <w:rFonts w:asciiTheme="minorHAnsi" w:eastAsiaTheme="minorHAnsi" w:hAnsiTheme="minorHAnsi" w:cstheme="minorBidi"/>
-          <w:color w:val="auto"/>
-          <w:sz w:val="24"/>
-          <w:szCs w:val="24"/>
-        </w:rPr>
-        <w:t xml:space="preserve">acquire </w:t>
-      </w:r>
-      <w:r>
-        <w:rPr>
-          <w:rFonts w:asciiTheme="minorHAnsi" w:eastAsiaTheme="minorHAnsi" w:hAnsiTheme="minorHAnsi" w:cstheme="minorBidi"/>
-          <w:color w:val="auto"/>
-          <w:sz w:val="24"/>
-          <w:szCs w:val="24"/>
-        </w:rPr>
-        <w:t>s</w:t>
-      </w:r>
-      <w:r>
-        <w:rPr>
-          <w:rFonts w:asciiTheme="minorHAnsi" w:eastAsiaTheme="minorHAnsi" w:hAnsiTheme="minorHAnsi" w:cstheme="minorBidi"/>
-          <w:color w:val="auto"/>
-          <w:sz w:val="24"/>
-          <w:szCs w:val="24"/>
-        </w:rPr>
-        <w:t>trategic salience. The perception of threat is an unreliable indicator for future</w:t>
-      </w:r>
-      <w:r>
-        <w:rPr>
-          <w:rFonts w:asciiTheme="minorHAnsi" w:eastAsiaTheme="minorHAnsi" w:hAnsiTheme="minorHAnsi" w:cstheme="minorBidi"/>
-          <w:color w:val="auto"/>
-          <w:sz w:val="24"/>
-          <w:szCs w:val="24"/>
-        </w:rPr>
-        <w:t xml:space="preserve"> </w:t>
-      </w:r>
-      <w:r>
-        <w:rPr>
-          <w:rFonts w:asciiTheme="minorHAnsi" w:eastAsiaTheme="minorHAnsi" w:hAnsiTheme="minorHAnsi" w:cstheme="minorBidi"/>
-          <w:color w:val="auto"/>
-          <w:sz w:val="24"/>
-          <w:szCs w:val="24"/>
-        </w:rPr>
-        <w:t xml:space="preserve">conflict. Failure to internalise the implications of </w:t>
-      </w:r>
-      <w:proofErr w:type="spellStart"/>
-      <w:r>
-        <w:rPr>
-          <w:rFonts w:asciiTheme="minorHAnsi" w:eastAsiaTheme="minorHAnsi" w:hAnsiTheme="minorHAnsi" w:cstheme="minorBidi"/>
-          <w:color w:val="auto"/>
-          <w:sz w:val="24"/>
-          <w:szCs w:val="24"/>
-        </w:rPr>
-        <w:t>UxS</w:t>
-      </w:r>
-      <w:proofErr w:type="spellEnd"/>
-      <w:r>
-        <w:rPr>
-          <w:rFonts w:asciiTheme="minorHAnsi" w:eastAsiaTheme="minorHAnsi" w:hAnsiTheme="minorHAnsi" w:cstheme="minorBidi"/>
-          <w:color w:val="auto"/>
-          <w:sz w:val="24"/>
-          <w:szCs w:val="24"/>
-        </w:rPr>
-        <w:t xml:space="preserve"> risks entrenching a force posture</w:t>
-      </w:r>
-      <w:r>
-        <w:rPr>
-          <w:rFonts w:asciiTheme="minorHAnsi" w:eastAsiaTheme="minorHAnsi" w:hAnsiTheme="minorHAnsi" w:cstheme="minorBidi"/>
-          <w:color w:val="auto"/>
-          <w:sz w:val="24"/>
-          <w:szCs w:val="24"/>
-        </w:rPr>
-        <w:t xml:space="preserve"> </w:t>
-      </w:r>
-      <w:r>
-        <w:rPr>
-          <w:rFonts w:asciiTheme="minorHAnsi" w:eastAsiaTheme="minorHAnsi" w:hAnsiTheme="minorHAnsi" w:cstheme="minorBidi"/>
-          <w:color w:val="auto"/>
-          <w:sz w:val="24"/>
-          <w:szCs w:val="24"/>
-        </w:rPr>
-        <w:t>optimised for conditions which no longer exist</w:t>
-      </w:r>
-      <w:r>
-        <w:rPr>
-          <w:rFonts w:asciiTheme="minorHAnsi" w:eastAsiaTheme="minorHAnsi" w:hAnsiTheme="minorHAnsi" w:cstheme="minorBidi"/>
-          <w:color w:val="auto"/>
-          <w:sz w:val="24"/>
-          <w:szCs w:val="24"/>
-        </w:rPr>
-        <w:t>,</w:t>
-      </w:r>
-      <w:r>
-        <w:rPr>
-          <w:rFonts w:asciiTheme="minorHAnsi" w:eastAsiaTheme="minorHAnsi" w:hAnsiTheme="minorHAnsi" w:cstheme="minorBidi"/>
-          <w:color w:val="auto"/>
-          <w:sz w:val="24"/>
-          <w:szCs w:val="24"/>
-        </w:rPr>
-        <w:t xml:space="preserve"> allowing force design decisions to prioritise</w:t>
-      </w:r>
-      <w:r>
-        <w:rPr>
-          <w:rFonts w:asciiTheme="minorHAnsi" w:eastAsiaTheme="minorHAnsi" w:hAnsiTheme="minorHAnsi" w:cstheme="minorBidi"/>
-          <w:color w:val="auto"/>
-          <w:sz w:val="24"/>
-          <w:szCs w:val="24"/>
-        </w:rPr>
-        <w:t xml:space="preserve"> </w:t>
-      </w:r>
-      <w:r>
-        <w:rPr>
-          <w:rFonts w:asciiTheme="minorHAnsi" w:eastAsiaTheme="minorHAnsi" w:hAnsiTheme="minorHAnsi" w:cstheme="minorBidi"/>
-          <w:color w:val="auto"/>
-          <w:sz w:val="24"/>
-          <w:szCs w:val="24"/>
-        </w:rPr>
-        <w:t>continuity over adaptation and without articulating a theory of victory.</w:t>
-      </w:r>
-      <w:r>
-        <w:rPr>
-          <w:rFonts w:asciiTheme="minorHAnsi" w:eastAsiaTheme="minorHAnsi" w:hAnsiTheme="minorHAnsi" w:cstheme="minorBidi"/>
-          <w:color w:val="auto"/>
-          <w:sz w:val="24"/>
-          <w:szCs w:val="24"/>
-        </w:rPr>
-        <w:t xml:space="preserve"> [</w:t>
-      </w:r>
-      <w:r>
-        <w:rPr>
-          <w:rFonts w:asciiTheme="minorHAnsi" w:eastAsiaTheme="minorHAnsi" w:hAnsiTheme="minorHAnsi" w:cstheme="minorBidi"/>
-          <w:color w:val="auto"/>
-          <w:sz w:val="24"/>
-          <w:szCs w:val="24"/>
-          <w:highlight w:val="yellow"/>
-        </w:rPr>
-        <w:t>OB: please proof the ideas here, they’re still in draft though</w:t>
-      </w:r>
-      <w:r>
-        <w:rPr>
-          <w:rFonts w:asciiTheme="minorHAnsi" w:eastAsiaTheme="minorHAnsi" w:hAnsiTheme="minorHAnsi" w:cstheme="minorBidi"/>
-          <w:color w:val="auto"/>
-          <w:sz w:val="24"/>
-          <w:szCs w:val="24"/>
-        </w:rPr>
-        <w:t>]</w:t>
-      </w:r>
-    </w:p>
-    <w:p>
-      <w:pPr>
-        <w:pStyle w:val="Heading2"/>
-        <w:rPr>
-          <w:rFonts w:asciiTheme="minorHAnsi" w:eastAsiaTheme="minorHAnsi" w:hAnsiTheme="minorHAnsi" w:cstheme="minorBidi"/>
-          <w:color w:val="auto"/>
-          <w:sz w:val="24"/>
-          <w:szCs w:val="24"/>
-        </w:rPr>
-      </w:pPr>
-      <w:r>
-        <w:rPr>
-          <w:rFonts w:asciiTheme="minorHAnsi" w:eastAsiaTheme="minorHAnsi" w:hAnsiTheme="minorHAnsi" w:cstheme="minorBidi"/>
-          <w:color w:val="auto"/>
-          <w:sz w:val="24"/>
-          <w:szCs w:val="24"/>
-        </w:rPr>
-        <w:lastRenderedPageBreak/>
-        <w:t>While capability is sometimes viewed as equipment, it is best considered as the synthesis which DOTMLPF-I describes – doctrine, organisation, training, materiel, leadership, personnel, facilities and interoperability – and Ireland's nine-soldier light infantry section fails against nearly every line. Its doctrine</w:t>
-      </w:r>
-      <w:r>
-        <w:rPr>
-          <w:rStyle w:val="FootnoteReference"/>
-          <w:rFonts w:asciiTheme="minorHAnsi" w:eastAsiaTheme="minorHAnsi" w:hAnsiTheme="minorHAnsi" w:cstheme="minorBidi"/>
-          <w:color w:val="auto"/>
-          <w:sz w:val="24"/>
-          <w:szCs w:val="24"/>
-        </w:rPr>
-        <w:footnoteReference w:id="5"/>
-      </w:r>
-      <w:r>
-        <w:rPr>
-          <w:rFonts w:asciiTheme="minorHAnsi" w:eastAsiaTheme="minorHAnsi" w:hAnsiTheme="minorHAnsi" w:cstheme="minorBidi"/>
-          <w:color w:val="auto"/>
-          <w:sz w:val="24"/>
-          <w:szCs w:val="24"/>
-        </w:rPr>
-        <w:t xml:space="preserve"> remains that of a foot-mobile light infantry section, never updated to the reality that the vehicles carrying it seat eight. </w:t>
-      </w:r>
-      <w:r>
-        <w:rPr>
-          <w:rFonts w:asciiTheme="minorHAnsi" w:eastAsiaTheme="minorHAnsi" w:hAnsiTheme="minorHAnsi" w:cstheme="minorBidi"/>
-          <w:color w:val="auto"/>
-          <w:sz w:val="24"/>
-          <w:szCs w:val="24"/>
-        </w:rPr>
-        <w:t xml:space="preserve">Its organisation </w:t>
-      </w:r>
-      <w:r>
-        <w:rPr>
-          <w:rFonts w:asciiTheme="minorHAnsi" w:eastAsiaTheme="minorHAnsi" w:hAnsiTheme="minorHAnsi" w:cstheme="minorBidi"/>
-          <w:color w:val="auto"/>
-          <w:sz w:val="24"/>
-          <w:szCs w:val="24"/>
-        </w:rPr>
-        <w:t>may</w:t>
-      </w:r>
-      <w:r>
-        <w:rPr>
-          <w:rFonts w:asciiTheme="minorHAnsi" w:eastAsiaTheme="minorHAnsi" w:hAnsiTheme="minorHAnsi" w:cstheme="minorBidi"/>
-          <w:color w:val="auto"/>
-          <w:sz w:val="24"/>
-          <w:szCs w:val="24"/>
-        </w:rPr>
-        <w:t xml:space="preserve"> now be</w:t>
-      </w:r>
-      <w:r>
-        <w:rPr>
-          <w:rFonts w:asciiTheme="minorHAnsi" w:eastAsiaTheme="minorHAnsi" w:hAnsiTheme="minorHAnsi" w:cstheme="minorBidi"/>
-          <w:color w:val="auto"/>
-          <w:sz w:val="24"/>
-          <w:szCs w:val="24"/>
-        </w:rPr>
-        <w:t xml:space="preserve"> </w:t>
-      </w:r>
-      <w:r>
-        <w:rPr>
-          <w:rFonts w:asciiTheme="minorHAnsi" w:eastAsiaTheme="minorHAnsi" w:hAnsiTheme="minorHAnsi" w:cstheme="minorBidi"/>
-          <w:color w:val="auto"/>
-          <w:sz w:val="24"/>
-          <w:szCs w:val="24"/>
-        </w:rPr>
-        <w:t>rebuilt around vehicle capacity</w:t>
-      </w:r>
-      <w:r>
-        <w:rPr>
-          <w:rStyle w:val="FootnoteReference"/>
-          <w:rFonts w:asciiTheme="minorHAnsi" w:eastAsiaTheme="minorHAnsi" w:hAnsiTheme="minorHAnsi" w:cstheme="minorBidi"/>
-          <w:color w:val="auto"/>
-          <w:sz w:val="24"/>
-          <w:szCs w:val="24"/>
-        </w:rPr>
-        <w:footnoteReference w:id="6"/>
-      </w:r>
-      <w:r>
-        <w:rPr>
-          <w:rFonts w:asciiTheme="minorHAnsi" w:eastAsiaTheme="minorHAnsi" w:hAnsiTheme="minorHAnsi" w:cstheme="minorBidi"/>
-          <w:color w:val="auto"/>
-          <w:sz w:val="24"/>
-          <w:szCs w:val="24"/>
-        </w:rPr>
-        <w:t xml:space="preserve">, </w:t>
-      </w:r>
-      <w:r>
-        <w:rPr>
-          <w:rFonts w:asciiTheme="minorHAnsi" w:eastAsiaTheme="minorHAnsi" w:hAnsiTheme="minorHAnsi" w:cstheme="minorBidi"/>
-          <w:color w:val="auto"/>
-          <w:sz w:val="24"/>
-          <w:szCs w:val="24"/>
-        </w:rPr>
-        <w:t xml:space="preserve">perhaps </w:t>
-      </w:r>
-      <w:r>
-        <w:rPr>
-          <w:rFonts w:asciiTheme="minorHAnsi" w:eastAsiaTheme="minorHAnsi" w:hAnsiTheme="minorHAnsi" w:cstheme="minorBidi"/>
-          <w:color w:val="auto"/>
-          <w:sz w:val="24"/>
-          <w:szCs w:val="24"/>
-        </w:rPr>
-        <w:t>on the assumption that one section must fit one carrier. This is a constraint which belongs to mechanised and armoured formations – and binds even them less rigidly than it is applied</w:t>
-      </w:r>
-      <w:r>
-        <w:rPr>
-          <w:rFonts w:asciiTheme="minorHAnsi" w:eastAsiaTheme="minorHAnsi" w:hAnsiTheme="minorHAnsi" w:cstheme="minorBidi"/>
-          <w:color w:val="auto"/>
-          <w:sz w:val="24"/>
-          <w:szCs w:val="24"/>
-        </w:rPr>
-        <w:t>. I</w:t>
-      </w:r>
-      <w:r>
-        <w:rPr>
-          <w:rFonts w:asciiTheme="minorHAnsi" w:eastAsiaTheme="minorHAnsi" w:hAnsiTheme="minorHAnsi" w:cstheme="minorBidi"/>
-          <w:color w:val="auto"/>
-          <w:sz w:val="24"/>
-          <w:szCs w:val="24"/>
-        </w:rPr>
-        <w:t xml:space="preserve">t does not bind light infantry, which moves on foot or </w:t>
-      </w:r>
-      <w:r>
-        <w:rPr>
-          <w:rFonts w:asciiTheme="minorHAnsi" w:eastAsiaTheme="minorHAnsi" w:hAnsiTheme="minorHAnsi" w:cstheme="minorBidi"/>
-          <w:color w:val="auto"/>
-          <w:sz w:val="24"/>
-          <w:szCs w:val="24"/>
-        </w:rPr>
-        <w:t>in soft-skin vehicles – increasingly ATVs such as</w:t>
-      </w:r>
-      <w:r>
-        <w:rPr>
-          <w:rFonts w:asciiTheme="minorHAnsi" w:eastAsiaTheme="minorHAnsi" w:hAnsiTheme="minorHAnsi" w:cstheme="minorBidi"/>
-          <w:color w:val="auto"/>
-          <w:sz w:val="24"/>
-          <w:szCs w:val="24"/>
-        </w:rPr>
-        <w:t xml:space="preserve"> the ULTV</w:t>
-      </w:r>
-      <w:r>
-        <w:rPr>
-          <w:rStyle w:val="FootnoteReference"/>
-          <w:rFonts w:asciiTheme="minorHAnsi" w:eastAsiaTheme="minorHAnsi" w:hAnsiTheme="minorHAnsi" w:cstheme="minorBidi"/>
-          <w:color w:val="auto"/>
-          <w:sz w:val="24"/>
-          <w:szCs w:val="24"/>
-        </w:rPr>
-        <w:footnoteReference w:id="7"/>
-      </w:r>
-      <w:r>
-        <w:rPr>
-          <w:rFonts w:asciiTheme="minorHAnsi" w:eastAsiaTheme="minorHAnsi" w:hAnsiTheme="minorHAnsi" w:cstheme="minorBidi"/>
-          <w:color w:val="auto"/>
-          <w:sz w:val="24"/>
-          <w:szCs w:val="24"/>
-        </w:rPr>
-        <w:t>.</w:t>
-      </w:r>
-      <w:r>
-        <w:rPr>
-          <w:rFonts w:asciiTheme="minorHAnsi" w:eastAsiaTheme="minorHAnsi" w:hAnsiTheme="minorHAnsi" w:cstheme="minorBidi"/>
-          <w:color w:val="auto"/>
-          <w:sz w:val="24"/>
-          <w:szCs w:val="24"/>
-        </w:rPr>
-        <w:t xml:space="preserve"> </w:t>
-      </w:r>
-      <w:r>
-        <w:rPr>
-          <w:rFonts w:asciiTheme="minorHAnsi" w:eastAsiaTheme="minorHAnsi" w:hAnsiTheme="minorHAnsi" w:cstheme="minorBidi"/>
-          <w:color w:val="auto"/>
-          <w:sz w:val="24"/>
-          <w:szCs w:val="24"/>
-        </w:rPr>
-        <w:t>Its training still rehearses the conventional drills of the last century and the peace-support tasks of the decades since, while neglecting cognitive burden, dispersion and the exposure of a dispersed section that can be found and struck on a checkpoint or a convoy as readily as in battle, without the higher-echelon cover it is built to assume. Its materiel reflects a Cold War mentality. Its leadership structure is not configured for mission command. And it fields too few soldiers to carry the cognitive load, operate the new systems and remain cohesive once dispersed. Adding drones to this section changes none of it.</w:t>
-      </w:r>
-    </w:p>
-    <w:p>
-      <w:r>
-        <w:rPr>
-          <w:highlight w:val="yellow"/>
-        </w:rPr>
-        <w:t>OB: I will reference TM 201 as proof that doctrine hasn’t changed. However, I think I want to cite paragraph 0202 “The fundamental role of the infantry man/woman has changed little over recent centuries: their tasks are still to close with and destroy the enemy or force them to surrender, to seize and hold terrain, to dominate and control close country and finally, to carry out close surveillance”. Then we can say that the first task – their most important – cannot be achieved without substantial review of the doctrine, organisation, training, leadership, materiel,</w:t>
-      </w:r>
-      <w:r>
-        <w:t xml:space="preserve"> </w:t>
-      </w:r>
-    </w:p>
-    <w:p/>
-    <w:p>
-      <w:pPr>
-        <w:pStyle w:val="Heading2"/>
-        <w:rPr>
-          <w:rFonts w:asciiTheme="minorHAnsi" w:eastAsiaTheme="minorHAnsi" w:hAnsiTheme="minorHAnsi" w:cstheme="minorBidi"/>
-          <w:color w:val="auto"/>
-          <w:sz w:val="24"/>
-          <w:szCs w:val="24"/>
-        </w:rPr>
-      </w:pPr>
-      <w:r>
-        <w:rPr>
-          <w:rFonts w:asciiTheme="minorHAnsi" w:eastAsiaTheme="minorHAnsi" w:hAnsiTheme="minorHAnsi" w:cstheme="minorBidi"/>
-          <w:color w:val="auto"/>
-          <w:sz w:val="24"/>
-          <w:szCs w:val="24"/>
-        </w:rPr>
-        <w:lastRenderedPageBreak/>
-        <w:t>Relative combat power has always rewarded the side that can mass force and absorb loss</w:t>
-      </w:r>
-      <w:r>
-        <w:rPr>
-          <w:rFonts w:asciiTheme="minorHAnsi" w:eastAsiaTheme="minorHAnsi" w:hAnsiTheme="minorHAnsi" w:cstheme="minorBidi"/>
-          <w:color w:val="auto"/>
-          <w:sz w:val="24"/>
-          <w:szCs w:val="24"/>
-        </w:rPr>
-        <w:t xml:space="preserve"> – </w:t>
-      </w:r>
-      <w:r>
-        <w:rPr>
-          <w:rFonts w:asciiTheme="minorHAnsi" w:eastAsiaTheme="minorHAnsi" w:hAnsiTheme="minorHAnsi" w:cstheme="minorBidi"/>
-          <w:color w:val="auto"/>
-          <w:sz w:val="24"/>
-          <w:szCs w:val="24"/>
-        </w:rPr>
-        <w:t xml:space="preserve">historically the better-funded one. Low-cost uncrewed systems disturb that arithmetic. They drive down the price of three functions </w:t>
-      </w:r>
-      <w:r>
-        <w:rPr>
-          <w:rFonts w:asciiTheme="minorHAnsi" w:eastAsiaTheme="minorHAnsi" w:hAnsiTheme="minorHAnsi" w:cstheme="minorBidi"/>
-          <w:color w:val="auto"/>
-          <w:sz w:val="24"/>
-          <w:szCs w:val="24"/>
-        </w:rPr>
-        <w:t>which</w:t>
-      </w:r>
-      <w:r>
-        <w:rPr>
-          <w:rFonts w:asciiTheme="minorHAnsi" w:eastAsiaTheme="minorHAnsi" w:hAnsiTheme="minorHAnsi" w:cstheme="minorBidi"/>
-          <w:color w:val="auto"/>
-          <w:sz w:val="24"/>
-          <w:szCs w:val="24"/>
-        </w:rPr>
-        <w:t xml:space="preserve"> once demanded expensive platforms: finding the enemy, striking </w:t>
-      </w:r>
-      <w:r>
-        <w:rPr>
-          <w:rFonts w:asciiTheme="minorHAnsi" w:eastAsiaTheme="minorHAnsi" w:hAnsiTheme="minorHAnsi" w:cstheme="minorBidi"/>
-          <w:color w:val="auto"/>
-          <w:sz w:val="24"/>
-          <w:szCs w:val="24"/>
-        </w:rPr>
-        <w:t>them</w:t>
-      </w:r>
-      <w:r>
-        <w:rPr>
-          <w:rFonts w:asciiTheme="minorHAnsi" w:eastAsiaTheme="minorHAnsi" w:hAnsiTheme="minorHAnsi" w:cstheme="minorBidi"/>
-          <w:color w:val="auto"/>
-          <w:sz w:val="24"/>
-          <w:szCs w:val="24"/>
-        </w:rPr>
-        <w:t xml:space="preserve"> precisely</w:t>
-      </w:r>
-      <w:r>
-        <w:rPr>
-          <w:rFonts w:asciiTheme="minorHAnsi" w:eastAsiaTheme="minorHAnsi" w:hAnsiTheme="minorHAnsi" w:cstheme="minorBidi"/>
-          <w:color w:val="auto"/>
-          <w:sz w:val="24"/>
-          <w:szCs w:val="24"/>
-        </w:rPr>
-        <w:t xml:space="preserve"> and</w:t>
-      </w:r>
-      <w:r>
-        <w:rPr>
-          <w:rFonts w:asciiTheme="minorHAnsi" w:eastAsiaTheme="minorHAnsi" w:hAnsiTheme="minorHAnsi" w:cstheme="minorBidi"/>
-          <w:color w:val="auto"/>
-          <w:sz w:val="24"/>
-          <w:szCs w:val="24"/>
-        </w:rPr>
-        <w:t xml:space="preserve"> sustaining the force. A defender who can see, range and attrit an attacker using systems costing hundreds rather than millions no longer </w:t>
-      </w:r>
-      <w:proofErr w:type="gramStart"/>
-      <w:r>
-        <w:rPr>
-          <w:rFonts w:asciiTheme="minorHAnsi" w:eastAsiaTheme="minorHAnsi" w:hAnsiTheme="minorHAnsi" w:cstheme="minorBidi"/>
-          <w:color w:val="auto"/>
-          <w:sz w:val="24"/>
-          <w:szCs w:val="24"/>
-        </w:rPr>
-        <w:t>has to</w:t>
-      </w:r>
-      <w:proofErr w:type="gramEnd"/>
-      <w:r>
-        <w:rPr>
-          <w:rFonts w:asciiTheme="minorHAnsi" w:eastAsiaTheme="minorHAnsi" w:hAnsiTheme="minorHAnsi" w:cstheme="minorBidi"/>
-          <w:color w:val="auto"/>
-          <w:sz w:val="24"/>
-          <w:szCs w:val="24"/>
-        </w:rPr>
-        <w:t xml:space="preserve"> match that attacker platform-for-</w:t>
-      </w:r>
-      <w:r>
-        <w:rPr>
-          <w:rFonts w:asciiTheme="minorHAnsi" w:eastAsiaTheme="minorHAnsi" w:hAnsiTheme="minorHAnsi" w:cstheme="minorBidi"/>
-          <w:color w:val="auto"/>
-          <w:sz w:val="24"/>
-          <w:szCs w:val="24"/>
-        </w:rPr>
-        <w:t>platform</w:t>
-      </w:r>
-      <w:r>
-        <w:rPr>
-          <w:rFonts w:asciiTheme="minorHAnsi" w:eastAsiaTheme="minorHAnsi" w:hAnsiTheme="minorHAnsi" w:cstheme="minorBidi"/>
-          <w:color w:val="auto"/>
-          <w:sz w:val="24"/>
-          <w:szCs w:val="24"/>
-        </w:rPr>
-        <w:t>. The effect is asymmetric: the attacker must still mass to break through, yet massing is exactly what persistent observation punishes most. So</w:t>
-      </w:r>
-      <w:r>
-        <w:rPr>
-          <w:rFonts w:asciiTheme="minorHAnsi" w:eastAsiaTheme="minorHAnsi" w:hAnsiTheme="minorHAnsi" w:cstheme="minorBidi"/>
-          <w:color w:val="auto"/>
-          <w:sz w:val="24"/>
-          <w:szCs w:val="24"/>
-        </w:rPr>
-        <w:t>,</w:t>
-      </w:r>
-      <w:r>
-        <w:rPr>
-          <w:rFonts w:asciiTheme="minorHAnsi" w:eastAsiaTheme="minorHAnsi" w:hAnsiTheme="minorHAnsi" w:cstheme="minorBidi"/>
-          <w:color w:val="auto"/>
-          <w:sz w:val="24"/>
-          <w:szCs w:val="24"/>
-        </w:rPr>
-        <w:t xml:space="preserve"> the cost of the attacker's strongest move rises while the defender's means of imposing that cost stays cheap. For a state that cannot buy conventional scale, this is the mechanism by which scarcity stops being decisive</w:t>
-      </w:r>
-      <w:r>
-        <w:rPr>
-          <w:rFonts w:asciiTheme="minorHAnsi" w:eastAsiaTheme="minorHAnsi" w:hAnsiTheme="minorHAnsi" w:cstheme="minorBidi"/>
-          <w:color w:val="auto"/>
-          <w:sz w:val="24"/>
-          <w:szCs w:val="24"/>
-        </w:rPr>
-        <w:t xml:space="preserve"> – </w:t>
-      </w:r>
-      <w:r>
-        <w:rPr>
-          <w:rFonts w:asciiTheme="minorHAnsi" w:eastAsiaTheme="minorHAnsi" w:hAnsiTheme="minorHAnsi" w:cstheme="minorBidi"/>
-          <w:color w:val="auto"/>
-          <w:sz w:val="24"/>
-          <w:szCs w:val="24"/>
-        </w:rPr>
-        <w:t>denial without parity.</w:t>
-      </w:r>
-    </w:p>
-    <w:p>
-      <w:r>
-        <w:fldChar w:fldCharType="begin"/>
-      </w:r>
-      <w:r>
-        <w:instrText xml:space="preserve"> REF _Ref233053446 \h </w:instrText>
-      </w:r>
-      <w:r>
-        <w:fldChar w:fldCharType="separate"/>
-      </w:r>
-      <w:r>
-        <w:t xml:space="preserve">Table </w:t>
-      </w:r>
-      <w:r>
-        <w:rPr>
-          <w:noProof/>
-        </w:rPr>
-        <w:t>1</w:t>
-      </w:r>
-      <w:r>
-        <w:fldChar w:fldCharType="end"/>
-      </w:r>
-      <w:r>
-        <w:t xml:space="preserve"> </w:t>
-      </w:r>
-      <w:r>
-        <w:t xml:space="preserve">shows that FPV-OWADs cannot be dismissed as cheap substitutes for Javelin. The operational comparison is the telling one: defeating an armoured company costs roughly €1.13 million in Javelins, compared with under €85,000 in FPV-OWADs – more than an order of magnitude less for the same task, on assumptions generous to Javelin. Ireland's recent Javelin-only procurement buys 44 missiles; the same budget fields thousands of FPV-OWADs. Javelin remains the higher-confidence kill mechanism, and FPV-OWADs may require several strikes to destroy armour, </w:t>
-      </w:r>
-      <w:r>
-        <w:t>but they can immobilise it for follow-on fires and reach more than an order of magnitude further.</w:t>
-      </w:r>
-      <w:r>
-        <w:t xml:space="preserve"> The direction is unambiguous: FPV-OWADs do not replace ATGMs, but they change the defensive arithmetic and can no longer be ignored</w:t>
-      </w:r>
-      <w:r>
-        <w:t>.</w:t>
-      </w:r>
-      <w:r>
-        <w:rPr>
-          <w:rStyle w:val="FootnoteReference"/>
-        </w:rPr>
-        <w:footnoteReference w:id="8"/>
-      </w:r>
-      <w:r>
-        <w:t xml:space="preserve"> </w:t>
-      </w:r>
-      <w:r>
-        <w:rPr>
-          <w:rStyle w:val="FootnoteReference"/>
-        </w:rPr>
-        <w:footnoteReference w:id="9"/>
-      </w:r>
-    </w:p>
-    <w:p>
-      <w:pPr>
-        <w:keepNext/>
-      </w:pPr>
-      <w:r>
         <w:drawing>
           <wp:inline distT="0" distB="0" distL="0" distR="0" wp14:anchorId="1ED79B76" wp14:editId="6CD40A73">
             <wp:extent cx="5731510" cy="1757045"/>
@@ -1802,437 +1340,288 @@
           <w:sz w:val="24"/>
           <w:szCs w:val="24"/>
         </w:rPr>
+        <w:t xml:space="preserve">Ireland has long treated serious territorial defence as financially unreachable, because credibility was assumed to require conventional mass. </w:t>
+      </w:r>
+      <w:proofErr w:type="spellStart"/>
+      <w:r>
+        <w:rPr>
+          <w:rFonts w:asciiTheme="minorHAnsi" w:eastAsiaTheme="minorHAnsi" w:hAnsiTheme="minorHAnsi" w:cstheme="minorBidi"/>
+          <w:color w:val="auto"/>
+          <w:sz w:val="24"/>
+          <w:szCs w:val="24"/>
+        </w:rPr>
+        <w:t>UxS</w:t>
+      </w:r>
+      <w:proofErr w:type="spellEnd"/>
+      <w:r>
+        <w:rPr>
+          <w:rFonts w:asciiTheme="minorHAnsi" w:eastAsiaTheme="minorHAnsi" w:hAnsiTheme="minorHAnsi" w:cstheme="minorBidi"/>
+          <w:color w:val="auto"/>
+          <w:sz w:val="24"/>
+          <w:szCs w:val="24"/>
+        </w:rPr>
+        <w:t xml:space="preserve"> break that premise: if cheap precision systems can make lodgement, movement and sustainment costly, the constraint shifts from money to organisation. For an island state, any hostile ground force must first arrive by sea or air, concentrating at a predictable point of entry – where exposure is highest and cheap precision strike most punishing.</w:t>
+      </w:r>
+    </w:p>
+    <w:p>
+      <w:pPr>
+        <w:pStyle w:val="Heading2"/>
+        <w:rPr>
+          <w:rFonts w:asciiTheme="minorHAnsi" w:eastAsiaTheme="minorHAnsi" w:hAnsiTheme="minorHAnsi" w:cstheme="minorBidi"/>
+          <w:color w:val="auto"/>
+          <w:sz w:val="24"/>
+          <w:szCs w:val="24"/>
+        </w:rPr>
+      </w:pPr>
+      <w:r>
+        <w:rPr>
+          <w:rFonts w:asciiTheme="minorHAnsi" w:eastAsiaTheme="minorHAnsi" w:hAnsiTheme="minorHAnsi" w:cstheme="minorBidi"/>
+          <w:color w:val="auto"/>
+          <w:sz w:val="24"/>
+          <w:szCs w:val="24"/>
+        </w:rPr>
+        <w:t xml:space="preserve">Deterrence-by-denial here means one thing: making an attacker doubt that victory will be quick or cheap. A defender need not win. </w:t>
+      </w:r>
+      <w:r>
+        <w:rPr>
+          <w:rFonts w:asciiTheme="minorHAnsi" w:eastAsiaTheme="minorHAnsi" w:hAnsiTheme="minorHAnsi" w:cstheme="minorBidi"/>
+          <w:color w:val="auto"/>
+          <w:sz w:val="24"/>
+          <w:szCs w:val="24"/>
+        </w:rPr>
+        <w:t>They</w:t>
+      </w:r>
+      <w:r>
+        <w:rPr>
+          <w:rFonts w:asciiTheme="minorHAnsi" w:eastAsiaTheme="minorHAnsi" w:hAnsiTheme="minorHAnsi" w:cstheme="minorBidi"/>
+          <w:color w:val="auto"/>
+          <w:sz w:val="24"/>
+          <w:szCs w:val="24"/>
+        </w:rPr>
+        <w:t xml:space="preserve"> need only to impose enough delay, attrition and uncertainty that the operation's price climbs past what the aggressor will pay. It does not stop an attack; it makes the attack expensive, slow and uncertain of success. The effect is cumulative rather than decisive</w:t>
+      </w:r>
+      <w:r>
+        <w:rPr>
+          <w:rFonts w:asciiTheme="minorHAnsi" w:eastAsiaTheme="minorHAnsi" w:hAnsiTheme="minorHAnsi" w:cstheme="minorBidi"/>
+          <w:color w:val="auto"/>
+          <w:sz w:val="24"/>
+          <w:szCs w:val="24"/>
+        </w:rPr>
+        <w:t xml:space="preserve"> — </w:t>
+      </w:r>
+      <w:r>
+        <w:rPr>
+          <w:rFonts w:asciiTheme="minorHAnsi" w:eastAsiaTheme="minorHAnsi" w:hAnsiTheme="minorHAnsi" w:cstheme="minorBidi"/>
+          <w:color w:val="auto"/>
+          <w:sz w:val="24"/>
+          <w:szCs w:val="24"/>
+        </w:rPr>
+        <w:t>a rising bill for movement and sustainment, presented until the bill itself deters.</w:t>
+      </w:r>
+    </w:p>
+    <w:p>
+      <w:pPr>
+        <w:pStyle w:val="NoSpacing"/>
+      </w:pPr>
+      <w:r>
+        <w:t>The recommendations follow directly and cost little to begin. First, adopt the lance-corporal rank: dispersed sections need a commander in each</w:t>
+      </w:r>
+      <w:r>
+        <w:t xml:space="preserve"> and</w:t>
+      </w:r>
+      <w:r>
+        <w:t xml:space="preserve"> the rank structure must catch up to the tactics. Second, experiment properly rather than procure blindly</w:t>
+      </w:r>
+      <w:r>
+        <w:t xml:space="preserve"> — </w:t>
+      </w:r>
+      <w:r>
+        <w:t xml:space="preserve">stand up trial sections at fourteen and fifteen </w:t>
+      </w:r>
+      <w:r>
+        <w:t>soldiers</w:t>
+      </w:r>
+      <w:r>
+        <w:t xml:space="preserve"> (</w:t>
+      </w:r>
+      <w:r>
+        <w:fldChar w:fldCharType="begin"/>
+      </w:r>
+      <w:r>
+        <w:instrText xml:space="preserve"> REF _Ref233060645 \h </w:instrText>
+      </w:r>
+      <w:r>
+        <w:instrText xml:space="preserve"> \* MERGEFORMAT </w:instrText>
+      </w:r>
+      <w:r>
+        <w:fldChar w:fldCharType="separate"/>
+      </w:r>
+      <w:r>
+        <w:t>Figure 1</w:t>
+      </w:r>
+      <w:r>
+        <w:fldChar w:fldCharType="end"/>
+      </w:r>
+      <w:r>
+        <w:t>)</w:t>
+      </w:r>
+      <w:r>
+        <w:t>, test them</w:t>
+      </w:r>
+      <w:r>
+        <w:t xml:space="preserve"> against realistic drone threats</w:t>
+      </w:r>
+      <w:r>
+        <w:t xml:space="preserve"> and</w:t>
+      </w:r>
+      <w:r>
+        <w:t xml:space="preserve"> let the results, not assumption, settle the establishment</w:t>
+      </w:r>
+      <w:r>
+        <w:t xml:space="preserve">. </w:t>
+      </w:r>
+      <w:r>
+        <w:t>Third, write exposure management into doctrine: build signature discipline, drone-halt drills and the sequencing of sensing, electronic warfare and fires into standard operating procedures, syllabi and retraining, with mobile training teams to push the new methods out quickly. None of this requires mass or heavy armour</w:t>
+      </w:r>
+      <w:r>
+        <w:t xml:space="preserve"> and</w:t>
+      </w:r>
+      <w:r>
+        <w:t xml:space="preserve"> none waits on a procurement cycle. The first move is organisational, not financial</w:t>
+      </w:r>
+      <w:r>
+        <w:t xml:space="preserve"> — </w:t>
+      </w:r>
+      <w:r>
+        <w:t>which is precisely why the constraint that stalled Irish defence no longer holds.</w:t>
+      </w:r>
+    </w:p>
+    <w:p>
+      <w:pPr>
+        <w:keepNext/>
+        <w:jc w:val="center"/>
+      </w:pPr>
+      <w:r>
         <w:lastRenderedPageBreak/>
-        <w:t>Ireland has long rested an implicit bargain on cost: serious territorial defence means conventional mass</w:t>
-      </w:r>
-      <w:r>
-        <w:rPr>
-          <w:rFonts w:asciiTheme="minorHAnsi" w:eastAsiaTheme="minorHAnsi" w:hAnsiTheme="minorHAnsi" w:cstheme="minorBidi"/>
-          <w:color w:val="auto"/>
-          <w:sz w:val="24"/>
-          <w:szCs w:val="24"/>
-        </w:rPr>
-        <w:t xml:space="preserve"> – </w:t>
-      </w:r>
-      <w:r>
-        <w:rPr>
-          <w:rFonts w:asciiTheme="minorHAnsi" w:eastAsiaTheme="minorHAnsi" w:hAnsiTheme="minorHAnsi" w:cstheme="minorBidi"/>
-          <w:color w:val="auto"/>
-          <w:sz w:val="24"/>
-          <w:szCs w:val="24"/>
-        </w:rPr>
-        <w:t>armour, air defence, layered fires</w:t>
-      </w:r>
-      <w:r>
-        <w:rPr>
-          <w:rFonts w:asciiTheme="minorHAnsi" w:eastAsiaTheme="minorHAnsi" w:hAnsiTheme="minorHAnsi" w:cstheme="minorBidi"/>
-          <w:color w:val="auto"/>
-          <w:sz w:val="24"/>
-          <w:szCs w:val="24"/>
-        </w:rPr>
-        <w:t xml:space="preserve"> – </w:t>
-      </w:r>
-      <w:r>
-        <w:rPr>
-          <w:rFonts w:asciiTheme="minorHAnsi" w:eastAsiaTheme="minorHAnsi" w:hAnsiTheme="minorHAnsi" w:cstheme="minorBidi"/>
-          <w:color w:val="auto"/>
-          <w:sz w:val="24"/>
-          <w:szCs w:val="24"/>
-        </w:rPr>
-        <w:t>and conventional mass is unaffordable, so the ambition is quietly set aside. That logic held only while imposing cost on an attacker required matching his platforms. It no longer does. If a defender can make lodgement, movement and sustainment dangerous using systems priced in the hundreds, the premise that credibility is financially out of reach collapses. The constraint shifts from money to organisation. For an island, the case sharpens further: any hostile ground force must first arrive by sea or air, concentrating at a predictable, observable point of entry</w:t>
-      </w:r>
-      <w:r>
-        <w:rPr>
-          <w:rFonts w:asciiTheme="minorHAnsi" w:eastAsiaTheme="minorHAnsi" w:hAnsiTheme="minorHAnsi" w:cstheme="minorBidi"/>
-          <w:color w:val="auto"/>
-          <w:sz w:val="24"/>
-          <w:szCs w:val="24"/>
-        </w:rPr>
-        <w:t xml:space="preserve"> – </w:t>
-      </w:r>
-      <w:r>
-        <w:rPr>
-          <w:rFonts w:asciiTheme="minorHAnsi" w:eastAsiaTheme="minorHAnsi" w:hAnsiTheme="minorHAnsi" w:cstheme="minorBidi"/>
-          <w:color w:val="auto"/>
-          <w:sz w:val="24"/>
-          <w:szCs w:val="24"/>
-        </w:rPr>
-        <w:t xml:space="preserve">precisely the moment cheap precision strike punishes most. </w:t>
-      </w:r>
-    </w:p>
-    <w:p>
-      <w:pPr>
-        <w:pStyle w:val="Heading2"/>
-        <w:rPr>
-          <w:rFonts w:asciiTheme="minorHAnsi" w:eastAsiaTheme="minorHAnsi" w:hAnsiTheme="minorHAnsi" w:cstheme="minorBidi"/>
-          <w:color w:val="auto"/>
-          <w:sz w:val="24"/>
-          <w:szCs w:val="24"/>
-        </w:rPr>
-      </w:pPr>
-      <w:r>
-        <w:rPr>
-          <w:rFonts w:asciiTheme="minorHAnsi" w:eastAsiaTheme="minorHAnsi" w:hAnsiTheme="minorHAnsi" w:cstheme="minorBidi"/>
-          <w:color w:val="auto"/>
-          <w:sz w:val="24"/>
-          <w:szCs w:val="24"/>
-        </w:rPr>
-        <w:t xml:space="preserve">Deterrence-by-denial here means one thing: making an attacker doubt that victory will be quick or cheap. A defender need not win. </w:t>
-      </w:r>
-      <w:r>
-        <w:rPr>
-          <w:rFonts w:asciiTheme="minorHAnsi" w:eastAsiaTheme="minorHAnsi" w:hAnsiTheme="minorHAnsi" w:cstheme="minorBidi"/>
-          <w:color w:val="auto"/>
-          <w:sz w:val="24"/>
-          <w:szCs w:val="24"/>
-        </w:rPr>
-        <w:t>They</w:t>
-      </w:r>
-      <w:r>
-        <w:rPr>
-          <w:rFonts w:asciiTheme="minorHAnsi" w:eastAsiaTheme="minorHAnsi" w:hAnsiTheme="minorHAnsi" w:cstheme="minorBidi"/>
-          <w:color w:val="auto"/>
-          <w:sz w:val="24"/>
-          <w:szCs w:val="24"/>
-        </w:rPr>
+        <w:drawing>
+          <wp:inline distT="0" distB="0" distL="0" distR="0" wp14:anchorId="3BA8F21E" wp14:editId="0F6E14AC">
+            <wp:extent cx="2709073" cy="1655277"/>
+            <wp:effectExtent l="0" t="0" r="0" b="2540"/>
+            <wp:docPr id="1944379885" name="Picture 1"/>
+            <wp:cNvGraphicFramePr>
+              <a:graphicFrameLocks xmlns:a="http://schemas.openxmlformats.org/drawingml/2006/main" noChangeAspect="1"/>
+            </wp:cNvGraphicFramePr>
+            <a:graphic xmlns:a="http://schemas.openxmlformats.org/drawingml/2006/main">
+              <a:graphicData uri="http://schemas.openxmlformats.org/drawingml/2006/picture">
+                <pic:pic xmlns:pic="http://schemas.openxmlformats.org/drawingml/2006/picture">
+                  <pic:nvPicPr>
+                    <pic:cNvPr id="1944379885" name=""/>
+                    <pic:cNvPicPr/>
+                  </pic:nvPicPr>
+                  <pic:blipFill>
+                    <a:blip r:embed="rId9"/>
+                    <a:stretch>
+                      <a:fillRect/>
+                    </a:stretch>
+                  </pic:blipFill>
+                  <pic:spPr>
+                    <a:xfrm>
+                      <a:off x="0" y="0"/>
+                      <a:ext cx="2723776" cy="1664261"/>
+                    </a:xfrm>
+                    <a:prstGeom prst="rect">
+                      <a:avLst/>
+                    </a:prstGeom>
+                  </pic:spPr>
+                </pic:pic>
+              </a:graphicData>
+            </a:graphic>
+          </wp:inline>
+        </w:drawing>
+      </w:r>
+      <w:r>
+        <w:drawing>
+          <wp:inline distT="0" distB="0" distL="0" distR="0" wp14:anchorId="5294252E" wp14:editId="7ABFAEE1">
+            <wp:extent cx="2907102" cy="1736016"/>
+            <wp:effectExtent l="0" t="0" r="7620" b="0"/>
+            <wp:docPr id="1981208126" name="Picture 1"/>
+            <wp:cNvGraphicFramePr>
+              <a:graphicFrameLocks xmlns:a="http://schemas.openxmlformats.org/drawingml/2006/main" noChangeAspect="1"/>
+            </wp:cNvGraphicFramePr>
+            <a:graphic xmlns:a="http://schemas.openxmlformats.org/drawingml/2006/main">
+              <a:graphicData uri="http://schemas.openxmlformats.org/drawingml/2006/picture">
+                <pic:pic xmlns:pic="http://schemas.openxmlformats.org/drawingml/2006/picture">
+                  <pic:nvPicPr>
+                    <pic:cNvPr id="1981208126" name=""/>
+                    <pic:cNvPicPr/>
+                  </pic:nvPicPr>
+                  <pic:blipFill>
+                    <a:blip r:embed="rId10"/>
+                    <a:stretch>
+                      <a:fillRect/>
+                    </a:stretch>
+                  </pic:blipFill>
+                  <pic:spPr>
+                    <a:xfrm>
+                      <a:off x="0" y="0"/>
+                      <a:ext cx="2918337" cy="1742725"/>
+                    </a:xfrm>
+                    <a:prstGeom prst="rect">
+                      <a:avLst/>
+                    </a:prstGeom>
+                  </pic:spPr>
+                </pic:pic>
+              </a:graphicData>
+            </a:graphic>
+          </wp:inline>
+        </w:drawing>
+      </w:r>
+    </w:p>
+    <w:p>
+      <w:pPr>
+        <w:pStyle w:val="Caption"/>
+        <w:jc w:val="center"/>
+      </w:pPr>
+      <w:bookmarkStart w:id="1" w:name="_Ref233060645"/>
+      <w:r>
+        <w:t xml:space="preserve">Figure </w:t>
+      </w:r>
+      <w:r>
+        <w:fldChar w:fldCharType="begin"/>
+      </w:r>
+      <w:r>
+        <w:instrText xml:space="preserve"> SEQ Figure \* ARABIC </w:instrText>
+      </w:r>
+      <w:r>
+        <w:fldChar w:fldCharType="separate"/>
+      </w:r>
+      <w:r>
+        <w:rPr>
+          <w:noProof/>
+        </w:rPr>
+        <w:t>1</w:t>
+      </w:r>
+      <w:r>
+        <w:fldChar w:fldCharType="end"/>
+      </w:r>
+      <w:bookmarkEnd w:id="1"/>
+      <w:r>
+        <w:t xml:space="preserve">. </w:t>
+      </w:r>
+      <w:r>
         <w:t xml:space="preserve"> </w:t>
       </w:r>
-      <w:proofErr w:type="gramStart"/>
-      <w:r>
-        <w:rPr>
-          <w:rFonts w:asciiTheme="minorHAnsi" w:eastAsiaTheme="minorHAnsi" w:hAnsiTheme="minorHAnsi" w:cstheme="minorBidi"/>
-          <w:color w:val="auto"/>
-          <w:sz w:val="24"/>
-          <w:szCs w:val="24"/>
-        </w:rPr>
-        <w:t>needs</w:t>
-      </w:r>
-      <w:proofErr w:type="gramEnd"/>
-      <w:r>
-        <w:rPr>
-          <w:rFonts w:asciiTheme="minorHAnsi" w:eastAsiaTheme="minorHAnsi" w:hAnsiTheme="minorHAnsi" w:cstheme="minorBidi"/>
-          <w:color w:val="auto"/>
-          <w:sz w:val="24"/>
-          <w:szCs w:val="24"/>
-        </w:rPr>
-        <w:t xml:space="preserve"> only to impose enough delay, attrition and uncertainty that the operation's price climbs past what the aggressor will pay</w:t>
-      </w:r>
-      <w:r>
-        <w:rPr>
-          <w:rFonts w:asciiTheme="minorHAnsi" w:eastAsiaTheme="minorHAnsi" w:hAnsiTheme="minorHAnsi" w:cstheme="minorBidi"/>
-          <w:color w:val="auto"/>
-          <w:sz w:val="24"/>
-          <w:szCs w:val="24"/>
-        </w:rPr>
-        <w:t xml:space="preserve"> – </w:t>
-      </w:r>
-      <w:r>
-        <w:rPr>
-          <w:rFonts w:asciiTheme="minorHAnsi" w:eastAsiaTheme="minorHAnsi" w:hAnsiTheme="minorHAnsi" w:cstheme="minorBidi"/>
-          <w:color w:val="auto"/>
-          <w:sz w:val="24"/>
-          <w:szCs w:val="24"/>
-        </w:rPr>
-        <w:t>and to be seen to be able to. That is the whole of the claim, and its modesty is the point. This is not deterrence by punishment: there is no threat to strike beyond the contested ground, no promise of pain elsewhere. Nor is it a promise to defeat a stronger force. It does not stop an attack; it makes the attack expensive, slow and uncertain of success. The effect is cumulative rather than decisive</w:t>
-      </w:r>
-      <w:r>
-        <w:rPr>
-          <w:rFonts w:asciiTheme="minorHAnsi" w:eastAsiaTheme="minorHAnsi" w:hAnsiTheme="minorHAnsi" w:cstheme="minorBidi"/>
-          <w:color w:val="auto"/>
-          <w:sz w:val="24"/>
-          <w:szCs w:val="24"/>
-        </w:rPr>
-        <w:t xml:space="preserve"> – </w:t>
-      </w:r>
-      <w:r>
-        <w:rPr>
-          <w:rFonts w:asciiTheme="minorHAnsi" w:eastAsiaTheme="minorHAnsi" w:hAnsiTheme="minorHAnsi" w:cstheme="minorBidi"/>
-          <w:color w:val="auto"/>
-          <w:sz w:val="24"/>
-          <w:szCs w:val="24"/>
-        </w:rPr>
-        <w:t>a rising bill for movement and sustainment, presented until the bill itself deters.</w:t>
-      </w:r>
-    </w:p>
-    <w:p>
-      <w:pPr>
-        <w:pStyle w:val="Heading2"/>
-        <w:rPr>
-          <w:rFonts w:asciiTheme="minorHAnsi" w:eastAsiaTheme="minorHAnsi" w:hAnsiTheme="minorHAnsi" w:cstheme="minorBidi"/>
-          <w:color w:val="auto"/>
-          <w:sz w:val="24"/>
-          <w:szCs w:val="24"/>
-        </w:rPr>
-      </w:pPr>
-      <w:r>
-        <w:rPr>
-          <w:rFonts w:asciiTheme="minorHAnsi" w:eastAsiaTheme="minorHAnsi" w:hAnsiTheme="minorHAnsi" w:cstheme="minorBidi"/>
-          <w:color w:val="auto"/>
-          <w:sz w:val="24"/>
-          <w:szCs w:val="24"/>
-        </w:rPr>
-        <w:t xml:space="preserve">A capability </w:t>
-      </w:r>
-      <w:r>
-        <w:rPr>
-          <w:rFonts w:asciiTheme="minorHAnsi" w:eastAsiaTheme="minorHAnsi" w:hAnsiTheme="minorHAnsi" w:cstheme="minorBidi"/>
-          <w:color w:val="auto"/>
-          <w:sz w:val="24"/>
-          <w:szCs w:val="24"/>
-        </w:rPr>
-        <w:t>does not constitute deterrence</w:t>
-      </w:r>
-      <w:r>
-        <w:rPr>
-          <w:rFonts w:asciiTheme="minorHAnsi" w:eastAsiaTheme="minorHAnsi" w:hAnsiTheme="minorHAnsi" w:cstheme="minorBidi"/>
-          <w:color w:val="auto"/>
-          <w:sz w:val="24"/>
-          <w:szCs w:val="24"/>
-        </w:rPr>
-        <w:t>. Drones in a depot impose no cost on an adversary's plan; deterrence is an effect produced in his calculations, not a property of an inventory. For cheap precision to become denial, four things must hold at once. It must be politically owned</w:t>
-      </w:r>
-      <w:r>
-        <w:rPr>
-          <w:rFonts w:asciiTheme="minorHAnsi" w:eastAsiaTheme="minorHAnsi" w:hAnsiTheme="minorHAnsi" w:cstheme="minorBidi"/>
-          <w:color w:val="auto"/>
-          <w:sz w:val="24"/>
-          <w:szCs w:val="24"/>
-        </w:rPr>
-        <w:t xml:space="preserve"> – </w:t>
-      </w:r>
-      <w:r>
-        <w:rPr>
-          <w:rFonts w:asciiTheme="minorHAnsi" w:eastAsiaTheme="minorHAnsi" w:hAnsiTheme="minorHAnsi" w:cstheme="minorBidi"/>
-          <w:color w:val="auto"/>
-          <w:sz w:val="24"/>
-          <w:szCs w:val="24"/>
-        </w:rPr>
-        <w:t>a government decision that territorial defence is a real task, funded as one. It must be credibly fielded</w:t>
-      </w:r>
-      <w:r>
-        <w:rPr>
-          <w:rFonts w:asciiTheme="minorHAnsi" w:eastAsiaTheme="minorHAnsi" w:hAnsiTheme="minorHAnsi" w:cstheme="minorBidi"/>
-          <w:color w:val="auto"/>
-          <w:sz w:val="24"/>
-          <w:szCs w:val="24"/>
-        </w:rPr>
-        <w:t xml:space="preserve"> – </w:t>
-      </w:r>
-      <w:r>
-        <w:rPr>
-          <w:rFonts w:asciiTheme="minorHAnsi" w:eastAsiaTheme="minorHAnsi" w:hAnsiTheme="minorHAnsi" w:cstheme="minorBidi"/>
-          <w:color w:val="auto"/>
-          <w:sz w:val="24"/>
-          <w:szCs w:val="24"/>
-        </w:rPr>
-        <w:t xml:space="preserve">built into a force </w:t>
-      </w:r>
-      <w:proofErr w:type="gramStart"/>
-      <w:r>
-        <w:rPr>
-          <w:rFonts w:asciiTheme="minorHAnsi" w:eastAsiaTheme="minorHAnsi" w:hAnsiTheme="minorHAnsi" w:cstheme="minorBidi"/>
-          <w:color w:val="auto"/>
-          <w:sz w:val="24"/>
-          <w:szCs w:val="24"/>
-        </w:rPr>
-        <w:t>actually organised</w:t>
-      </w:r>
-      <w:proofErr w:type="gramEnd"/>
-      <w:r>
-        <w:rPr>
-          <w:rFonts w:asciiTheme="minorHAnsi" w:eastAsiaTheme="minorHAnsi" w:hAnsiTheme="minorHAnsi" w:cstheme="minorBidi"/>
-          <w:color w:val="auto"/>
-          <w:sz w:val="24"/>
-          <w:szCs w:val="24"/>
-        </w:rPr>
-        <w:t>, trained and structured to use it, not bolted onto legacy units. It must be institutionally sustained</w:t>
-      </w:r>
-      <w:r>
-        <w:rPr>
-          <w:rFonts w:asciiTheme="minorHAnsi" w:eastAsiaTheme="minorHAnsi" w:hAnsiTheme="minorHAnsi" w:cstheme="minorBidi"/>
-          <w:color w:val="auto"/>
-          <w:sz w:val="24"/>
-          <w:szCs w:val="24"/>
-        </w:rPr>
-        <w:t xml:space="preserve"> – </w:t>
-      </w:r>
-      <w:r>
-        <w:rPr>
-          <w:rFonts w:asciiTheme="minorHAnsi" w:eastAsiaTheme="minorHAnsi" w:hAnsiTheme="minorHAnsi" w:cstheme="minorBidi"/>
-          <w:color w:val="auto"/>
-          <w:sz w:val="24"/>
-          <w:szCs w:val="24"/>
-        </w:rPr>
-        <w:t>resilient in supply, command and stocks, so it survives contact rather than collapsing at first loss. And it must be clearly communicated</w:t>
-      </w:r>
-      <w:r>
-        <w:rPr>
-          <w:rFonts w:asciiTheme="minorHAnsi" w:eastAsiaTheme="minorHAnsi" w:hAnsiTheme="minorHAnsi" w:cstheme="minorBidi"/>
-          <w:color w:val="auto"/>
-          <w:sz w:val="24"/>
-          <w:szCs w:val="24"/>
-        </w:rPr>
-        <w:t xml:space="preserve"> – </w:t>
-      </w:r>
-      <w:r>
-        <w:rPr>
-          <w:rFonts w:asciiTheme="minorHAnsi" w:eastAsiaTheme="minorHAnsi" w:hAnsiTheme="minorHAnsi" w:cstheme="minorBidi"/>
-          <w:color w:val="auto"/>
-          <w:sz w:val="24"/>
-          <w:szCs w:val="24"/>
-        </w:rPr>
-        <w:t>legible to an adversary's staff, since cost uncounted is cost undeterred. Remove any one and the others are wasted. The article takes each in turn.</w:t>
-      </w:r>
-    </w:p>
-    <w:p>
-      <w:pPr>
-        <w:pStyle w:val="Heading2"/>
-        <w:rPr>
-          <w:rFonts w:asciiTheme="minorHAnsi" w:eastAsiaTheme="minorHAnsi" w:hAnsiTheme="minorHAnsi" w:cstheme="minorBidi"/>
-          <w:color w:val="auto"/>
-          <w:sz w:val="24"/>
-          <w:szCs w:val="24"/>
-        </w:rPr>
-      </w:pPr>
-      <w:r>
-        <w:rPr>
-          <w:rFonts w:asciiTheme="minorHAnsi" w:eastAsiaTheme="minorHAnsi" w:hAnsiTheme="minorHAnsi" w:cstheme="minorBidi"/>
-          <w:color w:val="auto"/>
-          <w:sz w:val="24"/>
-          <w:szCs w:val="24"/>
-        </w:rPr>
-        <w:t>The recommendations follow directly and cost little to begin. First, adopt the lance-corporal rank: dispersed sections need a commander in each</w:t>
-      </w:r>
-      <w:r>
-        <w:rPr>
-          <w:rFonts w:asciiTheme="minorHAnsi" w:eastAsiaTheme="minorHAnsi" w:hAnsiTheme="minorHAnsi" w:cstheme="minorBidi"/>
-          <w:color w:val="auto"/>
-          <w:sz w:val="24"/>
-          <w:szCs w:val="24"/>
-        </w:rPr>
-        <w:t xml:space="preserve"> and</w:t>
-      </w:r>
-      <w:r>
-        <w:rPr>
-          <w:rFonts w:asciiTheme="minorHAnsi" w:eastAsiaTheme="minorHAnsi" w:hAnsiTheme="minorHAnsi" w:cstheme="minorBidi"/>
-          <w:color w:val="auto"/>
-          <w:sz w:val="24"/>
-          <w:szCs w:val="24"/>
-        </w:rPr>
-        <w:t xml:space="preserve"> the rank structure must catch up to the tactics. Second, experiment properly rather than procure blindly</w:t>
-      </w:r>
-      <w:r>
-        <w:rPr>
-          <w:rFonts w:asciiTheme="minorHAnsi" w:eastAsiaTheme="minorHAnsi" w:hAnsiTheme="minorHAnsi" w:cstheme="minorBidi"/>
-          <w:color w:val="auto"/>
-          <w:sz w:val="24"/>
-          <w:szCs w:val="24"/>
-        </w:rPr>
-        <w:t xml:space="preserve"> – </w:t>
-      </w:r>
-      <w:r>
-        <w:rPr>
-          <w:rFonts w:asciiTheme="minorHAnsi" w:eastAsiaTheme="minorHAnsi" w:hAnsiTheme="minorHAnsi" w:cstheme="minorBidi"/>
-          <w:color w:val="auto"/>
-          <w:sz w:val="24"/>
-          <w:szCs w:val="24"/>
-        </w:rPr>
-        <w:t>stand up trial sections at fourteen and fifteen soldiers, test them against realistic drone threats</w:t>
-      </w:r>
-      <w:r>
-        <w:rPr>
-          <w:rFonts w:asciiTheme="minorHAnsi" w:eastAsiaTheme="minorHAnsi" w:hAnsiTheme="minorHAnsi" w:cstheme="minorBidi"/>
-          <w:color w:val="auto"/>
-          <w:sz w:val="24"/>
-          <w:szCs w:val="24"/>
-        </w:rPr>
-        <w:t xml:space="preserve"> and</w:t>
-      </w:r>
-      <w:r>
-        <w:rPr>
-          <w:rFonts w:asciiTheme="minorHAnsi" w:eastAsiaTheme="minorHAnsi" w:hAnsiTheme="minorHAnsi" w:cstheme="minorBidi"/>
-          <w:color w:val="auto"/>
-          <w:sz w:val="24"/>
-          <w:szCs w:val="24"/>
-        </w:rPr>
-        <w:t xml:space="preserve"> let the results, not assumption, settle the establishment. Third, write exposure management into doctrine: build signature discipline, drone-halt drills and the sequencing of sensing, electronic warfare and fires into standard operating procedures, syllabi and retraining, with mobile training teams to push the new methods out quickly. None of this requires mass or heavy armour</w:t>
-      </w:r>
-      <w:r>
-        <w:rPr>
-          <w:rFonts w:asciiTheme="minorHAnsi" w:eastAsiaTheme="minorHAnsi" w:hAnsiTheme="minorHAnsi" w:cstheme="minorBidi"/>
-          <w:color w:val="auto"/>
-          <w:sz w:val="24"/>
-          <w:szCs w:val="24"/>
-        </w:rPr>
-        <w:t xml:space="preserve"> and</w:t>
-      </w:r>
-      <w:r>
-        <w:rPr>
-          <w:rFonts w:asciiTheme="minorHAnsi" w:eastAsiaTheme="minorHAnsi" w:hAnsiTheme="minorHAnsi" w:cstheme="minorBidi"/>
-          <w:color w:val="auto"/>
-          <w:sz w:val="24"/>
-          <w:szCs w:val="24"/>
-        </w:rPr>
-        <w:t xml:space="preserve"> none waits on a procurement cycle. The first move is organisational, not financial</w:t>
-      </w:r>
-      <w:r>
-        <w:rPr>
-          <w:rFonts w:asciiTheme="minorHAnsi" w:eastAsiaTheme="minorHAnsi" w:hAnsiTheme="minorHAnsi" w:cstheme="minorBidi"/>
-          <w:color w:val="auto"/>
-          <w:sz w:val="24"/>
-          <w:szCs w:val="24"/>
-        </w:rPr>
-        <w:t xml:space="preserve"> – </w:t>
-      </w:r>
-      <w:r>
-        <w:rPr>
-          <w:rFonts w:asciiTheme="minorHAnsi" w:eastAsiaTheme="minorHAnsi" w:hAnsiTheme="minorHAnsi" w:cstheme="minorBidi"/>
-          <w:color w:val="auto"/>
-          <w:sz w:val="24"/>
-          <w:szCs w:val="24"/>
-        </w:rPr>
-        <w:t>which is precisely why the constraint that stalled Irish defence no longer holds.</w:t>
-      </w:r>
-    </w:p>
-    <w:p>
-      <w:pPr>
-        <w:pStyle w:val="Heading2"/>
-        <w:rPr>
-          <w:rFonts w:asciiTheme="minorHAnsi" w:eastAsiaTheme="minorHAnsi" w:hAnsiTheme="minorHAnsi" w:cstheme="minorBidi"/>
-          <w:color w:val="auto"/>
-          <w:sz w:val="24"/>
-          <w:szCs w:val="24"/>
-        </w:rPr>
-      </w:pPr>
-      <w:r>
-        <w:rPr>
-          <w:rFonts w:asciiTheme="minorHAnsi" w:eastAsiaTheme="minorHAnsi" w:hAnsiTheme="minorHAnsi" w:cstheme="minorBidi"/>
-          <w:color w:val="auto"/>
-          <w:sz w:val="24"/>
-          <w:szCs w:val="24"/>
-        </w:rPr>
-        <w:lastRenderedPageBreak/>
-        <w:t xml:space="preserve">One objection runs: change is uncertain, resources unallocated, other programmes mid-stream. Each clause is true. None is a reason to stand still. The quieter version is that force design must fit the platform – an eight-seat carrier sets the section, the section sets the fight. That inverts the logic. The threat sets the survivable section; the carrier is procurement's problem. A vehicle that seats eight when survival demands fourteen is not a cap on the section – it is the wrong vehicle. Nor is experimentation the disruption the objection fears; it is the hedge against it. A trial section commits nothing and costs almost nothing – the iteration a resource-uncertain force should want. The expensive mistake is not testing too early. It is fielding a structure the evidence already calls </w:t>
-      </w:r>
-      <w:proofErr w:type="gramStart"/>
-      <w:r>
-        <w:rPr>
-          <w:rFonts w:asciiTheme="minorHAnsi" w:eastAsiaTheme="minorHAnsi" w:hAnsiTheme="minorHAnsi" w:cstheme="minorBidi"/>
-          <w:color w:val="auto"/>
-          <w:sz w:val="24"/>
-          <w:szCs w:val="24"/>
-        </w:rPr>
-        <w:t>obsolete, and</w:t>
-      </w:r>
-      <w:proofErr w:type="gramEnd"/>
-      <w:r>
-        <w:rPr>
-          <w:rFonts w:asciiTheme="minorHAnsi" w:eastAsiaTheme="minorHAnsi" w:hAnsiTheme="minorHAnsi" w:cstheme="minorBidi"/>
-          <w:color w:val="auto"/>
-          <w:sz w:val="24"/>
-          <w:szCs w:val="24"/>
-        </w:rPr>
-        <w:t xml:space="preserve"> discovering it under fire.</w:t>
+      <w:r>
+        <w:t>Fourteen and f</w:t>
+      </w:r>
+      <w:r>
+        <w:t>ifteen-soldier section</w:t>
+      </w:r>
+      <w:r>
+        <w:t>s</w:t>
+      </w:r>
+      <w:r>
+        <w:t xml:space="preserve"> with organic FPVD, support detachment and separate commander</w:t>
       </w:r>
     </w:p>
     <w:p>
@@ -2244,6 +1633,53 @@
           <w:szCs w:val="32"/>
         </w:rPr>
       </w:pPr>
+      <w:r>
+        <w:t xml:space="preserve">The pace of change is uncertain and programmes are mid-stream </w:t>
+      </w:r>
+      <w:r>
+        <w:t>—</w:t>
+      </w:r>
+      <w:r>
+        <w:t xml:space="preserve"> so reopening the section design now looks premature. Each clause is true. Neither is a reason to stand still. The deeper objection is that force design must fit the platform: the carrier defines the section, the section sets the </w:t>
+      </w:r>
+      <w:r>
+        <w:t>capability</w:t>
+      </w:r>
+      <w:r>
+        <w:t xml:space="preserve">. Vehicle capacity is a real constraint </w:t>
+      </w:r>
+      <w:r>
+        <w:t>—</w:t>
+      </w:r>
+      <w:r>
+        <w:t xml:space="preserve"> </w:t>
+      </w:r>
+      <w:r>
+        <w:t xml:space="preserve">it drives lift, sustainment, command and tactical mobility and cannot be dismissed. But it need not come first. The threat defines force </w:t>
+      </w:r>
+      <w:proofErr w:type="gramStart"/>
+      <w:r>
+        <w:t>protection</w:t>
+      </w:r>
+      <w:proofErr w:type="gramEnd"/>
+      <w:r>
+        <w:t xml:space="preserve"> and force protection drives </w:t>
+      </w:r>
+      <w:r>
+        <w:t>capability development</w:t>
+      </w:r>
+      <w:r>
+        <w:t xml:space="preserve">. Light infantry may not have this problem at all: it needs no armour, moving on foot or in commercial 4x4s already in Defence Forces service. A survivable light section is not an expensive structure waiting on a vehicle programme. It is a cheap one, available now </w:t>
+      </w:r>
+      <w:r>
+        <w:t>—</w:t>
+      </w:r>
+      <w:r>
+        <w:t xml:space="preserve"> </w:t>
+      </w:r>
+      <w:r>
+        <w:t>held back only by a constraint borrowed from a different kind of infantry.</w:t>
+      </w:r>
       <w:r>
         <w:br w:type="page"/>
       </w:r>
@@ -2805,7 +2241,31 @@
         <w:footnoteRef/>
       </w:r>
       <w:r>
-        <w:t xml:space="preserve"> TM 201</w:t>
+        <w:t xml:space="preserve"> </w:t>
+      </w:r>
+      <w:r>
+        <w:t xml:space="preserve">European Defence Agency. </w:t>
+      </w:r>
+      <w:r>
+        <w:rPr>
+          <w:i/>
+          <w:iCs/>
+        </w:rPr>
+        <w:t>The 2023 EU Capability Development Priorities: To Be Ready</w:t>
+      </w:r>
+      <w:r>
+        <w:t xml:space="preserve">. Brussels: European Defence Agency, 2023. Available at: </w:t>
+      </w:r>
+      <w:hyperlink r:id="rId1" w:history="1">
+        <w:r>
+          <w:rPr>
+            <w:rStyle w:val="Hyperlink"/>
+          </w:rPr>
+          <w:t>https://eda.europa.eu/docs/default-source/eda-publications/2023-eu-capability-development-priorities.pdf</w:t>
+        </w:r>
+      </w:hyperlink>
+      <w:r>
+        <w:t xml:space="preserve"> (accessed 22 June 2026).</w:t>
       </w:r>
     </w:p>
   </w:footnote>
@@ -2824,29 +2284,85 @@
         <w:t xml:space="preserve"> </w:t>
       </w:r>
       <w:r>
-        <w:t xml:space="preserve">O'Connor, N. </w:t>
+        <w:t xml:space="preserve">NATO Allied Command Transformation. </w:t>
       </w:r>
       <w:r>
         <w:rPr>
           <w:i/>
           <w:iCs/>
         </w:rPr>
-        <w:t>Ireland Could Be About to Sign €600m Armoured Vehicles Deal, French Arms Firm Says</w:t>
-      </w:r>
-      <w:r>
-        <w:t xml:space="preserve">. </w:t>
+        <w:t>NATO CD&amp;E Handbook: A Concept Developer's Toolbox</w:t>
+      </w:r>
+      <w:r>
+        <w:t xml:space="preserve">. Norfolk, VA: Allied Command Transformation, 2023. Available at: </w:t>
+      </w:r>
+      <w:hyperlink r:id="rId2" w:history="1">
+        <w:r>
+          <w:rPr>
+            <w:rStyle w:val="Hyperlink"/>
+          </w:rPr>
+          <w:t>https://www.act.nato.int/wp-content/uploads/2023/05/NATO-ACT-CDE-Handbook_A_Concept_Developers_Toolbox.pdf</w:t>
+        </w:r>
+      </w:hyperlink>
+      <w:r>
+        <w:t xml:space="preserve"> (accessed 22 June 2026).</w:t>
+      </w:r>
+    </w:p>
+  </w:footnote>
+  <w:footnote w:id="7">
+    <w:p>
+      <w:pPr>
+        <w:pStyle w:val="FootnoteText"/>
+      </w:pPr>
+      <w:r>
+        <w:rPr>
+          <w:rStyle w:val="FootnoteReference"/>
+        </w:rPr>
+        <w:footnoteRef/>
+      </w:r>
+      <w:r>
+        <w:t xml:space="preserve"> TM 201</w:t>
+      </w:r>
+    </w:p>
+  </w:footnote>
+  <w:footnote w:id="8">
+    <w:p>
+      <w:pPr>
+        <w:pStyle w:val="FootnoteText"/>
+      </w:pPr>
+      <w:r>
+        <w:rPr>
+          <w:rStyle w:val="FootnoteReference"/>
+        </w:rPr>
+        <w:footnoteRef/>
+      </w:r>
+      <w:r>
+        <w:t xml:space="preserve"> </w:t>
+      </w:r>
+      <w:r>
+        <w:t xml:space="preserve">O'Connor, N. </w:t>
       </w:r>
       <w:r>
         <w:rPr>
           <w:i/>
           <w:iCs/>
         </w:rPr>
+        <w:t>Ireland Could Be About to Sign €600m Armoured Vehicles Deal, French Arms Firm Says</w:t>
+      </w:r>
+      <w:r>
+        <w:t xml:space="preserve">. </w:t>
+      </w:r>
+      <w:r>
+        <w:rPr>
+          <w:i/>
+          <w:iCs/>
+        </w:rPr>
         <w:t>The Journal</w:t>
       </w:r>
       <w:r>
         <w:t xml:space="preserve">, 2025. Available at: </w:t>
       </w:r>
-      <w:hyperlink r:id="rId1" w:tgtFrame="_new" w:history="1">
+      <w:hyperlink r:id="rId3" w:tgtFrame="_new" w:history="1">
         <w:r>
           <w:rPr>
             <w:rStyle w:val="Hyperlink"/>
@@ -2859,7 +2375,7 @@
       </w:r>
     </w:p>
   </w:footnote>
-  <w:footnote w:id="7">
+  <w:footnote w:id="9">
     <w:p>
       <w:pPr>
         <w:pStyle w:val="FootnoteText"/>
@@ -2896,7 +2412,7 @@
       <w:r>
         <w:t xml:space="preserve">, August 2021. Available at: </w:t>
       </w:r>
-      <w:hyperlink r:id="rId2" w:history="1">
+      <w:hyperlink r:id="rId4" w:history="1">
         <w:r>
           <w:rPr>
             <w:rStyle w:val="Hyperlink"/>
@@ -2914,7 +2430,7 @@
       </w:pPr>
     </w:p>
   </w:footnote>
-  <w:footnote w:id="8">
+  <w:footnote w:id="10">
     <w:p>
       <w:pPr>
         <w:pStyle w:val="FootnoteText"/>
@@ -2929,21 +2445,21 @@
         <w:t xml:space="preserve"> </w:t>
       </w:r>
       <w:r>
-        <w:t xml:space="preserve">Beatty, A. </w:t>
+        <w:t xml:space="preserve">Lanchester, F. W. </w:t>
       </w:r>
       <w:r>
         <w:rPr>
           <w:i/>
           <w:iCs/>
         </w:rPr>
-        <w:t>Movement as Exposure: Uncrewed Systems and the Transformation of Light Infantry Tactics: From Tactical Adaptation to Force Design and Deterrence-by-Denial in a Small State Context</w:t>
-      </w:r>
-      <w:r>
-        <w:t>. MA thesis, Maynooth University, 2026. Available from the Defence Forces Library.</w:t>
+        <w:t>Aircraft in Warfare: The Dawn of the Fourth Arm</w:t>
+      </w:r>
+      <w:r>
+        <w:t>. London: Constable and Company Limited, 1916.</w:t>
       </w:r>
     </w:p>
   </w:footnote>
-  <w:footnote w:id="9">
+  <w:footnote w:id="11">
     <w:p>
       <w:pPr>
         <w:pStyle w:val="FootnoteText"/>
@@ -2958,46 +2474,125 @@
         <w:t xml:space="preserve"> </w:t>
       </w:r>
       <w:r>
-        <w:t xml:space="preserve">The salvo column estimates the number and cost of effectors required to defeat an armoured company. </w:t>
-      </w:r>
-      <w:r>
-        <w:t>Effect is normalised to delivered shaped-charge mass, not raw payload:</w:t>
-      </w:r>
-      <w:r>
-        <w:t xml:space="preserve"> </w:t>
-      </w:r>
-      <w:r>
-        <w:t>OWADs are calculated against the 100</w:t>
-      </w:r>
-      <w:r>
-        <w:t>-</w:t>
-      </w:r>
-      <w:r>
-        <w:t>k</w:t>
-      </w:r>
-      <w:r>
-        <w:t>ilogram</w:t>
-      </w:r>
-      <w:r>
-        <w:t xml:space="preserve"> shaped-charge requirement in Bronk and Watling; Javelin is calculated as six missiles at assumed 100 percent kill probability against the 40–60 per cent immobilisation threshold – an assumption</w:t>
-      </w:r>
-      <w:r>
-        <w:t xml:space="preserve"> which</w:t>
-      </w:r>
-      <w:r>
-        <w:t xml:space="preserve"> flatters Javelin and therefore understates the drone advantage. Bronk, J. and Watling, J. </w:t>
+        <w:t xml:space="preserve">Mearsheimer, J. J. </w:t>
       </w:r>
       <w:r>
         <w:rPr>
           <w:i/>
           <w:iCs/>
         </w:rPr>
+        <w:t>Assessing the Conventional Balance: The 3:1 Rule and Its Critics</w:t>
+      </w:r>
+      <w:r>
+        <w:t xml:space="preserve">. </w:t>
+      </w:r>
+      <w:r>
+        <w:rPr>
+          <w:i/>
+          <w:iCs/>
+        </w:rPr>
+        <w:t>International Security</w:t>
+      </w:r>
+      <w:r>
+        <w:t xml:space="preserve">, 13(4), 1989, pp. 54–89. Available at: </w:t>
+      </w:r>
+      <w:hyperlink r:id="rId5" w:tgtFrame="_new" w:history="1">
+        <w:r>
+          <w:rPr>
+            <w:rStyle w:val="Hyperlink"/>
+          </w:rPr>
+          <w:t>https://www.jstor.org/stable/2538780</w:t>
+        </w:r>
+      </w:hyperlink>
+      <w:r>
+        <w:t xml:space="preserve"> (accessed 29 March 2025).</w:t>
+      </w:r>
+    </w:p>
+  </w:footnote>
+  <w:footnote w:id="12">
+    <w:p>
+      <w:pPr>
+        <w:pStyle w:val="FootnoteText"/>
+      </w:pPr>
+      <w:r>
+        <w:rPr>
+          <w:rStyle w:val="FootnoteReference"/>
+        </w:rPr>
+        <w:footnoteRef/>
+      </w:r>
+      <w:r>
+        <w:t xml:space="preserve"> </w:t>
+      </w:r>
+      <w:r>
+        <w:t xml:space="preserve">Beatty, A. </w:t>
+      </w:r>
+      <w:r>
+        <w:rPr>
+          <w:i/>
+          <w:iCs/>
+        </w:rPr>
+        <w:t>Movement as Exposure: Uncrewed Systems and the Transformation of Light Infantry Tactics: From Tactical Adaptation to Force Design and Deterrence-by-Denial in a Small State Context</w:t>
+      </w:r>
+      <w:r>
+        <w:t>. MA thesis, Maynooth University, 2026. Available from the Defence Forces Library.</w:t>
+      </w:r>
+    </w:p>
+  </w:footnote>
+  <w:footnote w:id="13">
+    <w:p>
+      <w:pPr>
+        <w:pStyle w:val="FootnoteText"/>
+      </w:pPr>
+      <w:r>
+        <w:rPr>
+          <w:rStyle w:val="FootnoteReference"/>
+        </w:rPr>
+        <w:footnoteRef/>
+      </w:r>
+      <w:r>
+        <w:t xml:space="preserve"> </w:t>
+      </w:r>
+      <w:r>
+        <w:t xml:space="preserve">The salvo column estimates the number and cost of effectors required to defeat an armoured company. </w:t>
+      </w:r>
+      <w:r>
+        <w:t>Effect is normalised to delivered shaped-charge mass, not raw payload:</w:t>
+      </w:r>
+      <w:r>
+        <w:t xml:space="preserve"> </w:t>
+      </w:r>
+      <w:r>
+        <w:t>OWADs are calculated against the 100</w:t>
+      </w:r>
+      <w:r>
+        <w:t>-</w:t>
+      </w:r>
+      <w:r>
+        <w:t>k</w:t>
+      </w:r>
+      <w:r>
+        <w:t>ilogram</w:t>
+      </w:r>
+      <w:r>
+        <w:t xml:space="preserve"> shaped-charge requirement in Bronk and Watling; Javelin is calculated as six missiles at assumed 100 percent kill probability against the 40–60 per cent immobilisation threshold – an assumption</w:t>
+      </w:r>
+      <w:r>
+        <w:t xml:space="preserve"> which</w:t>
+      </w:r>
+      <w:r>
+        <w:t xml:space="preserve"> flatters Javelin and therefore understates the drone advantage. Bronk, J. and Watling, J. </w:t>
+      </w:r>
+      <w:r>
+        <w:rPr>
+          <w:i/>
+          <w:iCs/>
+        </w:rPr>
         <w:t>Mass Precision Strike: Designing UAV Complexes for Land Forces</w:t>
       </w:r>
       <w:r>
         <w:t xml:space="preserve">. London: Royal United Services Institute for Defence and Security Studies, 2024. Available at: </w:t>
       </w:r>
-      <w:hyperlink r:id="rId3" w:history="1">
+      <w:hyperlink r:id="rId6" w:history="1">
         <w:r>
           <w:rPr>
             <w:rStyle w:val="Hyperlink"/>
@@ -4953,6 +4548,15 @@
       <w:szCs w:val="18"/>
     </w:rPr>
   </w:style>
+  <w:style w:type="paragraph" w:styleId="NoSpacing">
+    <w:name w:val="No Spacing"/>
+    <w:uiPriority w:val="1"/>
+    <w:qFormat/>
+    <w:rsid w:val="00D539C9"/>
+    <w:pPr>
+      <w:spacing w:after="0" w:line="240" w:lineRule="auto"/>
+    </w:pPr>
+  </w:style>
 </w:styles>
 </file>
 

</xml_diff>

<commit_message>
OB's draft merged for AB editing
</commit_message>
<xml_diff>
--- a/Essays/DF_Review_Article.docx
+++ b/Essays/DF_Review_Article.docx
@@ -1548,6 +1548,2652 @@
     </w:p>
     <w:p>
       <w:pPr>
+        <w:spacing w:after="0" w:line="360" w:lineRule="auto"/>
+        <w:jc w:val="both"/>
+        <w:rPr>
+          <w:rFonts w:ascii="Times New Roman" w:hAnsi="Times New Roman" w:cs="Times New Roman"/>
+          <w:kern w:val="0"/>
+          <w:lang w:eastAsia="en-GB"/>
+          <w14:ligatures w14:val="none"/>
+        </w:rPr>
+      </w:pPr>
+      <w:r>
+        <w:rPr>
+          <w:rFonts w:ascii="Times New Roman" w:hAnsi="Times New Roman" w:cs="Times New Roman"/>
+          <w:kern w:val="0"/>
+          <w:lang w:eastAsia="en-GB"/>
+          <w14:ligatures w14:val="none"/>
+        </w:rPr>
+        <w:t>To become credible Irish defence policy, the argument for UxS integration must evolve from an attractive battlefield concept into an institutionalised capability embedded within national defence planning, supported by doctrine, exercised in practice, sustained by industry, and legitimised through political leadership.</w:t>
+      </w:r>
+    </w:p>
+    <w:p>
+      <w:pPr>
+        <w:spacing w:after="0" w:line="360" w:lineRule="auto"/>
+        <w:jc w:val="both"/>
+        <w:rPr>
+          <w:rFonts w:ascii="Times New Roman" w:hAnsi="Times New Roman" w:cs="Times New Roman"/>
+          <w:kern w:val="0"/>
+          <w:lang w:eastAsia="en-GB"/>
+          <w14:ligatures w14:val="none"/>
+        </w:rPr>
+      </w:pPr>
+    </w:p>
+    <w:p>
+      <w:pPr>
+        <w:pStyle w:val="ListParagraph"/>
+        <w:numPr>
+          <w:ilvl w:val="0"/>
+          <w:numId w:val="8"/>
+        </w:numPr>
+        <w:tabs>
+          <w:tab w:val="left" w:pos="567"/>
+        </w:tabs>
+        <w:spacing w:after="0" w:line="360" w:lineRule="auto"/>
+        <w:ind w:left="0" w:firstLine="0"/>
+        <w:jc w:val="both"/>
+        <w:rPr>
+          <w:rFonts w:ascii="Times New Roman" w:hAnsi="Times New Roman" w:cs="Times New Roman"/>
+          <w:b/>
+          <w:bCs/>
+          <w:kern w:val="0"/>
+          <w:lang w:eastAsia="en-GB"/>
+          <w14:ligatures w14:val="none"/>
+        </w:rPr>
+      </w:pPr>
+      <w:bookmarkStart w:id="1" w:name="_Hlk235287821"/>
+      <w:r>
+        <w:rPr>
+          <w:rFonts w:ascii="Times New Roman" w:hAnsi="Times New Roman" w:cs="Times New Roman"/>
+          <w:b/>
+          <w:bCs/>
+          <w:kern w:val="0"/>
+          <w:lang w:eastAsia="en-GB"/>
+          <w14:ligatures w14:val="none"/>
+        </w:rPr>
+        <w:t>The Recognition of the need for change.</w:t>
+      </w:r>
+    </w:p>
+    <w:p>
+      <w:pPr>
+        <w:spacing w:after="0" w:line="360" w:lineRule="auto"/>
+        <w:jc w:val="both"/>
+        <w:rPr>
+          <w:rFonts w:ascii="Times New Roman" w:hAnsi="Times New Roman" w:cs="Times New Roman"/>
+          <w:kern w:val="0"/>
+          <w:lang w:eastAsia="en-GB"/>
+          <w14:ligatures w14:val="none"/>
+        </w:rPr>
+      </w:pPr>
+      <w:r>
+        <w:rPr>
+          <w:rFonts w:ascii="Times New Roman" w:hAnsi="Times New Roman" w:cs="Times New Roman"/>
+          <w:kern w:val="0"/>
+          <w:lang w:eastAsia="en-GB"/>
+          <w14:ligatures w14:val="none"/>
+        </w:rPr>
+        <w:t>The first requirement is recognition at both the senior military and political levels that UxS represent a disruptive shift in military affairs</w:t>
+      </w:r>
+      <w:r>
+        <w:rPr>
+          <w:rFonts w:ascii="Times New Roman" w:hAnsi="Times New Roman" w:cs="Times New Roman"/>
+          <w:kern w:val="0"/>
+          <w:vertAlign w:val="superscript"/>
+          <w:lang w:eastAsia="en-GB"/>
+          <w14:ligatures w14:val="none"/>
+        </w:rPr>
+        <w:footnoteReference w:id="24"/>
+      </w:r>
+      <w:r>
+        <w:rPr>
+          <w:rFonts w:ascii="Times New Roman" w:hAnsi="Times New Roman" w:cs="Times New Roman"/>
+          <w:kern w:val="0"/>
+          <w:lang w:eastAsia="en-GB"/>
+          <w14:ligatures w14:val="none"/>
+        </w:rPr>
+        <w:t xml:space="preserve"> rather than simply another technological enhancement.</w:t>
+      </w:r>
+      <w:r>
+        <w:rPr>
+          <w:rFonts w:ascii="Times New Roman" w:hAnsi="Times New Roman" w:cs="Times New Roman"/>
+          <w:kern w:val="0"/>
+          <w:lang w:eastAsia="en-GB"/>
+          <w14:ligatures w14:val="none"/>
+        </w:rPr>
+        <w:t xml:space="preserve"> </w:t>
+      </w:r>
+      <w:r>
+        <w:rPr>
+          <w:rFonts w:ascii="Times New Roman" w:hAnsi="Times New Roman" w:cs="Times New Roman"/>
+          <w:kern w:val="0"/>
+          <w:lang w:eastAsia="en-GB"/>
+          <w14:ligatures w14:val="none"/>
+        </w:rPr>
+        <w:t>Historically, military organisations have often struggled to recognise discontinuous technological change, preferring to adapt existing structures rather than fundamentally reconsider them</w:t>
+      </w:r>
+      <w:r>
+        <w:rPr>
+          <w:rStyle w:val="FootnoteReference"/>
+          <w:rFonts w:ascii="Times New Roman" w:hAnsi="Times New Roman" w:cs="Times New Roman"/>
+          <w:kern w:val="0"/>
+          <w:lang w:eastAsia="en-GB"/>
+          <w14:ligatures w14:val="none"/>
+        </w:rPr>
+        <w:footnoteReference w:id="25"/>
+      </w:r>
+      <w:r>
+        <w:rPr>
+          <w:rFonts w:ascii="Times New Roman" w:hAnsi="Times New Roman" w:cs="Times New Roman"/>
+          <w:kern w:val="0"/>
+          <w:lang w:eastAsia="en-GB"/>
+          <w14:ligatures w14:val="none"/>
+        </w:rPr>
+        <w:t xml:space="preserve">. </w:t>
+      </w:r>
+    </w:p>
+    <w:p>
+      <w:pPr>
+        <w:spacing w:after="0" w:line="360" w:lineRule="auto"/>
+        <w:jc w:val="both"/>
+        <w:rPr>
+          <w:rFonts w:ascii="Times New Roman" w:hAnsi="Times New Roman" w:cs="Times New Roman"/>
+          <w:color w:val="FF0000"/>
+          <w:kern w:val="0"/>
+          <w:lang w:eastAsia="en-GB"/>
+          <w14:ligatures w14:val="none"/>
+        </w:rPr>
+      </w:pPr>
+      <w:r>
+        <w:rPr>
+          <w:rFonts w:ascii="Times New Roman" w:hAnsi="Times New Roman" w:cs="Times New Roman"/>
+          <w:kern w:val="0"/>
+          <w:lang w:eastAsia="en-GB"/>
+          <w14:ligatures w14:val="none"/>
+        </w:rPr>
+        <w:t>For Ireland, whose Defence Forces face significant personnel shortages and resource constraints</w:t>
+      </w:r>
+      <w:r>
+        <w:rPr>
+          <w:rStyle w:val="FootnoteReference"/>
+          <w:rFonts w:ascii="Times New Roman" w:hAnsi="Times New Roman" w:cs="Times New Roman"/>
+          <w:kern w:val="0"/>
+          <w:lang w:eastAsia="en-GB"/>
+          <w14:ligatures w14:val="none"/>
+        </w:rPr>
+        <w:footnoteReference w:id="26"/>
+      </w:r>
+      <w:r>
+        <w:rPr>
+          <w:rFonts w:ascii="Times New Roman" w:hAnsi="Times New Roman" w:cs="Times New Roman"/>
+          <w:kern w:val="0"/>
+          <w:lang w:eastAsia="en-GB"/>
+          <w14:ligatures w14:val="none"/>
+        </w:rPr>
+        <w:t>, UxS provide an opportunity to multiply the effectiveness of limited manpower</w:t>
+      </w:r>
+      <w:r>
+        <w:rPr>
+          <w:rStyle w:val="FootnoteReference"/>
+          <w:rFonts w:ascii="Times New Roman" w:hAnsi="Times New Roman" w:cs="Times New Roman"/>
+          <w:kern w:val="0"/>
+          <w:lang w:eastAsia="en-GB"/>
+          <w14:ligatures w14:val="none"/>
+        </w:rPr>
+        <w:footnoteReference w:id="27"/>
+      </w:r>
+      <w:r>
+        <w:rPr>
+          <w:rFonts w:ascii="Times New Roman" w:hAnsi="Times New Roman" w:cs="Times New Roman"/>
+          <w:kern w:val="0"/>
+          <w:lang w:eastAsia="en-GB"/>
+          <w14:ligatures w14:val="none"/>
+        </w:rPr>
+        <w:t xml:space="preserve">. </w:t>
+      </w:r>
+      <w:r>
+        <w:rPr>
+          <w:rFonts w:ascii="Times New Roman" w:hAnsi="Times New Roman" w:cs="Times New Roman"/>
+          <w:kern w:val="0"/>
+          <w:lang w:eastAsia="en-GB"/>
+          <w14:ligatures w14:val="none"/>
+        </w:rPr>
+        <w:t>Recent conflicts also demonstrate that uncrewed systems are altering the relationship between mass, precision, persistence and survivability</w:t>
+      </w:r>
+      <w:r>
+        <w:rPr>
+          <w:rStyle w:val="FootnoteReference"/>
+          <w:rFonts w:ascii="Times New Roman" w:hAnsi="Times New Roman" w:cs="Times New Roman"/>
+          <w:kern w:val="0"/>
+          <w:lang w:eastAsia="en-GB"/>
+          <w14:ligatures w14:val="none"/>
+        </w:rPr>
+        <w:footnoteReference w:id="28"/>
+      </w:r>
+      <w:r>
+        <w:rPr>
+          <w:rFonts w:ascii="Times New Roman" w:hAnsi="Times New Roman" w:cs="Times New Roman"/>
+          <w:kern w:val="0"/>
+          <w:lang w:eastAsia="en-GB"/>
+          <w14:ligatures w14:val="none"/>
+        </w:rPr>
+        <w:t>. Credible implementation</w:t>
+      </w:r>
+      <w:r>
+        <w:rPr>
+          <w:rFonts w:ascii="Times New Roman" w:hAnsi="Times New Roman" w:cs="Times New Roman"/>
+          <w:kern w:val="0"/>
+          <w:lang w:eastAsia="en-GB"/>
+          <w14:ligatures w14:val="none"/>
+        </w:rPr>
+        <w:t xml:space="preserve"> requires political acknowledgement that investment in autonomous and remotely operated systems is not a niche procurement decision but a strategic adaptation to a changing security environment</w:t>
+      </w:r>
+      <w:r>
+        <w:rPr>
+          <w:rStyle w:val="FootnoteReference"/>
+          <w:rFonts w:ascii="Times New Roman" w:hAnsi="Times New Roman" w:cs="Times New Roman"/>
+          <w:kern w:val="0"/>
+          <w:lang w:eastAsia="en-GB"/>
+          <w14:ligatures w14:val="none"/>
+        </w:rPr>
+        <w:footnoteReference w:id="29"/>
+      </w:r>
+      <w:r>
+        <w:rPr>
+          <w:rFonts w:ascii="Times New Roman" w:hAnsi="Times New Roman" w:cs="Times New Roman"/>
+          <w:kern w:val="0"/>
+          <w:lang w:eastAsia="en-GB"/>
+          <w14:ligatures w14:val="none"/>
+        </w:rPr>
+        <w:t>.</w:t>
+      </w:r>
+      <w:r>
+        <w:rPr>
+          <w:rFonts w:ascii="Times New Roman" w:hAnsi="Times New Roman" w:cs="Times New Roman"/>
+          <w:kern w:val="0"/>
+          <w:lang w:eastAsia="en-GB"/>
+          <w14:ligatures w14:val="none"/>
+        </w:rPr>
+        <w:t xml:space="preserve"> </w:t>
+      </w:r>
+      <w:r>
+        <w:rPr>
+          <w:rFonts w:ascii="Times New Roman" w:hAnsi="Times New Roman" w:cs="Times New Roman"/>
+          <w:kern w:val="0"/>
+          <w:lang w:eastAsia="en-GB"/>
+          <w14:ligatures w14:val="none"/>
+        </w:rPr>
+        <w:t>Such recognition would align with the recommendations of the Commission on the Defence Forces</w:t>
+      </w:r>
+      <w:r>
+        <w:rPr>
+          <w:rStyle w:val="FootnoteReference"/>
+          <w:rFonts w:ascii="Times New Roman" w:hAnsi="Times New Roman" w:cs="Times New Roman"/>
+          <w:kern w:val="0"/>
+          <w:lang w:eastAsia="en-GB"/>
+          <w14:ligatures w14:val="none"/>
+        </w:rPr>
+        <w:footnoteReference w:id="30"/>
+      </w:r>
+      <w:r>
+        <w:rPr>
+          <w:rFonts w:ascii="Times New Roman" w:hAnsi="Times New Roman" w:cs="Times New Roman"/>
+          <w:kern w:val="0"/>
+          <w:lang w:eastAsia="en-GB"/>
+          <w14:ligatures w14:val="none"/>
+        </w:rPr>
+        <w:t xml:space="preserve">, which identified technological transformation, digitalisation and enhanced surveillance capabilities as essential components of future force development. </w:t>
+      </w:r>
+    </w:p>
+    <w:bookmarkEnd w:id="1"/>
+    <w:p>
+      <w:pPr>
+        <w:spacing w:after="0" w:line="360" w:lineRule="auto"/>
+        <w:jc w:val="both"/>
+        <w:rPr>
+          <w:rFonts w:ascii="Times New Roman" w:hAnsi="Times New Roman" w:cs="Times New Roman"/>
+          <w:kern w:val="0"/>
+          <w:lang w:eastAsia="en-GB"/>
+          <w14:ligatures w14:val="none"/>
+        </w:rPr>
+      </w:pPr>
+      <w:r>
+        <w:rPr>
+          <w:rFonts w:ascii="Times New Roman" w:hAnsi="Times New Roman" w:cs="Times New Roman"/>
+          <w:kern w:val="0"/>
+          <w:lang w:eastAsia="en-GB"/>
+          <w14:ligatures w14:val="none"/>
+        </w:rPr>
+        <w:lastRenderedPageBreak/>
+        <w:t xml:space="preserve">Uncrewed systems (UxS) should be recognised by both military and political leaders as </w:t>
+      </w:r>
+      <w:r>
+        <w:rPr>
+          <w:rFonts w:ascii="Times New Roman" w:hAnsi="Times New Roman" w:cs="Times New Roman"/>
+          <w:kern w:val="0"/>
+          <w:lang w:eastAsia="en-GB"/>
+          <w14:ligatures w14:val="none"/>
+        </w:rPr>
+        <w:t xml:space="preserve">an evolution </w:t>
+      </w:r>
+      <w:r>
+        <w:rPr>
+          <w:rFonts w:ascii="Times New Roman" w:hAnsi="Times New Roman" w:cs="Times New Roman"/>
+          <w:kern w:val="0"/>
+          <w:lang w:eastAsia="en-GB"/>
+          <w14:ligatures w14:val="none"/>
+        </w:rPr>
+        <w:t>in warfare rather than simply a new technology. For Ireland, UxS offer a strategic means of addressing personnel and resource constraints while enhancing operational capability, making political commitment to their adoption essential for future Defence Forces modernisation.</w:t>
+      </w:r>
+      <w:r>
+        <w:t xml:space="preserve"> </w:t>
+      </w:r>
+    </w:p>
+    <w:p>
+      <w:pPr>
+        <w:spacing w:after="0" w:line="360" w:lineRule="auto"/>
+        <w:jc w:val="both"/>
+        <w:rPr>
+          <w:rFonts w:ascii="Times New Roman" w:hAnsi="Times New Roman" w:cs="Times New Roman"/>
+          <w:kern w:val="0"/>
+          <w:lang w:eastAsia="en-GB"/>
+          <w14:ligatures w14:val="none"/>
+        </w:rPr>
+      </w:pPr>
+    </w:p>
+    <w:p>
+      <w:pPr>
+        <w:pStyle w:val="ListParagraph"/>
+        <w:numPr>
+          <w:ilvl w:val="0"/>
+          <w:numId w:val="8"/>
+        </w:numPr>
+        <w:tabs>
+          <w:tab w:val="left" w:pos="567"/>
+        </w:tabs>
+        <w:spacing w:after="0" w:line="360" w:lineRule="auto"/>
+        <w:ind w:left="0" w:firstLine="0"/>
+        <w:jc w:val="both"/>
+        <w:rPr>
+          <w:rFonts w:ascii="Times New Roman" w:hAnsi="Times New Roman" w:cs="Times New Roman"/>
+          <w:b/>
+          <w:bCs/>
+          <w:kern w:val="0"/>
+          <w:lang w:eastAsia="en-GB"/>
+          <w14:ligatures w14:val="none"/>
+        </w:rPr>
+      </w:pPr>
+      <w:bookmarkStart w:id="2" w:name="_Hlk235294786"/>
+      <w:r>
+        <w:rPr>
+          <w:rFonts w:ascii="Times New Roman" w:hAnsi="Times New Roman" w:cs="Times New Roman"/>
+          <w:b/>
+          <w:bCs/>
+          <w:kern w:val="0"/>
+          <w:lang w:eastAsia="en-GB"/>
+          <w14:ligatures w14:val="none"/>
+        </w:rPr>
+        <w:t>Guiding Vision for Change.</w:t>
+      </w:r>
+    </w:p>
+    <w:p>
+      <w:pPr>
+        <w:spacing w:after="0" w:line="360" w:lineRule="auto"/>
+        <w:jc w:val="both"/>
+        <w:rPr>
+          <w:rFonts w:ascii="Times New Roman" w:hAnsi="Times New Roman" w:cs="Times New Roman"/>
+          <w:kern w:val="0"/>
+          <w:lang w:eastAsia="en-GB"/>
+          <w14:ligatures w14:val="none"/>
+        </w:rPr>
+      </w:pPr>
+      <w:r>
+        <w:rPr>
+          <w:rFonts w:ascii="Times New Roman" w:hAnsi="Times New Roman" w:cs="Times New Roman"/>
+          <w:kern w:val="0"/>
+          <w:lang w:eastAsia="en-GB"/>
+          <w14:ligatures w14:val="none"/>
+        </w:rPr>
+        <w:t>Political recognition must then be translated into a guiding vision. Military innovation succeeds when technological adoption is driven by coherent operational concepts rather than the availability of new equipment</w:t>
+      </w:r>
+      <w:r>
+        <w:rPr>
+          <w:vertAlign w:val="superscript"/>
+          <w:lang w:eastAsia="en-GB"/>
+        </w:rPr>
+        <w:footnoteReference w:id="31"/>
+      </w:r>
+      <w:r>
+        <w:rPr>
+          <w:rFonts w:ascii="Times New Roman" w:hAnsi="Times New Roman" w:cs="Times New Roman"/>
+          <w:kern w:val="0"/>
+          <w:lang w:eastAsia="en-GB"/>
+          <w14:ligatures w14:val="none"/>
+        </w:rPr>
+        <w:t>. Ireland therefore requires an operational concept that defines how UxS contribute to national defence objectives across all domains. Such a concept should emphasise persistent surveillance, situational awareness and denial operations rather than offensive power projection</w:t>
+      </w:r>
+      <w:r>
+        <w:rPr>
+          <w:rStyle w:val="FootnoteReference"/>
+          <w:rFonts w:ascii="Times New Roman" w:hAnsi="Times New Roman" w:cs="Times New Roman"/>
+          <w:kern w:val="0"/>
+          <w:lang w:eastAsia="en-GB"/>
+          <w14:ligatures w14:val="none"/>
+        </w:rPr>
+        <w:footnoteReference w:id="32"/>
+      </w:r>
+      <w:r>
+        <w:rPr>
+          <w:rFonts w:ascii="Times New Roman" w:hAnsi="Times New Roman" w:cs="Times New Roman"/>
+          <w:kern w:val="0"/>
+          <w:lang w:eastAsia="en-GB"/>
+          <w14:ligatures w14:val="none"/>
+        </w:rPr>
+        <w:t>.</w:t>
+      </w:r>
+      <w:r>
+        <w:rPr>
+          <w:rFonts w:ascii="Times New Roman" w:hAnsi="Times New Roman" w:cs="Times New Roman"/>
+          <w:kern w:val="0"/>
+          <w:lang w:eastAsia="en-GB"/>
+          <w14:ligatures w14:val="none"/>
+        </w:rPr>
+        <w:t xml:space="preserve"> </w:t>
+      </w:r>
+      <w:r>
+        <w:rPr>
+          <w:rFonts w:ascii="Times New Roman" w:hAnsi="Times New Roman" w:cs="Times New Roman"/>
+          <w:kern w:val="0"/>
+          <w:lang w:eastAsia="en-GB"/>
+          <w14:ligatures w14:val="none"/>
+        </w:rPr>
+        <w:t>For light infantry, this means integrating reconnaissance drones, loitering munitions where politically acceptable</w:t>
+      </w:r>
+      <w:r>
+        <w:rPr>
+          <w:rStyle w:val="FootnoteReference"/>
+          <w:rFonts w:ascii="Times New Roman" w:hAnsi="Times New Roman" w:cs="Times New Roman"/>
+          <w:kern w:val="0"/>
+          <w:lang w:eastAsia="en-GB"/>
+          <w14:ligatures w14:val="none"/>
+        </w:rPr>
+        <w:footnoteReference w:id="33"/>
+      </w:r>
+      <w:r>
+        <w:rPr>
+          <w:rFonts w:ascii="Times New Roman" w:hAnsi="Times New Roman" w:cs="Times New Roman"/>
+          <w:kern w:val="0"/>
+          <w:lang w:eastAsia="en-GB"/>
+          <w14:ligatures w14:val="none"/>
+        </w:rPr>
+        <w:t>, autonomous logistics platforms and electronic warfare systems into dispersed defensive operations.</w:t>
+      </w:r>
+    </w:p>
+    <w:p>
+      <w:pPr>
+        <w:spacing w:after="0" w:line="360" w:lineRule="auto"/>
+        <w:jc w:val="both"/>
+        <w:rPr>
+          <w:rFonts w:ascii="Times New Roman" w:hAnsi="Times New Roman" w:cs="Times New Roman"/>
+          <w:kern w:val="0"/>
+          <w:lang w:eastAsia="en-GB"/>
+          <w14:ligatures w14:val="none"/>
+        </w:rPr>
+      </w:pPr>
+      <w:r>
+        <w:rPr>
+          <w:rFonts w:ascii="Times New Roman" w:hAnsi="Times New Roman" w:cs="Times New Roman"/>
+          <w:kern w:val="0"/>
+          <w:lang w:eastAsia="en-GB"/>
+          <w14:ligatures w14:val="none"/>
+        </w:rPr>
+        <w:t>This policy must them be incorporated into an operational capability through DOTMLPF-I integration</w:t>
+      </w:r>
+      <w:r>
+        <w:rPr>
+          <w:rFonts w:ascii="Times New Roman" w:hAnsi="Times New Roman" w:cs="Times New Roman"/>
+          <w:kern w:val="0"/>
+          <w:lang w:eastAsia="en-GB"/>
+          <w14:ligatures w14:val="none"/>
+        </w:rPr>
+        <w:t>, ensuring that UxS become an integral part of operations rather than isolated specialist capabilities</w:t>
+      </w:r>
+      <w:r>
+        <w:rPr>
+          <w:rStyle w:val="FootnoteReference"/>
+          <w:rFonts w:ascii="Times New Roman" w:hAnsi="Times New Roman" w:cs="Times New Roman"/>
+          <w:kern w:val="0"/>
+          <w:lang w:eastAsia="en-GB"/>
+          <w14:ligatures w14:val="none"/>
+        </w:rPr>
+        <w:footnoteReference w:id="34"/>
+      </w:r>
+      <w:r>
+        <w:rPr>
+          <w:rFonts w:ascii="Times New Roman" w:hAnsi="Times New Roman" w:cs="Times New Roman"/>
+          <w:kern w:val="0"/>
+          <w:lang w:eastAsia="en-GB"/>
+          <w14:ligatures w14:val="none"/>
+        </w:rPr>
+        <w:t>.</w:t>
+      </w:r>
+    </w:p>
+    <w:bookmarkEnd w:id="2"/>
+    <w:p>
+      <w:pPr>
+        <w:spacing w:after="0" w:line="360" w:lineRule="auto"/>
+        <w:jc w:val="both"/>
+        <w:rPr>
+          <w:rFonts w:ascii="Times New Roman" w:hAnsi="Times New Roman" w:cs="Times New Roman"/>
+          <w:kern w:val="0"/>
+          <w:lang w:eastAsia="en-GB"/>
+          <w14:ligatures w14:val="none"/>
+        </w:rPr>
+      </w:pPr>
+      <w:r>
+        <w:rPr>
+          <w:rFonts w:ascii="Times New Roman" w:hAnsi="Times New Roman" w:cs="Times New Roman"/>
+          <w:kern w:val="0"/>
+          <w:lang w:eastAsia="en-GB"/>
+          <w14:ligatures w14:val="none"/>
+        </w:rPr>
+        <w:t>A clear political and military vision is essential to guide the adoption of uncrewed systems (UxS), ensuring they support Ireland's defence objectives through persistent surveillance, situational awareness and defensive operations rather than offensive power projection. This vision should be politically endorsed and implemented through DOTMLPF-I integration so that UxS are embedded across the Defence Forces as a core operational capability, not a niche specialist asset.</w:t>
+      </w:r>
+    </w:p>
+    <w:p>
+      <w:pPr>
+        <w:spacing w:after="0" w:line="360" w:lineRule="auto"/>
+        <w:jc w:val="both"/>
+        <w:rPr>
+          <w:rFonts w:ascii="Times New Roman" w:hAnsi="Times New Roman" w:cs="Times New Roman"/>
+          <w:kern w:val="0"/>
+          <w:lang w:eastAsia="en-GB"/>
+          <w14:ligatures w14:val="none"/>
+        </w:rPr>
+      </w:pPr>
+    </w:p>
+    <w:p>
+      <w:pPr>
+        <w:spacing w:after="0" w:line="360" w:lineRule="auto"/>
+        <w:jc w:val="both"/>
+        <w:rPr>
+          <w:rFonts w:ascii="Times New Roman" w:hAnsi="Times New Roman" w:cs="Times New Roman"/>
+          <w:kern w:val="0"/>
+          <w:lang w:eastAsia="en-GB"/>
+          <w14:ligatures w14:val="none"/>
+        </w:rPr>
+      </w:pPr>
+    </w:p>
+    <w:p>
+      <w:pPr>
+        <w:pStyle w:val="ListParagraph"/>
+        <w:numPr>
+          <w:ilvl w:val="0"/>
+          <w:numId w:val="8"/>
+        </w:numPr>
+        <w:tabs>
+          <w:tab w:val="left" w:pos="567"/>
+        </w:tabs>
+        <w:spacing w:after="0" w:line="360" w:lineRule="auto"/>
+        <w:ind w:left="0" w:firstLine="0"/>
+        <w:jc w:val="both"/>
+        <w:rPr>
+          <w:rFonts w:ascii="Times New Roman" w:hAnsi="Times New Roman" w:cs="Times New Roman"/>
+          <w:b/>
+          <w:bCs/>
+          <w:kern w:val="0"/>
+          <w:lang w:eastAsia="en-GB"/>
+          <w14:ligatures w14:val="none"/>
+        </w:rPr>
+      </w:pPr>
+      <w:bookmarkStart w:id="3" w:name="_Hlk235298037"/>
+      <w:r>
+        <w:rPr>
+          <w:rFonts w:ascii="Times New Roman" w:hAnsi="Times New Roman" w:cs="Times New Roman"/>
+          <w:b/>
+          <w:bCs/>
+          <w:kern w:val="0"/>
+          <w:lang w:eastAsia="en-GB"/>
+          <w14:ligatures w14:val="none"/>
+        </w:rPr>
+        <w:t>The Institutionalisation of Change.</w:t>
+      </w:r>
+    </w:p>
+    <w:p>
+      <w:pPr>
+        <w:spacing w:after="0" w:line="360" w:lineRule="auto"/>
+        <w:jc w:val="both"/>
+        <w:rPr>
+          <w:rFonts w:ascii="Times New Roman" w:hAnsi="Times New Roman" w:cs="Times New Roman"/>
+          <w:kern w:val="0"/>
+          <w:lang w:eastAsia="en-GB"/>
+          <w14:ligatures w14:val="none"/>
+        </w:rPr>
+      </w:pPr>
+      <w:r>
+        <w:rPr>
+          <w:rFonts w:ascii="Times New Roman" w:hAnsi="Times New Roman" w:cs="Times New Roman"/>
+          <w:kern w:val="0"/>
+          <w:lang w:eastAsia="en-GB"/>
+          <w14:ligatures w14:val="none"/>
+        </w:rPr>
+        <w:t>The third requirement is institutionalisation. Military innovation becomes credible only when organisations adapt</w:t>
+      </w:r>
+      <w:r>
+        <w:rPr>
+          <w:rStyle w:val="FootnoteReference"/>
+          <w:rFonts w:ascii="Times New Roman" w:hAnsi="Times New Roman" w:cs="Times New Roman"/>
+          <w:kern w:val="0"/>
+          <w:lang w:eastAsia="en-GB"/>
+          <w14:ligatures w14:val="none"/>
+        </w:rPr>
+        <w:footnoteReference w:id="35"/>
+      </w:r>
+      <w:r>
+        <w:rPr>
+          <w:rFonts w:ascii="Times New Roman" w:hAnsi="Times New Roman" w:cs="Times New Roman"/>
+          <w:kern w:val="0"/>
+          <w:lang w:eastAsia="en-GB"/>
+          <w14:ligatures w14:val="none"/>
+        </w:rPr>
+        <w:t xml:space="preserve"> themselves to sustain it. Institutional change also requires adapting procurement organisations, maintenance structures and training establishments to support rapid technological iteration rather than the traditionally slow acquisition cycles associated with major defence platforms.</w:t>
+      </w:r>
+    </w:p>
+    <w:p>
+      <w:pPr>
+        <w:spacing w:after="0" w:line="360" w:lineRule="auto"/>
+        <w:jc w:val="both"/>
+        <w:rPr>
+          <w:rFonts w:ascii="Times New Roman" w:hAnsi="Times New Roman" w:cs="Times New Roman"/>
+          <w:kern w:val="0"/>
+          <w:lang w:eastAsia="en-GB"/>
+          <w14:ligatures w14:val="none"/>
+        </w:rPr>
+      </w:pPr>
+      <w:r>
+        <w:rPr>
+          <w:rFonts w:ascii="Times New Roman" w:hAnsi="Times New Roman" w:cs="Times New Roman"/>
+          <w:kern w:val="0"/>
+          <w:lang w:eastAsia="en-GB"/>
+          <w14:ligatures w14:val="none"/>
+        </w:rPr>
+        <w:t>Creating dedicated UxS career pathways</w:t>
+      </w:r>
+      <w:r>
+        <w:rPr>
+          <w:rStyle w:val="FootnoteReference"/>
+          <w:rFonts w:ascii="Times New Roman" w:hAnsi="Times New Roman" w:cs="Times New Roman"/>
+          <w:kern w:val="0"/>
+          <w:lang w:eastAsia="en-GB"/>
+          <w14:ligatures w14:val="none"/>
+        </w:rPr>
+        <w:footnoteReference w:id="36"/>
+      </w:r>
+      <w:r>
+        <w:rPr>
+          <w:rFonts w:ascii="Times New Roman" w:hAnsi="Times New Roman" w:cs="Times New Roman"/>
+          <w:kern w:val="0"/>
+          <w:lang w:eastAsia="en-GB"/>
+          <w14:ligatures w14:val="none"/>
+        </w:rPr>
+        <w:t xml:space="preserve"> would </w:t>
+      </w:r>
+      <w:r>
+        <w:rPr>
+          <w:rFonts w:ascii="Times New Roman" w:hAnsi="Times New Roman" w:cs="Times New Roman"/>
+          <w:kern w:val="0"/>
+          <w:lang w:eastAsia="en-GB"/>
+          <w14:ligatures w14:val="none"/>
+        </w:rPr>
+        <w:t xml:space="preserve">also </w:t>
+      </w:r>
+      <w:r>
+        <w:rPr>
+          <w:rFonts w:ascii="Times New Roman" w:hAnsi="Times New Roman" w:cs="Times New Roman"/>
+          <w:kern w:val="0"/>
+          <w:lang w:eastAsia="en-GB"/>
+          <w14:ligatures w14:val="none"/>
+        </w:rPr>
+        <w:t>signal that these capabilities are enduring rather than experimental.</w:t>
+      </w:r>
+      <w:r>
+        <w:rPr>
+          <w:rFonts w:ascii="Times New Roman" w:hAnsi="Times New Roman" w:cs="Times New Roman"/>
+          <w:kern w:val="0"/>
+          <w:lang w:eastAsia="en-GB"/>
+          <w14:ligatures w14:val="none"/>
+        </w:rPr>
+        <w:t xml:space="preserve"> </w:t>
+      </w:r>
+      <w:r>
+        <w:rPr>
+          <w:rFonts w:ascii="Times New Roman" w:hAnsi="Times New Roman" w:cs="Times New Roman"/>
+          <w:kern w:val="0"/>
+          <w:lang w:eastAsia="en-GB"/>
+          <w14:ligatures w14:val="none"/>
+        </w:rPr>
+        <w:t>This requires recruiting and retaining personnel with expertise in robotics, artificial intelligence, software engineering and electronic warfare while integrating these specialists with operational commanders rather than separating technical and tactical functions</w:t>
+      </w:r>
+      <w:r>
+        <w:rPr>
+          <w:rStyle w:val="FootnoteReference"/>
+          <w:rFonts w:ascii="Times New Roman" w:hAnsi="Times New Roman" w:cs="Times New Roman"/>
+          <w:kern w:val="0"/>
+          <w:lang w:eastAsia="en-GB"/>
+          <w14:ligatures w14:val="none"/>
+        </w:rPr>
+        <w:footnoteReference w:id="37"/>
+      </w:r>
+      <w:r>
+        <w:rPr>
+          <w:rFonts w:ascii="Times New Roman" w:hAnsi="Times New Roman" w:cs="Times New Roman"/>
+          <w:kern w:val="0"/>
+          <w:lang w:eastAsia="en-GB"/>
+          <w14:ligatures w14:val="none"/>
+        </w:rPr>
+        <w:t>.</w:t>
+      </w:r>
+      <w:r>
+        <w:rPr>
+          <w:rFonts w:ascii="Times New Roman" w:hAnsi="Times New Roman" w:cs="Times New Roman"/>
+          <w:kern w:val="0"/>
+          <w:lang w:eastAsia="en-GB"/>
+          <w14:ligatures w14:val="none"/>
+        </w:rPr>
+        <w:t xml:space="preserve"> Establishing m</w:t>
+      </w:r>
+      <w:r>
+        <w:rPr>
+          <w:rFonts w:ascii="Times New Roman" w:hAnsi="Times New Roman" w:cs="Times New Roman"/>
+          <w:kern w:val="0"/>
+          <w:lang w:eastAsia="en-GB"/>
+          <w14:ligatures w14:val="none"/>
+        </w:rPr>
+        <w:t>ultidisciplinary teams</w:t>
+      </w:r>
+      <w:r>
+        <w:rPr>
+          <w:rFonts w:ascii="Times New Roman" w:hAnsi="Times New Roman" w:cs="Times New Roman"/>
+          <w:kern w:val="0"/>
+          <w:lang w:eastAsia="en-GB"/>
+          <w14:ligatures w14:val="none"/>
+        </w:rPr>
+        <w:t xml:space="preserve"> who</w:t>
+      </w:r>
+      <w:r>
+        <w:rPr>
+          <w:rFonts w:ascii="Times New Roman" w:hAnsi="Times New Roman" w:cs="Times New Roman"/>
+          <w:kern w:val="0"/>
+          <w:lang w:eastAsia="en-GB"/>
+          <w14:ligatures w14:val="none"/>
+        </w:rPr>
+        <w:t xml:space="preserve"> work collaboratively.</w:t>
+      </w:r>
+    </w:p>
+    <w:p>
+      <w:pPr>
+        <w:spacing w:after="0" w:line="360" w:lineRule="auto"/>
+        <w:jc w:val="both"/>
+        <w:rPr>
+          <w:rFonts w:ascii="Times New Roman" w:hAnsi="Times New Roman" w:cs="Times New Roman"/>
+          <w:kern w:val="0"/>
+          <w:lang w:eastAsia="en-GB"/>
+          <w14:ligatures w14:val="none"/>
+        </w:rPr>
+      </w:pPr>
+      <w:r>
+        <w:rPr>
+          <w:rFonts w:ascii="Times New Roman" w:hAnsi="Times New Roman" w:cs="Times New Roman"/>
+          <w:kern w:val="0"/>
+          <w:lang w:eastAsia="en-GB"/>
+          <w14:ligatures w14:val="none"/>
+        </w:rPr>
+        <w:t>Professional military education must therefore incorporate autonomous systems, human-machine teaming and counter-UxS operations throughout career progression</w:t>
+      </w:r>
+    </w:p>
+    <w:bookmarkEnd w:id="3"/>
+    <w:p>
+      <w:pPr>
+        <w:spacing w:after="0" w:line="360" w:lineRule="auto"/>
+        <w:jc w:val="both"/>
+        <w:rPr>
+          <w:rFonts w:ascii="Times New Roman" w:hAnsi="Times New Roman" w:cs="Times New Roman"/>
+          <w:kern w:val="0"/>
+          <w:lang w:eastAsia="en-GB"/>
+          <w14:ligatures w14:val="none"/>
+        </w:rPr>
+      </w:pPr>
+      <w:r>
+        <w:rPr>
+          <w:rFonts w:ascii="Times New Roman" w:hAnsi="Times New Roman" w:cs="Times New Roman"/>
+          <w:kern w:val="0"/>
+          <w:lang w:eastAsia="en-GB"/>
+          <w14:ligatures w14:val="none"/>
+        </w:rPr>
+        <w:t>Institutionalising UxS requires adapting Defence Forces structures, procurement, training and career pathways to support their long-term integration. Professional military education must also embed UxS and human-machine teaming across all levels to make these capabilities a core part of future operations.</w:t>
+      </w:r>
+    </w:p>
+    <w:p>
+      <w:pPr>
+        <w:spacing w:after="0" w:line="360" w:lineRule="auto"/>
+        <w:jc w:val="both"/>
+        <w:rPr>
+          <w:rFonts w:ascii="Times New Roman" w:hAnsi="Times New Roman" w:cs="Times New Roman"/>
+          <w:b/>
+          <w:bCs/>
+          <w:kern w:val="0"/>
+          <w:lang w:eastAsia="en-GB"/>
+          <w14:ligatures w14:val="none"/>
+        </w:rPr>
+      </w:pPr>
+    </w:p>
+    <w:p>
+      <w:pPr>
+        <w:pStyle w:val="ListParagraph"/>
+        <w:numPr>
+          <w:ilvl w:val="0"/>
+          <w:numId w:val="8"/>
+        </w:numPr>
+        <w:spacing w:after="0" w:line="360" w:lineRule="auto"/>
+        <w:ind w:left="0" w:firstLine="0"/>
+        <w:jc w:val="both"/>
+        <w:rPr>
+          <w:rFonts w:ascii="Times New Roman" w:hAnsi="Times New Roman" w:cs="Times New Roman"/>
+          <w:b/>
+          <w:bCs/>
+          <w:kern w:val="0"/>
+          <w:lang w:eastAsia="en-GB"/>
+          <w14:ligatures w14:val="none"/>
+        </w:rPr>
+      </w:pPr>
+      <w:bookmarkStart w:id="4" w:name="_Hlk235300244"/>
+      <w:r>
+        <w:rPr>
+          <w:rFonts w:ascii="Times New Roman" w:hAnsi="Times New Roman" w:cs="Times New Roman"/>
+          <w:b/>
+          <w:bCs/>
+          <w:kern w:val="0"/>
+          <w:lang w:eastAsia="en-GB"/>
+          <w14:ligatures w14:val="none"/>
+        </w:rPr>
+        <w:t>Virtuous Cycles of Wargaming</w:t>
+      </w:r>
+    </w:p>
+    <w:p>
+      <w:pPr>
+        <w:spacing w:after="0" w:line="360" w:lineRule="auto"/>
+        <w:jc w:val="both"/>
+        <w:rPr>
+          <w:rFonts w:ascii="Times New Roman" w:hAnsi="Times New Roman" w:cs="Times New Roman"/>
+          <w:kern w:val="0"/>
+          <w:lang w:eastAsia="en-GB"/>
+          <w14:ligatures w14:val="none"/>
+        </w:rPr>
+      </w:pPr>
+      <w:r>
+        <w:rPr>
+          <w:rFonts w:ascii="Times New Roman" w:hAnsi="Times New Roman" w:cs="Times New Roman"/>
+          <w:kern w:val="0"/>
+          <w:lang w:eastAsia="en-GB"/>
+          <w14:ligatures w14:val="none"/>
+        </w:rPr>
+        <w:t>The decisive stage in transforming a tactical concept into credible policy is experimentation through wargaming</w:t>
+      </w:r>
+      <w:r>
+        <w:rPr>
+          <w:rStyle w:val="FootnoteReference"/>
+          <w:rFonts w:ascii="Times New Roman" w:hAnsi="Times New Roman" w:cs="Times New Roman"/>
+          <w:kern w:val="0"/>
+          <w:lang w:eastAsia="en-GB"/>
+          <w14:ligatures w14:val="none"/>
+        </w:rPr>
+        <w:footnoteReference w:id="38"/>
+      </w:r>
+      <w:r>
+        <w:rPr>
+          <w:rFonts w:ascii="Times New Roman" w:hAnsi="Times New Roman" w:cs="Times New Roman"/>
+          <w:kern w:val="0"/>
+          <w:lang w:eastAsia="en-GB"/>
+          <w14:ligatures w14:val="none"/>
+        </w:rPr>
+        <w:t xml:space="preserve">, training, exercising and evaluation. Wargaming allows commanders to </w:t>
+      </w:r>
+      <w:r>
+        <w:rPr>
+          <w:rFonts w:ascii="Times New Roman" w:hAnsi="Times New Roman" w:cs="Times New Roman"/>
+          <w:kern w:val="0"/>
+          <w:lang w:eastAsia="en-GB"/>
+          <w14:ligatures w14:val="none"/>
+        </w:rPr>
+        <w:lastRenderedPageBreak/>
+        <w:t>explore how UxS enabled light infantry denial operations</w:t>
+      </w:r>
+      <w:r>
+        <w:rPr>
+          <w:rStyle w:val="FootnoteReference"/>
+          <w:rFonts w:ascii="Times New Roman" w:hAnsi="Times New Roman" w:cs="Times New Roman"/>
+          <w:kern w:val="0"/>
+          <w:lang w:eastAsia="en-GB"/>
+          <w14:ligatures w14:val="none"/>
+        </w:rPr>
+        <w:footnoteReference w:id="39"/>
+      </w:r>
+      <w:r>
+        <w:rPr>
+          <w:rFonts w:ascii="Times New Roman" w:hAnsi="Times New Roman" w:cs="Times New Roman"/>
+          <w:kern w:val="0"/>
+          <w:lang w:eastAsia="en-GB"/>
+          <w14:ligatures w14:val="none"/>
+        </w:rPr>
+        <w:t xml:space="preserve"> could respond to likely threats against Irish territory or critical infrastructure.</w:t>
+      </w:r>
+    </w:p>
+    <w:p>
+      <w:pPr>
+        <w:pStyle w:val="ListParagraph"/>
+        <w:spacing w:after="0" w:line="360" w:lineRule="auto"/>
+        <w:ind w:left="1440"/>
+        <w:jc w:val="both"/>
+        <w:rPr>
+          <w:rFonts w:ascii="Times New Roman" w:hAnsi="Times New Roman" w:cs="Times New Roman"/>
+          <w:b/>
+          <w:bCs/>
+          <w:kern w:val="0"/>
+          <w:lang w:eastAsia="en-GB"/>
+          <w14:ligatures w14:val="none"/>
+        </w:rPr>
+      </w:pPr>
+    </w:p>
+    <w:p>
+      <w:pPr>
+        <w:spacing w:after="0" w:line="360" w:lineRule="auto"/>
+        <w:jc w:val="both"/>
+        <w:rPr>
+          <w:rFonts w:ascii="Times New Roman" w:hAnsi="Times New Roman" w:cs="Times New Roman"/>
+          <w:kern w:val="0"/>
+          <w:lang w:eastAsia="en-GB"/>
+          <w14:ligatures w14:val="none"/>
+        </w:rPr>
+      </w:pPr>
+      <w:r>
+        <w:rPr>
+          <w:rFonts w:ascii="Times New Roman" w:hAnsi="Times New Roman" w:cs="Times New Roman"/>
+          <w:kern w:val="0"/>
+          <w:lang w:eastAsia="en-GB"/>
+          <w14:ligatures w14:val="none"/>
+        </w:rPr>
+        <w:t>New ideas acquire legitimacy through training and evaluation against realistic operational problems</w:t>
+      </w:r>
+      <w:r>
+        <w:rPr>
+          <w:rStyle w:val="FootnoteReference"/>
+          <w:rFonts w:ascii="Times New Roman" w:hAnsi="Times New Roman" w:cs="Times New Roman"/>
+          <w:kern w:val="0"/>
+          <w:lang w:eastAsia="en-GB"/>
+          <w14:ligatures w14:val="none"/>
+        </w:rPr>
+        <w:footnoteReference w:id="40"/>
+      </w:r>
+      <w:r>
+        <w:rPr>
+          <w:rFonts w:ascii="Times New Roman" w:hAnsi="Times New Roman" w:cs="Times New Roman"/>
+          <w:kern w:val="0"/>
+          <w:lang w:eastAsia="en-GB"/>
+          <w14:ligatures w14:val="none"/>
+        </w:rPr>
+        <w:t>. As tactics become standardised and personnel gain operational confidence, UxS integration transitions from innovation to normal military practice</w:t>
+      </w:r>
+      <w:r>
+        <w:rPr>
+          <w:rStyle w:val="FootnoteReference"/>
+          <w:rFonts w:ascii="Times New Roman" w:hAnsi="Times New Roman" w:cs="Times New Roman"/>
+          <w:kern w:val="0"/>
+          <w:lang w:eastAsia="en-GB"/>
+          <w14:ligatures w14:val="none"/>
+        </w:rPr>
+        <w:footnoteReference w:id="41"/>
+      </w:r>
+      <w:r>
+        <w:rPr>
+          <w:rFonts w:ascii="Times New Roman" w:hAnsi="Times New Roman" w:cs="Times New Roman"/>
+          <w:kern w:val="0"/>
+          <w:lang w:eastAsia="en-GB"/>
+          <w14:ligatures w14:val="none"/>
+        </w:rPr>
+        <w:t>. Importantly, this iterative process provides political leaders with demonstrable evidence that investment in autonomous systems generates measurable improvements in operational effectiveness</w:t>
+      </w:r>
+      <w:r>
+        <w:rPr>
+          <w:rStyle w:val="FootnoteReference"/>
+          <w:rFonts w:ascii="Times New Roman" w:hAnsi="Times New Roman" w:cs="Times New Roman"/>
+          <w:kern w:val="0"/>
+          <w:lang w:eastAsia="en-GB"/>
+          <w14:ligatures w14:val="none"/>
+        </w:rPr>
+        <w:footnoteReference w:id="42"/>
+      </w:r>
+      <w:r>
+        <w:rPr>
+          <w:rFonts w:ascii="Times New Roman" w:hAnsi="Times New Roman" w:cs="Times New Roman"/>
+          <w:kern w:val="0"/>
+          <w:lang w:eastAsia="en-GB"/>
+          <w14:ligatures w14:val="none"/>
+        </w:rPr>
+        <w:t>.</w:t>
+      </w:r>
+      <w:r>
+        <w:t xml:space="preserve"> </w:t>
+      </w:r>
+      <w:r>
+        <w:rPr>
+          <w:rFonts w:ascii="Times New Roman" w:hAnsi="Times New Roman" w:cs="Times New Roman"/>
+          <w:kern w:val="0"/>
+          <w:lang w:eastAsia="en-GB"/>
+          <w14:ligatures w14:val="none"/>
+        </w:rPr>
+        <w:t>Rather than relying upon theoretical arguments, Defence can point to validated concepts, tested doctrine and exercised capability as justification for continued investment.</w:t>
+      </w:r>
+    </w:p>
+    <w:p>
+      <w:pPr>
+        <w:spacing w:after="0" w:line="360" w:lineRule="auto"/>
+        <w:jc w:val="both"/>
+        <w:rPr>
+          <w:rFonts w:ascii="Times New Roman" w:hAnsi="Times New Roman" w:cs="Times New Roman"/>
+          <w:kern w:val="0"/>
+          <w:lang w:eastAsia="en-GB"/>
+          <w14:ligatures w14:val="none"/>
+        </w:rPr>
+      </w:pPr>
+      <w:r>
+        <w:rPr>
+          <w:rFonts w:ascii="Times New Roman" w:hAnsi="Times New Roman" w:cs="Times New Roman"/>
+          <w:kern w:val="0"/>
+          <w:lang w:eastAsia="en-GB"/>
+          <w14:ligatures w14:val="none"/>
+        </w:rPr>
+        <w:t>Lessons identified during experimentation must directly inform doctrinal refinement, force structure and procurement decisions</w:t>
+      </w:r>
+      <w:r>
+        <w:rPr>
+          <w:rStyle w:val="FootnoteReference"/>
+          <w:rFonts w:ascii="Times New Roman" w:hAnsi="Times New Roman" w:cs="Times New Roman"/>
+          <w:kern w:val="0"/>
+          <w:lang w:eastAsia="en-GB"/>
+          <w14:ligatures w14:val="none"/>
+        </w:rPr>
+        <w:footnoteReference w:id="43"/>
+      </w:r>
+      <w:r>
+        <w:rPr>
+          <w:rFonts w:ascii="Times New Roman" w:hAnsi="Times New Roman" w:cs="Times New Roman"/>
+          <w:kern w:val="0"/>
+          <w:lang w:eastAsia="en-GB"/>
+          <w14:ligatures w14:val="none"/>
+        </w:rPr>
+        <w:t>.</w:t>
+      </w:r>
+      <w:r>
+        <w:t xml:space="preserve"> </w:t>
+      </w:r>
+      <w:r>
+        <w:rPr>
+          <w:rFonts w:ascii="Times New Roman" w:hAnsi="Times New Roman" w:cs="Times New Roman"/>
+          <w:kern w:val="0"/>
+          <w:lang w:eastAsia="en-GB"/>
+          <w14:ligatures w14:val="none"/>
+        </w:rPr>
+        <w:t>The insights provided from these processes should inform progressively more demanding field exercises where unmanned systems operate alongside conventional forces under realistic conditions.</w:t>
+      </w:r>
+    </w:p>
+    <w:bookmarkEnd w:id="4"/>
+    <w:p>
+      <w:pPr>
+        <w:spacing w:after="0" w:line="360" w:lineRule="auto"/>
+        <w:jc w:val="both"/>
+        <w:rPr>
+          <w:rFonts w:ascii="Times New Roman" w:hAnsi="Times New Roman" w:cs="Times New Roman"/>
+          <w:kern w:val="0"/>
+          <w:lang w:eastAsia="en-GB"/>
+          <w14:ligatures w14:val="none"/>
+        </w:rPr>
+      </w:pPr>
+      <w:r>
+        <w:rPr>
+          <w:rFonts w:ascii="Times New Roman" w:hAnsi="Times New Roman" w:cs="Times New Roman"/>
+          <w:kern w:val="0"/>
+          <w:lang w:eastAsia="en-GB"/>
+          <w14:ligatures w14:val="none"/>
+        </w:rPr>
+        <w:t>Wargaming, training and experimentation are essential to test, validate and refine the operational use of UxS. The lessons identified should inform doctrine, force structure and procurement, while providing evidence to support continued investment.</w:t>
+      </w:r>
+    </w:p>
+    <w:p>
+      <w:pPr>
+        <w:spacing w:after="0" w:line="360" w:lineRule="auto"/>
+        <w:jc w:val="both"/>
+        <w:rPr>
+          <w:rFonts w:ascii="Times New Roman" w:hAnsi="Times New Roman" w:cs="Times New Roman"/>
+          <w:kern w:val="0"/>
+          <w:lang w:eastAsia="en-GB"/>
+          <w14:ligatures w14:val="none"/>
+        </w:rPr>
+      </w:pPr>
+    </w:p>
+    <w:p>
+      <w:pPr>
+        <w:pStyle w:val="ListParagraph"/>
+        <w:numPr>
+          <w:ilvl w:val="0"/>
+          <w:numId w:val="8"/>
+        </w:numPr>
+        <w:tabs>
+          <w:tab w:val="left" w:pos="567"/>
+        </w:tabs>
+        <w:spacing w:after="0" w:line="360" w:lineRule="auto"/>
+        <w:ind w:left="0" w:firstLine="0"/>
+        <w:jc w:val="both"/>
+        <w:rPr>
+          <w:rFonts w:ascii="Times New Roman" w:hAnsi="Times New Roman" w:cs="Times New Roman"/>
+          <w:b/>
+          <w:bCs/>
+          <w:kern w:val="0"/>
+          <w:lang w:eastAsia="en-GB"/>
+          <w14:ligatures w14:val="none"/>
+        </w:rPr>
+      </w:pPr>
+      <w:bookmarkStart w:id="5" w:name="_Hlk235301718"/>
+      <w:r>
+        <w:rPr>
+          <w:rFonts w:ascii="Times New Roman" w:hAnsi="Times New Roman" w:cs="Times New Roman"/>
+          <w:b/>
+          <w:bCs/>
+          <w:kern w:val="0"/>
+          <w:lang w:eastAsia="en-GB"/>
+          <w14:ligatures w14:val="none"/>
+        </w:rPr>
+        <w:t>Identification and iteration of enabling technologies</w:t>
+      </w:r>
+    </w:p>
+    <w:p>
+      <w:pPr>
+        <w:spacing w:after="0" w:line="360" w:lineRule="auto"/>
+        <w:jc w:val="both"/>
+        <w:rPr>
+          <w:rFonts w:ascii="Times New Roman" w:hAnsi="Times New Roman" w:cs="Times New Roman"/>
+          <w:kern w:val="0"/>
+          <w:lang w:eastAsia="en-GB"/>
+          <w14:ligatures w14:val="none"/>
+        </w:rPr>
+      </w:pPr>
+      <w:r>
+        <w:rPr>
+          <w:rFonts w:ascii="Times New Roman" w:hAnsi="Times New Roman" w:cs="Times New Roman"/>
+          <w:kern w:val="0"/>
+          <w:lang w:eastAsia="en-GB"/>
+          <w14:ligatures w14:val="none"/>
+        </w:rPr>
+        <w:t>Maintaining credibility also requires continuous technological adaptation</w:t>
+      </w:r>
+      <w:r>
+        <w:rPr>
+          <w:rStyle w:val="FootnoteReference"/>
+          <w:rFonts w:ascii="Times New Roman" w:hAnsi="Times New Roman" w:cs="Times New Roman"/>
+          <w:kern w:val="0"/>
+          <w:lang w:eastAsia="en-GB"/>
+          <w14:ligatures w14:val="none"/>
+        </w:rPr>
+        <w:footnoteReference w:id="44"/>
+      </w:r>
+      <w:r>
+        <w:rPr>
+          <w:rFonts w:ascii="Times New Roman" w:hAnsi="Times New Roman" w:cs="Times New Roman"/>
+          <w:kern w:val="0"/>
+          <w:lang w:eastAsia="en-GB"/>
+          <w14:ligatures w14:val="none"/>
+        </w:rPr>
+        <w:t>. One of the defining characteristics of contemporary uncrewed warfare is the exceptionally rapid pace of innovation</w:t>
+      </w:r>
+      <w:r>
+        <w:rPr>
+          <w:rStyle w:val="FootnoteReference"/>
+          <w:rFonts w:ascii="Times New Roman" w:hAnsi="Times New Roman" w:cs="Times New Roman"/>
+          <w:kern w:val="0"/>
+          <w:lang w:eastAsia="en-GB"/>
+          <w14:ligatures w14:val="none"/>
+        </w:rPr>
+        <w:footnoteReference w:id="45"/>
+      </w:r>
+      <w:r>
+        <w:rPr>
+          <w:rFonts w:ascii="Times New Roman" w:hAnsi="Times New Roman" w:cs="Times New Roman"/>
+          <w:kern w:val="0"/>
+          <w:lang w:eastAsia="en-GB"/>
+          <w14:ligatures w14:val="none"/>
+        </w:rPr>
+        <w:t>.</w:t>
+      </w:r>
+      <w:r>
+        <w:rPr>
+          <w:rFonts w:ascii="Times New Roman" w:hAnsi="Times New Roman" w:cs="Times New Roman"/>
+          <w:kern w:val="0"/>
+          <w:lang w:eastAsia="en-GB"/>
+          <w14:ligatures w14:val="none"/>
+        </w:rPr>
+        <w:t xml:space="preserve"> </w:t>
+      </w:r>
+      <w:r>
+        <w:rPr>
+          <w:rFonts w:ascii="Times New Roman" w:hAnsi="Times New Roman" w:cs="Times New Roman"/>
+          <w:kern w:val="0"/>
+          <w:lang w:eastAsia="en-GB"/>
+          <w14:ligatures w14:val="none"/>
+        </w:rPr>
+        <w:t xml:space="preserve">Ireland cannot therefore view UxS procurement as a once-off acquisition </w:t>
+      </w:r>
+      <w:r>
+        <w:rPr>
+          <w:rFonts w:ascii="Times New Roman" w:hAnsi="Times New Roman" w:cs="Times New Roman"/>
+          <w:kern w:val="0"/>
+          <w:lang w:eastAsia="en-GB"/>
+          <w14:ligatures w14:val="none"/>
+        </w:rPr>
+        <w:lastRenderedPageBreak/>
+        <w:t>programme. Instead, defence planning must establish mechanisms for continual capability development through spiral acquisition</w:t>
+      </w:r>
+      <w:r>
+        <w:rPr>
+          <w:rFonts w:ascii="Times New Roman" w:hAnsi="Times New Roman" w:cs="Times New Roman"/>
+          <w:kern w:val="0"/>
+          <w:lang w:eastAsia="en-GB"/>
+          <w14:ligatures w14:val="none"/>
+        </w:rPr>
+        <w:t xml:space="preserve"> and a </w:t>
+      </w:r>
+      <w:r>
+        <w:rPr>
+          <w:rFonts w:ascii="Times New Roman" w:hAnsi="Times New Roman" w:cs="Times New Roman"/>
+          <w:kern w:val="0"/>
+          <w:lang w:eastAsia="en-GB"/>
+          <w14:ligatures w14:val="none"/>
+        </w:rPr>
+        <w:t xml:space="preserve">modular </w:t>
+      </w:r>
+      <w:r>
+        <w:rPr>
+          <w:rFonts w:ascii="Times New Roman" w:hAnsi="Times New Roman" w:cs="Times New Roman"/>
+          <w:kern w:val="0"/>
+          <w:lang w:eastAsia="en-GB"/>
+          <w14:ligatures w14:val="none"/>
+        </w:rPr>
+        <w:t>open systems approach</w:t>
+      </w:r>
+      <w:r>
+        <w:rPr>
+          <w:rStyle w:val="FootnoteReference"/>
+          <w:rFonts w:ascii="Times New Roman" w:hAnsi="Times New Roman" w:cs="Times New Roman"/>
+          <w:kern w:val="0"/>
+          <w:lang w:eastAsia="en-GB"/>
+          <w14:ligatures w14:val="none"/>
+        </w:rPr>
+        <w:footnoteReference w:id="46"/>
+      </w:r>
+      <w:r>
+        <w:rPr>
+          <w:rFonts w:ascii="Times New Roman" w:hAnsi="Times New Roman" w:cs="Times New Roman"/>
+          <w:kern w:val="0"/>
+          <w:lang w:eastAsia="en-GB"/>
+          <w14:ligatures w14:val="none"/>
+        </w:rPr>
+        <w:t xml:space="preserve"> to acquisition</w:t>
+      </w:r>
+      <w:r>
+        <w:rPr>
+          <w:rFonts w:ascii="Times New Roman" w:hAnsi="Times New Roman" w:cs="Times New Roman"/>
+          <w:kern w:val="0"/>
+          <w:lang w:eastAsia="en-GB"/>
+          <w14:ligatures w14:val="none"/>
+        </w:rPr>
+        <w:t>.</w:t>
+      </w:r>
+      <w:r>
+        <w:rPr>
+          <w:rFonts w:ascii="Times New Roman" w:hAnsi="Times New Roman" w:cs="Times New Roman"/>
+          <w:kern w:val="0"/>
+          <w:lang w:eastAsia="en-GB"/>
+          <w14:ligatures w14:val="none"/>
+        </w:rPr>
+        <w:t xml:space="preserve"> </w:t>
+      </w:r>
+      <w:r>
+        <w:rPr>
+          <w:rFonts w:ascii="Times New Roman" w:hAnsi="Times New Roman" w:cs="Times New Roman"/>
+          <w:kern w:val="0"/>
+          <w:lang w:eastAsia="en-GB"/>
+          <w14:ligatures w14:val="none"/>
+        </w:rPr>
+        <w:t>Open systems allowing rapid integration of new sensors, communications and software will reduce obsolescence while enabling adaptation to emerging threats</w:t>
+      </w:r>
+      <w:r>
+        <w:rPr>
+          <w:rStyle w:val="FootnoteReference"/>
+          <w:rFonts w:ascii="Times New Roman" w:hAnsi="Times New Roman" w:cs="Times New Roman"/>
+          <w:kern w:val="0"/>
+          <w:lang w:eastAsia="en-GB"/>
+          <w14:ligatures w14:val="none"/>
+        </w:rPr>
+        <w:footnoteReference w:id="47"/>
+      </w:r>
+      <w:r>
+        <w:rPr>
+          <w:rFonts w:ascii="Times New Roman" w:hAnsi="Times New Roman" w:cs="Times New Roman"/>
+          <w:kern w:val="0"/>
+          <w:lang w:eastAsia="en-GB"/>
+          <w14:ligatures w14:val="none"/>
+        </w:rPr>
+        <w:t>.</w:t>
+      </w:r>
+    </w:p>
+    <w:p>
+      <w:pPr>
+        <w:spacing w:after="0" w:line="360" w:lineRule="auto"/>
+        <w:jc w:val="both"/>
+        <w:rPr>
+          <w:rFonts w:ascii="Times New Roman" w:hAnsi="Times New Roman" w:cs="Times New Roman"/>
+          <w:kern w:val="0"/>
+          <w:lang w:eastAsia="en-GB"/>
+          <w14:ligatures w14:val="none"/>
+        </w:rPr>
+      </w:pPr>
+      <w:r>
+        <w:rPr>
+          <w:rFonts w:ascii="Times New Roman" w:hAnsi="Times New Roman" w:cs="Times New Roman"/>
+          <w:kern w:val="0"/>
+          <w:lang w:eastAsia="en-GB"/>
+          <w14:ligatures w14:val="none"/>
+        </w:rPr>
+        <w:t xml:space="preserve">Military </w:t>
+      </w:r>
+      <w:r>
+        <w:rPr>
+          <w:rFonts w:ascii="Times New Roman" w:hAnsi="Times New Roman" w:cs="Times New Roman"/>
+          <w:kern w:val="0"/>
+          <w:lang w:eastAsia="en-GB"/>
+          <w14:ligatures w14:val="none"/>
+        </w:rPr>
+        <w:t>drone technologies evolve within months rather than decades</w:t>
+      </w:r>
+      <w:r>
+        <w:rPr>
+          <w:rStyle w:val="FootnoteReference"/>
+          <w:rFonts w:ascii="Times New Roman" w:hAnsi="Times New Roman" w:cs="Times New Roman"/>
+          <w:kern w:val="0"/>
+          <w:lang w:eastAsia="en-GB"/>
+          <w14:ligatures w14:val="none"/>
+        </w:rPr>
+        <w:footnoteReference w:id="48"/>
+      </w:r>
+      <w:r>
+        <w:rPr>
+          <w:rFonts w:ascii="Times New Roman" w:hAnsi="Times New Roman" w:cs="Times New Roman"/>
+          <w:kern w:val="0"/>
+          <w:lang w:eastAsia="en-GB"/>
+          <w14:ligatures w14:val="none"/>
+        </w:rPr>
+        <w:t>, while electronic warfare continuously drives adaptation in communications, autonomy and survivability.</w:t>
+      </w:r>
+      <w:r>
+        <w:t xml:space="preserve"> </w:t>
+      </w:r>
+      <w:r>
+        <w:rPr>
+          <w:rFonts w:ascii="Times New Roman" w:hAnsi="Times New Roman" w:cs="Times New Roman"/>
+          <w:kern w:val="0"/>
+          <w:lang w:eastAsia="en-GB"/>
+          <w14:ligatures w14:val="none"/>
+        </w:rPr>
+        <w:t>Such an approach better reflects the innovation cycles of civilian technology industries and ensures that Defence Forces capabilities remain operationally relevant despite constrained budgets</w:t>
+      </w:r>
+      <w:r>
+        <w:rPr>
+          <w:rFonts w:ascii="Times New Roman" w:hAnsi="Times New Roman" w:cs="Times New Roman"/>
+          <w:kern w:val="0"/>
+          <w:lang w:eastAsia="en-GB"/>
+          <w14:ligatures w14:val="none"/>
+        </w:rPr>
+        <w:t>.</w:t>
+      </w:r>
+    </w:p>
+    <w:bookmarkEnd w:id="5"/>
+    <w:p>
+      <w:pPr>
+        <w:spacing w:after="0" w:line="360" w:lineRule="auto"/>
+        <w:jc w:val="both"/>
+        <w:rPr>
+          <w:rFonts w:ascii="Times New Roman" w:hAnsi="Times New Roman" w:cs="Times New Roman"/>
+          <w:kern w:val="0"/>
+          <w:lang w:eastAsia="en-GB"/>
+          <w14:ligatures w14:val="none"/>
+        </w:rPr>
+      </w:pPr>
+      <w:r>
+        <w:rPr>
+          <w:rFonts w:ascii="Times New Roman" w:hAnsi="Times New Roman" w:cs="Times New Roman"/>
+          <w:kern w:val="0"/>
+          <w:lang w:eastAsia="en-GB"/>
+          <w14:ligatures w14:val="none"/>
+        </w:rPr>
+        <w:t>Maintaining an effective UxS capability requires continuous technological adaptation rather than one-time procurement. Adopting spiral acquisition, open systems and commercial technologies will reduce obsolescence and ensure the Defence Forces can respond quickly to emerging threats.</w:t>
+      </w:r>
+    </w:p>
+    <w:p>
+      <w:pPr>
+        <w:spacing w:after="0" w:line="360" w:lineRule="auto"/>
+        <w:jc w:val="both"/>
+        <w:rPr>
+          <w:rFonts w:ascii="Times New Roman" w:hAnsi="Times New Roman" w:cs="Times New Roman"/>
+          <w:kern w:val="0"/>
+          <w:lang w:eastAsia="en-GB"/>
+          <w14:ligatures w14:val="none"/>
+        </w:rPr>
+      </w:pPr>
+    </w:p>
+    <w:p>
+      <w:pPr>
+        <w:pStyle w:val="ListParagraph"/>
+        <w:numPr>
+          <w:ilvl w:val="0"/>
+          <w:numId w:val="8"/>
+        </w:numPr>
+        <w:spacing w:after="0" w:line="360" w:lineRule="auto"/>
+        <w:jc w:val="both"/>
+        <w:rPr>
+          <w:rFonts w:ascii="Times New Roman" w:hAnsi="Times New Roman" w:cs="Times New Roman"/>
+          <w:b/>
+          <w:bCs/>
+          <w:kern w:val="0"/>
+          <w:lang w:eastAsia="en-GB"/>
+          <w14:ligatures w14:val="none"/>
+        </w:rPr>
+      </w:pPr>
+      <w:bookmarkStart w:id="6" w:name="_Hlk235306840"/>
+      <w:r>
+        <w:rPr>
+          <w:rFonts w:ascii="Times New Roman" w:hAnsi="Times New Roman" w:cs="Times New Roman"/>
+          <w:b/>
+          <w:bCs/>
+          <w:kern w:val="0"/>
+          <w:lang w:eastAsia="en-GB"/>
+          <w14:ligatures w14:val="none"/>
+        </w:rPr>
+        <w:t>Agile Industrial Base</w:t>
+      </w:r>
+    </w:p>
+    <w:p>
+      <w:pPr>
+        <w:spacing w:after="0" w:line="360" w:lineRule="auto"/>
+        <w:jc w:val="both"/>
+        <w:rPr>
+          <w:rFonts w:ascii="Times New Roman" w:hAnsi="Times New Roman" w:cs="Times New Roman"/>
+          <w:kern w:val="0"/>
+          <w:lang w:eastAsia="en-GB"/>
+          <w14:ligatures w14:val="none"/>
+        </w:rPr>
+      </w:pPr>
+      <w:r>
+        <w:rPr>
+          <w:rFonts w:ascii="Times New Roman" w:hAnsi="Times New Roman" w:cs="Times New Roman"/>
+          <w:kern w:val="0"/>
+          <w:lang w:eastAsia="en-GB"/>
+          <w14:ligatures w14:val="none"/>
+        </w:rPr>
+        <w:t>Industrial engagement forms another essential pillar of credible policy. Effective military capability depends not only upon equipment quality but also upon the capacity to produce, maintain and replace systems at sufficient scale</w:t>
+      </w:r>
+      <w:r>
+        <w:rPr>
+          <w:rStyle w:val="FootnoteReference"/>
+          <w:rFonts w:ascii="Times New Roman" w:hAnsi="Times New Roman" w:cs="Times New Roman"/>
+          <w:kern w:val="0"/>
+          <w:lang w:eastAsia="en-GB"/>
+          <w14:ligatures w14:val="none"/>
+        </w:rPr>
+        <w:footnoteReference w:id="49"/>
+      </w:r>
+      <w:r>
+        <w:rPr>
+          <w:rFonts w:ascii="Times New Roman" w:hAnsi="Times New Roman" w:cs="Times New Roman"/>
+          <w:kern w:val="0"/>
+          <w:lang w:eastAsia="en-GB"/>
+          <w14:ligatures w14:val="none"/>
+        </w:rPr>
+        <w:t>.</w:t>
+      </w:r>
+      <w:r>
+        <w:rPr>
+          <w:rFonts w:ascii="Times New Roman" w:hAnsi="Times New Roman" w:cs="Times New Roman"/>
+          <w:kern w:val="0"/>
+          <w:lang w:eastAsia="en-GB"/>
+          <w14:ligatures w14:val="none"/>
+        </w:rPr>
+        <w:t xml:space="preserve"> </w:t>
+      </w:r>
+      <w:r>
+        <w:rPr>
+          <w:rFonts w:ascii="Times New Roman" w:hAnsi="Times New Roman" w:cs="Times New Roman"/>
+          <w:kern w:val="0"/>
+          <w:lang w:eastAsia="en-GB"/>
+          <w14:ligatures w14:val="none"/>
+        </w:rPr>
+        <w:t>Ireland should therefore strengthen partnerships between the Defence Forces, indigenous defence and technology companies, universities and research institutions to establish sustainable domestic capability in UxS</w:t>
+      </w:r>
+      <w:r>
+        <w:rPr>
+          <w:rStyle w:val="FootnoteReference"/>
+          <w:rFonts w:ascii="Times New Roman" w:hAnsi="Times New Roman" w:cs="Times New Roman"/>
+          <w:kern w:val="0"/>
+          <w:lang w:eastAsia="en-GB"/>
+          <w14:ligatures w14:val="none"/>
+        </w:rPr>
+        <w:footnoteReference w:id="50"/>
+      </w:r>
+      <w:r>
+        <w:rPr>
+          <w:rFonts w:ascii="Times New Roman" w:hAnsi="Times New Roman" w:cs="Times New Roman"/>
+          <w:kern w:val="0"/>
+          <w:lang w:eastAsia="en-GB"/>
+          <w14:ligatures w14:val="none"/>
+        </w:rPr>
+        <w:t>.</w:t>
+      </w:r>
+      <w:r>
+        <w:rPr>
+          <w:rFonts w:ascii="Times New Roman" w:hAnsi="Times New Roman" w:cs="Times New Roman"/>
+          <w:kern w:val="0"/>
+          <w:lang w:eastAsia="en-GB"/>
+          <w14:ligatures w14:val="none"/>
+        </w:rPr>
+        <w:t xml:space="preserve"> </w:t>
+      </w:r>
+      <w:r>
+        <w:rPr>
+          <w:rFonts w:ascii="Times New Roman" w:hAnsi="Times New Roman" w:cs="Times New Roman"/>
+          <w:kern w:val="0"/>
+          <w:lang w:eastAsia="en-GB"/>
+          <w14:ligatures w14:val="none"/>
+        </w:rPr>
+        <w:t>Indigenous production enhances strategic resilience, reduces dependence on overseas suppliers</w:t>
+      </w:r>
+      <w:r>
+        <w:rPr>
+          <w:rStyle w:val="FootnoteReference"/>
+          <w:rFonts w:ascii="Times New Roman" w:hAnsi="Times New Roman" w:cs="Times New Roman"/>
+          <w:kern w:val="0"/>
+          <w:lang w:eastAsia="en-GB"/>
+          <w14:ligatures w14:val="none"/>
+        </w:rPr>
+        <w:footnoteReference w:id="51"/>
+      </w:r>
+      <w:r>
+        <w:rPr>
+          <w:rFonts w:ascii="Times New Roman" w:hAnsi="Times New Roman" w:cs="Times New Roman"/>
+          <w:kern w:val="0"/>
+          <w:lang w:eastAsia="en-GB"/>
+          <w14:ligatures w14:val="none"/>
+        </w:rPr>
+        <w:t xml:space="preserve"> and creates opportunities for innovation within Ireland's expanding technology sector.</w:t>
+      </w:r>
+    </w:p>
+    <w:p>
+      <w:pPr>
+        <w:spacing w:after="0" w:line="360" w:lineRule="auto"/>
+        <w:jc w:val="both"/>
+        <w:rPr>
+          <w:rFonts w:ascii="Times New Roman" w:hAnsi="Times New Roman" w:cs="Times New Roman"/>
+          <w:kern w:val="0"/>
+          <w:lang w:eastAsia="en-GB"/>
+          <w14:ligatures w14:val="none"/>
+        </w:rPr>
+      </w:pPr>
+      <w:r>
+        <w:rPr>
+          <w:rFonts w:ascii="Times New Roman" w:hAnsi="Times New Roman" w:cs="Times New Roman"/>
+          <w:kern w:val="0"/>
+          <w:lang w:eastAsia="en-GB"/>
+          <w14:ligatures w14:val="none"/>
+        </w:rPr>
+        <w:lastRenderedPageBreak/>
+        <w:t>The Ukraine conflict has demonstrated that affordable mass frequently outweighs exquisite capability when attrition is high</w:t>
+      </w:r>
+      <w:r>
+        <w:rPr>
+          <w:rStyle w:val="FootnoteReference"/>
+          <w:rFonts w:ascii="Times New Roman" w:hAnsi="Times New Roman" w:cs="Times New Roman"/>
+          <w:kern w:val="0"/>
+          <w:lang w:eastAsia="en-GB"/>
+          <w14:ligatures w14:val="none"/>
+        </w:rPr>
+        <w:footnoteReference w:id="52"/>
+      </w:r>
+      <w:r>
+        <w:rPr>
+          <w:rFonts w:ascii="Times New Roman" w:hAnsi="Times New Roman" w:cs="Times New Roman"/>
+          <w:kern w:val="0"/>
+          <w:lang w:eastAsia="en-GB"/>
+          <w14:ligatures w14:val="none"/>
+        </w:rPr>
+        <w:t>.</w:t>
+      </w:r>
+      <w:r>
+        <w:rPr>
+          <w:rFonts w:ascii="Times New Roman" w:hAnsi="Times New Roman" w:cs="Times New Roman"/>
+          <w:kern w:val="0"/>
+          <w:lang w:eastAsia="en-GB"/>
+          <w14:ligatures w14:val="none"/>
+        </w:rPr>
+        <w:t xml:space="preserve"> </w:t>
+      </w:r>
+      <w:r>
+        <w:rPr>
+          <w:rFonts w:ascii="Times New Roman" w:hAnsi="Times New Roman" w:cs="Times New Roman"/>
+          <w:kern w:val="0"/>
+          <w:lang w:eastAsia="en-GB"/>
+          <w14:ligatures w14:val="none"/>
+        </w:rPr>
+        <w:t>Close civil-military cooperation will enable the rapid adoption of commercial innovations, creating a resilient and scalable smart mass of autonomous systems that can evolve to meet emerging operational requirements.</w:t>
+      </w:r>
+    </w:p>
+    <w:p>
+      <w:pPr>
+        <w:spacing w:after="0" w:line="360" w:lineRule="auto"/>
+        <w:jc w:val="both"/>
+        <w:rPr>
+          <w:rFonts w:ascii="Times New Roman" w:hAnsi="Times New Roman" w:cs="Times New Roman"/>
+          <w:b/>
+          <w:bCs/>
+          <w:kern w:val="0"/>
+          <w:lang w:eastAsia="en-GB"/>
+          <w14:ligatures w14:val="none"/>
+        </w:rPr>
+      </w:pPr>
+    </w:p>
+    <w:p>
+      <w:pPr>
+        <w:spacing w:after="0" w:line="360" w:lineRule="auto"/>
+        <w:jc w:val="both"/>
+        <w:rPr>
+          <w:rFonts w:ascii="Times New Roman" w:hAnsi="Times New Roman" w:cs="Times New Roman"/>
+          <w:kern w:val="0"/>
+          <w:lang w:eastAsia="en-GB"/>
+          <w14:ligatures w14:val="none"/>
+        </w:rPr>
+      </w:pPr>
+      <w:r>
+        <w:rPr>
+          <w:rFonts w:ascii="Times New Roman" w:hAnsi="Times New Roman" w:cs="Times New Roman"/>
+          <w:kern w:val="0"/>
+          <w:lang w:eastAsia="en-GB"/>
+          <w14:ligatures w14:val="none"/>
+        </w:rPr>
+        <w:t>However, to be successful this must be properly resourced. T</w:t>
+      </w:r>
+      <w:r>
+        <w:rPr>
+          <w:rFonts w:ascii="Times New Roman" w:hAnsi="Times New Roman" w:cs="Times New Roman"/>
+          <w:kern w:val="0"/>
+          <w:lang w:eastAsia="en-GB"/>
+          <w14:ligatures w14:val="none"/>
+        </w:rPr>
+        <w:t>here must be effective resourcing allocated to the generation of capability or industry will not be incentivised to support its implementation</w:t>
+      </w:r>
+      <w:r>
+        <w:rPr>
+          <w:rStyle w:val="FootnoteReference"/>
+          <w:rFonts w:ascii="Times New Roman" w:hAnsi="Times New Roman" w:cs="Times New Roman"/>
+          <w:kern w:val="0"/>
+          <w:lang w:eastAsia="en-GB"/>
+          <w14:ligatures w14:val="none"/>
+        </w:rPr>
+        <w:footnoteReference w:id="53"/>
+      </w:r>
+      <w:r>
+        <w:rPr>
+          <w:rFonts w:ascii="Times New Roman" w:hAnsi="Times New Roman" w:cs="Times New Roman"/>
+          <w:kern w:val="0"/>
+          <w:lang w:eastAsia="en-GB"/>
+          <w14:ligatures w14:val="none"/>
+        </w:rPr>
+        <w:t>.</w:t>
+      </w:r>
+    </w:p>
+    <w:bookmarkEnd w:id="6"/>
+    <w:p>
+      <w:pPr>
+        <w:pStyle w:val="ListParagraph"/>
+        <w:spacing w:after="0" w:line="360" w:lineRule="auto"/>
+        <w:ind w:left="0"/>
+        <w:jc w:val="both"/>
+        <w:rPr>
+          <w:rFonts w:ascii="Times New Roman" w:hAnsi="Times New Roman" w:cs="Times New Roman"/>
+          <w:kern w:val="0"/>
+          <w:lang w:eastAsia="en-GB"/>
+          <w14:ligatures w14:val="none"/>
+        </w:rPr>
+      </w:pPr>
+      <w:r>
+        <w:rPr>
+          <w:rFonts w:ascii="Times New Roman" w:hAnsi="Times New Roman" w:cs="Times New Roman"/>
+          <w:kern w:val="0"/>
+          <w:lang w:eastAsia="en-GB"/>
+          <w14:ligatures w14:val="none"/>
+        </w:rPr>
+        <w:t>A resilient domestic industrial base, built on strong partnerships between the Defence Forces, industry and academia, is essential to deliver a sustainable and scalable smart mass of uncrewed systems. However, this will only be achieved through sustained government investment and long-term resourcing that incentivises innovation and capability development.</w:t>
+      </w:r>
+    </w:p>
+    <w:p>
+      <w:pPr>
+        <w:spacing w:after="0" w:line="360" w:lineRule="auto"/>
+        <w:jc w:val="both"/>
+        <w:rPr>
+          <w:rFonts w:ascii="Times New Roman" w:hAnsi="Times New Roman" w:cs="Times New Roman"/>
+          <w:kern w:val="0"/>
+          <w:lang w:eastAsia="en-GB"/>
+          <w14:ligatures w14:val="none"/>
+        </w:rPr>
+      </w:pPr>
+    </w:p>
+    <w:p>
+      <w:pPr>
+        <w:pStyle w:val="ListParagraph"/>
+        <w:numPr>
+          <w:ilvl w:val="0"/>
+          <w:numId w:val="8"/>
+        </w:numPr>
+        <w:spacing w:after="0" w:line="360" w:lineRule="auto"/>
+        <w:jc w:val="both"/>
+        <w:rPr>
+          <w:rFonts w:ascii="Times New Roman" w:hAnsi="Times New Roman" w:cs="Times New Roman"/>
+          <w:b/>
+          <w:bCs/>
+          <w:kern w:val="0"/>
+          <w:lang w:eastAsia="en-GB"/>
+          <w14:ligatures w14:val="none"/>
+        </w:rPr>
+      </w:pPr>
+      <w:r>
+        <w:rPr>
+          <w:rFonts w:ascii="Times New Roman" w:hAnsi="Times New Roman" w:cs="Times New Roman"/>
+          <w:b/>
+          <w:bCs/>
+          <w:kern w:val="0"/>
+          <w:lang w:eastAsia="en-GB"/>
+          <w14:ligatures w14:val="none"/>
+        </w:rPr>
+        <w:t>The Multi-Stakeholder Approach.</w:t>
+      </w:r>
+    </w:p>
+    <w:p>
+      <w:pPr>
+        <w:pStyle w:val="ListParagraph"/>
+        <w:numPr>
+          <w:ilvl w:val="1"/>
+          <w:numId w:val="8"/>
+        </w:numPr>
+        <w:spacing w:after="0" w:line="360" w:lineRule="auto"/>
+        <w:jc w:val="both"/>
+        <w:rPr>
+          <w:rFonts w:ascii="Times New Roman" w:hAnsi="Times New Roman" w:cs="Times New Roman"/>
+          <w:b/>
+          <w:bCs/>
+          <w:kern w:val="0"/>
+          <w:lang w:eastAsia="en-GB"/>
+          <w14:ligatures w14:val="none"/>
+        </w:rPr>
+      </w:pPr>
+      <w:r>
+        <w:rPr>
+          <w:rFonts w:ascii="Times New Roman" w:hAnsi="Times New Roman" w:cs="Times New Roman"/>
+          <w:b/>
+          <w:bCs/>
+          <w:kern w:val="0"/>
+          <w:lang w:eastAsia="en-GB"/>
+          <w14:ligatures w14:val="none"/>
+        </w:rPr>
+        <w:t>Civil-Mil Cooperation</w:t>
+      </w:r>
+    </w:p>
+    <w:p>
+      <w:pPr>
+        <w:pStyle w:val="ListParagraph"/>
+        <w:spacing w:after="0" w:line="360" w:lineRule="auto"/>
+        <w:ind w:left="1440"/>
+        <w:jc w:val="both"/>
+        <w:rPr>
+          <w:rFonts w:ascii="Times New Roman" w:hAnsi="Times New Roman" w:cs="Times New Roman"/>
+          <w:kern w:val="0"/>
+          <w:lang w:eastAsia="en-GB"/>
+          <w14:ligatures w14:val="none"/>
+        </w:rPr>
+      </w:pPr>
+      <w:r>
+        <w:rPr>
+          <w:rFonts w:ascii="Times New Roman" w:hAnsi="Times New Roman" w:cs="Times New Roman"/>
+          <w:kern w:val="0"/>
+          <w:lang w:eastAsia="en-GB"/>
+          <w14:ligatures w14:val="none"/>
+        </w:rPr>
+        <w:t>Defence transformation cannot occur solely within military institutions. The successful integration of new ideas and technology requires a genuinely multi-stakeholder approach</w:t>
+      </w:r>
+      <w:r>
+        <w:rPr>
+          <w:rStyle w:val="FootnoteReference"/>
+          <w:rFonts w:ascii="Times New Roman" w:hAnsi="Times New Roman" w:cs="Times New Roman"/>
+          <w:kern w:val="0"/>
+          <w:lang w:eastAsia="en-GB"/>
+          <w14:ligatures w14:val="none"/>
+        </w:rPr>
+        <w:footnoteReference w:id="54"/>
+      </w:r>
+      <w:r>
+        <w:rPr>
+          <w:rFonts w:ascii="Times New Roman" w:hAnsi="Times New Roman" w:cs="Times New Roman"/>
+          <w:kern w:val="0"/>
+          <w:lang w:eastAsia="en-GB"/>
+          <w14:ligatures w14:val="none"/>
+        </w:rPr>
+        <w:t>.</w:t>
+      </w:r>
+    </w:p>
+    <w:p>
+      <w:pPr>
+        <w:pStyle w:val="ListParagraph"/>
+        <w:spacing w:after="0" w:line="360" w:lineRule="auto"/>
+        <w:ind w:left="1440"/>
+        <w:jc w:val="both"/>
+        <w:rPr>
+          <w:rFonts w:ascii="Times New Roman" w:hAnsi="Times New Roman" w:cs="Times New Roman"/>
+          <w:kern w:val="0"/>
+          <w:lang w:eastAsia="en-GB"/>
+          <w14:ligatures w14:val="none"/>
+        </w:rPr>
+      </w:pPr>
+    </w:p>
+    <w:p>
+      <w:pPr>
+        <w:pStyle w:val="ListParagraph"/>
+        <w:spacing w:after="0" w:line="360" w:lineRule="auto"/>
+        <w:ind w:left="1440"/>
+        <w:jc w:val="both"/>
+        <w:rPr>
+          <w:rFonts w:ascii="Times New Roman" w:hAnsi="Times New Roman" w:cs="Times New Roman"/>
+          <w:kern w:val="0"/>
+          <w:lang w:eastAsia="en-GB"/>
+          <w14:ligatures w14:val="none"/>
+        </w:rPr>
+      </w:pPr>
+      <w:r>
+        <w:rPr>
+          <w:rFonts w:ascii="Times New Roman" w:hAnsi="Times New Roman" w:cs="Times New Roman"/>
+          <w:kern w:val="0"/>
+          <w:lang w:eastAsia="en-GB"/>
+          <w14:ligatures w14:val="none"/>
+        </w:rPr>
+        <w:t>Political leadership, government departments, academia, industry and regulatory authorities must all contribute to capability development</w:t>
+      </w:r>
+      <w:r>
+        <w:rPr>
+          <w:rStyle w:val="FootnoteReference"/>
+          <w:rFonts w:ascii="Times New Roman" w:hAnsi="Times New Roman" w:cs="Times New Roman"/>
+          <w:kern w:val="0"/>
+          <w:lang w:eastAsia="en-GB"/>
+          <w14:ligatures w14:val="none"/>
+        </w:rPr>
+        <w:footnoteReference w:id="55"/>
+      </w:r>
+      <w:r>
+        <w:rPr>
+          <w:rFonts w:ascii="Times New Roman" w:hAnsi="Times New Roman" w:cs="Times New Roman"/>
+          <w:kern w:val="0"/>
+          <w:lang w:eastAsia="en-GB"/>
+          <w14:ligatures w14:val="none"/>
+        </w:rPr>
+        <w:t xml:space="preserve">. </w:t>
+      </w:r>
+      <w:r>
+        <w:rPr>
+          <w:rFonts w:ascii="Times New Roman" w:hAnsi="Times New Roman" w:cs="Times New Roman"/>
+          <w:kern w:val="0"/>
+          <w:lang w:eastAsia="en-GB"/>
+          <w14:ligatures w14:val="none"/>
+        </w:rPr>
+        <w:t>Such collaboration avoids organisational silos while ensuring that ethical, legal, financial and operational considerations develop together.</w:t>
+      </w:r>
+    </w:p>
+    <w:p>
+      <w:pPr>
+        <w:pStyle w:val="ListParagraph"/>
+        <w:spacing w:after="0" w:line="360" w:lineRule="auto"/>
+        <w:ind w:left="1440"/>
+        <w:jc w:val="both"/>
+        <w:rPr>
+          <w:rFonts w:ascii="Times New Roman" w:hAnsi="Times New Roman" w:cs="Times New Roman"/>
+          <w:b/>
+          <w:bCs/>
+          <w:kern w:val="0"/>
+          <w:lang w:eastAsia="en-GB"/>
+          <w14:ligatures w14:val="none"/>
+        </w:rPr>
+      </w:pPr>
+    </w:p>
+    <w:p>
+      <w:pPr>
+        <w:pStyle w:val="ListParagraph"/>
+        <w:numPr>
+          <w:ilvl w:val="1"/>
+          <w:numId w:val="8"/>
+        </w:numPr>
+        <w:spacing w:after="0" w:line="360" w:lineRule="auto"/>
+        <w:jc w:val="both"/>
+        <w:rPr>
+          <w:rFonts w:ascii="Times New Roman" w:hAnsi="Times New Roman" w:cs="Times New Roman"/>
+          <w:b/>
+          <w:bCs/>
+          <w:kern w:val="0"/>
+          <w:lang w:eastAsia="en-GB"/>
+          <w14:ligatures w14:val="none"/>
+        </w:rPr>
+      </w:pPr>
+      <w:r>
+        <w:rPr>
+          <w:rFonts w:ascii="Times New Roman" w:hAnsi="Times New Roman" w:cs="Times New Roman"/>
+          <w:b/>
+          <w:bCs/>
+          <w:kern w:val="0"/>
+          <w:lang w:eastAsia="en-GB"/>
+          <w14:ligatures w14:val="none"/>
+        </w:rPr>
+        <w:t>Transparent Governance and Oversight</w:t>
+      </w:r>
+    </w:p>
+    <w:p>
+      <w:pPr>
+        <w:pStyle w:val="ListParagraph"/>
+        <w:spacing w:after="0" w:line="360" w:lineRule="auto"/>
+        <w:ind w:left="1440"/>
+        <w:jc w:val="both"/>
+        <w:rPr>
+          <w:rFonts w:ascii="Times New Roman" w:hAnsi="Times New Roman" w:cs="Times New Roman"/>
+          <w:kern w:val="0"/>
+          <w:lang w:eastAsia="en-GB"/>
+          <w14:ligatures w14:val="none"/>
+        </w:rPr>
+      </w:pPr>
+      <w:r>
+        <w:rPr>
+          <w:rFonts w:ascii="Times New Roman" w:hAnsi="Times New Roman" w:cs="Times New Roman"/>
+          <w:kern w:val="0"/>
+          <w:lang w:eastAsia="en-GB"/>
+          <w14:ligatures w14:val="none"/>
+        </w:rPr>
+        <w:t>Civilian oversight is particularly important given the political sensitivities surrounding autonomy</w:t>
+      </w:r>
+      <w:r>
+        <w:rPr>
+          <w:rFonts w:ascii="Times New Roman" w:hAnsi="Times New Roman" w:cs="Times New Roman"/>
+          <w:kern w:val="0"/>
+          <w:lang w:eastAsia="en-GB"/>
+          <w14:ligatures w14:val="none"/>
+        </w:rPr>
+        <w:t xml:space="preserve"> </w:t>
+      </w:r>
+      <w:r>
+        <w:rPr>
+          <w:rFonts w:ascii="Times New Roman" w:hAnsi="Times New Roman" w:cs="Times New Roman"/>
+          <w:kern w:val="0"/>
+          <w:lang w:eastAsia="en-GB"/>
+          <w14:ligatures w14:val="none"/>
+        </w:rPr>
+        <w:t>and military neutrality</w:t>
+      </w:r>
+      <w:r>
+        <w:rPr>
+          <w:rStyle w:val="FootnoteReference"/>
+          <w:rFonts w:ascii="Times New Roman" w:hAnsi="Times New Roman" w:cs="Times New Roman"/>
+          <w:kern w:val="0"/>
+          <w:lang w:eastAsia="en-GB"/>
+          <w14:ligatures w14:val="none"/>
+        </w:rPr>
+        <w:footnoteReference w:id="56"/>
+      </w:r>
+      <w:r>
+        <w:rPr>
+          <w:rFonts w:ascii="Times New Roman" w:hAnsi="Times New Roman" w:cs="Times New Roman"/>
+          <w:kern w:val="0"/>
+          <w:lang w:eastAsia="en-GB"/>
+          <w14:ligatures w14:val="none"/>
+        </w:rPr>
+        <w:t xml:space="preserve">. </w:t>
+      </w:r>
+    </w:p>
+    <w:p>
+      <w:pPr>
+        <w:pStyle w:val="ListParagraph"/>
+        <w:spacing w:after="0" w:line="360" w:lineRule="auto"/>
+        <w:ind w:left="1440"/>
+        <w:jc w:val="both"/>
+        <w:rPr>
+          <w:rFonts w:ascii="Times New Roman" w:hAnsi="Times New Roman" w:cs="Times New Roman"/>
+          <w:kern w:val="0"/>
+          <w:lang w:eastAsia="en-GB"/>
+          <w14:ligatures w14:val="none"/>
+        </w:rPr>
+      </w:pPr>
+    </w:p>
+    <w:p>
+      <w:pPr>
+        <w:pStyle w:val="ListParagraph"/>
+        <w:spacing w:after="0" w:line="360" w:lineRule="auto"/>
+        <w:ind w:left="1440"/>
+        <w:jc w:val="both"/>
+        <w:rPr>
+          <w:rFonts w:ascii="Times New Roman" w:hAnsi="Times New Roman" w:cs="Times New Roman"/>
+          <w:kern w:val="0"/>
+          <w:lang w:eastAsia="en-GB"/>
+          <w14:ligatures w14:val="none"/>
+        </w:rPr>
+      </w:pPr>
+      <w:r>
+        <w:rPr>
+          <w:rFonts w:ascii="Times New Roman" w:hAnsi="Times New Roman" w:cs="Times New Roman"/>
+          <w:kern w:val="0"/>
+          <w:lang w:eastAsia="en-GB"/>
+          <w14:ligatures w14:val="none"/>
+        </w:rPr>
+        <w:t>Transparent governance strengthens public confidence that autonomous systems</w:t>
+      </w:r>
+      <w:r>
+        <w:rPr>
+          <w:rStyle w:val="FootnoteReference"/>
+          <w:rFonts w:ascii="Times New Roman" w:hAnsi="Times New Roman" w:cs="Times New Roman"/>
+          <w:kern w:val="0"/>
+          <w:lang w:eastAsia="en-GB"/>
+          <w14:ligatures w14:val="none"/>
+        </w:rPr>
+        <w:footnoteReference w:id="57"/>
+      </w:r>
+      <w:r>
+        <w:rPr>
+          <w:rFonts w:ascii="Times New Roman" w:hAnsi="Times New Roman" w:cs="Times New Roman"/>
+          <w:kern w:val="0"/>
+          <w:lang w:eastAsia="en-GB"/>
+          <w14:ligatures w14:val="none"/>
+        </w:rPr>
+        <w:t xml:space="preserve"> are enhancing national resilience rather than fundamentally altering Ireland's defence posture.</w:t>
+      </w:r>
+    </w:p>
+    <w:p>
+      <w:pPr>
+        <w:pStyle w:val="ListParagraph"/>
+        <w:spacing w:after="0" w:line="360" w:lineRule="auto"/>
+        <w:ind w:left="1440"/>
+        <w:jc w:val="both"/>
+        <w:rPr>
+          <w:rFonts w:ascii="Times New Roman" w:hAnsi="Times New Roman" w:cs="Times New Roman"/>
+          <w:kern w:val="0"/>
+          <w:lang w:eastAsia="en-GB"/>
+          <w14:ligatures w14:val="none"/>
+        </w:rPr>
+      </w:pPr>
+    </w:p>
+    <w:p>
+      <w:pPr>
+        <w:spacing w:after="0" w:line="360" w:lineRule="auto"/>
+        <w:jc w:val="both"/>
+        <w:rPr>
+          <w:rFonts w:ascii="Times New Roman" w:hAnsi="Times New Roman" w:cs="Times New Roman"/>
+          <w:kern w:val="0"/>
+          <w:lang w:eastAsia="en-GB"/>
+          <w14:ligatures w14:val="none"/>
+        </w:rPr>
+      </w:pPr>
+    </w:p>
+    <w:p>
+      <w:pPr>
+        <w:spacing w:after="0" w:line="360" w:lineRule="auto"/>
+        <w:jc w:val="both"/>
+        <w:rPr>
+          <w:rFonts w:ascii="Times New Roman" w:hAnsi="Times New Roman" w:cs="Times New Roman"/>
+          <w:b/>
+          <w:bCs/>
+          <w:kern w:val="0"/>
+          <w:lang w:eastAsia="en-GB"/>
+          <w14:ligatures w14:val="none"/>
+        </w:rPr>
+      </w:pPr>
+      <w:r>
+        <w:rPr>
+          <w:rFonts w:ascii="Times New Roman" w:hAnsi="Times New Roman" w:cs="Times New Roman"/>
+          <w:b/>
+          <w:bCs/>
+          <w:kern w:val="0"/>
+          <w:lang w:eastAsia="en-GB"/>
+          <w14:ligatures w14:val="none"/>
+        </w:rPr>
+        <w:t>Sub Conclusion</w:t>
+      </w:r>
+    </w:p>
+    <w:p>
+      <w:pPr>
+        <w:spacing w:after="0" w:line="360" w:lineRule="auto"/>
+        <w:jc w:val="both"/>
+        <w:rPr>
+          <w:rFonts w:ascii="Times New Roman" w:hAnsi="Times New Roman" w:cs="Times New Roman"/>
+          <w:kern w:val="0"/>
+          <w:lang w:eastAsia="en-GB"/>
+          <w14:ligatures w14:val="none"/>
+        </w:rPr>
+      </w:pPr>
+    </w:p>
+    <w:p>
+      <w:pPr>
+        <w:spacing w:after="0" w:line="360" w:lineRule="auto"/>
+        <w:jc w:val="both"/>
+        <w:rPr>
+          <w:rFonts w:ascii="Times New Roman" w:hAnsi="Times New Roman" w:cs="Times New Roman"/>
+          <w:kern w:val="0"/>
+          <w:lang w:eastAsia="en-GB"/>
+          <w14:ligatures w14:val="none"/>
+        </w:rPr>
+      </w:pPr>
+    </w:p>
+    <w:p>
+      <w:pPr>
+        <w:spacing w:after="0" w:line="360" w:lineRule="auto"/>
+        <w:jc w:val="both"/>
+        <w:rPr>
+          <w:rFonts w:ascii="Times New Roman" w:hAnsi="Times New Roman" w:cs="Times New Roman"/>
+          <w:kern w:val="0"/>
+          <w:lang w:eastAsia="en-GB"/>
+          <w14:ligatures w14:val="none"/>
+        </w:rPr>
+      </w:pPr>
+    </w:p>
+    <w:p>
+      <w:pPr>
+        <w:spacing w:after="0" w:line="360" w:lineRule="auto"/>
+        <w:jc w:val="both"/>
+        <w:rPr>
+          <w:rFonts w:ascii="Times New Roman" w:hAnsi="Times New Roman" w:cs="Times New Roman"/>
+          <w:b/>
+          <w:bCs/>
+          <w:kern w:val="0"/>
+          <w:lang w:eastAsia="en-GB"/>
+          <w14:ligatures w14:val="none"/>
+        </w:rPr>
+      </w:pPr>
+      <w:r>
+        <w:rPr>
+          <w:rFonts w:ascii="Times New Roman" w:hAnsi="Times New Roman" w:cs="Times New Roman"/>
+          <w:b/>
+          <w:bCs/>
+          <w:kern w:val="0"/>
+          <w:lang w:eastAsia="en-GB"/>
+          <w14:ligatures w14:val="none"/>
+        </w:rPr>
+        <w:t>Challenges to Credible Integration.</w:t>
+      </w:r>
+    </w:p>
+    <w:p>
+      <w:pPr>
+        <w:spacing w:after="0" w:line="360" w:lineRule="auto"/>
+        <w:jc w:val="both"/>
+        <w:rPr>
+          <w:rFonts w:ascii="Times New Roman" w:hAnsi="Times New Roman" w:cs="Times New Roman"/>
+          <w:kern w:val="0"/>
+          <w:lang w:eastAsia="en-GB"/>
+          <w14:ligatures w14:val="none"/>
+        </w:rPr>
+      </w:pPr>
+      <w:r>
+        <w:rPr>
+          <w:rFonts w:ascii="Times New Roman" w:hAnsi="Times New Roman" w:cs="Times New Roman"/>
+          <w:kern w:val="0"/>
+          <w:lang w:eastAsia="en-GB"/>
+          <w14:ligatures w14:val="none"/>
+        </w:rPr>
+        <w:t xml:space="preserve">Nevertheless, significant constraints remain. </w:t>
+      </w:r>
+    </w:p>
+    <w:p>
+      <w:pPr>
+        <w:pStyle w:val="ListParagraph"/>
+        <w:numPr>
+          <w:ilvl w:val="0"/>
+          <w:numId w:val="9"/>
+        </w:numPr>
+        <w:spacing w:after="0" w:line="360" w:lineRule="auto"/>
+        <w:jc w:val="both"/>
+        <w:rPr>
+          <w:rFonts w:ascii="Times New Roman" w:hAnsi="Times New Roman" w:cs="Times New Roman"/>
+          <w:b/>
+          <w:bCs/>
+          <w:kern w:val="0"/>
+          <w:lang w:eastAsia="en-GB"/>
+          <w14:ligatures w14:val="none"/>
+        </w:rPr>
+      </w:pPr>
+      <w:r>
+        <w:rPr>
+          <w:rFonts w:ascii="Times New Roman" w:hAnsi="Times New Roman" w:cs="Times New Roman"/>
+          <w:b/>
+          <w:bCs/>
+          <w:kern w:val="0"/>
+          <w:lang w:eastAsia="en-GB"/>
+          <w14:ligatures w14:val="none"/>
+        </w:rPr>
+        <w:t>Recruitment and Retention</w:t>
+      </w:r>
+    </w:p>
+    <w:p>
+      <w:pPr>
+        <w:spacing w:after="0" w:line="360" w:lineRule="auto"/>
+        <w:jc w:val="both"/>
+        <w:rPr>
+          <w:rFonts w:ascii="Times New Roman" w:hAnsi="Times New Roman" w:cs="Times New Roman"/>
+          <w:kern w:val="0"/>
+          <w:lang w:eastAsia="en-GB"/>
+          <w14:ligatures w14:val="none"/>
+        </w:rPr>
+      </w:pPr>
+      <w:r>
+        <w:rPr>
+          <w:rFonts w:ascii="Times New Roman" w:hAnsi="Times New Roman" w:cs="Times New Roman"/>
+          <w:kern w:val="0"/>
+          <w:lang w:eastAsia="en-GB"/>
+          <w14:ligatures w14:val="none"/>
+        </w:rPr>
+        <w:t>Chronic recruitment and retention difficulties continue to challenge Defence Forces modernisation</w:t>
+      </w:r>
+      <w:r>
+        <w:rPr>
+          <w:rFonts w:ascii="Times New Roman" w:hAnsi="Times New Roman" w:cs="Times New Roman"/>
+          <w:kern w:val="0"/>
+          <w:vertAlign w:val="superscript"/>
+          <w:lang w:eastAsia="en-GB"/>
+          <w14:ligatures w14:val="none"/>
+        </w:rPr>
+        <w:footnoteReference w:id="58"/>
+      </w:r>
+      <w:r>
+        <w:rPr>
+          <w:rFonts w:ascii="Times New Roman" w:hAnsi="Times New Roman" w:cs="Times New Roman"/>
+          <w:kern w:val="0"/>
+          <w:lang w:eastAsia="en-GB"/>
+          <w14:ligatures w14:val="none"/>
+        </w:rPr>
+        <w:t xml:space="preserve">. </w:t>
+      </w:r>
+    </w:p>
+    <w:p>
+      <w:pPr>
+        <w:pStyle w:val="ListParagraph"/>
+        <w:numPr>
+          <w:ilvl w:val="0"/>
+          <w:numId w:val="9"/>
+        </w:numPr>
+        <w:spacing w:after="0" w:line="360" w:lineRule="auto"/>
+        <w:jc w:val="both"/>
+        <w:rPr>
+          <w:rFonts w:ascii="Times New Roman" w:hAnsi="Times New Roman" w:cs="Times New Roman"/>
+          <w:b/>
+          <w:bCs/>
+          <w:kern w:val="0"/>
+          <w:lang w:eastAsia="en-GB"/>
+          <w14:ligatures w14:val="none"/>
+        </w:rPr>
+      </w:pPr>
+      <w:r>
+        <w:rPr>
+          <w:rFonts w:ascii="Times New Roman" w:hAnsi="Times New Roman" w:cs="Times New Roman"/>
+          <w:b/>
+          <w:bCs/>
+          <w:kern w:val="0"/>
+          <w:lang w:eastAsia="en-GB"/>
+          <w14:ligatures w14:val="none"/>
+        </w:rPr>
+        <w:t>Institutional Inertia</w:t>
+      </w:r>
+    </w:p>
+    <w:p>
+      <w:pPr>
+        <w:spacing w:after="0" w:line="360" w:lineRule="auto"/>
+        <w:jc w:val="both"/>
+        <w:rPr>
+          <w:rFonts w:ascii="Times New Roman" w:hAnsi="Times New Roman" w:cs="Times New Roman"/>
+          <w:kern w:val="0"/>
+          <w:lang w:eastAsia="en-GB"/>
+          <w14:ligatures w14:val="none"/>
+        </w:rPr>
+      </w:pPr>
+      <w:r>
+        <w:rPr>
+          <w:rFonts w:ascii="Times New Roman" w:hAnsi="Times New Roman" w:cs="Times New Roman"/>
+          <w:kern w:val="0"/>
+          <w:lang w:eastAsia="en-GB"/>
+          <w14:ligatures w14:val="none"/>
+        </w:rPr>
+        <w:t>Procurement processes are often slow and risk-averse, while sustained political commitment to increased defence expenditure cannot be assumed</w:t>
+      </w:r>
+      <w:r>
+        <w:rPr>
+          <w:rFonts w:ascii="Times New Roman" w:hAnsi="Times New Roman" w:cs="Times New Roman"/>
+          <w:kern w:val="0"/>
+          <w:vertAlign w:val="superscript"/>
+          <w:lang w:eastAsia="en-GB"/>
+          <w14:ligatures w14:val="none"/>
+        </w:rPr>
+        <w:footnoteReference w:id="59"/>
+      </w:r>
+      <w:r>
+        <w:rPr>
+          <w:rFonts w:ascii="Times New Roman" w:hAnsi="Times New Roman" w:cs="Times New Roman"/>
+          <w:kern w:val="0"/>
+          <w:lang w:eastAsia="en-GB"/>
+          <w14:ligatures w14:val="none"/>
+        </w:rPr>
+        <w:t xml:space="preserve">. </w:t>
+      </w:r>
+    </w:p>
+    <w:p>
+      <w:pPr>
+        <w:pStyle w:val="ListParagraph"/>
+        <w:numPr>
+          <w:ilvl w:val="0"/>
+          <w:numId w:val="9"/>
+        </w:numPr>
+        <w:spacing w:after="0" w:line="360" w:lineRule="auto"/>
+        <w:jc w:val="both"/>
+        <w:rPr>
+          <w:rFonts w:ascii="Times New Roman" w:hAnsi="Times New Roman" w:cs="Times New Roman"/>
+          <w:b/>
+          <w:bCs/>
+          <w:kern w:val="0"/>
+          <w:lang w:eastAsia="en-GB"/>
+          <w14:ligatures w14:val="none"/>
+        </w:rPr>
+      </w:pPr>
+      <w:r>
+        <w:rPr>
+          <w:rFonts w:ascii="Times New Roman" w:hAnsi="Times New Roman" w:cs="Times New Roman"/>
+          <w:b/>
+          <w:bCs/>
+          <w:kern w:val="0"/>
+          <w:lang w:eastAsia="en-GB"/>
+          <w14:ligatures w14:val="none"/>
+        </w:rPr>
+        <w:t>Ethical Concerns</w:t>
+      </w:r>
+    </w:p>
+    <w:p>
+      <w:pPr>
+        <w:spacing w:after="0" w:line="360" w:lineRule="auto"/>
+        <w:jc w:val="both"/>
+        <w:rPr>
+          <w:rFonts w:ascii="Times New Roman" w:hAnsi="Times New Roman" w:cs="Times New Roman"/>
+          <w:kern w:val="0"/>
+          <w:lang w:eastAsia="en-GB"/>
+          <w14:ligatures w14:val="none"/>
+        </w:rPr>
+      </w:pPr>
+      <w:r>
+        <w:rPr>
+          <w:rFonts w:ascii="Times New Roman" w:hAnsi="Times New Roman" w:cs="Times New Roman"/>
+          <w:kern w:val="0"/>
+          <w:lang w:eastAsia="en-GB"/>
+          <w14:ligatures w14:val="none"/>
+        </w:rPr>
+        <w:t>Ethical concerns surrounding autonomous systems require careful policy development, particularly where lethal capabilities are considered</w:t>
+      </w:r>
+      <w:r>
+        <w:rPr>
+          <w:rFonts w:ascii="Times New Roman" w:hAnsi="Times New Roman" w:cs="Times New Roman"/>
+          <w:kern w:val="0"/>
+          <w:vertAlign w:val="superscript"/>
+          <w:lang w:eastAsia="en-GB"/>
+          <w14:ligatures w14:val="none"/>
+        </w:rPr>
+        <w:footnoteReference w:id="60"/>
+      </w:r>
+      <w:r>
+        <w:rPr>
+          <w:rFonts w:ascii="Times New Roman" w:hAnsi="Times New Roman" w:cs="Times New Roman"/>
+          <w:kern w:val="0"/>
+          <w:lang w:eastAsia="en-GB"/>
+          <w14:ligatures w14:val="none"/>
+        </w:rPr>
+        <w:t xml:space="preserve">. </w:t>
+      </w:r>
+    </w:p>
+    <w:p>
+      <w:pPr>
+        <w:pStyle w:val="ListParagraph"/>
+        <w:numPr>
+          <w:ilvl w:val="0"/>
+          <w:numId w:val="9"/>
+        </w:numPr>
+        <w:spacing w:after="0" w:line="360" w:lineRule="auto"/>
+        <w:jc w:val="both"/>
+        <w:rPr>
+          <w:rFonts w:ascii="Times New Roman" w:hAnsi="Times New Roman" w:cs="Times New Roman"/>
+          <w:b/>
+          <w:bCs/>
+          <w:kern w:val="0"/>
+          <w:lang w:eastAsia="en-GB"/>
+          <w14:ligatures w14:val="none"/>
+        </w:rPr>
+      </w:pPr>
+      <w:r>
+        <w:rPr>
+          <w:rFonts w:ascii="Times New Roman" w:hAnsi="Times New Roman" w:cs="Times New Roman"/>
+          <w:b/>
+          <w:bCs/>
+          <w:kern w:val="0"/>
+          <w:lang w:eastAsia="en-GB"/>
+          <w14:ligatures w14:val="none"/>
+        </w:rPr>
+        <w:t>Industrial Capacity</w:t>
+      </w:r>
+    </w:p>
+    <w:p>
+      <w:pPr>
+        <w:spacing w:after="0" w:line="360" w:lineRule="auto"/>
+        <w:jc w:val="both"/>
+        <w:rPr>
+          <w:rFonts w:ascii="Times New Roman" w:hAnsi="Times New Roman" w:cs="Times New Roman"/>
+          <w:kern w:val="0"/>
+          <w:lang w:eastAsia="en-GB"/>
+          <w14:ligatures w14:val="none"/>
+        </w:rPr>
+      </w:pPr>
+      <w:r>
+        <w:rPr>
+          <w:rFonts w:ascii="Times New Roman" w:hAnsi="Times New Roman" w:cs="Times New Roman"/>
+          <w:kern w:val="0"/>
+          <w:lang w:eastAsia="en-GB"/>
+          <w14:ligatures w14:val="none"/>
+        </w:rPr>
+        <w:t>Ireland's relatively small industrial base may also limit domestic production without substantial collaboration with European partners</w:t>
+      </w:r>
+      <w:r>
+        <w:rPr>
+          <w:rFonts w:ascii="Times New Roman" w:hAnsi="Times New Roman" w:cs="Times New Roman"/>
+          <w:kern w:val="0"/>
+          <w:vertAlign w:val="superscript"/>
+          <w:lang w:eastAsia="en-GB"/>
+          <w14:ligatures w14:val="none"/>
+        </w:rPr>
+        <w:footnoteReference w:id="61"/>
+      </w:r>
+      <w:r>
+        <w:rPr>
+          <w:rFonts w:ascii="Times New Roman" w:hAnsi="Times New Roman" w:cs="Times New Roman"/>
+          <w:kern w:val="0"/>
+          <w:lang w:eastAsia="en-GB"/>
+          <w14:ligatures w14:val="none"/>
+        </w:rPr>
+        <w:t xml:space="preserve">. </w:t>
+      </w:r>
+    </w:p>
+    <w:p>
+      <w:pPr>
+        <w:spacing w:after="0" w:line="360" w:lineRule="auto"/>
+        <w:jc w:val="both"/>
+        <w:rPr>
+          <w:rFonts w:ascii="Times New Roman" w:hAnsi="Times New Roman" w:cs="Times New Roman"/>
+          <w:kern w:val="0"/>
+          <w:lang w:eastAsia="en-GB"/>
+          <w14:ligatures w14:val="none"/>
+        </w:rPr>
+      </w:pPr>
+    </w:p>
+    <w:p>
+      <w:pPr>
+        <w:spacing w:after="0" w:line="360" w:lineRule="auto"/>
+        <w:jc w:val="both"/>
+        <w:rPr>
+          <w:rFonts w:ascii="Times New Roman" w:hAnsi="Times New Roman" w:cs="Times New Roman"/>
+          <w:kern w:val="0"/>
+          <w:lang w:eastAsia="en-GB"/>
+          <w14:ligatures w14:val="none"/>
+        </w:rPr>
+      </w:pPr>
+    </w:p>
+    <w:p>
+      <w:pPr>
+        <w:spacing w:after="0" w:line="360" w:lineRule="auto"/>
+        <w:jc w:val="both"/>
+        <w:rPr>
+          <w:rFonts w:ascii="Times New Roman" w:hAnsi="Times New Roman" w:cs="Times New Roman"/>
+          <w:b/>
+          <w:bCs/>
+          <w:kern w:val="0"/>
+          <w:lang w:eastAsia="en-GB"/>
+          <w14:ligatures w14:val="none"/>
+        </w:rPr>
+      </w:pPr>
+      <w:r>
+        <w:rPr>
+          <w:rFonts w:ascii="Times New Roman" w:hAnsi="Times New Roman" w:cs="Times New Roman"/>
+          <w:b/>
+          <w:bCs/>
+          <w:kern w:val="0"/>
+          <w:lang w:eastAsia="en-GB"/>
+          <w14:ligatures w14:val="none"/>
+        </w:rPr>
+        <w:t>Section Conclusion</w:t>
+      </w:r>
+    </w:p>
+    <w:p>
+      <w:pPr>
+        <w:spacing w:after="0" w:line="360" w:lineRule="auto"/>
+        <w:jc w:val="both"/>
+        <w:rPr>
+          <w:rFonts w:ascii="Times New Roman" w:hAnsi="Times New Roman" w:cs="Times New Roman"/>
+          <w:kern w:val="0"/>
+          <w:highlight w:val="yellow"/>
+          <w:lang w:eastAsia="en-GB"/>
+          <w14:ligatures w14:val="none"/>
+        </w:rPr>
+      </w:pPr>
+      <w:r>
+        <w:rPr>
+          <w:rFonts w:ascii="Times New Roman" w:hAnsi="Times New Roman" w:cs="Times New Roman"/>
+          <w:b/>
+          <w:bCs/>
+          <w:color w:val="FF0000"/>
+          <w:kern w:val="0"/>
+          <w:lang w:eastAsia="en-GB"/>
+          <w14:ligatures w14:val="none"/>
+        </w:rPr>
+        <w:t>Ultimately, the credibility of UxS integration within Irish defence policy will not be determined by the sophistication of the technology itself but by the effectiveness of the institutions that adopt it.</w:t>
+      </w:r>
+      <w:r>
+        <w:rPr>
+          <w:rFonts w:ascii="Times New Roman" w:hAnsi="Times New Roman" w:cs="Times New Roman"/>
+          <w:color w:val="FF0000"/>
+          <w:kern w:val="0"/>
+          <w:lang w:eastAsia="en-GB"/>
+          <w14:ligatures w14:val="none"/>
+        </w:rPr>
+        <w:t xml:space="preserve"> </w:t>
+      </w:r>
+      <w:r>
+        <w:rPr>
+          <w:rFonts w:ascii="Times New Roman" w:hAnsi="Times New Roman" w:cs="Times New Roman"/>
+          <w:color w:val="FFC000"/>
+          <w:kern w:val="0"/>
+          <w:lang w:eastAsia="en-GB"/>
+          <w14:ligatures w14:val="none"/>
+        </w:rPr>
+        <w:t xml:space="preserve">Recognition of disruptive military change, coherent operational </w:t>
+      </w:r>
+      <w:r>
+        <w:rPr>
+          <w:rFonts w:ascii="Times New Roman" w:hAnsi="Times New Roman" w:cs="Times New Roman"/>
+          <w:color w:val="FFC000"/>
+          <w:kern w:val="0"/>
+          <w:lang w:eastAsia="en-GB"/>
+          <w14:ligatures w14:val="none"/>
+        </w:rPr>
+        <w:lastRenderedPageBreak/>
+        <w:t>concepts, institutional reform, rigorous experimentation, continuous technological adaptation, industrial partnership and multi-stakeholder governance together provide the pathway from tactical innovation to enduring capability. By following this process, Ireland can develop a defence posture that is affordable, credible and aligned with its strategic objectives, demonstrating that UxS-enabled denial is not merely an attractive tactical concept but a realistic and sustainable foundation for future Irish defence policy.</w:t>
+      </w:r>
+      <w:r>
+        <w:rPr>
+          <w:rFonts w:ascii="Times New Roman" w:hAnsi="Times New Roman" w:cs="Times New Roman"/>
+          <w:b/>
+          <w:bCs/>
+          <w:kern w:val="0"/>
+          <w:lang w:eastAsia="en-GB"/>
+          <w14:ligatures w14:val="none"/>
+        </w:rPr>
+        <w:t xml:space="preserve"> </w:t>
+      </w:r>
+      <w:r>
+        <w:rPr>
+          <w:rFonts w:ascii="Times New Roman" w:hAnsi="Times New Roman" w:cs="Times New Roman"/>
+          <w:b/>
+          <w:bCs/>
+          <w:kern w:val="0"/>
+          <w:lang w:eastAsia="en-GB"/>
+          <w14:ligatures w14:val="none"/>
+        </w:rPr>
+        <w:t>Within Irish defence policy, a UxS enabled light infantry denial posture therefore occupies an important middle ground between symbolic defence and conventional deterrence.</w:t>
+      </w:r>
+      <w:r>
+        <w:rPr>
+          <w:rFonts w:ascii="Times New Roman" w:hAnsi="Times New Roman" w:cs="Times New Roman"/>
+          <w:kern w:val="0"/>
+          <w:lang w:eastAsia="en-GB"/>
+          <w14:ligatures w14:val="none"/>
+        </w:rPr>
+        <w:t xml:space="preserve"> </w:t>
+      </w:r>
+    </w:p>
+    <w:p>
+      <w:pPr>
+        <w:spacing w:after="0" w:line="360" w:lineRule="auto"/>
+        <w:jc w:val="both"/>
+        <w:rPr>
+          <w:rFonts w:ascii="Times New Roman" w:hAnsi="Times New Roman" w:cs="Times New Roman"/>
+          <w:kern w:val="0"/>
+          <w:lang w:eastAsia="en-GB"/>
+          <w14:ligatures w14:val="none"/>
+        </w:rPr>
+      </w:pPr>
+    </w:p>
+    <w:p/>
+    <w:p/>
+    <w:p>
+      <w:pPr>
         <w:keepNext/>
         <w:keepLines/>
         <w:spacing w:before="160" w:after="80"/>
@@ -1566,797 +4212,6 @@
           <w:sz w:val="32"/>
           <w:szCs w:val="32"/>
         </w:rPr>
-        <w:t>Main Body – OB</w:t>
-      </w:r>
-    </w:p>
-    <w:p>
-      <w:pPr>
-        <w:rPr>
-          <w:rFonts w:ascii="Times New Roman" w:hAnsi="Times New Roman" w:cs="Times New Roman"/>
-          <w:b/>
-          <w:bCs/>
-          <w:lang w:val="en-GB"/>
-        </w:rPr>
-      </w:pPr>
-      <w:r>
-        <w:rPr>
-          <w:rFonts w:ascii="Times New Roman" w:hAnsi="Times New Roman" w:cs="Times New Roman"/>
-          <w:b/>
-          <w:bCs/>
-          <w:lang w:val="en-GB"/>
-        </w:rPr>
-        <w:t>From Tactical Innovation to Credible Defence Policy: Integrating Uncrewed Systems into Irish Military Capability</w:t>
-      </w:r>
-    </w:p>
-    <w:p>
-      <w:pPr>
-        <w:rPr>
-          <w:rFonts w:ascii="Times New Roman" w:hAnsi="Times New Roman" w:cs="Times New Roman"/>
-          <w:b/>
-          <w:bCs/>
-          <w:lang w:val="en-GB"/>
-        </w:rPr>
-      </w:pPr>
-    </w:p>
-    <w:p>
-      <w:pPr>
-        <w:spacing w:after="0" w:line="360" w:lineRule="auto"/>
-        <w:jc w:val="both"/>
-        <w:rPr>
-          <w:rFonts w:ascii="Times New Roman" w:hAnsi="Times New Roman" w:cs="Times New Roman"/>
-          <w:kern w:val="0"/>
-          <w:lang w:val="en-GB" w:eastAsia="en-GB"/>
-          <w14:ligatures w14:val="none"/>
-        </w:rPr>
-      </w:pPr>
-      <w:commentRangeStart w:id="1"/>
-      <w:r>
-        <w:rPr>
-          <w:rFonts w:ascii="Times New Roman" w:hAnsi="Times New Roman" w:cs="Times New Roman"/>
-          <w:kern w:val="0"/>
-          <w:lang w:val="en-GB" w:eastAsia="en-GB"/>
-          <w14:ligatures w14:val="none"/>
-        </w:rPr>
-        <w:t xml:space="preserve">The rapid proliferation of uncrewed systems (UxS) has fundamentally altered the character of contemporary warfare. From the battlefields of Ukraine to maritime security operations in the Red Sea, inexpensive and increasingly autonomous platforms have demonstrated an ability to challenge technologically superior forces, provide persistent surveillance, and impose disproportionate costs on adversaries. For small states with limited defence budgets, these developments present an opportunity to rethink conventional approaches to military capability. For Ireland in particular, UxS enabled light infantry and maritime denial capabilities offer a realistic means of enhancing deterrence without abandoning the principles of military neutrality or requiring prohibitively expensive conventional force structures. However, tactical utility alone is insufficient to justify major defence investment. </w:t>
-      </w:r>
-      <w:commentRangeEnd w:id="1"/>
-      <w:r>
-        <w:rPr>
-          <w:rStyle w:val="CommentReference"/>
-          <w:rFonts w:ascii="Times New Roman" w:hAnsi="Times New Roman" w:cs="Times New Roman"/>
-          <w:kern w:val="0"/>
-          <w:sz w:val="24"/>
-          <w:szCs w:val="24"/>
-          <w:lang w:val="en-GB" w:eastAsia="en-GB"/>
-          <w14:ligatures w14:val="none"/>
-        </w:rPr>
-        <w:commentReference w:id="1"/>
-      </w:r>
-    </w:p>
-    <w:p>
-      <w:pPr>
-        <w:spacing w:after="0" w:line="360" w:lineRule="auto"/>
-        <w:jc w:val="both"/>
-        <w:rPr>
-          <w:rFonts w:ascii="Times New Roman" w:hAnsi="Times New Roman" w:cs="Times New Roman"/>
-          <w:kern w:val="0"/>
-          <w:lang w:val="en-GB" w:eastAsia="en-GB"/>
-          <w14:ligatures w14:val="none"/>
-        </w:rPr>
-      </w:pPr>
-    </w:p>
-    <w:p>
-      <w:pPr>
-        <w:spacing w:after="0" w:line="360" w:lineRule="auto"/>
-        <w:jc w:val="both"/>
-        <w:rPr>
-          <w:rFonts w:ascii="Times New Roman" w:hAnsi="Times New Roman" w:cs="Times New Roman"/>
-          <w:kern w:val="0"/>
-          <w:lang w:val="en-GB" w:eastAsia="en-GB"/>
-          <w14:ligatures w14:val="none"/>
-        </w:rPr>
-      </w:pPr>
-      <w:commentRangeStart w:id="2"/>
-      <w:r>
-        <w:rPr>
-          <w:rFonts w:ascii="Times New Roman" w:hAnsi="Times New Roman" w:cs="Times New Roman"/>
-          <w:kern w:val="0"/>
-          <w:lang w:val="en-GB" w:eastAsia="en-GB"/>
-          <w14:ligatures w14:val="none"/>
-        </w:rPr>
-        <w:t>To become credible Irish defence policy, the argument for UxS integration must evolve from an attractive battlefield concept into an institutionalised capability embedded within national defence planning, supported by doctrine, exercised in practice, sustained by industry, and legitimised through political leadership.</w:t>
-      </w:r>
-      <w:commentRangeEnd w:id="2"/>
-      <w:r>
-        <w:rPr>
-          <w:rStyle w:val="CommentReference"/>
-          <w:rFonts w:ascii="Times New Roman" w:hAnsi="Times New Roman" w:cs="Times New Roman"/>
-          <w:kern w:val="0"/>
-          <w:sz w:val="24"/>
-          <w:szCs w:val="24"/>
-          <w:lang w:val="en-GB" w:eastAsia="en-GB"/>
-          <w14:ligatures w14:val="none"/>
-        </w:rPr>
-        <w:commentReference w:id="2"/>
-      </w:r>
-    </w:p>
-    <w:p>
-      <w:pPr>
-        <w:spacing w:after="0" w:line="360" w:lineRule="auto"/>
-        <w:jc w:val="both"/>
-        <w:rPr>
-          <w:rFonts w:ascii="Times New Roman" w:hAnsi="Times New Roman" w:cs="Times New Roman"/>
-          <w:kern w:val="0"/>
-          <w:lang w:val="en-GB" w:eastAsia="en-GB"/>
-          <w14:ligatures w14:val="none"/>
-        </w:rPr>
-      </w:pPr>
-    </w:p>
-    <w:p>
-      <w:pPr>
-        <w:spacing w:after="0" w:line="360" w:lineRule="auto"/>
-        <w:jc w:val="both"/>
-        <w:rPr>
-          <w:rFonts w:ascii="Times New Roman" w:hAnsi="Times New Roman" w:cs="Times New Roman"/>
-          <w:b/>
-          <w:bCs/>
-          <w:kern w:val="0"/>
-          <w:lang w:val="en-GB" w:eastAsia="en-GB"/>
-          <w14:ligatures w14:val="none"/>
-        </w:rPr>
-      </w:pPr>
-      <w:r>
-        <w:rPr>
-          <w:rFonts w:ascii="Times New Roman" w:hAnsi="Times New Roman" w:cs="Times New Roman"/>
-          <w:b/>
-          <w:bCs/>
-          <w:kern w:val="0"/>
-          <w:lang w:val="en-GB" w:eastAsia="en-GB"/>
-          <w14:ligatures w14:val="none"/>
-        </w:rPr>
-        <w:t>Recognition at the Senior and Political Level.</w:t>
-      </w:r>
-    </w:p>
-    <w:p>
-      <w:pPr>
-        <w:spacing w:after="0" w:line="360" w:lineRule="auto"/>
-        <w:jc w:val="both"/>
-        <w:rPr>
-          <w:rFonts w:ascii="Times New Roman" w:hAnsi="Times New Roman" w:cs="Times New Roman"/>
-          <w:kern w:val="0"/>
-          <w:lang w:val="en-GB" w:eastAsia="en-GB"/>
-          <w14:ligatures w14:val="none"/>
-        </w:rPr>
-      </w:pPr>
-      <w:r>
-        <w:rPr>
-          <w:rFonts w:ascii="Times New Roman" w:hAnsi="Times New Roman" w:cs="Times New Roman"/>
-          <w:kern w:val="0"/>
-          <w:lang w:val="en-GB" w:eastAsia="en-GB"/>
-          <w14:ligatures w14:val="none"/>
-        </w:rPr>
-        <w:t xml:space="preserve">The first requirement is recognition at both the senior military and political levels that UxS represent a disruptive shift in military affairs </w:t>
-      </w:r>
-      <w:r>
-        <w:rPr>
-          <w:rFonts w:ascii="Times New Roman" w:hAnsi="Times New Roman" w:cs="Times New Roman"/>
-          <w:kern w:val="0"/>
-          <w:vertAlign w:val="superscript"/>
-          <w:lang w:val="en-GB" w:eastAsia="en-GB"/>
-          <w14:ligatures w14:val="none"/>
-        </w:rPr>
-        <w:footnoteReference w:id="24"/>
-      </w:r>
-      <w:r>
-        <w:rPr>
-          <w:rFonts w:ascii="Times New Roman" w:hAnsi="Times New Roman" w:cs="Times New Roman"/>
-          <w:kern w:val="0"/>
-          <w:lang w:val="en-GB" w:eastAsia="en-GB"/>
-          <w14:ligatures w14:val="none"/>
-        </w:rPr>
-        <w:t xml:space="preserve"> rather than simply another technological enhancement. Historically, military organisations have often struggled to recognise discontinuous technological change, preferring to adapt existing structures rather than fundamentally reconsider them. Yet recent conflicts demonstrate that uncrewed systems are altering the relationship between mass, precision, persistence and survivability. For Ireland, whose Defence Forces face significant personnel shortages and resource constraints, UxS </w:t>
-      </w:r>
-      <w:r>
-        <w:rPr>
-          <w:rFonts w:ascii="Times New Roman" w:hAnsi="Times New Roman" w:cs="Times New Roman"/>
-          <w:kern w:val="0"/>
-          <w:lang w:val="en-GB" w:eastAsia="en-GB"/>
-          <w14:ligatures w14:val="none"/>
-        </w:rPr>
-        <w:lastRenderedPageBreak/>
-        <w:t>provide an opportunity to multiply the effectiveness of limited manpower. This requires political acknowledgement that investment in autonomous and remotely operated systems is not a niche procurement decision but a strategic adaptation to a changing security environment. Such recognition would align with the recommendations of the Commission on the Defence Forces, which identified technological transformation, digitalisation and enhanced surveillance capabilities as essential components of future force development. Framing UxS as part of a broader military revolution elevates the discussion beyond procurement towards strategic reform.</w:t>
-      </w:r>
-    </w:p>
-    <w:p>
-      <w:pPr>
-        <w:spacing w:after="0" w:line="360" w:lineRule="auto"/>
-        <w:jc w:val="both"/>
-        <w:rPr>
-          <w:rFonts w:ascii="Times New Roman" w:hAnsi="Times New Roman" w:cs="Times New Roman"/>
-          <w:kern w:val="0"/>
-          <w:lang w:val="en-GB" w:eastAsia="en-GB"/>
-          <w14:ligatures w14:val="none"/>
-        </w:rPr>
-      </w:pPr>
-    </w:p>
-    <w:p>
-      <w:pPr>
-        <w:spacing w:after="0" w:line="360" w:lineRule="auto"/>
-        <w:jc w:val="both"/>
-        <w:rPr>
-          <w:rFonts w:ascii="Times New Roman" w:hAnsi="Times New Roman" w:cs="Times New Roman"/>
-          <w:b/>
-          <w:bCs/>
-          <w:kern w:val="0"/>
-          <w:lang w:val="en-GB" w:eastAsia="en-GB"/>
-          <w14:ligatures w14:val="none"/>
-        </w:rPr>
-      </w:pPr>
-      <w:r>
-        <w:rPr>
-          <w:rFonts w:ascii="Times New Roman" w:hAnsi="Times New Roman" w:cs="Times New Roman"/>
-          <w:b/>
-          <w:bCs/>
-          <w:kern w:val="0"/>
-          <w:lang w:val="en-GB" w:eastAsia="en-GB"/>
-          <w14:ligatures w14:val="none"/>
-        </w:rPr>
-        <w:t>The Production of a Guiding Vision.</w:t>
-      </w:r>
-    </w:p>
-    <w:p>
-      <w:pPr>
-        <w:spacing w:after="0" w:line="360" w:lineRule="auto"/>
-        <w:jc w:val="both"/>
-        <w:rPr>
-          <w:rFonts w:ascii="Times New Roman" w:hAnsi="Times New Roman" w:cs="Times New Roman"/>
-          <w:kern w:val="0"/>
-          <w:lang w:val="en-GB" w:eastAsia="en-GB"/>
-          <w14:ligatures w14:val="none"/>
-        </w:rPr>
-      </w:pPr>
-      <w:r>
-        <w:rPr>
-          <w:rFonts w:ascii="Times New Roman" w:hAnsi="Times New Roman" w:cs="Times New Roman"/>
-          <w:kern w:val="0"/>
-          <w:lang w:val="en-GB" w:eastAsia="en-GB"/>
-          <w14:ligatures w14:val="none"/>
-        </w:rPr>
-        <w:t>Political recognition must then be translated into a guiding vision. Military innovation succeeds when technological adoption is driven by coherent operational concepts rather than the availability of new equipment. Ireland therefore requires an operational concept that defines how UxS contribute to national defence objectives across land, maritime and air domains. Such a concept should emphasise persistent surveillance, intelligence collection, force protection and denial operations rather than offensive power projection. For light infantry, this means integrating reconnaissance drones, loitering munitions where politically acceptable, autonomous logistics platforms and electronic warfare systems into dispersed defensive operations. At sea, unmanned surface and underwater vehicles could strengthen maritime domain awareness and contribute to protecting critical underwater infrastructure within Ireland's extensive Exclusive Economic Zone. Supporting doctrine would provide common procedures, command relationships and tactical principles, ensuring that UxS become an integral part of operations rather than isolated specialist capabilities. Doctrine also ensures interoperability with European partners and NATO members during peace support, humanitarian assistance and maritime security operations while remaining entirely compatible with Ireland's policy of military neutrality.</w:t>
-      </w:r>
-    </w:p>
-    <w:p>
-      <w:pPr>
-        <w:spacing w:after="0" w:line="360" w:lineRule="auto"/>
-        <w:jc w:val="both"/>
-        <w:rPr>
-          <w:rFonts w:ascii="Times New Roman" w:hAnsi="Times New Roman" w:cs="Times New Roman"/>
-          <w:kern w:val="0"/>
-          <w:lang w:val="en-GB" w:eastAsia="en-GB"/>
-          <w14:ligatures w14:val="none"/>
-        </w:rPr>
-      </w:pPr>
-    </w:p>
-    <w:p>
-      <w:pPr>
-        <w:spacing w:after="0" w:line="360" w:lineRule="auto"/>
-        <w:jc w:val="both"/>
-        <w:rPr>
-          <w:rFonts w:ascii="Times New Roman" w:hAnsi="Times New Roman" w:cs="Times New Roman"/>
-          <w:b/>
-          <w:bCs/>
-          <w:kern w:val="0"/>
-          <w:lang w:val="en-GB" w:eastAsia="en-GB"/>
-          <w14:ligatures w14:val="none"/>
-        </w:rPr>
-      </w:pPr>
-      <w:r>
-        <w:rPr>
-          <w:rFonts w:ascii="Times New Roman" w:hAnsi="Times New Roman" w:cs="Times New Roman"/>
-          <w:b/>
-          <w:bCs/>
-          <w:kern w:val="0"/>
-          <w:lang w:val="en-GB" w:eastAsia="en-GB"/>
-          <w14:ligatures w14:val="none"/>
-        </w:rPr>
-        <w:t>The Industrialisation of Change.</w:t>
-      </w:r>
-    </w:p>
-    <w:p>
-      <w:pPr>
-        <w:spacing w:after="0" w:line="360" w:lineRule="auto"/>
-        <w:jc w:val="both"/>
-        <w:rPr>
-          <w:rFonts w:ascii="Times New Roman" w:hAnsi="Times New Roman" w:cs="Times New Roman"/>
-          <w:kern w:val="0"/>
-          <w:lang w:val="en-GB" w:eastAsia="en-GB"/>
-          <w14:ligatures w14:val="none"/>
-        </w:rPr>
-      </w:pPr>
-      <w:r>
-        <w:rPr>
-          <w:rFonts w:ascii="Times New Roman" w:hAnsi="Times New Roman" w:cs="Times New Roman"/>
-          <w:kern w:val="0"/>
-          <w:lang w:val="en-GB" w:eastAsia="en-GB"/>
-          <w14:ligatures w14:val="none"/>
-        </w:rPr>
-        <w:t xml:space="preserve">The third requirement is institutionalisation. Military innovation becomes credible only when organisations adapt themselves to sustain it. Creating dedicated UxS career pathways would signal that these capabilities are enduring rather than experimental. This requires recruiting and retaining personnel with expertise in robotics, artificial intelligence, software engineering and electronic warfare while integrating these specialists with operational commanders rather than separating technical and tactical functions. Modern uncrewed systems demand </w:t>
-      </w:r>
-      <w:r>
-        <w:rPr>
-          <w:rFonts w:ascii="Times New Roman" w:hAnsi="Times New Roman" w:cs="Times New Roman"/>
-          <w:kern w:val="0"/>
-          <w:lang w:val="en-GB" w:eastAsia="en-GB"/>
-          <w14:ligatures w14:val="none"/>
-        </w:rPr>
-        <w:lastRenderedPageBreak/>
-        <w:t>multidisciplinary teams where technicians, intelligence analysts and combat leaders work collaboratively. Professional military education should therefore incorporate autonomous systems, human-machine teaming and counter-UxS operations throughout career progression. Institutional change also requires adapting procurement organisations, maintenance structures and training establishments to support rapid technological iteration rather than the traditionally slow acquisition cycles associated with major defence platforms.</w:t>
-      </w:r>
-    </w:p>
-    <w:p>
-      <w:pPr>
-        <w:spacing w:after="0" w:line="360" w:lineRule="auto"/>
-        <w:jc w:val="both"/>
-        <w:rPr>
-          <w:rFonts w:ascii="Times New Roman" w:hAnsi="Times New Roman" w:cs="Times New Roman"/>
-          <w:kern w:val="0"/>
-          <w:lang w:val="en-GB" w:eastAsia="en-GB"/>
-          <w14:ligatures w14:val="none"/>
-        </w:rPr>
-      </w:pPr>
-    </w:p>
-    <w:p>
-      <w:pPr>
-        <w:spacing w:after="0" w:line="360" w:lineRule="auto"/>
-        <w:jc w:val="both"/>
-        <w:rPr>
-          <w:rFonts w:ascii="Times New Roman" w:hAnsi="Times New Roman" w:cs="Times New Roman"/>
-          <w:b/>
-          <w:bCs/>
-          <w:kern w:val="0"/>
-          <w:lang w:val="en-GB" w:eastAsia="en-GB"/>
-          <w14:ligatures w14:val="none"/>
-        </w:rPr>
-      </w:pPr>
-      <w:r>
-        <w:rPr>
-          <w:rFonts w:ascii="Times New Roman" w:hAnsi="Times New Roman" w:cs="Times New Roman"/>
-          <w:b/>
-          <w:bCs/>
-          <w:kern w:val="0"/>
-          <w:lang w:val="en-GB" w:eastAsia="en-GB"/>
-          <w14:ligatures w14:val="none"/>
-        </w:rPr>
-        <w:t>Experimentation, Wargaming, Training.</w:t>
-      </w:r>
-    </w:p>
-    <w:p>
-      <w:pPr>
-        <w:spacing w:after="0" w:line="360" w:lineRule="auto"/>
-        <w:jc w:val="both"/>
-        <w:rPr>
-          <w:rFonts w:ascii="Times New Roman" w:hAnsi="Times New Roman" w:cs="Times New Roman"/>
-          <w:kern w:val="0"/>
-          <w:lang w:val="en-GB" w:eastAsia="en-GB"/>
-          <w14:ligatures w14:val="none"/>
-        </w:rPr>
-      </w:pPr>
-      <w:r>
-        <w:rPr>
-          <w:rFonts w:ascii="Times New Roman" w:hAnsi="Times New Roman" w:cs="Times New Roman"/>
-          <w:kern w:val="0"/>
-          <w:lang w:val="en-GB" w:eastAsia="en-GB"/>
-          <w14:ligatures w14:val="none"/>
-        </w:rPr>
-        <w:t>The decisive stage in transforming a tactical concept into credible policy is experimentation through wargaming, training, exercising and evaluation. New ideas acquire legitimacy only when repeatedly tested against realistic operational problems. Wargaming allows commanders to explore how UxS enabled light infantry denial operations would respond to likely threats against Irish territory or critical infrastructure. These conceptual insights should inform progressively more demanding field exercises where unmanned systems operate alongside conventional forces under realistic conditions. Lessons identified during experimentation must directly inform doctrinal refinement, force structure and procurement decisions. As tactics become standardised and personnel gain operational confidence, UxS integration transitions from innovation to normal military practice. Importantly, this iterative process provides political leaders with demonstrable evidence that investment in autonomous systems generates measurable improvements in operational effectiveness. Rather than relying upon theoretical arguments, Defence can point to validated concepts, tested doctrine and exercised capability as justification for continued investment.</w:t>
-      </w:r>
-    </w:p>
-    <w:p>
-      <w:pPr>
-        <w:spacing w:after="0" w:line="360" w:lineRule="auto"/>
-        <w:jc w:val="both"/>
-        <w:rPr>
-          <w:rFonts w:ascii="Times New Roman" w:hAnsi="Times New Roman" w:cs="Times New Roman"/>
-          <w:kern w:val="0"/>
-          <w:lang w:val="en-GB" w:eastAsia="en-GB"/>
-          <w14:ligatures w14:val="none"/>
-        </w:rPr>
-      </w:pPr>
-    </w:p>
-    <w:p>
-      <w:pPr>
-        <w:spacing w:after="0" w:line="360" w:lineRule="auto"/>
-        <w:jc w:val="both"/>
-        <w:rPr>
-          <w:rFonts w:ascii="Times New Roman" w:hAnsi="Times New Roman" w:cs="Times New Roman"/>
-          <w:b/>
-          <w:bCs/>
-          <w:kern w:val="0"/>
-          <w:lang w:val="en-GB" w:eastAsia="en-GB"/>
-          <w14:ligatures w14:val="none"/>
-        </w:rPr>
-      </w:pPr>
-      <w:r>
-        <w:rPr>
-          <w:rFonts w:ascii="Times New Roman" w:hAnsi="Times New Roman" w:cs="Times New Roman"/>
-          <w:b/>
-          <w:bCs/>
-          <w:kern w:val="0"/>
-          <w:lang w:val="en-GB" w:eastAsia="en-GB"/>
-          <w14:ligatures w14:val="none"/>
-        </w:rPr>
-        <w:t>Technological Adaption.</w:t>
-      </w:r>
-    </w:p>
-    <w:p>
-      <w:pPr>
-        <w:spacing w:after="0" w:line="360" w:lineRule="auto"/>
-        <w:jc w:val="both"/>
-        <w:rPr>
-          <w:rFonts w:ascii="Times New Roman" w:hAnsi="Times New Roman" w:cs="Times New Roman"/>
-          <w:kern w:val="0"/>
-          <w:lang w:val="en-GB" w:eastAsia="en-GB"/>
-          <w14:ligatures w14:val="none"/>
-        </w:rPr>
-      </w:pPr>
-      <w:r>
-        <w:rPr>
-          <w:rFonts w:ascii="Times New Roman" w:hAnsi="Times New Roman" w:cs="Times New Roman"/>
-          <w:kern w:val="0"/>
-          <w:lang w:val="en-GB" w:eastAsia="en-GB"/>
-          <w14:ligatures w14:val="none"/>
-        </w:rPr>
-        <w:t xml:space="preserve">Maintaining credibility also requires continuous technological adaptation. One of the defining characteristics of contemporary uncrewed warfare is the exceptionally rapid pace of innovation. Commercial drone technologies evolve within months rather than decades, while electronic warfare continuously drives adaptation in communications, autonomy and survivability. Ireland cannot therefore view UxS procurement as a once-off acquisition programme. Instead, defence planning must establish mechanisms for continual capability development through spiral acquisition, modular architectures and regular technology insertion. Open systems allowing rapid integration of new sensors, communications and software will reduce obsolescence while enabling adaptation to emerging threats. Such an </w:t>
-      </w:r>
-      <w:r>
-        <w:rPr>
-          <w:rFonts w:ascii="Times New Roman" w:hAnsi="Times New Roman" w:cs="Times New Roman"/>
-          <w:kern w:val="0"/>
-          <w:lang w:val="en-GB" w:eastAsia="en-GB"/>
-          <w14:ligatures w14:val="none"/>
-        </w:rPr>
-        <w:lastRenderedPageBreak/>
-        <w:t>approach better reflects the innovation cycles of civilian technology industries and ensures that Defence Forces capabilities remain operationally relevant despite constrained budgets.</w:t>
-      </w:r>
-    </w:p>
-    <w:p>
-      <w:pPr>
-        <w:spacing w:after="0" w:line="360" w:lineRule="auto"/>
-        <w:jc w:val="both"/>
-        <w:rPr>
-          <w:rFonts w:ascii="Times New Roman" w:hAnsi="Times New Roman" w:cs="Times New Roman"/>
-          <w:kern w:val="0"/>
-          <w:lang w:val="en-GB" w:eastAsia="en-GB"/>
-          <w14:ligatures w14:val="none"/>
-        </w:rPr>
-      </w:pPr>
-    </w:p>
-    <w:p>
-      <w:pPr>
-        <w:spacing w:after="0" w:line="360" w:lineRule="auto"/>
-        <w:jc w:val="both"/>
-        <w:rPr>
-          <w:rFonts w:ascii="Times New Roman" w:hAnsi="Times New Roman" w:cs="Times New Roman"/>
-          <w:b/>
-          <w:bCs/>
-          <w:kern w:val="0"/>
-          <w:lang w:val="en-GB" w:eastAsia="en-GB"/>
-          <w14:ligatures w14:val="none"/>
-        </w:rPr>
-      </w:pPr>
-    </w:p>
-    <w:p>
-      <w:pPr>
-        <w:spacing w:after="0" w:line="360" w:lineRule="auto"/>
-        <w:jc w:val="both"/>
-        <w:rPr>
-          <w:rFonts w:ascii="Times New Roman" w:hAnsi="Times New Roman" w:cs="Times New Roman"/>
-          <w:b/>
-          <w:bCs/>
-          <w:kern w:val="0"/>
-          <w:lang w:val="en-GB" w:eastAsia="en-GB"/>
-          <w14:ligatures w14:val="none"/>
-        </w:rPr>
-      </w:pPr>
-      <w:r>
-        <w:rPr>
-          <w:rFonts w:ascii="Times New Roman" w:hAnsi="Times New Roman" w:cs="Times New Roman"/>
-          <w:b/>
-          <w:bCs/>
-          <w:kern w:val="0"/>
-          <w:lang w:val="en-GB" w:eastAsia="en-GB"/>
-          <w14:ligatures w14:val="none"/>
-        </w:rPr>
-        <w:t>Industrial Engagement.</w:t>
-      </w:r>
-    </w:p>
-    <w:p>
-      <w:pPr>
-        <w:spacing w:after="0" w:line="360" w:lineRule="auto"/>
-        <w:jc w:val="both"/>
-        <w:rPr>
-          <w:rFonts w:ascii="Times New Roman" w:hAnsi="Times New Roman" w:cs="Times New Roman"/>
-          <w:kern w:val="0"/>
-          <w:lang w:val="en-GB" w:eastAsia="en-GB"/>
-          <w14:ligatures w14:val="none"/>
-        </w:rPr>
-      </w:pPr>
-      <w:r>
-        <w:rPr>
-          <w:rFonts w:ascii="Times New Roman" w:hAnsi="Times New Roman" w:cs="Times New Roman"/>
-          <w:kern w:val="0"/>
-          <w:lang w:val="en-GB" w:eastAsia="en-GB"/>
-          <w14:ligatures w14:val="none"/>
-        </w:rPr>
-        <w:t>Industrial engagement forms another essential pillar of credible policy. Effective military capability depends not only upon equipment quality but also upon the capacity to produce, maintain and replace systems at sufficient scale. The Ukraine conflict has demonstrated that affordable mass frequently outweighs exquisite capability when attrition is high. Ireland should therefore strengthen partnerships between the Defence Forces, indigenous defence and technology companies, universities and research institutions to establish sustainable domestic capability in autonomous systems. Indigenous production enhances strategic resilience, reduces dependence on overseas suppliers and creates opportunities for innovation within Ireland's expanding technology sector. Collaboration with European defence initiatives can further support industrial development while reinforcing wider European security cooperation. Such partnerships transform defence expenditure from a purely consumptive cost into an investment supporting national innovation and industrial capacity.</w:t>
-      </w:r>
-    </w:p>
-    <w:p>
-      <w:pPr>
-        <w:spacing w:after="0" w:line="360" w:lineRule="auto"/>
-        <w:jc w:val="both"/>
-        <w:rPr>
-          <w:rFonts w:ascii="Times New Roman" w:hAnsi="Times New Roman" w:cs="Times New Roman"/>
-          <w:kern w:val="0"/>
-          <w:lang w:val="en-GB" w:eastAsia="en-GB"/>
-          <w14:ligatures w14:val="none"/>
-        </w:rPr>
-      </w:pPr>
-    </w:p>
-    <w:p>
-      <w:pPr>
-        <w:spacing w:after="0" w:line="360" w:lineRule="auto"/>
-        <w:jc w:val="both"/>
-        <w:rPr>
-          <w:rFonts w:ascii="Times New Roman" w:hAnsi="Times New Roman" w:cs="Times New Roman"/>
-          <w:b/>
-          <w:bCs/>
-          <w:kern w:val="0"/>
-          <w:lang w:val="en-GB" w:eastAsia="en-GB"/>
-          <w14:ligatures w14:val="none"/>
-        </w:rPr>
-      </w:pPr>
-      <w:r>
-        <w:rPr>
-          <w:rFonts w:ascii="Times New Roman" w:hAnsi="Times New Roman" w:cs="Times New Roman"/>
-          <w:b/>
-          <w:bCs/>
-          <w:kern w:val="0"/>
-          <w:lang w:val="en-GB" w:eastAsia="en-GB"/>
-          <w14:ligatures w14:val="none"/>
-        </w:rPr>
-        <w:t>The Multi-Stakeholder Approach.</w:t>
-      </w:r>
-    </w:p>
-    <w:p>
-      <w:pPr>
-        <w:spacing w:after="0" w:line="360" w:lineRule="auto"/>
-        <w:jc w:val="both"/>
-        <w:rPr>
-          <w:rFonts w:ascii="Times New Roman" w:hAnsi="Times New Roman" w:cs="Times New Roman"/>
-          <w:kern w:val="0"/>
-          <w:lang w:val="en-GB" w:eastAsia="en-GB"/>
-          <w14:ligatures w14:val="none"/>
-        </w:rPr>
-      </w:pPr>
-      <w:r>
-        <w:rPr>
-          <w:rFonts w:ascii="Times New Roman" w:hAnsi="Times New Roman" w:cs="Times New Roman"/>
-          <w:kern w:val="0"/>
-          <w:lang w:val="en-GB" w:eastAsia="en-GB"/>
-          <w14:ligatures w14:val="none"/>
-        </w:rPr>
-        <w:t>Finally, successful UxS integration requires a genuinely multi-stakeholder approach. Defence transformation cannot occur solely within military institutions. Political leadership, government departments, academia, industry and regulatory authorities must all contribute to capability development. Such collaboration avoids organisational silos while ensuring that ethical, legal, financial and operational considerations develop together. Civilian oversight is particularly important given the political sensitivities surrounding autonomy, artificial intelligence and military neutrality. Transparent governance strengthens public confidence that autonomous systems are enhancing national resilience rather than fundamentally altering Ireland's defence posture. Equally, engagement with emergency services, the Coast Guard and other state agencies creates opportunities for dual-use capability, allowing investments in surveillance and autonomous technologies to contribute to disaster response, search and rescue and maritime security alongside military tasks.</w:t>
-      </w:r>
-    </w:p>
-    <w:p>
-      <w:pPr>
-        <w:spacing w:after="0" w:line="360" w:lineRule="auto"/>
-        <w:jc w:val="both"/>
-        <w:rPr>
-          <w:rFonts w:ascii="Times New Roman" w:hAnsi="Times New Roman" w:cs="Times New Roman"/>
-          <w:kern w:val="0"/>
-          <w:lang w:val="en-GB" w:eastAsia="en-GB"/>
-          <w14:ligatures w14:val="none"/>
-        </w:rPr>
-      </w:pPr>
-    </w:p>
-    <w:p>
-      <w:pPr>
-        <w:spacing w:after="0" w:line="360" w:lineRule="auto"/>
-        <w:jc w:val="both"/>
-        <w:rPr>
-          <w:rFonts w:ascii="Times New Roman" w:hAnsi="Times New Roman" w:cs="Times New Roman"/>
-          <w:b/>
-          <w:bCs/>
-          <w:kern w:val="0"/>
-          <w:lang w:val="en-GB" w:eastAsia="en-GB"/>
-          <w14:ligatures w14:val="none"/>
-        </w:rPr>
-      </w:pPr>
-      <w:r>
-        <w:rPr>
-          <w:rFonts w:ascii="Times New Roman" w:hAnsi="Times New Roman" w:cs="Times New Roman"/>
-          <w:b/>
-          <w:bCs/>
-          <w:kern w:val="0"/>
-          <w:lang w:val="en-GB" w:eastAsia="en-GB"/>
-          <w14:ligatures w14:val="none"/>
-        </w:rPr>
-        <w:t>Engaging with Partners.</w:t>
-      </w:r>
-    </w:p>
-    <w:p>
-      <w:pPr>
-        <w:spacing w:after="0" w:line="360" w:lineRule="auto"/>
-        <w:jc w:val="both"/>
-        <w:rPr>
-          <w:rFonts w:ascii="Times New Roman" w:hAnsi="Times New Roman" w:cs="Times New Roman"/>
-          <w:kern w:val="0"/>
-          <w:lang w:val="en-GB" w:eastAsia="en-GB"/>
-          <w14:ligatures w14:val="none"/>
-        </w:rPr>
-      </w:pPr>
-      <w:r>
-        <w:rPr>
-          <w:rFonts w:ascii="Times New Roman" w:hAnsi="Times New Roman" w:cs="Times New Roman"/>
-          <w:kern w:val="0"/>
-          <w:lang w:val="en-GB" w:eastAsia="en-GB"/>
-          <w14:ligatures w14:val="none"/>
-        </w:rPr>
-        <w:lastRenderedPageBreak/>
-        <w:t>Within Irish defence policy, a UxS enabled light infantry denial posture therefore occupies an important middle ground between symbolic defence and conventional deterrence. It neither seeks offensive expeditionary capability nor attempts to replicate the force structures of larger European militaries. Instead, it exploits Ireland's geographical advantages, supports territorial surveillance, complicates hostile military activity and increases the costs of coercion while remaining consistent with military neutrality. Practical interoperability with European Union partners and NATO members is enhanced through common communications, doctrine and operating procedures rather than alliance membership itself. The resulting force would be capable of contributing meaningfully to domestic security, maritime surveillance and international peace support operations while remaining firmly grounded in Irish strategic culture.</w:t>
-      </w:r>
-    </w:p>
-    <w:p>
-      <w:pPr>
-        <w:spacing w:after="0" w:line="360" w:lineRule="auto"/>
-        <w:jc w:val="both"/>
-        <w:rPr>
-          <w:rFonts w:ascii="Times New Roman" w:hAnsi="Times New Roman" w:cs="Times New Roman"/>
-          <w:kern w:val="0"/>
-          <w:lang w:val="en-GB" w:eastAsia="en-GB"/>
-          <w14:ligatures w14:val="none"/>
-        </w:rPr>
-      </w:pPr>
-    </w:p>
-    <w:p>
-      <w:pPr>
-        <w:spacing w:after="0" w:line="360" w:lineRule="auto"/>
-        <w:jc w:val="both"/>
-        <w:rPr>
-          <w:rFonts w:ascii="Times New Roman" w:hAnsi="Times New Roman" w:cs="Times New Roman"/>
-          <w:b/>
-          <w:bCs/>
-          <w:kern w:val="0"/>
-          <w:lang w:val="en-GB" w:eastAsia="en-GB"/>
-          <w14:ligatures w14:val="none"/>
-        </w:rPr>
-      </w:pPr>
-      <w:r>
-        <w:rPr>
-          <w:rFonts w:ascii="Times New Roman" w:hAnsi="Times New Roman" w:cs="Times New Roman"/>
-          <w:b/>
-          <w:bCs/>
-          <w:kern w:val="0"/>
-          <w:lang w:val="en-GB" w:eastAsia="en-GB"/>
-          <w14:ligatures w14:val="none"/>
-        </w:rPr>
-        <w:t>Challenges to Credible Integration.</w:t>
-      </w:r>
-    </w:p>
-    <w:p>
-      <w:pPr>
-        <w:spacing w:after="0" w:line="360" w:lineRule="auto"/>
-        <w:jc w:val="both"/>
-        <w:rPr>
-          <w:rFonts w:ascii="Times New Roman" w:hAnsi="Times New Roman" w:cs="Times New Roman"/>
-          <w:kern w:val="0"/>
-          <w:lang w:val="en-GB" w:eastAsia="en-GB"/>
-          <w14:ligatures w14:val="none"/>
-        </w:rPr>
-      </w:pPr>
-      <w:r>
-        <w:rPr>
-          <w:rFonts w:ascii="Times New Roman" w:hAnsi="Times New Roman" w:cs="Times New Roman"/>
-          <w:kern w:val="0"/>
-          <w:lang w:val="en-GB" w:eastAsia="en-GB"/>
-          <w14:ligatures w14:val="none"/>
-        </w:rPr>
-        <w:t>Nevertheless, significant constraints remain. Chronic recruitment and retention difficulties continue to challenge Defence Forces modernisation. Procurement processes are often slow and risk-averse, while sustained political commitment to increased defence expenditure cannot be assumed. Ethical concerns surrounding autonomous systems require careful policy development, particularly where lethal capabilities are considered. Ireland's relatively small industrial base may also limit domestic production without substantial collaboration with European partners. Finally, organisational culture frequently favours incremental adaptation over disruptive change, making institutional resistance an enduring obstacle to transformation.</w:t>
-      </w:r>
-    </w:p>
-    <w:p>
-      <w:pPr>
-        <w:spacing w:after="0" w:line="360" w:lineRule="auto"/>
-        <w:jc w:val="both"/>
-        <w:rPr>
-          <w:rFonts w:ascii="Times New Roman" w:hAnsi="Times New Roman" w:cs="Times New Roman"/>
-          <w:kern w:val="0"/>
-          <w:lang w:val="en-GB" w:eastAsia="en-GB"/>
-          <w14:ligatures w14:val="none"/>
-        </w:rPr>
-      </w:pPr>
-    </w:p>
-    <w:p>
-      <w:pPr>
-        <w:spacing w:after="0" w:line="360" w:lineRule="auto"/>
-        <w:jc w:val="both"/>
-        <w:rPr>
-          <w:rFonts w:ascii="Times New Roman" w:hAnsi="Times New Roman" w:cs="Times New Roman"/>
-          <w:kern w:val="0"/>
-          <w:lang w:val="en-GB" w:eastAsia="en-GB"/>
-          <w14:ligatures w14:val="none"/>
-        </w:rPr>
-      </w:pPr>
-      <w:commentRangeStart w:id="3"/>
-      <w:r>
-        <w:rPr>
-          <w:rFonts w:ascii="Times New Roman" w:hAnsi="Times New Roman" w:cs="Times New Roman"/>
-          <w:b/>
-          <w:bCs/>
-          <w:color w:val="FF0000"/>
-          <w:kern w:val="0"/>
-          <w:lang w:val="en-GB" w:eastAsia="en-GB"/>
-          <w14:ligatures w14:val="none"/>
-        </w:rPr>
-        <w:t>Ultimately, the credibility of UxS integration within Irish defence policy will not be determined by the sophistication of the technology itself but by the effectiveness of the institutions that adopt it.</w:t>
-      </w:r>
-      <w:r>
-        <w:rPr>
-          <w:rFonts w:ascii="Times New Roman" w:hAnsi="Times New Roman" w:cs="Times New Roman"/>
-          <w:color w:val="FF0000"/>
-          <w:kern w:val="0"/>
-          <w:lang w:val="en-GB" w:eastAsia="en-GB"/>
-          <w14:ligatures w14:val="none"/>
-        </w:rPr>
-        <w:t xml:space="preserve"> </w:t>
-      </w:r>
-      <w:commentRangeEnd w:id="3"/>
-      <w:r>
-        <w:rPr>
-          <w:rStyle w:val="CommentReference"/>
-          <w:rFonts w:ascii="Times New Roman" w:hAnsi="Times New Roman" w:cs="Times New Roman"/>
-          <w:kern w:val="0"/>
-          <w:sz w:val="24"/>
-          <w:szCs w:val="24"/>
-          <w:lang w:val="en-GB" w:eastAsia="en-GB"/>
-          <w14:ligatures w14:val="none"/>
-        </w:rPr>
-        <w:commentReference w:id="3"/>
-      </w:r>
-      <w:r>
-        <w:rPr>
-          <w:rFonts w:ascii="Times New Roman" w:hAnsi="Times New Roman" w:cs="Times New Roman"/>
-          <w:kern w:val="0"/>
-          <w:lang w:val="en-GB" w:eastAsia="en-GB"/>
-          <w14:ligatures w14:val="none"/>
-        </w:rPr>
-        <w:t>Recognition of disruptive military change, coherent operational concepts, institutional reform, rigorous experimentation, continuous technological adaptation, industrial partnership and multi-stakeholder governance together provide the pathway from tactical innovation to enduring capability. By following this process, Ireland can develop a defence posture that is affordable, credible and aligned with its strategic objectives, demonstrating that UxS-enabled denial is not merely an attractive tactical concept but a realistic and sustainable foundation for future Irish defence policy.</w:t>
-      </w:r>
-    </w:p>
-    <w:p/>
-    <w:p>
-      <w:pPr>
-        <w:keepNext/>
-        <w:keepLines/>
-        <w:spacing w:before="160" w:after="80"/>
-        <w:outlineLvl w:val="1"/>
-        <w:rPr>
-          <w:rFonts w:asciiTheme="majorHAnsi" w:eastAsiaTheme="majorEastAsia" w:hAnsiTheme="majorHAnsi" w:cstheme="majorBidi"/>
-          <w:color w:val="0F4761" w:themeColor="accent1" w:themeShade="BF"/>
-          <w:sz w:val="32"/>
-          <w:szCs w:val="32"/>
-        </w:rPr>
-      </w:pPr>
-      <w:r>
-        <w:rPr>
-          <w:rFonts w:asciiTheme="majorHAnsi" w:eastAsiaTheme="majorEastAsia" w:hAnsiTheme="majorHAnsi" w:cstheme="majorBidi"/>
-          <w:color w:val="0F4761" w:themeColor="accent1" w:themeShade="BF"/>
-          <w:sz w:val="32"/>
-          <w:szCs w:val="32"/>
-        </w:rPr>
-        <w:lastRenderedPageBreak/>
         <w:t>Conclusion</w:t>
       </w:r>
     </w:p>
@@ -2395,83 +4250,6 @@
 </w:document>
 </file>
 
-<file path=word/comments.xml><?xml version="1.0" encoding="utf-8"?>
-<w:comments xmlns:wpc="http://schemas.microsoft.com/office/word/2010/wordprocessingCanvas" xmlns:cx="http://schemas.microsoft.com/office/drawing/2014/chartex" xmlns:cx1="http://schemas.microsoft.com/office/drawing/2015/9/8/chartex" xmlns:cx2="http://schemas.microsoft.com/office/drawing/2015/10/21/chartex" xmlns:cx3="http://schemas.microsoft.com/office/drawing/2016/5/9/chartex" xmlns:cx4="http://schemas.microsoft.com/office/drawing/2016/5/10/chartex" xmlns:cx5="http://schemas.microsoft.com/office/drawing/2016/5/11/chartex" xmlns:cx6="http://schemas.microsoft.com/office/drawing/2016/5/12/chartex" xmlns:cx7="http://schemas.microsoft.com/office/drawing/2016/5/13/chartex" xmlns:cx8="http://schemas.microsoft.com/office/drawing/2016/5/14/chartex" xmlns:mc="http://schemas.openxmlformats.org/markup-compatibility/2006" xmlns:aink="http://schemas.microsoft.com/office/drawing/2016/ink" xmlns:am3d="http://schemas.microsoft.com/office/drawing/2017/model3d" xmlns:o="urn:schemas-microsoft-com:office:office" xmlns:oel="http://schemas.microsoft.com/office/2019/extlst" xmlns:r="http://schemas.openxmlformats.org/officeDocument/2006/relationships" xmlns:m="http://schemas.openxmlformats.org/officeDocument/2006/math" xmlns:v="urn:schemas-microsoft-com:vml" xmlns:wp14="http://schemas.microsoft.com/office/word/2010/wordprocessingDrawing" xmlns:wp="http://schemas.openxmlformats.org/drawingml/2006/wordprocessingDrawing" xmlns:w10="urn:schemas-microsoft-com:office:word" xmlns:w="http://schemas.openxmlformats.org/wordprocessingml/2006/main" xmlns:w14="http://schemas.microsoft.com/office/word/2010/wordml" xmlns:w15="http://schemas.microsoft.com/office/word/2012/wordml" xmlns:w16cex="http://schemas.microsoft.com/office/word/2018/wordml/cex" xmlns:w16cid="http://schemas.microsoft.com/office/word/2016/wordml/cid" xmlns:w16="http://schemas.microsoft.com/office/word/2018/wordml" xmlns:w16du="http://schemas.microsoft.com/office/word/2023/wordml/word16du" xmlns:w16sdtdh="http://schemas.microsoft.com/office/word/2020/wordml/sdtdatahash" xmlns:w16sdtfl="http://schemas.microsoft.com/office/word/2024/wordml/sdtformatlock" xmlns:w16se="http://schemas.microsoft.com/office/word/2015/wordml/symex" xmlns:wpg="http://schemas.microsoft.com/office/word/2010/wordprocessingGroup" xmlns:wpi="http://schemas.microsoft.com/office/word/2010/wordprocessingInk" xmlns:wne="http://schemas.microsoft.com/office/word/2006/wordml" xmlns:wps="http://schemas.microsoft.com/office/word/2010/wordprocessingShape" mc:Ignorable="w14 w15 w16se w16cid w16 w16cex w16sdtdh w16sdtfl w16du wp14">
-  <w:comment w:id="1" w:author="Eoin O'Brien" w:date="2026-07-06T16:35:00Z" w:initials="EO">
-    <w:p>
-      <w:pPr>
-        <w:pStyle w:val="CommentText"/>
-      </w:pPr>
-      <w:r>
-        <w:rPr>
-          <w:rStyle w:val="CommentReference"/>
-        </w:rPr>
-        <w:annotationRef/>
-      </w:r>
-      <w:r>
-        <w:t>This must link better</w:t>
-      </w:r>
-    </w:p>
-  </w:comment>
-  <w:comment w:id="2" w:author="Eoin O'Brien" w:date="2026-07-06T16:35:00Z" w:initials="EO">
-    <w:p>
-      <w:pPr>
-        <w:pStyle w:val="CommentText"/>
-      </w:pPr>
-      <w:r>
-        <w:rPr>
-          <w:rStyle w:val="CommentReference"/>
-        </w:rPr>
-        <w:annotationRef/>
-      </w:r>
-      <w:r>
-        <w:t xml:space="preserve">This is the core argument </w:t>
-      </w:r>
-    </w:p>
-  </w:comment>
-  <w:comment w:id="3" w:author="Eoin O'Brien" w:date="2026-07-06T17:10:00Z" w:initials="EO">
-    <w:p>
-      <w:pPr>
-        <w:pStyle w:val="CommentText"/>
-      </w:pPr>
-      <w:r>
-        <w:rPr>
-          <w:rStyle w:val="CommentReference"/>
-        </w:rPr>
-        <w:annotationRef/>
-      </w:r>
-      <w:r>
-        <w:t>This is my concluding statement. The technology isn’t the important part, the procurement, adoption and adaption culture is what make it a credible defence policy.</w:t>
-      </w:r>
-    </w:p>
-  </w:comment>
-</w:comments>
-</file>
-
-<file path=word/commentsExtended.xml><?xml version="1.0" encoding="utf-8"?>
-<w15:commentsEx xmlns:wpc="http://schemas.microsoft.com/office/word/2010/wordprocessingCanvas" xmlns:cx="http://schemas.microsoft.com/office/drawing/2014/chartex" xmlns:cx1="http://schemas.microsoft.com/office/drawing/2015/9/8/chartex" xmlns:cx2="http://schemas.microsoft.com/office/drawing/2015/10/21/chartex" xmlns:cx3="http://schemas.microsoft.com/office/drawing/2016/5/9/chartex" xmlns:cx4="http://schemas.microsoft.com/office/drawing/2016/5/10/chartex" xmlns:cx5="http://schemas.microsoft.com/office/drawing/2016/5/11/chartex" xmlns:cx6="http://schemas.microsoft.com/office/drawing/2016/5/12/chartex" xmlns:cx7="http://schemas.microsoft.com/office/drawing/2016/5/13/chartex" xmlns:cx8="http://schemas.microsoft.com/office/drawing/2016/5/14/chartex" xmlns:mc="http://schemas.openxmlformats.org/markup-compatibility/2006" xmlns:aink="http://schemas.microsoft.com/office/drawing/2016/ink" xmlns:am3d="http://schemas.microsoft.com/office/drawing/2017/model3d" xmlns:o="urn:schemas-microsoft-com:office:office" xmlns:oel="http://schemas.microsoft.com/office/2019/extlst" xmlns:r="http://schemas.openxmlformats.org/officeDocument/2006/relationships" xmlns:m="http://schemas.openxmlformats.org/officeDocument/2006/math" xmlns:v="urn:schemas-microsoft-com:vml" xmlns:wp14="http://schemas.microsoft.com/office/word/2010/wordprocessingDrawing" xmlns:wp="http://schemas.openxmlformats.org/drawingml/2006/wordprocessingDrawing" xmlns:w10="urn:schemas-microsoft-com:office:word" xmlns:w="http://schemas.openxmlformats.org/wordprocessingml/2006/main" xmlns:w14="http://schemas.microsoft.com/office/word/2010/wordml" xmlns:w15="http://schemas.microsoft.com/office/word/2012/wordml" xmlns:w16cex="http://schemas.microsoft.com/office/word/2018/wordml/cex" xmlns:w16cid="http://schemas.microsoft.com/office/word/2016/wordml/cid" xmlns:w16="http://schemas.microsoft.com/office/word/2018/wordml" xmlns:w16du="http://schemas.microsoft.com/office/word/2023/wordml/word16du" xmlns:w16sdtdh="http://schemas.microsoft.com/office/word/2020/wordml/sdtdatahash" xmlns:w16sdtfl="http://schemas.microsoft.com/office/word/2024/wordml/sdtformatlock" xmlns:w16se="http://schemas.microsoft.com/office/word/2015/wordml/symex" xmlns:wpg="http://schemas.microsoft.com/office/word/2010/wordprocessingGroup" xmlns:wpi="http://schemas.microsoft.com/office/word/2010/wordprocessingInk" xmlns:wne="http://schemas.microsoft.com/office/word/2006/wordml" xmlns:wps="http://schemas.microsoft.com/office/word/2010/wordprocessingShape" mc:Ignorable="w14 w15 w16se w16cid w16 w16cex w16sdtdh w16sdtfl w16du wp14">
-  <w15:commentEx w15:paraId="39EA9539" w15:done="0"/>
-  <w15:commentEx w15:paraId="776B90B5" w15:done="0"/>
-  <w15:commentEx w15:paraId="749B6A42" w15:done="0"/>
-</w15:commentsEx>
-</file>
-
-<file path=word/commentsExtensible.xml><?xml version="1.0" encoding="utf-8"?>
-<w16cex:commentsExtensible xmlns:wpc="http://schemas.microsoft.com/office/word/2010/wordprocessingCanvas" xmlns:cx="http://schemas.microsoft.com/office/drawing/2014/chartex" xmlns:cx1="http://schemas.microsoft.com/office/drawing/2015/9/8/chartex" xmlns:cx2="http://schemas.microsoft.com/office/drawing/2015/10/21/chartex" xmlns:cx3="http://schemas.microsoft.com/office/drawing/2016/5/9/chartex" xmlns:cx4="http://schemas.microsoft.com/office/drawing/2016/5/10/chartex" xmlns:cx5="http://schemas.microsoft.com/office/drawing/2016/5/11/chartex" xmlns:cx6="http://schemas.microsoft.com/office/drawing/2016/5/12/chartex" xmlns:cx7="http://schemas.microsoft.com/office/drawing/2016/5/13/chartex" xmlns:cx8="http://schemas.microsoft.com/office/drawing/2016/5/14/chartex" xmlns:cr="http://schemas.microsoft.com/office/comments/2020/reactions" xmlns:mc="http://schemas.openxmlformats.org/markup-compatibility/2006" xmlns:aink="http://schemas.microsoft.com/office/drawing/2016/ink" xmlns:am3d="http://schemas.microsoft.com/office/drawing/2017/model3d" xmlns:o="urn:schemas-microsoft-com:office:office" xmlns:oel="http://schemas.microsoft.com/office/2019/extlst" xmlns:r="http://schemas.openxmlformats.org/officeDocument/2006/relationships" xmlns:m="http://schemas.openxmlformats.org/officeDocument/2006/math" xmlns:v="urn:schemas-microsoft-com:vml" xmlns:wp14="http://schemas.microsoft.com/office/word/2010/wordprocessingDrawing" xmlns:wp="http://schemas.openxmlformats.org/drawingml/2006/wordprocessingDrawing" xmlns:w10="urn:schemas-microsoft-com:office:word" xmlns:w="http://schemas.openxmlformats.org/wordprocessingml/2006/main" xmlns:w14="http://schemas.microsoft.com/office/word/2010/wordml" xmlns:w15="http://schemas.microsoft.com/office/word/2012/wordml" xmlns:w16cex="http://schemas.microsoft.com/office/word/2018/wordml/cex" xmlns:w16cid="http://schemas.microsoft.com/office/word/2016/wordml/cid" xmlns:w16="http://schemas.microsoft.com/office/word/2018/wordml" xmlns:w16du="http://schemas.microsoft.com/office/word/2023/wordml/word16du" xmlns:w16sdtdh="http://schemas.microsoft.com/office/word/2020/wordml/sdtdatahash" xmlns:w16sdtfl="http://schemas.microsoft.com/office/word/2024/wordml/sdtformatlock" xmlns:w16se="http://schemas.microsoft.com/office/word/2015/wordml/symex" xmlns:wpg="http://schemas.microsoft.com/office/word/2010/wordprocessingGroup" xmlns:wpi="http://schemas.microsoft.com/office/word/2010/wordprocessingInk" xmlns:wne="http://schemas.microsoft.com/office/word/2006/wordml" xmlns:wps="http://schemas.microsoft.com/office/word/2010/wordprocessingShape" mc:Ignorable="w14 w15 w16se w16cid w16 w16cex w16sdtdh w16sdtfl cr w16du wp14">
-  <w16cex:commentExtensible w16cex:durableId="7BDDAB5F" w16cex:dateUtc="2026-07-06T15:35:00Z"/>
-  <w16cex:commentExtensible w16cex:durableId="19B9777A" w16cex:dateUtc="2026-07-06T15:35:00Z"/>
-  <w16cex:commentExtensible w16cex:durableId="5FF9CA22" w16cex:dateUtc="2026-07-06T16:10:00Z"/>
-</w16cex:commentsExtensible>
-</file>
-
-<file path=word/commentsIds.xml><?xml version="1.0" encoding="utf-8"?>
-<w16cid:commentsIds xmlns:wpc="http://schemas.microsoft.com/office/word/2010/wordprocessingCanvas" xmlns:cx="http://schemas.microsoft.com/office/drawing/2014/chartex" xmlns:cx1="http://schemas.microsoft.com/office/drawing/2015/9/8/chartex" xmlns:cx2="http://schemas.microsoft.com/office/drawing/2015/10/21/chartex" xmlns:cx3="http://schemas.microsoft.com/office/drawing/2016/5/9/chartex" xmlns:cx4="http://schemas.microsoft.com/office/drawing/2016/5/10/chartex" xmlns:cx5="http://schemas.microsoft.com/office/drawing/2016/5/11/chartex" xmlns:cx6="http://schemas.microsoft.com/office/drawing/2016/5/12/chartex" xmlns:cx7="http://schemas.microsoft.com/office/drawing/2016/5/13/chartex" xmlns:cx8="http://schemas.microsoft.com/office/drawing/2016/5/14/chartex" xmlns:mc="http://schemas.openxmlformats.org/markup-compatibility/2006" xmlns:aink="http://schemas.microsoft.com/office/drawing/2016/ink" xmlns:am3d="http://schemas.microsoft.com/office/drawing/2017/model3d" xmlns:o="urn:schemas-microsoft-com:office:office" xmlns:oel="http://schemas.microsoft.com/office/2019/extlst" xmlns:r="http://schemas.openxmlformats.org/officeDocument/2006/relationships" xmlns:m="http://schemas.openxmlformats.org/officeDocument/2006/math" xmlns:v="urn:schemas-microsoft-com:vml" xmlns:wp14="http://schemas.microsoft.com/office/word/2010/wordprocessingDrawing" xmlns:wp="http://schemas.openxmlformats.org/drawingml/2006/wordprocessingDrawing" xmlns:w10="urn:schemas-microsoft-com:office:word" xmlns:w="http://schemas.openxmlformats.org/wordprocessingml/2006/main" xmlns:w14="http://schemas.microsoft.com/office/word/2010/wordml" xmlns:w15="http://schemas.microsoft.com/office/word/2012/wordml" xmlns:w16cex="http://schemas.microsoft.com/office/word/2018/wordml/cex" xmlns:w16cid="http://schemas.microsoft.com/office/word/2016/wordml/cid" xmlns:w16="http://schemas.microsoft.com/office/word/2018/wordml" xmlns:w16du="http://schemas.microsoft.com/office/word/2023/wordml/word16du" xmlns:w16sdtdh="http://schemas.microsoft.com/office/word/2020/wordml/sdtdatahash" xmlns:w16sdtfl="http://schemas.microsoft.com/office/word/2024/wordml/sdtformatlock" xmlns:w16se="http://schemas.microsoft.com/office/word/2015/wordml/symex" xmlns:wpg="http://schemas.microsoft.com/office/word/2010/wordprocessingGroup" xmlns:wpi="http://schemas.microsoft.com/office/word/2010/wordprocessingInk" xmlns:wne="http://schemas.microsoft.com/office/word/2006/wordml" xmlns:wps="http://schemas.microsoft.com/office/word/2010/wordprocessingShape" mc:Ignorable="w14 w15 w16se w16cid w16 w16cex w16sdtdh w16sdtfl w16du wp14">
-  <w16cid:commentId w16cid:paraId="39EA9539" w16cid:durableId="7BDDAB5F"/>
-  <w16cid:commentId w16cid:paraId="776B90B5" w16cid:durableId="19B9777A"/>
-  <w16cid:commentId w16cid:paraId="749B6A42" w16cid:durableId="5FF9CA22"/>
-</w16cid:commentsIds>
-</file>
-
 <file path=word/endnotes.xml><?xml version="1.0" encoding="utf-8"?>
 <w:endnotes xmlns:wpc="http://schemas.microsoft.com/office/word/2010/wordprocessingCanvas" xmlns:cx="http://schemas.microsoft.com/office/drawing/2014/chartex" xmlns:cx1="http://schemas.microsoft.com/office/drawing/2015/9/8/chartex" xmlns:cx2="http://schemas.microsoft.com/office/drawing/2015/10/21/chartex" xmlns:cx3="http://schemas.microsoft.com/office/drawing/2016/5/9/chartex" xmlns:cx4="http://schemas.microsoft.com/office/drawing/2016/5/10/chartex" xmlns:cx5="http://schemas.microsoft.com/office/drawing/2016/5/11/chartex" xmlns:cx6="http://schemas.microsoft.com/office/drawing/2016/5/12/chartex" xmlns:cx7="http://schemas.microsoft.com/office/drawing/2016/5/13/chartex" xmlns:cx8="http://schemas.microsoft.com/office/drawing/2016/5/14/chartex" xmlns:mc="http://schemas.openxmlformats.org/markup-compatibility/2006" xmlns:aink="http://schemas.microsoft.com/office/drawing/2016/ink" xmlns:am3d="http://schemas.microsoft.com/office/drawing/2017/model3d" xmlns:o="urn:schemas-microsoft-com:office:office" xmlns:oel="http://schemas.microsoft.com/office/2019/extlst" xmlns:r="http://schemas.openxmlformats.org/officeDocument/2006/relationships" xmlns:m="http://schemas.openxmlformats.org/officeDocument/2006/math" xmlns:v="urn:schemas-microsoft-com:vml" xmlns:wp14="http://schemas.microsoft.com/office/word/2010/wordprocessingDrawing" xmlns:wp="http://schemas.openxmlformats.org/drawingml/2006/wordprocessingDrawing" xmlns:w10="urn:schemas-microsoft-com:office:word" xmlns:w="http://schemas.openxmlformats.org/wordprocessingml/2006/main" xmlns:w14="http://schemas.microsoft.com/office/word/2010/wordml" xmlns:w15="http://schemas.microsoft.com/office/word/2012/wordml" xmlns:w16cex="http://schemas.microsoft.com/office/word/2018/wordml/cex" xmlns:w16cid="http://schemas.microsoft.com/office/word/2016/wordml/cid" xmlns:w16="http://schemas.microsoft.com/office/word/2018/wordml" xmlns:w16du="http://schemas.microsoft.com/office/word/2023/wordml/word16du" xmlns:w16sdtdh="http://schemas.microsoft.com/office/word/2020/wordml/sdtdatahash" xmlns:w16sdtfl="http://schemas.microsoft.com/office/word/2024/wordml/sdtformatlock" xmlns:w16se="http://schemas.microsoft.com/office/word/2015/wordml/symex" xmlns:wpg="http://schemas.microsoft.com/office/word/2010/wordprocessingGroup" xmlns:wpi="http://schemas.microsoft.com/office/word/2010/wordprocessingInk" xmlns:wne="http://schemas.microsoft.com/office/word/2006/wordml" xmlns:wps="http://schemas.microsoft.com/office/word/2010/wordprocessingShape" mc:Ignorable="w14 w15 w16se w16cid w16 w16cex w16sdtdh w16sdtfl w16du wp14">
   <w:endnote w:type="separator" w:id="-1">
@@ -3725,7 +5503,7 @@
         <w:footnoteRef/>
       </w:r>
       <w:r>
-        <w:t xml:space="preserve"> Mick Ryan and Clint Hinote, ‘Uncrewed Systems and the Transformation of the U.S. Warfighting Capacity’, War on the Rocks, February 2024, </w:t>
+        <w:t xml:space="preserve"> Mick Ryan and Clint Hinote. ‘Uncrewed Systems and the Transformation of the U.S. Warfighting Capacity’. War on the Rocks. February 2024. </w:t>
       </w:r>
       <w:hyperlink r:id="rId23" w:history="1">
         <w:r>
@@ -3736,13 +5514,1199 @@
         </w:r>
       </w:hyperlink>
       <w:r>
-        <w:t>, Accessed 06 July 2026.</w:t>
-      </w:r>
-    </w:p>
+        <w:t xml:space="preserve">. Accessed 06 July 2026. </w:t>
+      </w:r>
+    </w:p>
+  </w:footnote>
+  <w:footnote w:id="25">
     <w:p>
       <w:pPr>
         <w:pStyle w:val="FootnoteText"/>
-      </w:pPr>
+        <w:ind w:right="-1180"/>
+        <w:rPr>
+          <w:lang w:val="en-GB"/>
+        </w:rPr>
+      </w:pPr>
+      <w:r>
+        <w:rPr>
+          <w:rStyle w:val="FootnoteReference"/>
+        </w:rPr>
+        <w:footnoteRef/>
+      </w:r>
+      <w:r>
+        <w:t xml:space="preserve"> Barry Posen. ‘The Sources of Military Doctrine’. Cornell University Press. 1984.</w:t>
+      </w:r>
+      <w:hyperlink r:id="rId24" w:history="1">
+        <w:r>
+          <w:rPr>
+            <w:rStyle w:val="Hyperlink"/>
+          </w:rPr>
+          <w:t>https://www.jstor.org/stable/10.7591/j.ctt1287fp3</w:t>
+        </w:r>
+      </w:hyperlink>
+      <w:r>
+        <w:t>. Accessed on 18 July 2026.</w:t>
+      </w:r>
+    </w:p>
+  </w:footnote>
+  <w:footnote w:id="26">
+    <w:p>
+      <w:pPr>
+        <w:pStyle w:val="FootnoteText"/>
+        <w:rPr>
+          <w:lang w:val="en-GB"/>
+        </w:rPr>
+      </w:pPr>
+      <w:r>
+        <w:rPr>
+          <w:rStyle w:val="FootnoteReference"/>
+        </w:rPr>
+        <w:footnoteRef/>
+      </w:r>
+      <w:r>
+        <w:t xml:space="preserve"> Eoin McNamara. ‘Ireland’s Defence Deficit’. RUSI. December 2022. </w:t>
+      </w:r>
+      <w:hyperlink r:id="rId25" w:history="1">
+        <w:r>
+          <w:rPr>
+            <w:rStyle w:val="Hyperlink"/>
+          </w:rPr>
+          <w:t>https://www.rusi.org/explore-our-research/publications/commentary/irelands-defence-deficit</w:t>
+        </w:r>
+      </w:hyperlink>
+      <w:r>
+        <w:t xml:space="preserve">. Accessed 14 July 2026. </w:t>
+      </w:r>
+    </w:p>
+  </w:footnote>
+  <w:footnote w:id="27">
+    <w:p>
+      <w:pPr>
+        <w:pStyle w:val="FootnoteText"/>
+      </w:pPr>
+      <w:r>
+        <w:rPr>
+          <w:rStyle w:val="FootnoteReference"/>
+        </w:rPr>
+        <w:footnoteRef/>
+      </w:r>
+      <w:r>
+        <w:t xml:space="preserve"> David Kirichenko. ‘Ukraine’s robot army will be crucial in 2026 but drones can’t replace infantry’. January 2026.</w:t>
+      </w:r>
+      <w:r>
+        <w:t xml:space="preserve"> </w:t>
+      </w:r>
+      <w:hyperlink r:id="rId26" w:history="1">
+        <w:r>
+          <w:rPr>
+            <w:rStyle w:val="Hyperlink"/>
+          </w:rPr>
+          <w:t>https://www.atlanticcouncil.org/blogs/ukrainealert/ukraines-robot-army-will-be-crucial-in-2026-but-drones-cant-replace-infantry/</w:t>
+        </w:r>
+      </w:hyperlink>
+      <w:r>
+        <w:t>. Accessed 15 July 2026.</w:t>
+      </w:r>
+    </w:p>
+  </w:footnote>
+  <w:footnote w:id="28">
+    <w:p>
+      <w:pPr>
+        <w:pStyle w:val="FootnoteText"/>
+        <w:rPr>
+          <w:lang w:val="en-GB"/>
+        </w:rPr>
+      </w:pPr>
+      <w:r>
+        <w:rPr>
+          <w:rStyle w:val="FootnoteReference"/>
+        </w:rPr>
+        <w:footnoteRef/>
+      </w:r>
+      <w:r>
+        <w:t xml:space="preserve"> Kyaw Jaw Sine Marmw. </w:t>
+      </w:r>
+      <w:r>
+        <w:rPr>
+          <w:lang w:val="en-GB"/>
+        </w:rPr>
+        <w:t>‘Tech Blitzkrieg: Drone Warfare and the Transformation of</w:t>
+      </w:r>
+      <w:r>
+        <w:rPr>
+          <w:lang w:val="en-GB"/>
+        </w:rPr>
+        <w:t xml:space="preserve"> Maneuver’. Modern Diplomacy. July 2026. </w:t>
+      </w:r>
+      <w:hyperlink r:id="rId27" w:history="1">
+        <w:r>
+          <w:rPr>
+            <w:rStyle w:val="Hyperlink"/>
+            <w:lang w:val="en-GB"/>
+          </w:rPr>
+          <w:t>https://moderndiplomacy.eu/2026/07/16/tech-blitzkrieg-drone-warfare-and-the-transformation-of-maneuver/</w:t>
+        </w:r>
+      </w:hyperlink>
+      <w:r>
+        <w:rPr>
+          <w:lang w:val="en-GB"/>
+        </w:rPr>
+        <w:t>. Accessed on 18 July 2026.</w:t>
+      </w:r>
+    </w:p>
+  </w:footnote>
+  <w:footnote w:id="29">
+    <w:p>
+      <w:pPr>
+        <w:pStyle w:val="FootnoteText"/>
+      </w:pPr>
+      <w:r>
+        <w:rPr>
+          <w:rStyle w:val="FootnoteReference"/>
+        </w:rPr>
+        <w:footnoteRef/>
+      </w:r>
+      <w:r>
+        <w:t xml:space="preserve"> Paul Franklin. ‘Defence Tech is no longer niche – it’s institutional’. Primary Markets. June 2026. </w:t>
+      </w:r>
+    </w:p>
+    <w:p>
+      <w:pPr>
+        <w:pStyle w:val="FootnoteText"/>
+        <w:rPr>
+          <w:lang w:val="en-GB"/>
+        </w:rPr>
+      </w:pPr>
+      <w:hyperlink r:id="rId28" w:history="1">
+        <w:r>
+          <w:rPr>
+            <w:rStyle w:val="Hyperlink"/>
+          </w:rPr>
+          <w:t>https://www.primarymarkets.com/defence-tech-is-no-longer-niche-its-institutional/</w:t>
+        </w:r>
+      </w:hyperlink>
+      <w:r>
+        <w:t>. Accessed on 18 July 2026.</w:t>
+      </w:r>
+    </w:p>
+  </w:footnote>
+  <w:footnote w:id="30">
+    <w:p>
+      <w:pPr>
+        <w:pStyle w:val="FootnoteText"/>
+        <w:rPr>
+          <w:lang w:val="en-GB"/>
+        </w:rPr>
+      </w:pPr>
+      <w:r>
+        <w:rPr>
+          <w:rStyle w:val="FootnoteReference"/>
+        </w:rPr>
+        <w:footnoteRef/>
+      </w:r>
+      <w:r>
+        <w:t xml:space="preserve"> Commission on the Defence Forces. ‘Report of the Commission on the Defence Forces’. February 2022. </w:t>
+      </w:r>
+      <w:hyperlink r:id="rId29" w:history="1">
+        <w:r>
+          <w:rPr>
+            <w:rStyle w:val="Hyperlink"/>
+          </w:rPr>
+          <w:t>https://www.military.ie/media/0rfpwgrl/report-of-the-commission-on-defence-forces-1.pdf</w:t>
+        </w:r>
+      </w:hyperlink>
+      <w:r>
+        <w:t>. Accessed on 17 July 2026.</w:t>
+      </w:r>
+    </w:p>
+  </w:footnote>
+  <w:footnote w:id="31">
+    <w:p>
+      <w:r>
+        <w:rPr>
+          <w:rStyle w:val="FootnoteReference"/>
+        </w:rPr>
+        <w:footnoteRef/>
+      </w:r>
+      <w:r>
+        <w:t xml:space="preserve"> </w:t>
+      </w:r>
+      <w:r>
+        <w:rPr>
+          <w:sz w:val="20"/>
+          <w:szCs w:val="20"/>
+        </w:rPr>
+        <w:t xml:space="preserve">NATO. “Innovation and technology adoption”. July 2026. </w:t>
+      </w:r>
+      <w:hyperlink r:id="rId30" w:tgtFrame="_blank" w:history="1">
+        <w:r>
+          <w:rPr>
+            <w:rStyle w:val="Hyperlink"/>
+            <w:sz w:val="20"/>
+            <w:szCs w:val="20"/>
+          </w:rPr>
+          <w:t>https://www.nato.int/en/what-we-do/deterrence-and-defence/emerging-and-disruptive-technologies</w:t>
+        </w:r>
+      </w:hyperlink>
+      <w:r>
+        <w:rPr>
+          <w:sz w:val="20"/>
+          <w:szCs w:val="20"/>
+        </w:rPr>
+        <w:t>. Accessed 14 July 2026.</w:t>
+      </w:r>
+    </w:p>
+  </w:footnote>
+  <w:footnote w:id="32">
+    <w:p>
+      <w:pPr>
+        <w:pStyle w:val="FootnoteText"/>
+        <w:rPr>
+          <w:lang w:val="en-GB"/>
+        </w:rPr>
+      </w:pPr>
+      <w:r>
+        <w:rPr>
+          <w:rStyle w:val="FootnoteReference"/>
+        </w:rPr>
+        <w:footnoteRef/>
+      </w:r>
+      <w:r>
+        <w:t xml:space="preserve"> Applied Aeronautics. ‘How small affordable drones are revolutionizing defense technology’. Applied Aeronautics. March 2025. </w:t>
+      </w:r>
+      <w:hyperlink r:id="rId31" w:history="1">
+        <w:r>
+          <w:rPr>
+            <w:rStyle w:val="Hyperlink"/>
+          </w:rPr>
+          <w:t>https://www.appliedaeronautics.com/post/how-small-affordable-drones-are-revolutionizing-defense-technology</w:t>
+        </w:r>
+      </w:hyperlink>
+      <w:r>
+        <w:t>. Accessed on 18 July 2026.</w:t>
+      </w:r>
+    </w:p>
+  </w:footnote>
+  <w:footnote w:id="33">
+    <w:p>
+      <w:pPr>
+        <w:rPr>
+          <w:sz w:val="20"/>
+          <w:szCs w:val="20"/>
+        </w:rPr>
+      </w:pPr>
+      <w:r>
+        <w:rPr>
+          <w:rStyle w:val="FootnoteReference"/>
+        </w:rPr>
+        <w:footnoteRef/>
+      </w:r>
+      <w:r>
+        <w:t xml:space="preserve"> </w:t>
+      </w:r>
+      <w:r>
+        <w:rPr>
+          <w:sz w:val="20"/>
+          <w:szCs w:val="20"/>
+        </w:rPr>
+        <w:t xml:space="preserve">Robbe Du Pont. ‘The Politics of Drone Armament: A Content Analysis of Political Views on the Weaponisation of Military Drones in Belgium and the Netherlands. Ghent University. September 2025. </w:t>
+      </w:r>
+      <w:hyperlink r:id="rId32" w:history="1">
+        <w:r>
+          <w:rPr>
+            <w:rStyle w:val="Hyperlink"/>
+            <w:sz w:val="20"/>
+            <w:szCs w:val="20"/>
+          </w:rPr>
+          <w:t>https://www.ugent.be/ps/politiekewetenschappen/gies/en/research/publications/honours_paper/academic-year-2024-2025/the-politics-of-drone-armament</w:t>
+        </w:r>
+      </w:hyperlink>
+      <w:r>
+        <w:rPr>
+          <w:sz w:val="20"/>
+          <w:szCs w:val="20"/>
+        </w:rPr>
+        <w:t>. Accessed 18 July 2026.</w:t>
+      </w:r>
+    </w:p>
+  </w:footnote>
+  <w:footnote w:id="34">
+    <w:p>
+      <w:pPr>
+        <w:pStyle w:val="FootnoteText"/>
+        <w:rPr>
+          <w:lang w:val="en-GB"/>
+        </w:rPr>
+      </w:pPr>
+      <w:r>
+        <w:rPr>
+          <w:rStyle w:val="FootnoteReference"/>
+        </w:rPr>
+        <w:footnoteRef/>
+      </w:r>
+      <w:r>
+        <w:t xml:space="preserve"> U.S. Joint</w:t>
+      </w:r>
+      <w:r>
+        <w:rPr>
+          <w:lang w:val="en-GB"/>
+        </w:rPr>
+        <w:t xml:space="preserve"> Staff. ‘Joint Capabilities and Integration Development System Manual’. January 2018.  </w:t>
+      </w:r>
+      <w:hyperlink r:id="rId33" w:history="1">
+        <w:r>
+          <w:rPr>
+            <w:rStyle w:val="Hyperlink"/>
+            <w:lang w:val="en-GB"/>
+          </w:rPr>
+          <w:t>https://www.acq.osd.mil/asda/jrac/docs/2018-jcids.pdf</w:t>
+        </w:r>
+      </w:hyperlink>
+      <w:r>
+        <w:rPr>
+          <w:lang w:val="en-GB"/>
+        </w:rPr>
+        <w:t>. Accessed 18 July 2026.</w:t>
+      </w:r>
+      <w:r>
+        <w:rPr>
+          <w:lang w:val="en-GB"/>
+        </w:rPr>
+        <w:t xml:space="preserve"> </w:t>
+      </w:r>
+    </w:p>
+  </w:footnote>
+  <w:footnote w:id="35">
+    <w:p>
+      <w:pPr>
+        <w:pStyle w:val="FootnoteText"/>
+        <w:rPr>
+          <w:lang w:val="en-GB"/>
+        </w:rPr>
+      </w:pPr>
+      <w:r>
+        <w:rPr>
+          <w:rStyle w:val="FootnoteReference"/>
+        </w:rPr>
+        <w:footnoteRef/>
+      </w:r>
+      <w:r>
+        <w:rPr>
+          <w:lang w:val="de-DE"/>
+        </w:rPr>
+        <w:t xml:space="preserve"> Martin van der</w:t>
+      </w:r>
+      <w:r>
+        <w:rPr>
+          <w:lang w:val="de-DE"/>
+        </w:rPr>
+        <w:t xml:space="preserve"> Vorm. </w:t>
+      </w:r>
+      <w:r>
+        <w:rPr>
+          <w:lang w:val="en-GB"/>
+        </w:rPr>
+        <w:t>‚The Crucible of War‘. N</w:t>
+      </w:r>
+      <w:r>
+        <w:rPr>
+          <w:lang w:val="en-GB"/>
+        </w:rPr>
+        <w:t xml:space="preserve">ovember 2021. </w:t>
+      </w:r>
+      <w:hyperlink r:id="rId34" w:history="1">
+        <w:r>
+          <w:rPr>
+            <w:rStyle w:val="Hyperlink"/>
+            <w:lang w:val="en-GB"/>
+          </w:rPr>
+          <w:t>https://muse.jhu.edu/pub/419/article/797091</w:t>
+        </w:r>
+      </w:hyperlink>
+      <w:r>
+        <w:rPr>
+          <w:lang w:val="en-GB"/>
+        </w:rPr>
+        <w:t>. Accessed 18 July 2026.</w:t>
+      </w:r>
+    </w:p>
+  </w:footnote>
+  <w:footnote w:id="36">
+    <w:p>
+      <w:pPr>
+        <w:rPr>
+          <w:sz w:val="20"/>
+          <w:szCs w:val="20"/>
+        </w:rPr>
+      </w:pPr>
+      <w:r>
+        <w:rPr>
+          <w:rStyle w:val="FootnoteReference"/>
+          <w:sz w:val="20"/>
+          <w:szCs w:val="20"/>
+        </w:rPr>
+        <w:footnoteRef/>
+      </w:r>
+      <w:r>
+        <w:rPr>
+          <w:sz w:val="20"/>
+          <w:szCs w:val="20"/>
+          <w:lang w:val="de-DE"/>
+        </w:rPr>
+        <w:t xml:space="preserve"> James Peterson. </w:t>
+      </w:r>
+      <w:r>
+        <w:rPr>
+          <w:sz w:val="20"/>
+          <w:szCs w:val="20"/>
+        </w:rPr>
+        <w:t xml:space="preserve">‘Transforming in Contact: The Army Needs an Unmanned Systems Command Now’. April 2026. </w:t>
+      </w:r>
+      <w:hyperlink r:id="rId35" w:history="1">
+        <w:r>
+          <w:rPr>
+            <w:rStyle w:val="Hyperlink"/>
+            <w:sz w:val="20"/>
+            <w:szCs w:val="20"/>
+          </w:rPr>
+          <w:t>https://smallwarsjournal.com/2026/04/14/transforming-in-contact-the-army-needs-an-unmanned-systems-command-now/</w:t>
+        </w:r>
+      </w:hyperlink>
+      <w:r>
+        <w:rPr>
+          <w:sz w:val="20"/>
+          <w:szCs w:val="20"/>
+        </w:rPr>
+        <w:t>.Accessed 18 July 2026.</w:t>
+      </w:r>
+    </w:p>
+  </w:footnote>
+  <w:footnote w:id="37">
+    <w:p>
+      <w:pPr>
+        <w:pStyle w:val="FootnoteText"/>
+        <w:rPr>
+          <w:lang w:val="en-GB"/>
+        </w:rPr>
+      </w:pPr>
+      <w:r>
+        <w:rPr>
+          <w:rStyle w:val="FootnoteReference"/>
+        </w:rPr>
+        <w:footnoteRef/>
+      </w:r>
+      <w:r>
+        <w:t xml:space="preserve"> Lt Col Reed Markham. ‘Integrating Drones isn’t Intuitive’. February 2024.  </w:t>
+      </w:r>
+      <w:hyperlink r:id="rId36" w:history="1">
+        <w:r>
+          <w:rPr>
+            <w:rStyle w:val="Hyperlink"/>
+          </w:rPr>
+          <w:t>https://www.lineofdeparture.army.mil/Journals/Infantry/Infantry-Fall-2024/Integrating-drones/</w:t>
+        </w:r>
+      </w:hyperlink>
+      <w:r>
+        <w:t>. Accessed 18 July 2026.</w:t>
+      </w:r>
+    </w:p>
+  </w:footnote>
+  <w:footnote w:id="38">
+    <w:p>
+      <w:pPr>
+        <w:pStyle w:val="FootnoteText"/>
+        <w:rPr>
+          <w:lang w:val="en-GB"/>
+        </w:rPr>
+      </w:pPr>
+      <w:r>
+        <w:rPr>
+          <w:rStyle w:val="FootnoteReference"/>
+        </w:rPr>
+        <w:footnoteRef/>
+      </w:r>
+      <w:r>
+        <w:t xml:space="preserve"> UK Strategic Command. ‘The Crucial Role of Wargaming in Defence’. November 2023. </w:t>
+      </w:r>
+      <w:hyperlink r:id="rId37" w:history="1">
+        <w:r>
+          <w:rPr>
+            <w:rStyle w:val="Hyperlink"/>
+          </w:rPr>
+          <w:t>https://www.gov.uk/government/news/the-crucial-role-of-wargaming-in-defence</w:t>
+        </w:r>
+      </w:hyperlink>
+      <w:r>
+        <w:t>. Accessed on 18 July 2026.</w:t>
+      </w:r>
+    </w:p>
+  </w:footnote>
+  <w:footnote w:id="39">
+    <w:p>
+      <w:pPr>
+        <w:pStyle w:val="FootnoteText"/>
+        <w:rPr>
+          <w:lang w:val="en-GB"/>
+        </w:rPr>
+      </w:pPr>
+      <w:r>
+        <w:rPr>
+          <w:rStyle w:val="FootnoteReference"/>
+        </w:rPr>
+        <w:footnoteRef/>
+      </w:r>
+      <w:r>
+        <w:rPr>
+          <w:lang w:val="de-DE"/>
+        </w:rPr>
+        <w:t xml:space="preserve"> Paul Lushenko, Russell McGuire, Christopher G. Pernin, Sean M. Zeigler. </w:t>
+      </w:r>
+      <w:r>
+        <w:rPr>
+          <w:lang w:val="en-GB"/>
+        </w:rPr>
+        <w:t>‘Defencding U.S. Military Bases Against Drones? A Recent T</w:t>
+      </w:r>
+      <w:r>
+        <w:rPr>
+          <w:lang w:val="en-GB"/>
+        </w:rPr>
+        <w:t xml:space="preserve">abletop Exercise Explores How’. June 2025. </w:t>
+      </w:r>
+      <w:hyperlink r:id="rId38" w:history="1">
+        <w:r>
+          <w:rPr>
+            <w:rStyle w:val="Hyperlink"/>
+            <w:lang w:val="en-GB"/>
+          </w:rPr>
+          <w:t>https://www.rand.org/pubs/commentary/2025/06/defending-us-military-bases-against-drones-a-recent.html</w:t>
+        </w:r>
+      </w:hyperlink>
+      <w:r>
+        <w:rPr>
+          <w:lang w:val="en-GB"/>
+        </w:rPr>
+        <w:t>. Accessed on 18 July 2026.</w:t>
+      </w:r>
+    </w:p>
+  </w:footnote>
+  <w:footnote w:id="40">
+    <w:p>
+      <w:pPr>
+        <w:pStyle w:val="FootnoteText"/>
+        <w:rPr>
+          <w:lang w:val="en-GB"/>
+        </w:rPr>
+      </w:pPr>
+      <w:r>
+        <w:rPr>
+          <w:rStyle w:val="FootnoteReference"/>
+        </w:rPr>
+        <w:footnoteRef/>
+      </w:r>
+      <w:r>
+        <w:t xml:space="preserve"> National Academies of Sciences, Engineering and Medicine. ‘Key Challenges for Effective Testing and Evaluation Across Department of Defense Ranges: Proceedings of a Workshop’. 2021. </w:t>
+      </w:r>
+      <w:hyperlink r:id="rId39" w:anchor="12" w:history="1">
+        <w:r>
+          <w:rPr>
+            <w:rStyle w:val="Hyperlink"/>
+          </w:rPr>
+          <w:t>https://www.nationalacademies.org/read/26150/chapter/1#12</w:t>
+        </w:r>
+      </w:hyperlink>
+      <w:r>
+        <w:t xml:space="preserve">. Accessed on 18 July 2026. </w:t>
+      </w:r>
+    </w:p>
+  </w:footnote>
+  <w:footnote w:id="41">
+    <w:p>
+      <w:pPr>
+        <w:pStyle w:val="FootnoteText"/>
+        <w:rPr>
+          <w:lang w:val="en-GB"/>
+        </w:rPr>
+      </w:pPr>
+      <w:r>
+        <w:rPr>
+          <w:rStyle w:val="FootnoteReference"/>
+        </w:rPr>
+        <w:footnoteRef/>
+      </w:r>
+      <w:r>
+        <w:rPr>
+          <w:lang w:val="de-DE"/>
+        </w:rPr>
+        <w:t xml:space="preserve"> Lt Gen James Dubik. </w:t>
+      </w:r>
+      <w:r>
+        <w:rPr>
+          <w:lang w:val="en-GB"/>
+        </w:rPr>
+        <w:t>‘Confidence and Combat Power</w:t>
+      </w:r>
+      <w:r>
+        <w:rPr>
+          <w:rFonts w:hint="cs"/>
+          <w:lang w:val="en-GB"/>
+        </w:rPr>
+        <w:t>‘</w:t>
+      </w:r>
+      <w:r>
+        <w:rPr>
+          <w:lang w:val="en-GB"/>
+        </w:rPr>
+        <w:t>. J</w:t>
+      </w:r>
+      <w:r>
+        <w:rPr>
+          <w:lang w:val="en-GB"/>
+        </w:rPr>
+        <w:t xml:space="preserve">une 2025. </w:t>
+      </w:r>
+      <w:hyperlink r:id="rId40" w:history="1">
+        <w:r>
+          <w:rPr>
+            <w:rStyle w:val="Hyperlink"/>
+            <w:lang w:val="en-GB"/>
+          </w:rPr>
+          <w:t>https://ausa.org/articles/confidence-and-combat-power#</w:t>
+        </w:r>
+      </w:hyperlink>
+      <w:r>
+        <w:rPr>
+          <w:lang w:val="en-GB"/>
+        </w:rPr>
+        <w:t>. Accessed on 16 July 2026.</w:t>
+      </w:r>
+    </w:p>
+  </w:footnote>
+  <w:footnote w:id="42">
+    <w:p>
+      <w:pPr>
+        <w:pStyle w:val="FootnoteText"/>
+        <w:rPr>
+          <w:lang w:val="en-GB"/>
+        </w:rPr>
+      </w:pPr>
+      <w:r>
+        <w:rPr>
+          <w:rStyle w:val="FootnoteReference"/>
+        </w:rPr>
+        <w:footnoteRef/>
+      </w:r>
+      <w:r>
+        <w:rPr>
+          <w:lang w:val="en-GB"/>
+        </w:rPr>
+        <w:t xml:space="preserve"> </w:t>
+      </w:r>
+      <w:r>
+        <w:rPr>
+          <w:lang w:val="en-GB"/>
+        </w:rPr>
+        <w:t>Ibid.</w:t>
+      </w:r>
+    </w:p>
+  </w:footnote>
+  <w:footnote w:id="43">
+    <w:p>
+      <w:pPr>
+        <w:pStyle w:val="FootnoteText"/>
+        <w:rPr>
+          <w:lang w:val="en-GB"/>
+        </w:rPr>
+      </w:pPr>
+      <w:r>
+        <w:rPr>
+          <w:rStyle w:val="FootnoteReference"/>
+        </w:rPr>
+        <w:footnoteRef/>
+      </w:r>
+      <w:r>
+        <w:t xml:space="preserve"> UK MOD. ‘Defence Experimentation for Force Development Handbook. January 2021. </w:t>
+      </w:r>
+      <w:hyperlink r:id="rId41" w:history="1">
+        <w:r>
+          <w:rPr>
+            <w:rStyle w:val="Hyperlink"/>
+          </w:rPr>
+          <w:t>https://assets.publishing.service.gov.uk/media/6014030be90e07626914df3c/20210121-DEFD_Handbook_Version_2-O.pdf</w:t>
+        </w:r>
+      </w:hyperlink>
+      <w:r>
+        <w:t>. Accessed on 16 July 2026.</w:t>
+      </w:r>
+    </w:p>
+  </w:footnote>
+  <w:footnote w:id="44">
+    <w:p>
+      <w:pPr>
+        <w:pStyle w:val="FootnoteText"/>
+        <w:rPr>
+          <w:lang w:val="en-GB"/>
+        </w:rPr>
+      </w:pPr>
+      <w:r>
+        <w:rPr>
+          <w:rStyle w:val="FootnoteReference"/>
+        </w:rPr>
+        <w:footnoteRef/>
+      </w:r>
+      <w:r>
+        <w:t xml:space="preserve"> </w:t>
+      </w:r>
+      <w:r>
+        <w:t xml:space="preserve">NATO. </w:t>
+      </w:r>
+      <w:r>
+        <w:rPr>
+          <w:rFonts w:hint="cs"/>
+        </w:rPr>
+        <w:t>“</w:t>
+      </w:r>
+      <w:r>
+        <w:t>Innovation and technology adoption</w:t>
+      </w:r>
+      <w:r>
+        <w:rPr>
+          <w:rFonts w:hint="cs"/>
+        </w:rPr>
+        <w:t>”</w:t>
+      </w:r>
+      <w:r>
+        <w:t xml:space="preserve">. July 2026. </w:t>
+      </w:r>
+      <w:hyperlink r:id="rId42" w:history="1">
+        <w:r>
+          <w:rPr>
+            <w:rStyle w:val="Hyperlink"/>
+          </w:rPr>
+          <w:t>https://www.nato.int/en/what-we-do/deterrence-and-defence/emerging-and-disruptive-technologies</w:t>
+        </w:r>
+      </w:hyperlink>
+      <w:r>
+        <w:t>.</w:t>
+      </w:r>
+      <w:r>
+        <w:t xml:space="preserve"> </w:t>
+      </w:r>
+      <w:r>
+        <w:t>Accessed 14 July 2026.</w:t>
+      </w:r>
+    </w:p>
+  </w:footnote>
+  <w:footnote w:id="45">
+    <w:p>
+      <w:pPr>
+        <w:pStyle w:val="FootnoteText"/>
+        <w:rPr>
+          <w:lang w:val="en-GB"/>
+        </w:rPr>
+      </w:pPr>
+      <w:r>
+        <w:rPr>
+          <w:rStyle w:val="FootnoteReference"/>
+        </w:rPr>
+        <w:footnoteRef/>
+      </w:r>
+      <w:r>
+        <w:t xml:space="preserve"> Samuel Bendett and David Kirichenko. ‘Battlefield Drones and the Accelerating Autonomous Arms Race in Ukraine’. October 2025. </w:t>
+      </w:r>
+      <w:hyperlink r:id="rId43" w:history="1">
+        <w:r>
+          <w:rPr>
+            <w:rStyle w:val="Hyperlink"/>
+          </w:rPr>
+          <w:t>https://mwi.westpoint.edu/battlefield-drones-and-the-accelerating-autonomous-arms-race-in-ukraine/</w:t>
+        </w:r>
+      </w:hyperlink>
+      <w:r>
+        <w:t>. Accessed on 17 July 2026.</w:t>
+      </w:r>
+    </w:p>
+  </w:footnote>
+  <w:footnote w:id="46">
+    <w:p>
+      <w:pPr>
+        <w:pStyle w:val="FootnoteText"/>
+        <w:rPr>
+          <w:lang w:val="en-GB"/>
+        </w:rPr>
+      </w:pPr>
+      <w:r>
+        <w:rPr>
+          <w:rStyle w:val="FootnoteReference"/>
+        </w:rPr>
+        <w:footnoteRef/>
+      </w:r>
+      <w:r>
+        <w:t xml:space="preserve"> </w:t>
+      </w:r>
+      <w:r>
+        <w:t xml:space="preserve">Capt Kaya I. Volger. ‘Modular Open Systems Approach: Impacts on Program Management Metrics’. Defence ARJ Volume 33. Winter 2026. </w:t>
+      </w:r>
+      <w:hyperlink r:id="rId44" w:history="1">
+        <w:r>
+          <w:rPr>
+            <w:rStyle w:val="Hyperlink"/>
+          </w:rPr>
+          <w:t>https://www.waru.edu/sites/default/files/2026-01/ARJ110%20Content%20111025%20REBRAND_PK_508_Article1.pdf</w:t>
+        </w:r>
+      </w:hyperlink>
+      <w:r>
+        <w:t>. Accessed 18 July 2026.</w:t>
+      </w:r>
+      <w:r>
+        <w:t xml:space="preserve"> </w:t>
+      </w:r>
+    </w:p>
+  </w:footnote>
+  <w:footnote w:id="47">
+    <w:p>
+      <w:pPr>
+        <w:pStyle w:val="FootnoteText"/>
+        <w:rPr>
+          <w:lang w:val="en-GB"/>
+        </w:rPr>
+      </w:pPr>
+      <w:r>
+        <w:rPr>
+          <w:rStyle w:val="FootnoteReference"/>
+        </w:rPr>
+        <w:footnoteRef/>
+      </w:r>
+      <w:r>
+        <w:t xml:space="preserve"> Ibid.</w:t>
+      </w:r>
+    </w:p>
+  </w:footnote>
+  <w:footnote w:id="48">
+    <w:p>
+      <w:pPr>
+        <w:pStyle w:val="FootnoteText"/>
+        <w:rPr>
+          <w:lang w:val="en-GB"/>
+        </w:rPr>
+      </w:pPr>
+      <w:r>
+        <w:rPr>
+          <w:rStyle w:val="FootnoteReference"/>
+        </w:rPr>
+        <w:footnoteRef/>
+      </w:r>
+      <w:r>
+        <w:t xml:space="preserve"> Cosmo Curtane and John Nagl. ‘How the United States is Learning from Drone Warfare in Ukraine’. Small Wars Journal. June 2026. </w:t>
+      </w:r>
+      <w:hyperlink r:id="rId45" w:history="1">
+        <w:r>
+          <w:rPr>
+            <w:rStyle w:val="Hyperlink"/>
+          </w:rPr>
+          <w:t>https://smallwarsjournal.com/2026/06/17/how-the-united-states-is-learning-from-drone-warfare-in-ukraine/</w:t>
+        </w:r>
+      </w:hyperlink>
+      <w:r>
+        <w:t>. Accessed 17 July 2026.</w:t>
+      </w:r>
+    </w:p>
+  </w:footnote>
+  <w:footnote w:id="49">
+    <w:p>
+      <w:pPr>
+        <w:pStyle w:val="FootnoteText"/>
+        <w:rPr>
+          <w:lang w:val="en-GB"/>
+        </w:rPr>
+      </w:pPr>
+      <w:r>
+        <w:rPr>
+          <w:rStyle w:val="FootnoteReference"/>
+        </w:rPr>
+        <w:footnoteRef/>
+      </w:r>
+      <w:r>
+        <w:t xml:space="preserve"> Vice Adm Lou Crenshaw (Ret.). ‘Military power begins with industrial stregth’. Defensescoop. February 2026. </w:t>
+      </w:r>
+      <w:hyperlink r:id="rId46" w:history="1">
+        <w:r>
+          <w:rPr>
+            <w:rStyle w:val="Hyperlink"/>
+          </w:rPr>
+          <w:t>https://defensescoop.com/2026/02/18/military-power-begins-with-industrial-strength/</w:t>
+        </w:r>
+      </w:hyperlink>
+      <w:r>
+        <w:t>. Accessed on 18 July 2026.</w:t>
+      </w:r>
+    </w:p>
+  </w:footnote>
+  <w:footnote w:id="50">
+    <w:p>
+      <w:pPr>
+        <w:pStyle w:val="FootnoteText"/>
+        <w:rPr>
+          <w:lang w:val="en-GB"/>
+        </w:rPr>
+      </w:pPr>
+      <w:r>
+        <w:rPr>
+          <w:rStyle w:val="FootnoteReference"/>
+        </w:rPr>
+        <w:footnoteRef/>
+      </w:r>
+      <w:r>
+        <w:t xml:space="preserve"> Marium Halstian. ‘A First Point View: Examining Ukraine’s Drone Industry’. Georgetown Security Studies Review 2026. 2026.</w:t>
+      </w:r>
+      <w:r>
+        <w:t xml:space="preserve"> </w:t>
+      </w:r>
+      <w:hyperlink r:id="rId47" w:history="1">
+        <w:r>
+          <w:rPr>
+            <w:rStyle w:val="Hyperlink"/>
+          </w:rPr>
+          <w:t>https://gssr.georgetown.edu/the-forum/regions/eurasia/a-first-point-view-examining-ukraines-drone-industry/</w:t>
+        </w:r>
+      </w:hyperlink>
+      <w:r>
+        <w:t>. Accessed 18 July 2026.</w:t>
+      </w:r>
+    </w:p>
+  </w:footnote>
+  <w:footnote w:id="51">
+    <w:p>
+      <w:pPr>
+        <w:pStyle w:val="FootnoteText"/>
+        <w:rPr>
+          <w:lang w:val="en-GB"/>
+        </w:rPr>
+      </w:pPr>
+      <w:r>
+        <w:rPr>
+          <w:rStyle w:val="FootnoteReference"/>
+        </w:rPr>
+        <w:footnoteRef/>
+      </w:r>
+      <w:r>
+        <w:t xml:space="preserve"> </w:t>
+      </w:r>
+      <w:r>
+        <w:rPr>
+          <w:lang w:val="en-GB"/>
+        </w:rPr>
+        <w:t>Ibid.</w:t>
+      </w:r>
+    </w:p>
+  </w:footnote>
+  <w:footnote w:id="52">
+    <w:p>
+      <w:pPr>
+        <w:pStyle w:val="FootnoteText"/>
+        <w:rPr>
+          <w:lang w:val="en-GB"/>
+        </w:rPr>
+      </w:pPr>
+      <w:r>
+        <w:rPr>
+          <w:rStyle w:val="FootnoteReference"/>
+        </w:rPr>
+        <w:footnoteRef/>
+      </w:r>
+      <w:r>
+        <w:t xml:space="preserve"> Center for Slavic, East European and Eurasian Studies. ‘Cheap Weapons, Expensive Consequences: How Ukraine is rewriting the rules of warfare dominance’. Ohio State University. June 2026. </w:t>
+      </w:r>
+      <w:hyperlink r:id="rId48" w:history="1">
+        <w:r>
+          <w:rPr>
+            <w:rStyle w:val="Hyperlink"/>
+          </w:rPr>
+          <w:t>https://slaviccenter.osu.edu/news/cheap-weapons-expensive-consequences-how-ukraine-rewriting-rules-warfare-dominance</w:t>
+        </w:r>
+      </w:hyperlink>
+      <w:r>
+        <w:t xml:space="preserve">. Accessed on 18 July 2026. </w:t>
+      </w:r>
+    </w:p>
+  </w:footnote>
+  <w:footnote w:id="53">
+    <w:p>
+      <w:pPr>
+        <w:pStyle w:val="FootnoteText"/>
+        <w:rPr>
+          <w:lang w:val="en-GB"/>
+        </w:rPr>
+      </w:pPr>
+      <w:r>
+        <w:rPr>
+          <w:rStyle w:val="FootnoteReference"/>
+        </w:rPr>
+        <w:footnoteRef/>
+      </w:r>
+      <w:r>
+        <w:t xml:space="preserve"> NATO. ‘Increasing defence Industry Production. NATO. July 2026. </w:t>
+      </w:r>
+      <w:hyperlink r:id="rId49" w:history="1">
+        <w:r>
+          <w:rPr>
+            <w:rStyle w:val="Hyperlink"/>
+          </w:rPr>
+          <w:t>https://www.nato.int/en/what-we-do/deterrence-and-defence/natos-role-in-defence-industry-production</w:t>
+        </w:r>
+      </w:hyperlink>
+      <w:r>
+        <w:t xml:space="preserve">. Accessed on 18 July 2026. </w:t>
+      </w:r>
+    </w:p>
+  </w:footnote>
+  <w:footnote w:id="54">
+    <w:p>
+      <w:pPr>
+        <w:pStyle w:val="FootnoteText"/>
+        <w:rPr>
+          <w:lang w:val="en-GB"/>
+        </w:rPr>
+      </w:pPr>
+      <w:r>
+        <w:rPr>
+          <w:rStyle w:val="FootnoteReference"/>
+        </w:rPr>
+        <w:footnoteRef/>
+      </w:r>
+      <w:r>
+        <w:t xml:space="preserve"> </w:t>
+      </w:r>
+    </w:p>
+  </w:footnote>
+  <w:footnote w:id="55">
+    <w:p>
+      <w:pPr>
+        <w:pStyle w:val="FootnoteText"/>
+        <w:rPr>
+          <w:lang w:val="en-GB"/>
+        </w:rPr>
+      </w:pPr>
+      <w:r>
+        <w:rPr>
+          <w:rStyle w:val="FootnoteReference"/>
+        </w:rPr>
+        <w:footnoteRef/>
+      </w:r>
+      <w:r>
+        <w:t xml:space="preserve"> </w:t>
+      </w:r>
+    </w:p>
+  </w:footnote>
+  <w:footnote w:id="56">
+    <w:p>
+      <w:pPr>
+        <w:pStyle w:val="FootnoteText"/>
+        <w:rPr>
+          <w:lang w:val="en-GB"/>
+        </w:rPr>
+      </w:pPr>
+      <w:r>
+        <w:rPr>
+          <w:rStyle w:val="FootnoteReference"/>
+        </w:rPr>
+        <w:footnoteRef/>
+      </w:r>
+      <w:r>
+        <w:t xml:space="preserve"> </w:t>
+      </w:r>
+    </w:p>
+  </w:footnote>
+  <w:footnote w:id="57">
+    <w:p>
+      <w:pPr>
+        <w:pStyle w:val="FootnoteText"/>
+        <w:rPr>
+          <w:lang w:val="en-GB"/>
+        </w:rPr>
+      </w:pPr>
+      <w:r>
+        <w:rPr>
+          <w:rStyle w:val="FootnoteReference"/>
+        </w:rPr>
+        <w:footnoteRef/>
+      </w:r>
+      <w:r>
+        <w:t xml:space="preserve"> </w:t>
+      </w:r>
+    </w:p>
+  </w:footnote>
+  <w:footnote w:id="58">
+    <w:p>
+      <w:pPr>
+        <w:pStyle w:val="FootnoteText"/>
+        <w:rPr>
+          <w:lang w:val="en-GB"/>
+        </w:rPr>
+      </w:pPr>
+      <w:r>
+        <w:rPr>
+          <w:rStyle w:val="FootnoteReference"/>
+        </w:rPr>
+        <w:footnoteRef/>
+      </w:r>
+      <w:r>
+        <w:t xml:space="preserve"> </w:t>
+      </w:r>
+    </w:p>
+  </w:footnote>
+  <w:footnote w:id="59">
+    <w:p>
+      <w:pPr>
+        <w:pStyle w:val="FootnoteText"/>
+        <w:rPr>
+          <w:lang w:val="en-GB"/>
+        </w:rPr>
+      </w:pPr>
+      <w:r>
+        <w:rPr>
+          <w:rStyle w:val="FootnoteReference"/>
+        </w:rPr>
+        <w:footnoteRef/>
+      </w:r>
+      <w:r>
+        <w:t xml:space="preserve"> </w:t>
+      </w:r>
+    </w:p>
+  </w:footnote>
+  <w:footnote w:id="60">
+    <w:p>
+      <w:pPr>
+        <w:pStyle w:val="FootnoteText"/>
+        <w:rPr>
+          <w:lang w:val="en-GB"/>
+        </w:rPr>
+      </w:pPr>
+      <w:r>
+        <w:rPr>
+          <w:rStyle w:val="FootnoteReference"/>
+        </w:rPr>
+        <w:footnoteRef/>
+      </w:r>
+      <w:r>
+        <w:t xml:space="preserve"> </w:t>
+      </w:r>
+    </w:p>
+  </w:footnote>
+  <w:footnote w:id="61">
+    <w:p>
+      <w:pPr>
+        <w:pStyle w:val="FootnoteText"/>
+        <w:rPr>
+          <w:lang w:val="en-GB"/>
+        </w:rPr>
+      </w:pPr>
+      <w:r>
+        <w:rPr>
+          <w:rStyle w:val="FootnoteReference"/>
+        </w:rPr>
+        <w:footnoteRef/>
+      </w:r>
       <w:r>
         <w:t xml:space="preserve"> </w:t>
       </w:r>
@@ -4364,6 +7328,95 @@
     </w:lvl>
   </w:abstractNum>
   <w:abstractNum w:abstractNumId="5" w15:restartNumberingAfterBreak="0">
+    <w:nsid w:val="521115D4"/>
+    <w:multiLevelType w:val="hybridMultilevel"/>
+    <w:tmpl w:val="1EF88EB8"/>
+    <w:lvl w:ilvl="0" w:tplc="0809000F">
+      <w:start w:val="1"/>
+      <w:numFmt w:val="decimal"/>
+      <w:lvlText w:val="%1."/>
+      <w:lvlJc w:val="left"/>
+      <w:pPr>
+        <w:ind w:left="720" w:hanging="360"/>
+      </w:pPr>
+      <w:rPr>
+        <w:rFonts w:hint="default"/>
+      </w:rPr>
+    </w:lvl>
+    <w:lvl w:ilvl="1" w:tplc="08090019">
+      <w:start w:val="1"/>
+      <w:numFmt w:val="lowerLetter"/>
+      <w:lvlText w:val="%2."/>
+      <w:lvlJc w:val="left"/>
+      <w:pPr>
+        <w:ind w:left="1440" w:hanging="360"/>
+      </w:pPr>
+    </w:lvl>
+    <w:lvl w:ilvl="2" w:tplc="0809001B" w:tentative="1">
+      <w:start w:val="1"/>
+      <w:numFmt w:val="lowerRoman"/>
+      <w:lvlText w:val="%3."/>
+      <w:lvlJc w:val="right"/>
+      <w:pPr>
+        <w:ind w:left="2160" w:hanging="180"/>
+      </w:pPr>
+    </w:lvl>
+    <w:lvl w:ilvl="3" w:tplc="0809000F" w:tentative="1">
+      <w:start w:val="1"/>
+      <w:numFmt w:val="decimal"/>
+      <w:lvlText w:val="%4."/>
+      <w:lvlJc w:val="left"/>
+      <w:pPr>
+        <w:ind w:left="2880" w:hanging="360"/>
+      </w:pPr>
+    </w:lvl>
+    <w:lvl w:ilvl="4" w:tplc="08090019" w:tentative="1">
+      <w:start w:val="1"/>
+      <w:numFmt w:val="lowerLetter"/>
+      <w:lvlText w:val="%5."/>
+      <w:lvlJc w:val="left"/>
+      <w:pPr>
+        <w:ind w:left="3600" w:hanging="360"/>
+      </w:pPr>
+    </w:lvl>
+    <w:lvl w:ilvl="5" w:tplc="0809001B" w:tentative="1">
+      <w:start w:val="1"/>
+      <w:numFmt w:val="lowerRoman"/>
+      <w:lvlText w:val="%6."/>
+      <w:lvlJc w:val="right"/>
+      <w:pPr>
+        <w:ind w:left="4320" w:hanging="180"/>
+      </w:pPr>
+    </w:lvl>
+    <w:lvl w:ilvl="6" w:tplc="0809000F" w:tentative="1">
+      <w:start w:val="1"/>
+      <w:numFmt w:val="decimal"/>
+      <w:lvlText w:val="%7."/>
+      <w:lvlJc w:val="left"/>
+      <w:pPr>
+        <w:ind w:left="5040" w:hanging="360"/>
+      </w:pPr>
+    </w:lvl>
+    <w:lvl w:ilvl="7" w:tplc="08090019" w:tentative="1">
+      <w:start w:val="1"/>
+      <w:numFmt w:val="lowerLetter"/>
+      <w:lvlText w:val="%8."/>
+      <w:lvlJc w:val="left"/>
+      <w:pPr>
+        <w:ind w:left="5760" w:hanging="360"/>
+      </w:pPr>
+    </w:lvl>
+    <w:lvl w:ilvl="8" w:tplc="0809001B" w:tentative="1">
+      <w:start w:val="1"/>
+      <w:numFmt w:val="lowerRoman"/>
+      <w:lvlText w:val="%9."/>
+      <w:lvlJc w:val="right"/>
+      <w:pPr>
+        <w:ind w:left="6480" w:hanging="180"/>
+      </w:pPr>
+    </w:lvl>
+  </w:abstractNum>
+  <w:abstractNum w:abstractNumId="6" w15:restartNumberingAfterBreak="0">
     <w:nsid w:val="54C71D81"/>
     <w:multiLevelType w:val="multilevel"/>
     <w:tmpl w:val="2938AE9A"/>
@@ -4512,7 +7565,7 @@
       </w:rPr>
     </w:lvl>
   </w:abstractNum>
-  <w:abstractNum w:abstractNumId="6" w15:restartNumberingAfterBreak="0">
+  <w:abstractNum w:abstractNumId="7" w15:restartNumberingAfterBreak="0">
     <w:nsid w:val="700F3DED"/>
     <w:multiLevelType w:val="multilevel"/>
     <w:tmpl w:val="D20A8854"/>
@@ -4659,6 +7712,95 @@
         <w:rFonts w:ascii="Wingdings" w:hAnsi="Wingdings" w:hint="default"/>
         <w:sz w:val="20"/>
       </w:rPr>
+    </w:lvl>
+  </w:abstractNum>
+  <w:abstractNum w:abstractNumId="8" w15:restartNumberingAfterBreak="0">
+    <w:nsid w:val="7B8C08E5"/>
+    <w:multiLevelType w:val="hybridMultilevel"/>
+    <w:tmpl w:val="EEE2042A"/>
+    <w:lvl w:ilvl="0" w:tplc="08090019">
+      <w:start w:val="1"/>
+      <w:numFmt w:val="lowerLetter"/>
+      <w:lvlText w:val="%1."/>
+      <w:lvlJc w:val="left"/>
+      <w:pPr>
+        <w:ind w:left="720" w:hanging="360"/>
+      </w:pPr>
+      <w:rPr>
+        <w:rFonts w:hint="default"/>
+      </w:rPr>
+    </w:lvl>
+    <w:lvl w:ilvl="1" w:tplc="08090019" w:tentative="1">
+      <w:start w:val="1"/>
+      <w:numFmt w:val="lowerLetter"/>
+      <w:lvlText w:val="%2."/>
+      <w:lvlJc w:val="left"/>
+      <w:pPr>
+        <w:ind w:left="1440" w:hanging="360"/>
+      </w:pPr>
+    </w:lvl>
+    <w:lvl w:ilvl="2" w:tplc="0809001B" w:tentative="1">
+      <w:start w:val="1"/>
+      <w:numFmt w:val="lowerRoman"/>
+      <w:lvlText w:val="%3."/>
+      <w:lvlJc w:val="right"/>
+      <w:pPr>
+        <w:ind w:left="2160" w:hanging="180"/>
+      </w:pPr>
+    </w:lvl>
+    <w:lvl w:ilvl="3" w:tplc="0809000F" w:tentative="1">
+      <w:start w:val="1"/>
+      <w:numFmt w:val="decimal"/>
+      <w:lvlText w:val="%4."/>
+      <w:lvlJc w:val="left"/>
+      <w:pPr>
+        <w:ind w:left="2880" w:hanging="360"/>
+      </w:pPr>
+    </w:lvl>
+    <w:lvl w:ilvl="4" w:tplc="08090019" w:tentative="1">
+      <w:start w:val="1"/>
+      <w:numFmt w:val="lowerLetter"/>
+      <w:lvlText w:val="%5."/>
+      <w:lvlJc w:val="left"/>
+      <w:pPr>
+        <w:ind w:left="3600" w:hanging="360"/>
+      </w:pPr>
+    </w:lvl>
+    <w:lvl w:ilvl="5" w:tplc="0809001B" w:tentative="1">
+      <w:start w:val="1"/>
+      <w:numFmt w:val="lowerRoman"/>
+      <w:lvlText w:val="%6."/>
+      <w:lvlJc w:val="right"/>
+      <w:pPr>
+        <w:ind w:left="4320" w:hanging="180"/>
+      </w:pPr>
+    </w:lvl>
+    <w:lvl w:ilvl="6" w:tplc="0809000F" w:tentative="1">
+      <w:start w:val="1"/>
+      <w:numFmt w:val="decimal"/>
+      <w:lvlText w:val="%7."/>
+      <w:lvlJc w:val="left"/>
+      <w:pPr>
+        <w:ind w:left="5040" w:hanging="360"/>
+      </w:pPr>
+    </w:lvl>
+    <w:lvl w:ilvl="7" w:tplc="08090019" w:tentative="1">
+      <w:start w:val="1"/>
+      <w:numFmt w:val="lowerLetter"/>
+      <w:lvlText w:val="%8."/>
+      <w:lvlJc w:val="left"/>
+      <w:pPr>
+        <w:ind w:left="5760" w:hanging="360"/>
+      </w:pPr>
+    </w:lvl>
+    <w:lvl w:ilvl="8" w:tplc="0809001B" w:tentative="1">
+      <w:start w:val="1"/>
+      <w:numFmt w:val="lowerRoman"/>
+      <w:lvlText w:val="%9."/>
+      <w:lvlJc w:val="right"/>
+      <w:pPr>
+        <w:ind w:left="6480" w:hanging="180"/>
+      </w:pPr>
     </w:lvl>
   </w:abstractNum>
   <w:num w:numId="1" w16cid:durableId="1548443802">
@@ -4674,23 +7816,21 @@
     <w:abstractNumId w:val="3"/>
   </w:num>
   <w:num w:numId="5" w16cid:durableId="949435667">
-    <w:abstractNumId w:val="6"/>
+    <w:abstractNumId w:val="7"/>
   </w:num>
   <w:num w:numId="6" w16cid:durableId="2129355854">
     <w:abstractNumId w:val="2"/>
   </w:num>
   <w:num w:numId="7" w16cid:durableId="1714574288">
+    <w:abstractNumId w:val="6"/>
+  </w:num>
+  <w:num w:numId="8" w16cid:durableId="531382399">
     <w:abstractNumId w:val="5"/>
   </w:num>
+  <w:num w:numId="9" w16cid:durableId="516701611">
+    <w:abstractNumId w:val="8"/>
+  </w:num>
 </w:numbering>
-</file>
-
-<file path=word/people.xml><?xml version="1.0" encoding="utf-8"?>
-<w15:people xmlns:wpc="http://schemas.microsoft.com/office/word/2010/wordprocessingCanvas" xmlns:cx="http://schemas.microsoft.com/office/drawing/2014/chartex" xmlns:cx1="http://schemas.microsoft.com/office/drawing/2015/9/8/chartex" xmlns:cx2="http://schemas.microsoft.com/office/drawing/2015/10/21/chartex" xmlns:cx3="http://schemas.microsoft.com/office/drawing/2016/5/9/chartex" xmlns:cx4="http://schemas.microsoft.com/office/drawing/2016/5/10/chartex" xmlns:cx5="http://schemas.microsoft.com/office/drawing/2016/5/11/chartex" xmlns:cx6="http://schemas.microsoft.com/office/drawing/2016/5/12/chartex" xmlns:cx7="http://schemas.microsoft.com/office/drawing/2016/5/13/chartex" xmlns:cx8="http://schemas.microsoft.com/office/drawing/2016/5/14/chartex" xmlns:mc="http://schemas.openxmlformats.org/markup-compatibility/2006" xmlns:aink="http://schemas.microsoft.com/office/drawing/2016/ink" xmlns:am3d="http://schemas.microsoft.com/office/drawing/2017/model3d" xmlns:o="urn:schemas-microsoft-com:office:office" xmlns:oel="http://schemas.microsoft.com/office/2019/extlst" xmlns:r="http://schemas.openxmlformats.org/officeDocument/2006/relationships" xmlns:m="http://schemas.openxmlformats.org/officeDocument/2006/math" xmlns:v="urn:schemas-microsoft-com:vml" xmlns:wp14="http://schemas.microsoft.com/office/word/2010/wordprocessingDrawing" xmlns:wp="http://schemas.openxmlformats.org/drawingml/2006/wordprocessingDrawing" xmlns:w10="urn:schemas-microsoft-com:office:word" xmlns:w="http://schemas.openxmlformats.org/wordprocessingml/2006/main" xmlns:w14="http://schemas.microsoft.com/office/word/2010/wordml" xmlns:w15="http://schemas.microsoft.com/office/word/2012/wordml" xmlns:w16cex="http://schemas.microsoft.com/office/word/2018/wordml/cex" xmlns:w16cid="http://schemas.microsoft.com/office/word/2016/wordml/cid" xmlns:w16="http://schemas.microsoft.com/office/word/2018/wordml" xmlns:w16du="http://schemas.microsoft.com/office/word/2023/wordml/word16du" xmlns:w16sdtdh="http://schemas.microsoft.com/office/word/2020/wordml/sdtdatahash" xmlns:w16sdtfl="http://schemas.microsoft.com/office/word/2024/wordml/sdtformatlock" xmlns:w16se="http://schemas.microsoft.com/office/word/2015/wordml/symex" xmlns:wpg="http://schemas.microsoft.com/office/word/2010/wordprocessingGroup" xmlns:wpi="http://schemas.microsoft.com/office/word/2010/wordprocessingInk" xmlns:wne="http://schemas.microsoft.com/office/word/2006/wordml" xmlns:wps="http://schemas.microsoft.com/office/word/2010/wordprocessingShape" mc:Ignorable="w14 w15 w16se w16cid w16 w16cex w16sdtdh w16sdtfl w16du wp14">
-  <w15:person w15:author="Eoin O'Brien">
-    <w15:presenceInfo w15:providerId="AD" w15:userId="S-1-5-21-260408978-1581569393-1597378745-31211"/>
-  </w15:person>
-</w15:people>
 </file>
 
 <file path=word/styles.xml><?xml version="1.0" encoding="utf-8"?>
@@ -5613,7 +8753,6 @@
     <w:basedOn w:val="Normal"/>
     <w:link w:val="FootnoteTextChar"/>
     <w:uiPriority w:val="99"/>
-    <w:semiHidden/>
     <w:unhideWhenUsed/>
     <w:rsid w:val="008F41DA"/>
     <w:pPr>
@@ -5629,7 +8768,6 @@
     <w:basedOn w:val="DefaultParagraphFont"/>
     <w:link w:val="FootnoteText"/>
     <w:uiPriority w:val="99"/>
-    <w:semiHidden/>
     <w:rsid w:val="008F41DA"/>
     <w:rPr>
       <w:sz w:val="20"/>

</xml_diff>

<commit_message>
Full 3800 word version
</commit_message>
<xml_diff>
--- a/Essays/DF_Review_Article.docx
+++ b/Essays/DF_Review_Article.docx
@@ -77,20 +77,7 @@
         <w:rPr>
           <w:rFonts w:ascii="Times New Roman" w:hAnsi="Times New Roman" w:cs="Times New Roman"/>
         </w:rPr>
-        <w:t xml:space="preserve"> costing under €85,000 against €1.13 million in Javelins </w:t>
-      </w:r>
-      <w:proofErr w:type="spellStart"/>
-      <w:r>
-        <w:rPr>
-          <w:rFonts w:ascii="Times New Roman" w:hAnsi="Times New Roman" w:cs="Times New Roman"/>
-        </w:rPr>
-        <w:t>demonstrate</w:t>
-      </w:r>
-      <w:r>
-        <w:rPr>
-          <w:rFonts w:ascii="Times New Roman" w:hAnsi="Times New Roman" w:cs="Times New Roman"/>
-        </w:rPr>
-        <w:t>demonstrate</w:t>
+        <w:t xml:space="preserve"> costing under €85,000 against €1.13 million in Javelins demonstrate</w:t>
       </w:r>
       <w:r>
         <w:rPr>
@@ -98,7 +85,6 @@
         </w:rPr>
         <w:t>s</w:t>
       </w:r>
-      <w:proofErr w:type="spellEnd"/>
       <w:r>
         <w:rPr>
           <w:rFonts w:ascii="Times New Roman" w:hAnsi="Times New Roman" w:cs="Times New Roman"/>
@@ -3293,34 +3279,7 @@
           <w:lang w:val="en-US"/>
           <w14:ligatures w14:val="none"/>
         </w:rPr>
-        <w:t>Iterative cycles of</w:t>
-      </w:r>
-      <w:r>
-        <w:rPr>
-          <w:rFonts w:ascii="Times New Roman" w:eastAsia="Times New Roman" w:hAnsi="Times New Roman" w:cs="Times New Roman"/>
-          <w:kern w:val="0"/>
-          <w:lang w:val="en-US"/>
-          <w14:ligatures w14:val="none"/>
-        </w:rPr>
-        <w:t xml:space="preserve"> wargaming, experimentation, training and evaluation generate evidence, reduce uncertainty, inform strategic decisions and refine concepts and capabilities. </w:t>
-      </w:r>
-      <w:r>
-        <w:rPr>
-          <w:rFonts w:ascii="Times New Roman" w:eastAsia="Times New Roman" w:hAnsi="Times New Roman" w:cs="Times New Roman"/>
-          <w:kern w:val="0"/>
-          <w:lang w:val="en-US"/>
-          <w14:ligatures w14:val="none"/>
-        </w:rPr>
-        <w:t>These processes</w:t>
-      </w:r>
-      <w:r>
-        <w:rPr>
-          <w:rFonts w:ascii="Times New Roman" w:eastAsia="Times New Roman" w:hAnsi="Times New Roman" w:cs="Times New Roman"/>
-          <w:kern w:val="0"/>
-          <w:lang w:val="en-US"/>
-          <w14:ligatures w14:val="none"/>
-        </w:rPr>
-        <w:t xml:space="preserve"> allow commanders to test </w:t>
+        <w:t xml:space="preserve">Iterative cycles of wargaming, experimentation, training and evaluation generate evidence, reduce uncertainty, inform strategic decisions and refine concepts and capabilities. These processes allow commanders to test </w:t>
       </w:r>
       <w:proofErr w:type="spellStart"/>
       <w:r>
@@ -3405,7 +3364,15 @@
           <w:rFonts w:ascii="Times New Roman" w:eastAsia="Aptos" w:hAnsi="Times New Roman" w:cs="Times New Roman"/>
           <w:lang w:val="en-US"/>
         </w:rPr>
-        <w:t>Practitioner testimony shows what happens when it does not: one participant described two Ukrainian drone teams jamming one another because they were not coordinated; neither could engage, and soldiers were killed.</w:t>
+        <w:t xml:space="preserve">Practitioner testimony shows what happens when it does not: one participant </w:t>
+      </w:r>
+      <w:r>
+        <w:rPr>
+          <w:rFonts w:ascii="Times New Roman" w:eastAsia="Aptos" w:hAnsi="Times New Roman" w:cs="Times New Roman"/>
+          <w:lang w:val="en-US"/>
+        </w:rPr>
+        <w:lastRenderedPageBreak/>
+        <w:t>described two Ukrainian drone teams jamming one another because they were not coordinated; neither could engage, and soldiers were killed.</w:t>
       </w:r>
       <w:r>
         <w:rPr>
@@ -3420,15 +3387,7 @@
           <w:rFonts w:ascii="Times New Roman" w:eastAsia="Aptos" w:hAnsi="Times New Roman" w:cs="Times New Roman"/>
           <w:lang w:val="en-US"/>
         </w:rPr>
-        <w:t xml:space="preserve"> This is Krepinevich’s argument in </w:t>
-      </w:r>
-      <w:r>
-        <w:rPr>
-          <w:rFonts w:ascii="Times New Roman" w:eastAsia="Aptos" w:hAnsi="Times New Roman" w:cs="Times New Roman"/>
-          <w:lang w:val="en-US"/>
-        </w:rPr>
-        <w:lastRenderedPageBreak/>
-        <w:t>contemporary form: technology becomes capability only when operational innovation and organisational adaptation keep pace.</w:t>
+        <w:t xml:space="preserve"> This is Krepinevich’s argument in contemporary form: technology becomes capability only when operational innovation and organisational adaptation keep pace.</w:t>
       </w:r>
       <w:r>
         <w:rPr>
@@ -3464,21 +3423,7 @@
           <w:rFonts w:ascii="Times New Roman" w:eastAsia="Aptos" w:hAnsi="Times New Roman" w:cs="Times New Roman"/>
           <w:lang w:val="en-US"/>
         </w:rPr>
-        <w:t xml:space="preserve">Validated concepts, tested doctrine and exercised capability can inform continued investment, while experimental lessons must </w:t>
-      </w:r>
-      <w:r>
-        <w:rPr>
-          <w:rFonts w:ascii="Times New Roman" w:eastAsia="Aptos" w:hAnsi="Times New Roman" w:cs="Times New Roman"/>
-          <w:lang w:val="en-US"/>
-        </w:rPr>
-        <w:t>inform and direct</w:t>
-      </w:r>
-      <w:r>
-        <w:rPr>
-          <w:rFonts w:ascii="Times New Roman" w:eastAsia="Aptos" w:hAnsi="Times New Roman" w:cs="Times New Roman"/>
-          <w:lang w:val="en-US"/>
-        </w:rPr>
-        <w:t xml:space="preserve"> doctrinal refinement, force structure and procurement.</w:t>
+        <w:t>Validated concepts, tested doctrine and exercised capability can inform continued investment, while experimental lessons must inform and direct doctrinal refinement, force structure and procurement.</w:t>
       </w:r>
       <w:r>
         <w:rPr>
@@ -3507,25 +3452,7 @@
           <w:lang w:val="en-US"/>
           <w14:ligatures w14:val="none"/>
         </w:rPr>
-        <w:t xml:space="preserve">The identification, integration and iterative maturation of </w:t>
-      </w:r>
-      <w:r>
-        <w:rPr>
-          <w:rFonts w:ascii="Times New Roman" w:eastAsia="Times New Roman" w:hAnsi="Times New Roman" w:cs="Times New Roman"/>
-          <w:kern w:val="0"/>
-          <w:lang w:val="en-US"/>
-          <w14:ligatures w14:val="none"/>
-        </w:rPr>
-        <w:t>enabling technologies</w:t>
-      </w:r>
-      <w:r>
-        <w:rPr>
-          <w:rFonts w:ascii="Times New Roman" w:eastAsia="Times New Roman" w:hAnsi="Times New Roman" w:cs="Times New Roman"/>
-          <w:kern w:val="0"/>
-          <w:lang w:val="en-US"/>
-          <w14:ligatures w14:val="none"/>
-        </w:rPr>
-        <w:t xml:space="preserve"> must proceed in parallel with doctrinal and organisational development to ensure technology remains aligned with ends and ways.  </w:t>
+        <w:t xml:space="preserve">The identification, integration and iterative maturation of enabling technologies must proceed in parallel with doctrinal and organisational development to ensure technology remains aligned with ends and ways.  </w:t>
       </w:r>
       <w:r>
         <w:rPr>
@@ -3700,36 +3627,34 @@
           <w:rFonts w:ascii="Times New Roman" w:hAnsi="Times New Roman" w:cs="Times New Roman"/>
           <w:lang w:val="en-US"/>
         </w:rPr>
+        <w:t xml:space="preserve">. </w:t>
+      </w:r>
+      <w:r>
+        <w:rPr>
+          <w:rFonts w:ascii="Times New Roman" w:hAnsi="Times New Roman" w:cs="Times New Roman"/>
+          <w:lang w:val="en-US"/>
+        </w:rPr>
+        <w:lastRenderedPageBreak/>
+        <w:t>Partnerships — such as the existing National Maritime College of Ireland</w:t>
+      </w:r>
+      <w:r>
+        <w:rPr>
+          <w:rFonts w:ascii="Times New Roman" w:eastAsia="Times New Roman" w:hAnsi="Times New Roman" w:cs="Times New Roman"/>
+          <w:kern w:val="0"/>
+          <w:vertAlign w:val="superscript"/>
+          <w:lang w:val="en-US"/>
+          <w14:ligatures w14:val="none"/>
+        </w:rPr>
+        <w:footnoteReference w:id="65"/>
+      </w:r>
+      <w:r>
+        <w:rPr>
+          <w:rFonts w:ascii="Times New Roman" w:eastAsia="Times New Roman" w:hAnsi="Times New Roman" w:cs="Times New Roman"/>
+          <w:kern w:val="0"/>
+          <w:lang w:val="en-US"/>
+          <w14:ligatures w14:val="none"/>
+        </w:rPr>
         <w:t>. Partnerships — such as the existing National Maritime College of Ireland</w:t>
-      </w:r>
-      <w:r>
-        <w:rPr>
-          <w:rFonts w:ascii="Times New Roman" w:eastAsia="Times New Roman" w:hAnsi="Times New Roman" w:cs="Times New Roman"/>
-          <w:kern w:val="0"/>
-          <w:vertAlign w:val="superscript"/>
-          <w:lang w:val="en-US"/>
-          <w14:ligatures w14:val="none"/>
-        </w:rPr>
-        <w:footnoteReference w:id="65"/>
-      </w:r>
-      <w:r>
-        <w:rPr>
-          <w:rFonts w:ascii="Times New Roman" w:eastAsia="Times New Roman" w:hAnsi="Times New Roman" w:cs="Times New Roman"/>
-          <w:kern w:val="0"/>
-          <w:lang w:val="en-US"/>
-          <w14:ligatures w14:val="none"/>
-        </w:rPr>
-        <w:t xml:space="preserve">. Partnerships — </w:t>
-      </w:r>
-      <w:r>
-        <w:rPr>
-          <w:rFonts w:ascii="Times New Roman" w:eastAsia="Times New Roman" w:hAnsi="Times New Roman" w:cs="Times New Roman"/>
-          <w:kern w:val="0"/>
-          <w:lang w:val="en-US"/>
-          <w14:ligatures w14:val="none"/>
-        </w:rPr>
-        <w:lastRenderedPageBreak/>
-        <w:t>such as the existing National Maritime College of Ireland</w:t>
       </w:r>
       <w:r>
         <w:rPr>
@@ -3915,16 +3840,7 @@
           <w:lang w:val="en-US"/>
           <w14:ligatures w14:val="none"/>
         </w:rPr>
-        <w:t xml:space="preserve"> that defence innovation is inherently socio-technical, successful </w:t>
-      </w:r>
-      <w:r>
-        <w:rPr>
-          <w:rFonts w:ascii="Times New Roman" w:eastAsia="Times New Roman" w:hAnsi="Times New Roman" w:cs="Times New Roman"/>
-          <w:kern w:val="0"/>
-          <w:lang w:val="en-US"/>
-          <w14:ligatures w14:val="none"/>
-        </w:rPr>
-        <w:t xml:space="preserve">adaptation requires a multi-stakeholder approach </w:t>
+        <w:t xml:space="preserve"> that defence innovation is inherently socio-technical, successful adaptation requires a multi-stakeholder approach </w:t>
       </w:r>
       <w:r>
         <w:rPr>
@@ -3940,25 +3856,7 @@
           <w:lang w:val="en-US"/>
           <w14:ligatures w14:val="none"/>
         </w:rPr>
-        <w:t xml:space="preserve"> the contributions of government, the military, industry, academia and </w:t>
-      </w:r>
-      <w:r>
-        <w:rPr>
-          <w:rFonts w:ascii="Times New Roman" w:eastAsia="Times New Roman" w:hAnsi="Times New Roman" w:cs="Times New Roman"/>
-          <w:kern w:val="0"/>
-          <w:lang w:val="en-US"/>
-          <w14:ligatures w14:val="none"/>
-        </w:rPr>
-        <w:t>allied partners.</w:t>
-      </w:r>
-      <w:r>
-        <w:rPr>
-          <w:rFonts w:ascii="Times New Roman" w:eastAsia="Times New Roman" w:hAnsi="Times New Roman" w:cs="Times New Roman"/>
-          <w:kern w:val="0"/>
-          <w:lang w:val="en-US"/>
-          <w14:ligatures w14:val="none"/>
-        </w:rPr>
-        <w:t xml:space="preserve"> </w:t>
+        <w:t xml:space="preserve"> the contributions of government, the military, industry, academia and allied partners. </w:t>
       </w:r>
       <w:proofErr w:type="spellStart"/>
       <w:r>
@@ -3997,7 +3895,17 @@
           <w:lang w:val="en-US"/>
           <w14:ligatures w14:val="none"/>
         </w:rPr>
-        <w:t xml:space="preserve"> The relationship with industry must be complementary: The Department of Defence must provide certainty</w:t>
+        <w:t xml:space="preserve"> The relationship with industry must be complementary: The Department of </w:t>
+      </w:r>
+      <w:r>
+        <w:rPr>
+          <w:rFonts w:ascii="Times New Roman" w:eastAsia="Times New Roman" w:hAnsi="Times New Roman" w:cs="Times New Roman"/>
+          <w:kern w:val="0"/>
+          <w:lang w:val="en-US"/>
+          <w14:ligatures w14:val="none"/>
+        </w:rPr>
+        <w:lastRenderedPageBreak/>
+        <w:t>Defence must provide certainty</w:t>
       </w:r>
       <w:r>
         <w:rPr>
@@ -4056,7 +3964,6 @@
           <w:lang w:val="en-US"/>
           <w14:ligatures w14:val="none"/>
         </w:rPr>
-        <w:lastRenderedPageBreak/>
         <w:t xml:space="preserve">The Ordnance Corps’ relationship with REAMDA has progressed from life-extension of the HOBO robot to joint development and continuing support of the REACHER EOD robot. VRAI followed a comparable user-led model in simulation, developing the </w:t>
       </w:r>
       <w:proofErr w:type="spellStart"/>
@@ -4112,25 +4019,14 @@
         </w:rPr>
         <w:t xml:space="preserve"> </w:t>
       </w:r>
-      <w:proofErr w:type="gramStart"/>
-      <w:r>
-        <w:rPr>
-          <w:rFonts w:ascii="Times New Roman" w:eastAsia="Times New Roman" w:hAnsi="Times New Roman" w:cs="Times New Roman"/>
-          <w:kern w:val="0"/>
-          <w:lang w:val="en-US"/>
-          <w14:ligatures w14:val="none"/>
-        </w:rPr>
-        <w:t>Partnerships</w:t>
-      </w:r>
-      <w:proofErr w:type="gramEnd"/>
-      <w:r>
-        <w:rPr>
-          <w:rFonts w:ascii="Times New Roman" w:eastAsia="Times New Roman" w:hAnsi="Times New Roman" w:cs="Times New Roman"/>
-          <w:kern w:val="0"/>
-          <w:lang w:val="en-US"/>
-          <w14:ligatures w14:val="none"/>
-        </w:rPr>
-        <w:t xml:space="preserve"> with universities are well established. These relationships demonstrate the complementary model required: Defence defines and validates the operational problem; industry develops iteratively with end users; procurement and support sustain the resulting capability beyond the initial demonstration.</w:t>
+      <w:r>
+        <w:rPr>
+          <w:rFonts w:ascii="Times New Roman" w:eastAsia="Times New Roman" w:hAnsi="Times New Roman" w:cs="Times New Roman"/>
+          <w:kern w:val="0"/>
+          <w:lang w:val="en-US"/>
+          <w14:ligatures w14:val="none"/>
+        </w:rPr>
+        <w:t>Partnerships with universities are well established. These relationships demonstrate the complementary model required: Defence defines and validates the operational problem; industry develops iteratively with end users; procurement and support sustain the resulting capability beyond the initial demonstration.</w:t>
       </w:r>
     </w:p>
     <w:p>
@@ -4186,6 +4082,15 @@
         </w:rPr>
         <w:t xml:space="preserve"> </w:t>
       </w:r>
+      <w:r>
+        <w:rPr>
+          <w:rFonts w:ascii="Times New Roman" w:eastAsia="Times New Roman" w:hAnsi="Times New Roman" w:cs="Times New Roman"/>
+          <w:kern w:val="0"/>
+          <w:lang w:val="en-US"/>
+          <w14:ligatures w14:val="none"/>
+        </w:rPr>
+        <w:t xml:space="preserve">While acknowledging the importance of </w:t>
+      </w:r>
       <w:proofErr w:type="gramStart"/>
       <w:r>
         <w:rPr>
@@ -4194,7 +4099,7 @@
           <w:lang w:val="en-US"/>
           <w14:ligatures w14:val="none"/>
         </w:rPr>
-        <w:t>While</w:t>
+        <w:t>each</w:t>
       </w:r>
       <w:proofErr w:type="gramEnd"/>
       <w:r>
@@ -4204,36 +4109,7 @@
           <w:lang w:val="en-US"/>
           <w14:ligatures w14:val="none"/>
         </w:rPr>
-        <w:t xml:space="preserve"> acknowledging the importance of </w:t>
-      </w:r>
-      <w:proofErr w:type="gramStart"/>
-      <w:r>
-        <w:rPr>
-          <w:rFonts w:ascii="Times New Roman" w:eastAsia="Times New Roman" w:hAnsi="Times New Roman" w:cs="Times New Roman"/>
-          <w:kern w:val="0"/>
-          <w:lang w:val="en-US"/>
-          <w14:ligatures w14:val="none"/>
-        </w:rPr>
-        <w:t>each</w:t>
-      </w:r>
-      <w:proofErr w:type="gramEnd"/>
-      <w:r>
-        <w:rPr>
-          <w:rFonts w:ascii="Times New Roman" w:eastAsia="Times New Roman" w:hAnsi="Times New Roman" w:cs="Times New Roman"/>
-          <w:kern w:val="0"/>
-          <w:lang w:val="en-US"/>
-          <w14:ligatures w14:val="none"/>
-        </w:rPr>
-        <w:t xml:space="preserve"> the component parts of the comprehensive process above, political acceptance is its binding constraint.</w:t>
-      </w:r>
-      <w:r>
-        <w:rPr>
-          <w:rFonts w:ascii="Times New Roman" w:eastAsia="Times New Roman" w:hAnsi="Times New Roman" w:cs="Times New Roman"/>
-          <w:kern w:val="0"/>
-          <w:lang w:val="en-US"/>
-          <w14:ligatures w14:val="none"/>
-        </w:rPr>
-        <w:t xml:space="preserve"> It </w:t>
+        <w:t xml:space="preserve"> the component parts of the comprehensive process above, political acceptance is its binding constraint. It </w:t>
       </w:r>
       <w:proofErr w:type="spellStart"/>
       <w:r>
@@ -4253,43 +4129,7 @@
           <w:lang w:val="en-US"/>
           <w14:ligatures w14:val="none"/>
         </w:rPr>
-        <w:t xml:space="preserve"> and drives policy, sustains investment and gives doctrine, procurement and industrial engagement its scope and direction. </w:t>
-      </w:r>
-      <w:r>
-        <w:rPr>
-          <w:rFonts w:ascii="Times New Roman" w:eastAsia="Times New Roman" w:hAnsi="Times New Roman" w:cs="Times New Roman"/>
-          <w:kern w:val="0"/>
-          <w:lang w:val="en-US"/>
-          <w14:ligatures w14:val="none"/>
-        </w:rPr>
-        <w:t>Without it,</w:t>
-      </w:r>
-      <w:r>
-        <w:rPr>
-          <w:rFonts w:ascii="Times New Roman" w:eastAsia="Times New Roman" w:hAnsi="Times New Roman" w:cs="Times New Roman"/>
-          <w:kern w:val="0"/>
-          <w:lang w:val="en-US"/>
-          <w14:ligatures w14:val="none"/>
-        </w:rPr>
-        <w:t xml:space="preserve"> any efforts to implement tactical adaptions into </w:t>
-      </w:r>
-      <w:r>
-        <w:rPr>
-          <w:rFonts w:ascii="Times New Roman" w:eastAsia="Times New Roman" w:hAnsi="Times New Roman" w:cs="Times New Roman"/>
-          <w:kern w:val="0"/>
-          <w:lang w:val="en-US"/>
-          <w14:ligatures w14:val="none"/>
-        </w:rPr>
-        <w:t>strategy or policy will fail.</w:t>
-      </w:r>
-      <w:r>
-        <w:rPr>
-          <w:rFonts w:ascii="Times New Roman" w:eastAsia="Times New Roman" w:hAnsi="Times New Roman" w:cs="Times New Roman"/>
-          <w:kern w:val="0"/>
-          <w:lang w:val="en-US"/>
-          <w14:ligatures w14:val="none"/>
-        </w:rPr>
-        <w:t xml:space="preserve"> </w:t>
+        <w:t xml:space="preserve"> and drives policy, sustains investment and gives doctrine, procurement and industrial engagement its scope and direction. Without it, any efforts to implement tactical adaptions into strategy or policy will fail. </w:t>
       </w:r>
     </w:p>
     <w:p>
@@ -4329,7 +4169,17 @@
           <w:lang w:val="en-US"/>
           <w14:ligatures w14:val="none"/>
         </w:rPr>
-        <w:t xml:space="preserve"> Murphy's account of the Triple Lock's origins reinforces the point from a different angle: the mechanism was not designed as a safeguard of neutrality at all, but as legislative machinery built in 1960 to let Ireland meet its UN Charter obligations — the neutrality-safeguard narrative attached to it came later.</w:t>
+        <w:t xml:space="preserve"> Murphy's account of the Triple Lock's origins reinforces the point from a different angle: the mechanism </w:t>
+      </w:r>
+      <w:r>
+        <w:rPr>
+          <w:rFonts w:ascii="Times New Roman" w:eastAsia="Times New Roman" w:hAnsi="Times New Roman" w:cs="Times New Roman"/>
+          <w:kern w:val="0"/>
+          <w:lang w:val="en-US"/>
+          <w14:ligatures w14:val="none"/>
+        </w:rPr>
+        <w:lastRenderedPageBreak/>
+        <w:t>was not designed as a safeguard of neutrality at all, but as legislative machinery built in 1960 to let Ireland meet its UN Charter obligations — the neutrality-safeguard narrative attached to it came later.</w:t>
       </w:r>
       <w:r>
         <w:rPr>
@@ -4368,17 +4218,7 @@
           <w:lang w:val="en-US"/>
           <w14:ligatures w14:val="none"/>
         </w:rPr>
-        <w:t xml:space="preserve"> integration, the harder constraint sits alongside that non-alignment policy rather than within it: political acceptance of particular capabilities, loitering munitions </w:t>
-      </w:r>
-      <w:r>
-        <w:rPr>
-          <w:rFonts w:ascii="Times New Roman" w:eastAsia="Times New Roman" w:hAnsi="Times New Roman" w:cs="Times New Roman"/>
-          <w:kern w:val="0"/>
-          <w:lang w:val="en-US"/>
-          <w14:ligatures w14:val="none"/>
-        </w:rPr>
-        <w:lastRenderedPageBreak/>
-        <w:t xml:space="preserve">above all, where a distinct pacifist current — general, utilitarian or selective, in </w:t>
+        <w:t xml:space="preserve"> integration, the harder constraint sits alongside that non-alignment policy rather than within it: political acceptance of particular capabilities, loitering munitions above all, where a distinct pacifist current — general, utilitarian or selective, in </w:t>
       </w:r>
       <w:proofErr w:type="spellStart"/>
       <w:r>
@@ -4455,10 +4295,8 @@
         <w:spacing w:after="120" w:line="360" w:lineRule="auto"/>
         <w:jc w:val="both"/>
         <w:rPr>
-          <w:rFonts w:ascii="Times New Roman" w:eastAsia="Times New Roman" w:hAnsi="Times New Roman" w:cs="Times New Roman"/>
-          <w:kern w:val="0"/>
-          <w:lang w:val="en-US"/>
-          <w14:ligatures w14:val="none"/>
+          <w:rFonts w:ascii="Times New Roman" w:hAnsi="Times New Roman" w:cs="Times New Roman"/>
+          <w:lang w:val="en-US"/>
         </w:rPr>
       </w:pPr>
       <w:r>
@@ -4536,7 +4374,26 @@
           <w:rFonts w:ascii="Times New Roman" w:hAnsi="Times New Roman" w:cs="Times New Roman"/>
           <w:lang w:val="en-US"/>
         </w:rPr>
-        <w:t xml:space="preserve"> Decision-making architecture matters as much as the capability itself. Nor does the mere presence of a human on the loop settle the issue: control is meaningful only where that person has sufficient information, time and practical ability to interrupt the engagement. Ireland has told the UN directly that “human beings must exert full control over lethal weapons systems to ensure compliance with international law — in particular international humanitarian law — </w:t>
+        <w:t xml:space="preserve"> </w:t>
+      </w:r>
+    </w:p>
+    <w:p>
+      <w:pPr>
+        <w:spacing w:after="120" w:line="360" w:lineRule="auto"/>
+        <w:jc w:val="both"/>
+        <w:rPr>
+          <w:rFonts w:ascii="Times New Roman" w:eastAsia="Times New Roman" w:hAnsi="Times New Roman" w:cs="Times New Roman"/>
+          <w:kern w:val="0"/>
+          <w:lang w:val="en-US"/>
+          <w14:ligatures w14:val="none"/>
+        </w:rPr>
+      </w:pPr>
+      <w:r>
+        <w:rPr>
+          <w:rFonts w:ascii="Times New Roman" w:hAnsi="Times New Roman" w:cs="Times New Roman"/>
+          <w:lang w:val="en-US"/>
+        </w:rPr>
+        <w:t xml:space="preserve">Decision-making architecture matters as much as the capability itself. Nor does the mere presence of a human on the loop settle the issue: control is meaningful only where that person has sufficient information, time and practical ability to interrupt the engagement. Ireland has </w:t>
       </w:r>
       <w:r>
         <w:rPr>
@@ -4544,7 +4401,7 @@
           <w:lang w:val="en-US"/>
         </w:rPr>
         <w:lastRenderedPageBreak/>
-        <w:t>and due consideration for ethics,” a position it has actively advanced at the CCW since 2013.</w:t>
+        <w:t>told the UN directly that “human beings must exert full control over lethal weapons systems to ensure compliance with international law — in particular international humanitarian law — and due consideration for ethics,” a position it has actively advanced at the CCW since 2013.</w:t>
       </w:r>
       <w:r>
         <w:rPr>
@@ -4614,8 +4471,40 @@
           <w:lang w:val="en-US"/>
           <w14:ligatures w14:val="none"/>
         </w:rPr>
-        <w:t xml:space="preserve"> The unease which loitering munitions can provoke is frequently mis-targeted for exactly this reason: it belongs to systems where the decision to kill passes from a human to a machine, not to remote operation as such.[</w:t>
-      </w:r>
+        <w:t xml:space="preserve"> </w:t>
+      </w:r>
+    </w:p>
+    <w:p>
+      <w:pPr>
+        <w:spacing w:after="120" w:line="360" w:lineRule="auto"/>
+        <w:jc w:val="both"/>
+        <w:rPr>
+          <w:rFonts w:ascii="Times New Roman" w:eastAsia="Times New Roman" w:hAnsi="Times New Roman" w:cs="Times New Roman"/>
+          <w:kern w:val="0"/>
+          <w:lang w:val="en-US"/>
+          <w14:ligatures w14:val="none"/>
+        </w:rPr>
+      </w:pPr>
+      <w:r>
+        <w:rPr>
+          <w:rFonts w:ascii="Times New Roman" w:eastAsia="Times New Roman" w:hAnsi="Times New Roman" w:cs="Times New Roman"/>
+          <w:kern w:val="0"/>
+          <w:lang w:val="en-US"/>
+          <w14:ligatures w14:val="none"/>
+        </w:rPr>
+        <w:t xml:space="preserve">The unease which loitering munitions can provoke is frequently mis-targeted for exactly this reason: it belongs to systems where the decision to kill passes from a human to a machine, not to remote operation as </w:t>
+      </w:r>
+      <w:proofErr w:type="gramStart"/>
+      <w:r>
+        <w:rPr>
+          <w:rFonts w:ascii="Times New Roman" w:eastAsia="Times New Roman" w:hAnsi="Times New Roman" w:cs="Times New Roman"/>
+          <w:kern w:val="0"/>
+          <w:lang w:val="en-US"/>
+          <w14:ligatures w14:val="none"/>
+        </w:rPr>
+        <w:t>such.[</w:t>
+      </w:r>
+      <w:proofErr w:type="gramEnd"/>
       <w:r>
         <w:rPr>
           <w:rFonts w:ascii="Times New Roman" w:eastAsia="Times New Roman" w:hAnsi="Times New Roman" w:cs="Times New Roman"/>
@@ -4815,7 +4704,7 @@
           <w:rFonts w:ascii="Times New Roman" w:hAnsi="Times New Roman" w:cs="Times New Roman"/>
           <w:lang w:val="en-US"/>
         </w:rPr>
-        <w:t xml:space="preserve"> earlier. A materiel-heavy profile — equipment acquired without corresponding doctrine, </w:t>
+        <w:t xml:space="preserve"> </w:t>
       </w:r>
       <w:r>
         <w:rPr>
@@ -4823,7 +4712,7 @@
           <w:lang w:val="en-US"/>
         </w:rPr>
         <w:lastRenderedPageBreak/>
-        <w:t>organisation, training, personnel, leadership and sustainment — would show that Ireland had purchased technology without building capability. Equipment remaining in stores rather than operating in trained units is the clearest evidence that implementation has failed and that confidence in the concept has been lost.</w:t>
+        <w:t>earlier. A materiel-heavy profile — equipment acquired without corresponding doctrine, organisation, training, personnel, leadership and sustainment — would show that Ireland had purchased technology without building capability. Equipment remaining in stores rather than operating in trained units is the clearest evidence that implementation has failed and that confidence in the concept has been lost.</w:t>
       </w:r>
     </w:p>
     <w:p>
@@ -4919,8 +4808,7 @@
       <w:pPr>
         <w:spacing w:line="360" w:lineRule="auto"/>
         <w:rPr>
-          <w:rFonts w:ascii="Times New Roman" w:eastAsiaTheme="majorEastAsia" w:hAnsi="Times New Roman" w:cs="Times New Roman"/>
-          <w:color w:val="0F4761" w:themeColor="accent1" w:themeShade="BF"/>
+          <w:rFonts w:ascii="Times New Roman" w:hAnsi="Times New Roman" w:cs="Times New Roman"/>
         </w:rPr>
       </w:pPr>
       <w:r>
@@ -4996,6 +4884,62 @@
         <w:rPr>
           <w:rFonts w:ascii="Times New Roman" w:hAnsi="Times New Roman" w:cs="Times New Roman"/>
         </w:rPr>
+        <w:t xml:space="preserve">That redesign becomes credible policy only if political leaders accept it first. Political acceptance is the binding constraint on everything that </w:t>
+      </w:r>
+      <w:proofErr w:type="gramStart"/>
+      <w:r>
+        <w:rPr>
+          <w:rFonts w:ascii="Times New Roman" w:hAnsi="Times New Roman" w:cs="Times New Roman"/>
+        </w:rPr>
+        <w:t>follows:</w:t>
+      </w:r>
+      <w:proofErr w:type="gramEnd"/>
+      <w:r>
+        <w:rPr>
+          <w:rFonts w:ascii="Times New Roman" w:hAnsi="Times New Roman" w:cs="Times New Roman"/>
+        </w:rPr>
+        <w:t xml:space="preserve"> it authorises the doctrine, funds the institutionalisation and sets the industrial demand signal. For Ireland, that acceptance faces two specific tests. Neutrality, properly understood as non-alignment rather than pacifism, does not itself bar </w:t>
+      </w:r>
+      <w:proofErr w:type="spellStart"/>
+      <w:r>
+        <w:rPr>
+          <w:rFonts w:ascii="Times New Roman" w:hAnsi="Times New Roman" w:cs="Times New Roman"/>
+        </w:rPr>
+        <w:t>UxS</w:t>
+      </w:r>
+      <w:proofErr w:type="spellEnd"/>
+      <w:r>
+        <w:rPr>
+          <w:rFonts w:ascii="Times New Roman" w:hAnsi="Times New Roman" w:cs="Times New Roman"/>
+        </w:rPr>
+        <w:t xml:space="preserve">-enabled defence — but a distinct pacifist current within Irish politics may resist </w:t>
+      </w:r>
+      <w:proofErr w:type="gramStart"/>
+      <w:r>
+        <w:rPr>
+          <w:rFonts w:ascii="Times New Roman" w:hAnsi="Times New Roman" w:cs="Times New Roman"/>
+        </w:rPr>
+        <w:t>particular capabilities</w:t>
+      </w:r>
+      <w:proofErr w:type="gramEnd"/>
+      <w:r>
+        <w:rPr>
+          <w:rFonts w:ascii="Times New Roman" w:hAnsi="Times New Roman" w:cs="Times New Roman"/>
+        </w:rPr>
+        <w:t>, loitering munitions above all. Autonomy is the second test: Ireland's own position, that human control must be exercised over target selection and engagement, gives a clear standard by which any capability can be judged and defended.</w:t>
+      </w:r>
+    </w:p>
+    <w:p>
+      <w:pPr>
+        <w:spacing w:line="360" w:lineRule="auto"/>
+        <w:rPr>
+          <w:rFonts w:ascii="Times New Roman" w:hAnsi="Times New Roman" w:cs="Times New Roman"/>
+        </w:rPr>
+      </w:pPr>
+      <w:r>
+        <w:rPr>
+          <w:rFonts w:ascii="Times New Roman" w:hAnsi="Times New Roman" w:cs="Times New Roman"/>
+        </w:rPr>
         <w:t xml:space="preserve">That tactical redesign becomes policy only through four steps. Recognition that </w:t>
       </w:r>
       <w:proofErr w:type="spellStart"/>
@@ -5098,7 +5042,25 @@
         <w:br w:type="page"/>
       </w:r>
     </w:p>
-    <w:p/>
+    <w:p>
+      <w:pPr>
+        <w:pStyle w:val="Heading1"/>
+      </w:pPr>
+      <w:r>
+        <w:lastRenderedPageBreak/>
+        <w:t>About the Authors</w:t>
+      </w:r>
+    </w:p>
+    <w:p>
+      <w:r>
+        <w:t>Eoin O’Brien is an Infantry Officer currently working in Strategic Planning. His academic background includes commerce, leadership and defence studies. His recent research focuses on defence standardisation and interoperability.</w:t>
+      </w:r>
+    </w:p>
+    <w:p>
+      <w:r>
+        <w:t>Adam Beatty is an Ordnance Engineer. His academic background includes physics, weapons, ordnance and explosives engineering, and leadership, management and defence studies. His recent research focuses on uncrewed systems and the adaptation of land forces. </w:t>
+      </w:r>
+    </w:p>
     <w:sectPr>
       <w:pgSz w:w="11906" w:h="16838"/>
       <w:pgMar w:top="1440" w:right="1440" w:bottom="1440" w:left="1440" w:header="708" w:footer="708" w:gutter="0"/>
@@ -7828,7 +7790,7 @@
   <w:footnote w:id="28">
     <w:p>
       <w:pPr>
-        <w:spacing w:after="20" w:line="180" w:lineRule="auto"/>
+        <w:spacing w:after="0" w:line="240" w:lineRule="auto"/>
         <w:rPr>
           <w:rFonts w:ascii="Times New Roman" w:hAnsi="Times New Roman" w:cs="Times New Roman"/>
           <w:sz w:val="16"/>
@@ -7875,7 +7837,7 @@
   <w:footnote w:id="29">
     <w:p>
       <w:pPr>
-        <w:spacing w:after="20" w:line="180" w:lineRule="auto"/>
+        <w:spacing w:after="0" w:line="240" w:lineRule="auto"/>
         <w:rPr>
           <w:rFonts w:ascii="Times New Roman" w:hAnsi="Times New Roman" w:cs="Times New Roman"/>
           <w:sz w:val="16"/>
@@ -7976,7 +7938,7 @@
   <w:footnote w:id="30">
     <w:p>
       <w:pPr>
-        <w:spacing w:after="20" w:line="180" w:lineRule="auto"/>
+        <w:spacing w:after="0" w:line="240" w:lineRule="auto"/>
         <w:rPr>
           <w:rFonts w:ascii="Times New Roman" w:hAnsi="Times New Roman" w:cs="Times New Roman"/>
           <w:sz w:val="16"/>
@@ -8144,7 +8106,7 @@
   <w:footnote w:id="32">
     <w:p>
       <w:pPr>
-        <w:spacing w:after="20" w:line="180" w:lineRule="auto"/>
+        <w:spacing w:after="0" w:line="240" w:lineRule="auto"/>
         <w:rPr>
           <w:rFonts w:ascii="Times New Roman" w:hAnsi="Times New Roman" w:cs="Times New Roman"/>
           <w:sz w:val="16"/>
@@ -8229,7 +8191,7 @@
   <w:footnote w:id="33">
     <w:p>
       <w:pPr>
-        <w:spacing w:after="20" w:line="180" w:lineRule="auto"/>
+        <w:spacing w:after="0" w:line="240" w:lineRule="auto"/>
         <w:rPr>
           <w:rFonts w:ascii="Times New Roman" w:hAnsi="Times New Roman" w:cs="Times New Roman"/>
           <w:sz w:val="16"/>
@@ -8295,7 +8257,7 @@
   <w:footnote w:id="34">
     <w:p>
       <w:pPr>
-        <w:spacing w:after="20" w:line="180" w:lineRule="auto"/>
+        <w:spacing w:after="0" w:line="240" w:lineRule="auto"/>
         <w:rPr>
           <w:rFonts w:ascii="Times New Roman" w:hAnsi="Times New Roman" w:cs="Times New Roman"/>
           <w:sz w:val="16"/>
@@ -8342,7 +8304,7 @@
   <w:footnote w:id="35">
     <w:p>
       <w:pPr>
-        <w:spacing w:after="20" w:line="180" w:lineRule="auto"/>
+        <w:spacing w:after="0" w:line="240" w:lineRule="auto"/>
         <w:rPr>
           <w:rFonts w:ascii="Times New Roman" w:hAnsi="Times New Roman" w:cs="Times New Roman"/>
           <w:sz w:val="16"/>
@@ -8389,7 +8351,7 @@
   <w:footnote w:id="36">
     <w:p>
       <w:pPr>
-        <w:spacing w:after="20" w:line="180" w:lineRule="auto"/>
+        <w:spacing w:after="0" w:line="240" w:lineRule="auto"/>
         <w:rPr>
           <w:rFonts w:ascii="Times New Roman" w:hAnsi="Times New Roman" w:cs="Times New Roman"/>
           <w:sz w:val="16"/>
@@ -8436,7 +8398,7 @@
   <w:footnote w:id="37">
     <w:p>
       <w:pPr>
-        <w:spacing w:after="20" w:line="180" w:lineRule="auto"/>
+        <w:spacing w:after="0" w:line="240" w:lineRule="auto"/>
         <w:rPr>
           <w:rFonts w:ascii="Times New Roman" w:hAnsi="Times New Roman" w:cs="Times New Roman"/>
           <w:sz w:val="16"/>
@@ -8501,7 +8463,7 @@
   <w:footnote w:id="38">
     <w:p>
       <w:pPr>
-        <w:spacing w:after="20" w:line="180" w:lineRule="auto"/>
+        <w:spacing w:after="0" w:line="240" w:lineRule="auto"/>
         <w:rPr>
           <w:rFonts w:ascii="Times New Roman" w:hAnsi="Times New Roman" w:cs="Times New Roman"/>
           <w:sz w:val="16"/>
@@ -8566,7 +8528,7 @@
   <w:footnote w:id="39">
     <w:p>
       <w:pPr>
-        <w:spacing w:after="20" w:line="180" w:lineRule="auto"/>
+        <w:spacing w:after="0" w:line="240" w:lineRule="auto"/>
         <w:rPr>
           <w:rFonts w:ascii="Times New Roman" w:hAnsi="Times New Roman" w:cs="Times New Roman"/>
           <w:sz w:val="16"/>
@@ -8613,7 +8575,7 @@
   <w:footnote w:id="40">
     <w:p>
       <w:pPr>
-        <w:spacing w:after="20" w:line="180" w:lineRule="auto"/>
+        <w:spacing w:after="0" w:line="240" w:lineRule="auto"/>
         <w:rPr>
           <w:rFonts w:ascii="Times New Roman" w:hAnsi="Times New Roman" w:cs="Times New Roman"/>
           <w:sz w:val="16"/>
@@ -8678,7 +8640,7 @@
   <w:footnote w:id="41">
     <w:p>
       <w:pPr>
-        <w:spacing w:after="20" w:line="180" w:lineRule="auto"/>
+        <w:spacing w:after="0" w:line="240" w:lineRule="auto"/>
         <w:rPr>
           <w:rFonts w:ascii="Times New Roman" w:hAnsi="Times New Roman" w:cs="Times New Roman"/>
           <w:sz w:val="16"/>
@@ -8725,7 +8687,7 @@
   <w:footnote w:id="42">
     <w:p>
       <w:pPr>
-        <w:spacing w:after="20" w:line="180" w:lineRule="auto"/>
+        <w:spacing w:after="0" w:line="240" w:lineRule="auto"/>
         <w:rPr>
           <w:rFonts w:ascii="Times New Roman" w:hAnsi="Times New Roman" w:cs="Times New Roman"/>
           <w:sz w:val="16"/>
@@ -8826,7 +8788,7 @@
   <w:footnote w:id="43">
     <w:p>
       <w:pPr>
-        <w:spacing w:after="20" w:line="180" w:lineRule="auto"/>
+        <w:spacing w:after="0" w:line="240" w:lineRule="auto"/>
         <w:rPr>
           <w:rFonts w:ascii="Times New Roman" w:hAnsi="Times New Roman" w:cs="Times New Roman"/>
           <w:sz w:val="16"/>
@@ -8994,7 +8956,7 @@
   <w:footnote w:id="45">
     <w:p>
       <w:pPr>
-        <w:spacing w:after="20" w:line="180" w:lineRule="auto"/>
+        <w:spacing w:after="0" w:line="240" w:lineRule="auto"/>
         <w:rPr>
           <w:rFonts w:ascii="Times New Roman" w:hAnsi="Times New Roman" w:cs="Times New Roman"/>
           <w:sz w:val="16"/>
@@ -9079,7 +9041,7 @@
   <w:footnote w:id="46">
     <w:p>
       <w:pPr>
-        <w:spacing w:after="20" w:line="180" w:lineRule="auto"/>
+        <w:spacing w:after="0" w:line="240" w:lineRule="auto"/>
         <w:rPr>
           <w:rFonts w:ascii="Times New Roman" w:hAnsi="Times New Roman" w:cs="Times New Roman"/>
           <w:sz w:val="16"/>
@@ -9145,7 +9107,7 @@
   <w:footnote w:id="47">
     <w:p>
       <w:pPr>
-        <w:spacing w:after="20" w:line="180" w:lineRule="auto"/>
+        <w:spacing w:after="0" w:line="240" w:lineRule="auto"/>
         <w:rPr>
           <w:rFonts w:ascii="Times New Roman" w:hAnsi="Times New Roman" w:cs="Times New Roman"/>
           <w:sz w:val="16"/>
@@ -9192,7 +9154,7 @@
   <w:footnote w:id="48">
     <w:p>
       <w:pPr>
-        <w:spacing w:after="20" w:line="180" w:lineRule="auto"/>
+        <w:spacing w:after="0" w:line="240" w:lineRule="auto"/>
         <w:rPr>
           <w:rFonts w:ascii="Times New Roman" w:hAnsi="Times New Roman" w:cs="Times New Roman"/>
           <w:sz w:val="16"/>
@@ -9239,7 +9201,7 @@
   <w:footnote w:id="49">
     <w:p>
       <w:pPr>
-        <w:spacing w:after="20" w:line="180" w:lineRule="auto"/>
+        <w:spacing w:after="0" w:line="240" w:lineRule="auto"/>
         <w:rPr>
           <w:rFonts w:ascii="Times New Roman" w:hAnsi="Times New Roman" w:cs="Times New Roman"/>
           <w:sz w:val="16"/>
@@ -9286,7 +9248,7 @@
   <w:footnote w:id="50">
     <w:p>
       <w:pPr>
-        <w:spacing w:after="20" w:line="180" w:lineRule="auto"/>
+        <w:spacing w:after="0" w:line="240" w:lineRule="auto"/>
         <w:rPr>
           <w:rFonts w:ascii="Times New Roman" w:hAnsi="Times New Roman" w:cs="Times New Roman"/>
           <w:sz w:val="16"/>
@@ -9351,7 +9313,7 @@
   <w:footnote w:id="51">
     <w:p>
       <w:pPr>
-        <w:spacing w:after="20" w:line="180" w:lineRule="auto"/>
+        <w:spacing w:after="0" w:line="240" w:lineRule="auto"/>
         <w:rPr>
           <w:rFonts w:ascii="Times New Roman" w:hAnsi="Times New Roman" w:cs="Times New Roman"/>
           <w:sz w:val="16"/>
@@ -9416,7 +9378,7 @@
   <w:footnote w:id="52">
     <w:p>
       <w:pPr>
-        <w:spacing w:after="20" w:line="180" w:lineRule="auto"/>
+        <w:spacing w:after="0" w:line="240" w:lineRule="auto"/>
         <w:rPr>
           <w:rFonts w:ascii="Times New Roman" w:hAnsi="Times New Roman" w:cs="Times New Roman"/>
           <w:sz w:val="16"/>
@@ -9463,7 +9425,7 @@
   <w:footnote w:id="53">
     <w:p>
       <w:pPr>
-        <w:spacing w:after="20" w:line="180" w:lineRule="auto"/>
+        <w:spacing w:after="0" w:line="240" w:lineRule="auto"/>
         <w:rPr>
           <w:rFonts w:ascii="Times New Roman" w:hAnsi="Times New Roman" w:cs="Times New Roman"/>
           <w:sz w:val="16"/>
@@ -9528,7 +9490,7 @@
   <w:footnote w:id="54">
     <w:p>
       <w:pPr>
-        <w:spacing w:after="20" w:line="180" w:lineRule="auto"/>
+        <w:spacing w:after="0" w:line="240" w:lineRule="auto"/>
         <w:rPr>
           <w:rFonts w:ascii="Times New Roman" w:hAnsi="Times New Roman" w:cs="Times New Roman"/>
           <w:sz w:val="16"/>
@@ -9575,7 +9537,7 @@
   <w:footnote w:id="55">
     <w:p>
       <w:pPr>
-        <w:spacing w:after="20" w:line="180" w:lineRule="auto"/>
+        <w:spacing w:after="0" w:line="240" w:lineRule="auto"/>
         <w:rPr>
           <w:rFonts w:ascii="Times New Roman" w:hAnsi="Times New Roman" w:cs="Times New Roman"/>
           <w:sz w:val="16"/>
@@ -9622,7 +9584,7 @@
   <w:footnote w:id="56">
     <w:p>
       <w:pPr>
-        <w:spacing w:after="20" w:line="180" w:lineRule="auto"/>
+        <w:spacing w:after="0" w:line="240" w:lineRule="auto"/>
         <w:rPr>
           <w:rFonts w:ascii="Times New Roman" w:hAnsi="Times New Roman" w:cs="Times New Roman"/>
           <w:sz w:val="16"/>
@@ -9651,7 +9613,7 @@
   <w:footnote w:id="57">
     <w:p>
       <w:pPr>
-        <w:spacing w:after="20" w:line="180" w:lineRule="auto"/>
+        <w:spacing w:after="0" w:line="240" w:lineRule="auto"/>
         <w:rPr>
           <w:rFonts w:ascii="Times New Roman" w:hAnsi="Times New Roman" w:cs="Times New Roman"/>
           <w:sz w:val="16"/>
@@ -9680,7 +9642,7 @@
   <w:footnote w:id="58">
     <w:p>
       <w:pPr>
-        <w:spacing w:after="20" w:line="180" w:lineRule="auto"/>
+        <w:spacing w:after="0" w:line="240" w:lineRule="auto"/>
         <w:rPr>
           <w:rFonts w:ascii="Times New Roman" w:hAnsi="Times New Roman" w:cs="Times New Roman"/>
           <w:sz w:val="16"/>
@@ -9727,7 +9689,7 @@
   <w:footnote w:id="59">
     <w:p>
       <w:pPr>
-        <w:spacing w:after="20" w:line="180" w:lineRule="auto"/>
+        <w:spacing w:after="0" w:line="240" w:lineRule="auto"/>
         <w:rPr>
           <w:rFonts w:ascii="Times New Roman" w:hAnsi="Times New Roman" w:cs="Times New Roman"/>
           <w:sz w:val="16"/>
@@ -9793,7 +9755,7 @@
   <w:footnote w:id="60">
     <w:p>
       <w:pPr>
-        <w:spacing w:after="20" w:line="180" w:lineRule="auto"/>
+        <w:spacing w:after="0" w:line="240" w:lineRule="auto"/>
         <w:rPr>
           <w:rFonts w:ascii="Times New Roman" w:hAnsi="Times New Roman" w:cs="Times New Roman"/>
           <w:sz w:val="16"/>
@@ -9822,7 +9784,7 @@
   <w:footnote w:id="61">
     <w:p>
       <w:pPr>
-        <w:spacing w:after="20" w:line="180" w:lineRule="auto"/>
+        <w:spacing w:after="0" w:line="240" w:lineRule="auto"/>
         <w:rPr>
           <w:rFonts w:ascii="Times New Roman" w:hAnsi="Times New Roman" w:cs="Times New Roman"/>
           <w:sz w:val="16"/>
@@ -9914,7 +9876,7 @@
   <w:footnote w:id="62">
     <w:p>
       <w:pPr>
-        <w:spacing w:after="20" w:line="180" w:lineRule="auto"/>
+        <w:spacing w:after="0" w:line="240" w:lineRule="auto"/>
         <w:rPr>
           <w:rFonts w:ascii="Times New Roman" w:hAnsi="Times New Roman" w:cs="Times New Roman"/>
           <w:sz w:val="16"/>
@@ -9973,7 +9935,7 @@
   <w:footnote w:id="63">
     <w:p>
       <w:pPr>
-        <w:spacing w:after="20" w:line="180" w:lineRule="auto"/>
+        <w:spacing w:after="0" w:line="240" w:lineRule="auto"/>
         <w:rPr>
           <w:rFonts w:ascii="Times New Roman" w:hAnsi="Times New Roman" w:cs="Times New Roman"/>
           <w:sz w:val="16"/>
@@ -10040,7 +10002,7 @@
   <w:footnote w:id="64">
     <w:p>
       <w:pPr>
-        <w:spacing w:after="20" w:line="180" w:lineRule="auto"/>
+        <w:spacing w:after="0" w:line="240" w:lineRule="auto"/>
         <w:rPr>
           <w:rFonts w:ascii="Times New Roman" w:hAnsi="Times New Roman" w:cs="Times New Roman"/>
           <w:sz w:val="16"/>
@@ -10174,7 +10136,7 @@
   <w:footnote w:id="67">
     <w:p>
       <w:pPr>
-        <w:spacing w:after="20" w:line="180" w:lineRule="auto"/>
+        <w:spacing w:after="0" w:line="240" w:lineRule="auto"/>
         <w:rPr>
           <w:rFonts w:ascii="Times New Roman" w:hAnsi="Times New Roman" w:cs="Times New Roman"/>
           <w:sz w:val="16"/>
@@ -10203,7 +10165,7 @@
   <w:footnote w:id="68">
     <w:p>
       <w:pPr>
-        <w:spacing w:after="20" w:line="180" w:lineRule="auto"/>
+        <w:spacing w:after="0" w:line="240" w:lineRule="auto"/>
         <w:rPr>
           <w:rFonts w:ascii="Times New Roman" w:hAnsi="Times New Roman" w:cs="Times New Roman"/>
           <w:sz w:val="16"/>
@@ -10250,7 +10212,7 @@
   <w:footnote w:id="69">
     <w:p>
       <w:pPr>
-        <w:spacing w:after="20" w:line="180" w:lineRule="auto"/>
+        <w:spacing w:after="0" w:line="240" w:lineRule="auto"/>
         <w:rPr>
           <w:rFonts w:ascii="Times New Roman" w:hAnsi="Times New Roman" w:cs="Times New Roman"/>
           <w:sz w:val="16"/>
@@ -10297,7 +10259,7 @@
   <w:footnote w:id="70">
     <w:p>
       <w:pPr>
-        <w:spacing w:after="20" w:line="180" w:lineRule="auto"/>
+        <w:spacing w:after="0" w:line="240" w:lineRule="auto"/>
         <w:rPr>
           <w:rFonts w:ascii="Times New Roman" w:hAnsi="Times New Roman" w:cs="Times New Roman"/>
           <w:sz w:val="16"/>
@@ -10381,7 +10343,7 @@
   <w:footnote w:id="71">
     <w:p>
       <w:pPr>
-        <w:spacing w:after="20" w:line="180" w:lineRule="auto"/>
+        <w:spacing w:after="0" w:line="240" w:lineRule="auto"/>
         <w:rPr>
           <w:rFonts w:ascii="Times New Roman" w:hAnsi="Times New Roman" w:cs="Times New Roman"/>
           <w:sz w:val="16"/>
@@ -10786,6 +10748,7 @@
   <w:footnote w:id="76">
     <w:p>
       <w:pPr>
+        <w:spacing w:after="0" w:line="240" w:lineRule="auto"/>
         <w:rPr>
           <w:rFonts w:ascii="Times New Roman" w:hAnsi="Times New Roman" w:cs="Times New Roman"/>
           <w:sz w:val="16"/>
@@ -10832,6 +10795,7 @@
   <w:footnote w:id="77">
     <w:p>
       <w:pPr>
+        <w:spacing w:after="0" w:line="240" w:lineRule="auto"/>
         <w:rPr>
           <w:rFonts w:ascii="Times New Roman" w:hAnsi="Times New Roman" w:cs="Times New Roman"/>
           <w:sz w:val="16"/>
@@ -10878,6 +10842,7 @@
   <w:footnote w:id="78">
     <w:p>
       <w:pPr>
+        <w:spacing w:after="0" w:line="240" w:lineRule="auto"/>
         <w:rPr>
           <w:rFonts w:ascii="Times New Roman" w:hAnsi="Times New Roman" w:cs="Times New Roman"/>
           <w:sz w:val="16"/>
@@ -10960,6 +10925,7 @@
   <w:footnote w:id="79">
     <w:p>
       <w:pPr>
+        <w:spacing w:after="0" w:line="240" w:lineRule="auto"/>
         <w:rPr>
           <w:rFonts w:ascii="Times New Roman" w:hAnsi="Times New Roman" w:cs="Times New Roman"/>
           <w:sz w:val="16"/>
@@ -11020,20 +10986,11 @@
         <w:t>, no. 20 of 2008, ss. 2, 9 and sch. 2, accessed July 20, 2026.</w:t>
       </w:r>
     </w:p>
-    <w:p>
-      <w:pPr>
-        <w:pStyle w:val="FootnoteText"/>
-        <w:rPr>
-          <w:rFonts w:ascii="Times New Roman" w:hAnsi="Times New Roman" w:cs="Times New Roman"/>
-          <w:sz w:val="16"/>
-          <w:szCs w:val="16"/>
-        </w:rPr>
-      </w:pPr>
-    </w:p>
   </w:footnote>
   <w:footnote w:id="80">
     <w:p>
       <w:pPr>
+        <w:spacing w:after="0" w:line="240" w:lineRule="auto"/>
         <w:rPr>
           <w:rFonts w:ascii="Times New Roman" w:hAnsi="Times New Roman" w:cs="Times New Roman"/>
           <w:sz w:val="16"/>
@@ -11062,6 +11019,7 @@
   <w:footnote w:id="81">
     <w:p>
       <w:pPr>
+        <w:spacing w:after="0" w:line="240" w:lineRule="auto"/>
         <w:rPr>
           <w:rFonts w:ascii="Times New Roman" w:hAnsi="Times New Roman" w:cs="Times New Roman"/>
           <w:sz w:val="16"/>
@@ -11174,6 +11132,7 @@
   <w:footnote w:id="83">
     <w:p>
       <w:pPr>
+        <w:spacing w:after="0" w:line="240" w:lineRule="auto"/>
         <w:rPr>
           <w:rFonts w:ascii="Times New Roman" w:hAnsi="Times New Roman" w:cs="Times New Roman"/>
           <w:sz w:val="16"/>
@@ -11202,6 +11161,7 @@
   <w:footnote w:id="84">
     <w:p>
       <w:pPr>
+        <w:spacing w:after="0" w:line="240" w:lineRule="auto"/>
         <w:rPr>
           <w:rFonts w:ascii="Times New Roman" w:hAnsi="Times New Roman" w:cs="Times New Roman"/>
           <w:sz w:val="16"/>
@@ -11230,6 +11190,7 @@
   <w:footnote w:id="85">
     <w:p>
       <w:pPr>
+        <w:spacing w:after="0" w:line="240" w:lineRule="auto"/>
         <w:rPr>
           <w:rFonts w:ascii="Times New Roman" w:hAnsi="Times New Roman" w:cs="Times New Roman"/>
           <w:sz w:val="16"/>
@@ -11342,6 +11303,7 @@
   <w:footnote w:id="87">
     <w:p>
       <w:pPr>
+        <w:spacing w:after="0" w:line="240" w:lineRule="auto"/>
         <w:rPr>
           <w:rFonts w:ascii="Times New Roman" w:hAnsi="Times New Roman" w:cs="Times New Roman"/>
           <w:sz w:val="16"/>

</xml_diff>